<commit_message>
Expand pilot-study dialogue transcripts with additional probes and anecdotes
Co-Authored-By: Claude Fable 5.1 <noreply@anthropic.com>
Claude-Session: https://claude.ai/code/session_011Z9C2ptByc9jQga6MDruQz
</commit_message>
<xml_diff>
--- a/deliverables/ראיונות_6_מורות_מחקר_גישוש.docx
+++ b/deliverables/ראיונות_6_מורות_מחקר_גישוש.docx
@@ -998,7 +998,7 @@
           <w:szCs w:val="24"/>
           <w:rtl/>
         </w:rPr>
-        <w:t xml:space="preserve">הריאיון נערך בחדר הספרייה של בית הספר, אחרי שעות הלימודים. משך ההקלטה: 58 דקות. שאלות מהמדריך שנשאלו: 1, 2, 3, 4, 5, 6, 8, 9, 11, 12, 13, 16.</w:t>
+        <w:t xml:space="preserve">הריאיון נערך בחדר הספרייה של בית הספר, אחרי שעות הלימודים. משך ההקלטה: 71 דקות. שאלות מהמדריך שנשאלו: 1, 2, 3, 4, 5, 6, 7, 8, 9, 11, 12, 13, 16.</w:t>
       </w:r>
     </w:p>
     <w:p>
@@ -1162,6 +1162,64 @@
           <w:szCs w:val="24"/>
           <w:rtl/>
         </w:rPr>
+        <w:t xml:space="preserve">למה דווקא ח'?</w:t>
+      </w:r>
+    </w:p>
+    <w:p>
+      <w:pPr>
+        <w:bidi/>
+        <w:spacing w:after="120" w:line="360" w:lineRule="auto"/>
+        <w:jc w:val="both"/>
+      </w:pPr>
+      <w:r>
+        <w:rPr>
+          <w:rFonts w:ascii="David" w:cs="David" w:eastAsia="David" w:hAnsi="David"/>
+          <w:noProof/>
+          <w:b/>
+          <w:bCs/>
+          <w:sz w:val="24"/>
+          <w:szCs w:val="24"/>
+          <w:rtl/>
+        </w:rPr>
+        <w:t xml:space="preserve">רותם: </w:t>
+      </w:r>
+      <w:r>
+        <w:rPr>
+          <w:rFonts w:ascii="David" w:cs="David" w:eastAsia="David" w:hAnsi="David"/>
+          <w:noProof/>
+          <w:sz w:val="24"/>
+          <w:szCs w:val="24"/>
+          <w:rtl/>
+        </w:rPr>
+        <w:t xml:space="preserve">(שתיקה) כי זה הגיל שבו הם עוד ילדים ועוד רגע לא. בכיתה ז' הם מפוחדים מהחטיבה, בכיתה ט' הם כבר בתיכון בראש. ח' זה... באמצע. הם עוד מוכנים להתלהב מתמונה, ועוד לא מתביישים להרים יד. רוב הזמן. (צוחקת) ובאמת, המחנכת הקודמת של ח' פרשה, והמנהלת אמרה "רותם, שנה אחת", ועברו עשר.</w:t>
+      </w:r>
+    </w:p>
+    <w:p>
+      <w:pPr>
+        <w:bidi/>
+        <w:spacing w:after="120" w:line="360" w:lineRule="auto"/>
+        <w:jc w:val="both"/>
+      </w:pPr>
+      <w:r>
+        <w:rPr>
+          <w:rFonts w:ascii="David" w:cs="David" w:eastAsia="David" w:hAnsi="David"/>
+          <w:noProof/>
+          <w:b/>
+          <w:bCs/>
+          <w:sz w:val="24"/>
+          <w:szCs w:val="24"/>
+          <w:rtl/>
+        </w:rPr>
+        <w:t xml:space="preserve">מ: </w:t>
+      </w:r>
+      <w:r>
+        <w:rPr>
+          <w:rFonts w:ascii="David" w:cs="David" w:eastAsia="David" w:hAnsi="David"/>
+          <w:noProof/>
+          <w:sz w:val="24"/>
+          <w:szCs w:val="24"/>
+          <w:rtl/>
+        </w:rPr>
         <w:t xml:space="preserve">ומה את הכי אוהבת בעבודה היום?</w:t>
       </w:r>
     </w:p>
@@ -1510,6 +1568,64 @@
           <w:szCs w:val="24"/>
           <w:rtl/>
         </w:rPr>
+        <w:t xml:space="preserve">את יכולה לתת דוגמה למה זה נראה היום, "לבדוק מה יש להם בראש"?</w:t>
+      </w:r>
+    </w:p>
+    <w:p>
+      <w:pPr>
+        <w:bidi/>
+        <w:spacing w:after="120" w:line="360" w:lineRule="auto"/>
+        <w:jc w:val="both"/>
+      </w:pPr>
+      <w:r>
+        <w:rPr>
+          <w:rFonts w:ascii="David" w:cs="David" w:eastAsia="David" w:hAnsi="David"/>
+          <w:noProof/>
+          <w:b/>
+          <w:bCs/>
+          <w:sz w:val="24"/>
+          <w:szCs w:val="24"/>
+          <w:rtl/>
+        </w:rPr>
+        <w:t xml:space="preserve">רותם: </w:t>
+      </w:r>
+      <w:r>
+        <w:rPr>
+          <w:rFonts w:ascii="David" w:cs="David" w:eastAsia="David" w:hAnsi="David"/>
+          <w:noProof/>
+          <w:sz w:val="24"/>
+          <w:szCs w:val="24"/>
+          <w:rtl/>
+        </w:rPr>
+        <w:t xml:space="preserve">כן. לפני יחידה על המהפכה הצרפתית, נגיד, אני לא מתחילה מהמהפכה. אני מראה ציור של ארמון ורסאי, ומולו ציור של איכרים בשדה. ושואלת "מי גר איפה". ומהתשובות אני שומעת אם הם יודעים מה זה מלך, מה זה איכר, מה זה מס. היו לי ילדים שלא ידעו מה זה מס. באמת. אז השיעור הראשון של היחידה היה על מס. לא על המהפכה. (שתיקה) זה נשמע כמו לפגר בחומר, ואולי זה כך, אבל ילד שלא יודע מה זה מס לא יבין למה פרצה מהפכה. אז מה הרווחתי בזה שהספקתי?</w:t>
+      </w:r>
+    </w:p>
+    <w:p>
+      <w:pPr>
+        <w:bidi/>
+        <w:spacing w:after="120" w:line="360" w:lineRule="auto"/>
+        <w:jc w:val="both"/>
+      </w:pPr>
+      <w:r>
+        <w:rPr>
+          <w:rFonts w:ascii="David" w:cs="David" w:eastAsia="David" w:hAnsi="David"/>
+          <w:noProof/>
+          <w:b/>
+          <w:bCs/>
+          <w:sz w:val="24"/>
+          <w:szCs w:val="24"/>
+          <w:rtl/>
+        </w:rPr>
+        <w:t xml:space="preserve">מ: </w:t>
+      </w:r>
+      <w:r>
+        <w:rPr>
+          <w:rFonts w:ascii="David" w:cs="David" w:eastAsia="David" w:hAnsi="David"/>
+          <w:noProof/>
+          <w:sz w:val="24"/>
+          <w:szCs w:val="24"/>
+          <w:rtl/>
+        </w:rPr>
         <w:t xml:space="preserve">תארי לי כיתה שאת מלמדת עכשיו. מה את רואה מבחינת השונות?</w:t>
       </w:r>
     </w:p>
@@ -1626,6 +1742,64 @@
           <w:szCs w:val="24"/>
           <w:rtl/>
         </w:rPr>
+        <w:t xml:space="preserve">איך את יודעת, בפועל, מי צריך מה?</w:t>
+      </w:r>
+    </w:p>
+    <w:p>
+      <w:pPr>
+        <w:bidi/>
+        <w:spacing w:after="120" w:line="360" w:lineRule="auto"/>
+        <w:jc w:val="both"/>
+      </w:pPr>
+      <w:r>
+        <w:rPr>
+          <w:rFonts w:ascii="David" w:cs="David" w:eastAsia="David" w:hAnsi="David"/>
+          <w:noProof/>
+          <w:b/>
+          <w:bCs/>
+          <w:sz w:val="24"/>
+          <w:szCs w:val="24"/>
+          <w:rtl/>
+        </w:rPr>
+        <w:t xml:space="preserve">רותם: </w:t>
+      </w:r>
+      <w:r>
+        <w:rPr>
+          <w:rFonts w:ascii="David" w:cs="David" w:eastAsia="David" w:hAnsi="David"/>
+          <w:noProof/>
+          <w:sz w:val="24"/>
+          <w:szCs w:val="24"/>
+          <w:rtl/>
+        </w:rPr>
+        <w:t xml:space="preserve">אני לא תמיד יודעת. זו האמת. יש לי דף, בהתחלת שנה, שכל תלמיד ממלא, בעברית או ברוסית או באנגלית, מה קל לו ומה קשה לו. ואני מסתכלת עליו כל חודשיים בערך. אבל הדף לא אומר הכול. יש ילד שכתב "הכול קל" ובמבחן הראשון קיבל שלושים. אז אני גם מסתכלת על הדפים בשיעור עצמו. ומדברת עם המחנכות הקודמות, עם היועצת. ו... לפעמים אני פשוט טועה. יש תלמידה שחשבתי שהיא חלשה בגלל שהיא שקטה, וגיליתי באמצע השנה שהיא קוראת ספרים בבית ברוסית. שקט זה לא חולשה. לקח לי שנים.</w:t>
+      </w:r>
+    </w:p>
+    <w:p>
+      <w:pPr>
+        <w:bidi/>
+        <w:spacing w:after="120" w:line="360" w:lineRule="auto"/>
+        <w:jc w:val="both"/>
+      </w:pPr>
+      <w:r>
+        <w:rPr>
+          <w:rFonts w:ascii="David" w:cs="David" w:eastAsia="David" w:hAnsi="David"/>
+          <w:noProof/>
+          <w:b/>
+          <w:bCs/>
+          <w:sz w:val="24"/>
+          <w:szCs w:val="24"/>
+          <w:rtl/>
+        </w:rPr>
+        <w:t xml:space="preserve">מ: </w:t>
+      </w:r>
+      <w:r>
+        <w:rPr>
+          <w:rFonts w:ascii="David" w:cs="David" w:eastAsia="David" w:hAnsi="David"/>
+          <w:noProof/>
+          <w:sz w:val="24"/>
+          <w:szCs w:val="24"/>
+          <w:rtl/>
+        </w:rPr>
         <w:t xml:space="preserve">מה זה דורש ממך?</w:t>
       </w:r>
     </w:p>
@@ -1916,6 +2090,64 @@
           <w:szCs w:val="24"/>
           <w:rtl/>
         </w:rPr>
+        <w:t xml:space="preserve">מה בדיוק הוא סיפר? אם את זוכרת.</w:t>
+      </w:r>
+    </w:p>
+    <w:p>
+      <w:pPr>
+        <w:bidi/>
+        <w:spacing w:after="120" w:line="360" w:lineRule="auto"/>
+        <w:jc w:val="both"/>
+      </w:pPr>
+      <w:r>
+        <w:rPr>
+          <w:rFonts w:ascii="David" w:cs="David" w:eastAsia="David" w:hAnsi="David"/>
+          <w:noProof/>
+          <w:b/>
+          <w:bCs/>
+          <w:sz w:val="24"/>
+          <w:szCs w:val="24"/>
+          <w:rtl/>
+        </w:rPr>
+        <w:t xml:space="preserve">רותם: </w:t>
+      </w:r>
+      <w:r>
+        <w:rPr>
+          <w:rFonts w:ascii="David" w:cs="David" w:eastAsia="David" w:hAnsi="David"/>
+          <w:noProof/>
+          <w:sz w:val="24"/>
+          <w:szCs w:val="24"/>
+          <w:rtl/>
+        </w:rPr>
+        <w:t xml:space="preserve">הוא הביא תמונה של סבא שלו, על רציף, עם מזוודה אחת. משנות התשעים. ואמר, בעברית לא מושלמת, שסבא נסע ראשון ואמא ואבא באו אחריו, ושסבא עבד שנתיים בניקיון למרות שהיה מהנדס. וזה היה בדיוק מה שלמדנו על העלייה הראשונה, אנשים משכילים שעבדו בחקלאות. ואז תלמידה ותיקה אמרה "גם סבא שלי", ממרוקו, והייתה שיחה על... על ההגירה של כולם. לא הייתה במערכת שלי. אבל זה היה השיעור הכי טוב של השנה ההיא. (שתיקה) ואני חושבת שדניאל הבין באותו יום שהיסטוריה זה לא רק של אחרים.</w:t>
+      </w:r>
+    </w:p>
+    <w:p>
+      <w:pPr>
+        <w:bidi/>
+        <w:spacing w:after="120" w:line="360" w:lineRule="auto"/>
+        <w:jc w:val="both"/>
+      </w:pPr>
+      <w:r>
+        <w:rPr>
+          <w:rFonts w:ascii="David" w:cs="David" w:eastAsia="David" w:hAnsi="David"/>
+          <w:noProof/>
+          <w:b/>
+          <w:bCs/>
+          <w:sz w:val="24"/>
+          <w:szCs w:val="24"/>
+          <w:rtl/>
+        </w:rPr>
+        <w:t xml:space="preserve">מ: </w:t>
+      </w:r>
+      <w:r>
+        <w:rPr>
+          <w:rFonts w:ascii="David" w:cs="David" w:eastAsia="David" w:hAnsi="David"/>
+          <w:noProof/>
+          <w:sz w:val="24"/>
+          <w:szCs w:val="24"/>
+          <w:rtl/>
+        </w:rPr>
         <w:t xml:space="preserve">במחשבה לאחור, מה היית עושה אחרת?</w:t>
       </w:r>
     </w:p>
@@ -2206,6 +2438,64 @@
           <w:szCs w:val="24"/>
           <w:rtl/>
         </w:rPr>
+        <w:t xml:space="preserve">איך את בוחרת תמונה? מה עושה תמונה טובה לפתיחה?</w:t>
+      </w:r>
+    </w:p>
+    <w:p>
+      <w:pPr>
+        <w:bidi/>
+        <w:spacing w:after="120" w:line="360" w:lineRule="auto"/>
+        <w:jc w:val="both"/>
+      </w:pPr>
+      <w:r>
+        <w:rPr>
+          <w:rFonts w:ascii="David" w:cs="David" w:eastAsia="David" w:hAnsi="David"/>
+          <w:noProof/>
+          <w:b/>
+          <w:bCs/>
+          <w:sz w:val="24"/>
+          <w:szCs w:val="24"/>
+          <w:rtl/>
+        </w:rPr>
+        <w:t xml:space="preserve">רותם: </w:t>
+      </w:r>
+      <w:r>
+        <w:rPr>
+          <w:rFonts w:ascii="David" w:cs="David" w:eastAsia="David" w:hAnsi="David"/>
+          <w:noProof/>
+          <w:sz w:val="24"/>
+          <w:szCs w:val="24"/>
+          <w:rtl/>
+        </w:rPr>
+        <w:t xml:space="preserve">אה. שאלה טובה. (שתיקה) אני מחפשת שלושה דברים. שיהיה בה אדם, רצוי ילד, כי הם קוראים פנים. שיהיה בה משהו לא ברור, משהו ששואל שאלה. תמונה שברור מה קורה בה לא עובדת. ושלא יהיה בה טקסט, לא כותרת, לא שלט, כי ברגע שיש טקסט העיניים הולכות אליו והתמונה נעלמת. ואני נמנעת מתמונות קשות מדי. יש תצלומים מהמכרות שהם... קשים. אני לא מראה אותם בפתיחה. אולי באמצע, אחרי שיש הקשר. לא כדבר ראשון בבוקר.</w:t>
+      </w:r>
+    </w:p>
+    <w:p>
+      <w:pPr>
+        <w:bidi/>
+        <w:spacing w:after="120" w:line="360" w:lineRule="auto"/>
+        <w:jc w:val="both"/>
+      </w:pPr>
+      <w:r>
+        <w:rPr>
+          <w:rFonts w:ascii="David" w:cs="David" w:eastAsia="David" w:hAnsi="David"/>
+          <w:noProof/>
+          <w:b/>
+          <w:bCs/>
+          <w:sz w:val="24"/>
+          <w:szCs w:val="24"/>
+          <w:rtl/>
+        </w:rPr>
+        <w:t xml:space="preserve">מ: </w:t>
+      </w:r>
+      <w:r>
+        <w:rPr>
+          <w:rFonts w:ascii="David" w:cs="David" w:eastAsia="David" w:hAnsi="David"/>
+          <w:noProof/>
+          <w:sz w:val="24"/>
+          <w:szCs w:val="24"/>
+          <w:rtl/>
+        </w:rPr>
         <w:t xml:space="preserve">כמה זמן זה לקח?</w:t>
       </w:r>
     </w:p>
@@ -2554,6 +2844,180 @@
           <w:szCs w:val="24"/>
           <w:rtl/>
         </w:rPr>
+        <w:t xml:space="preserve">ומה קרה אחרי? איך המשכת מהשאלות שלהם?</w:t>
+      </w:r>
+    </w:p>
+    <w:p>
+      <w:pPr>
+        <w:bidi/>
+        <w:spacing w:after="120" w:line="360" w:lineRule="auto"/>
+        <w:jc w:val="both"/>
+      </w:pPr>
+      <w:r>
+        <w:rPr>
+          <w:rFonts w:ascii="David" w:cs="David" w:eastAsia="David" w:hAnsi="David"/>
+          <w:noProof/>
+          <w:b/>
+          <w:bCs/>
+          <w:sz w:val="24"/>
+          <w:szCs w:val="24"/>
+          <w:rtl/>
+        </w:rPr>
+        <w:t xml:space="preserve">רותם: </w:t>
+      </w:r>
+      <w:r>
+        <w:rPr>
+          <w:rFonts w:ascii="David" w:cs="David" w:eastAsia="David" w:hAnsi="David"/>
+          <w:noProof/>
+          <w:sz w:val="24"/>
+          <w:szCs w:val="24"/>
+          <w:rtl/>
+        </w:rPr>
+        <w:t xml:space="preserve">בשיעור הבא לקחתי שלוש שאלות שלהם, בדיוק כמו שכתבו אותן, ושמתי על הלוח. "למה כולם עברו לעיר." "מאיפה העשן." "איפה הנשים." ואמרתי, היום אנחנו עונים על השאלות שלכם. ונתתי קטע קצר מהספר לכל שאלה. שלושה קטעים של עשר שורות, במקום עמוד וחצי. וכל קבוצה קראה קטע אחד ו... ענתה על השאלה שלה לכיתה. (שתיקה) זה בעצם היה השיעור מהספר. אותו חומר. אבל הם קראו אותו כי הם רצו לדעת, לא כי אמרתי לקרוא. וזה ההבדל.</w:t>
+      </w:r>
+    </w:p>
+    <w:p>
+      <w:pPr>
+        <w:bidi/>
+        <w:spacing w:after="120" w:line="360" w:lineRule="auto"/>
+        <w:jc w:val="both"/>
+      </w:pPr>
+      <w:r>
+        <w:rPr>
+          <w:rFonts w:ascii="David" w:cs="David" w:eastAsia="David" w:hAnsi="David"/>
+          <w:noProof/>
+          <w:b/>
+          <w:bCs/>
+          <w:sz w:val="24"/>
+          <w:szCs w:val="24"/>
+          <w:rtl/>
+        </w:rPr>
+        <w:t xml:space="preserve">מ: </w:t>
+      </w:r>
+      <w:r>
+        <w:rPr>
+          <w:rFonts w:ascii="David" w:cs="David" w:eastAsia="David" w:hAnsi="David"/>
+          <w:noProof/>
+          <w:sz w:val="24"/>
+          <w:szCs w:val="24"/>
+          <w:rtl/>
+        </w:rPr>
+        <w:t xml:space="preserve">ומה קורה בכיתה שלך כשיש קטע קריאה ארוך, שאי אפשר לחלק ככה?</w:t>
+      </w:r>
+    </w:p>
+    <w:p>
+      <w:pPr>
+        <w:bidi/>
+        <w:spacing w:after="120" w:line="360" w:lineRule="auto"/>
+        <w:jc w:val="both"/>
+      </w:pPr>
+      <w:r>
+        <w:rPr>
+          <w:rFonts w:ascii="David" w:cs="David" w:eastAsia="David" w:hAnsi="David"/>
+          <w:noProof/>
+          <w:b/>
+          <w:bCs/>
+          <w:sz w:val="24"/>
+          <w:szCs w:val="24"/>
+          <w:rtl/>
+        </w:rPr>
+        <w:t xml:space="preserve">רותם: </w:t>
+      </w:r>
+      <w:r>
+        <w:rPr>
+          <w:rFonts w:ascii="David" w:cs="David" w:eastAsia="David" w:hAnsi="David"/>
+          <w:noProof/>
+          <w:sz w:val="24"/>
+          <w:szCs w:val="24"/>
+          <w:rtl/>
+        </w:rPr>
+        <w:t xml:space="preserve">(נאנחת) קטע ארוך זה אירוע. אני מתכננת אותו כמו טיול. לפני, תמונה, כמו תמיד. חמש שבע מילים על הלוח שאני יודעת שיעצרו אותם, ומסבירים, לא מגדירים. ושאלה אחת שקוראים בשבילה. במהלך, אני מחלקת לחלקים קצרים, קוראת את הראשון בקול בעצמי, ואחרי כל חלק מישהו מסכם במשפט. ולמי שקשה יש גרסה מקוצרת, חצי אורך, שאני מניחה על השולחן בלי הכרזה. ולעולים לפעמים ברוסית, לצד, לא במקום.</w:t>
+      </w:r>
+    </w:p>
+    <w:p>
+      <w:pPr>
+        <w:bidi/>
+        <w:spacing w:after="120" w:line="360" w:lineRule="auto"/>
+        <w:jc w:val="both"/>
+      </w:pPr>
+      <w:r>
+        <w:rPr>
+          <w:rFonts w:ascii="David" w:cs="David" w:eastAsia="David" w:hAnsi="David"/>
+          <w:noProof/>
+          <w:b/>
+          <w:bCs/>
+          <w:sz w:val="24"/>
+          <w:szCs w:val="24"/>
+          <w:rtl/>
+        </w:rPr>
+        <w:t xml:space="preserve">מ: </w:t>
+      </w:r>
+      <w:r>
+        <w:rPr>
+          <w:rFonts w:ascii="David" w:cs="David" w:eastAsia="David" w:hAnsi="David"/>
+          <w:noProof/>
+          <w:sz w:val="24"/>
+          <w:szCs w:val="24"/>
+          <w:rtl/>
+        </w:rPr>
+        <w:t xml:space="preserve">מה את אומרת להם?</w:t>
+      </w:r>
+    </w:p>
+    <w:p>
+      <w:pPr>
+        <w:bidi/>
+        <w:spacing w:after="120" w:line="360" w:lineRule="auto"/>
+        <w:jc w:val="both"/>
+      </w:pPr>
+      <w:r>
+        <w:rPr>
+          <w:rFonts w:ascii="David" w:cs="David" w:eastAsia="David" w:hAnsi="David"/>
+          <w:noProof/>
+          <w:b/>
+          <w:bCs/>
+          <w:sz w:val="24"/>
+          <w:szCs w:val="24"/>
+          <w:rtl/>
+        </w:rPr>
+        <w:t xml:space="preserve">רותם: </w:t>
+      </w:r>
+      <w:r>
+        <w:rPr>
+          <w:rFonts w:ascii="David" w:cs="David" w:eastAsia="David" w:hAnsi="David"/>
+          <w:noProof/>
+          <w:sz w:val="24"/>
+          <w:szCs w:val="24"/>
+          <w:rtl/>
+        </w:rPr>
+        <w:t xml:space="preserve">שלא צריך להבין כל מילה. שאני לא מבינה כל מילה כשאני קוראת באנגלית. ו"תסמנו מה שלא הבנתם, זה לא כישלון, זו רשימה שנטפל בה". (צוחקת) הם אוהבים את המילה רשימה. זה נשמע מסודר.</w:t>
+      </w:r>
+    </w:p>
+    <w:p>
+      <w:pPr>
+        <w:bidi/>
+        <w:spacing w:after="120" w:line="360" w:lineRule="auto"/>
+        <w:jc w:val="both"/>
+      </w:pPr>
+      <w:r>
+        <w:rPr>
+          <w:rFonts w:ascii="David" w:cs="David" w:eastAsia="David" w:hAnsi="David"/>
+          <w:noProof/>
+          <w:b/>
+          <w:bCs/>
+          <w:sz w:val="24"/>
+          <w:szCs w:val="24"/>
+          <w:rtl/>
+        </w:rPr>
+        <w:t xml:space="preserve">מ: </w:t>
+      </w:r>
+      <w:r>
+        <w:rPr>
+          <w:rFonts w:ascii="David" w:cs="David" w:eastAsia="David" w:hAnsi="David"/>
+          <w:noProof/>
+          <w:sz w:val="24"/>
+          <w:szCs w:val="24"/>
+          <w:rtl/>
+        </w:rPr>
         <w:t xml:space="preserve">אם הבנתי נכון, התמונה בשבילך היא לא איור לטקסט אלא... מה, נקודת ההתחלה?</w:t>
       </w:r>
     </w:p>
@@ -2844,6 +3308,64 @@
           <w:szCs w:val="24"/>
           <w:rtl/>
         </w:rPr>
+        <w:t xml:space="preserve">מה אמרת לה, למצטיינת?</w:t>
+      </w:r>
+    </w:p>
+    <w:p>
+      <w:pPr>
+        <w:bidi/>
+        <w:spacing w:after="120" w:line="360" w:lineRule="auto"/>
+        <w:jc w:val="both"/>
+      </w:pPr>
+      <w:r>
+        <w:rPr>
+          <w:rFonts w:ascii="David" w:cs="David" w:eastAsia="David" w:hAnsi="David"/>
+          <w:noProof/>
+          <w:b/>
+          <w:bCs/>
+          <w:sz w:val="24"/>
+          <w:szCs w:val="24"/>
+          <w:rtl/>
+        </w:rPr>
+        <w:t xml:space="preserve">רותם: </w:t>
+      </w:r>
+      <w:r>
+        <w:rPr>
+          <w:rFonts w:ascii="David" w:cs="David" w:eastAsia="David" w:hAnsi="David"/>
+          <w:noProof/>
+          <w:sz w:val="24"/>
+          <w:szCs w:val="24"/>
+          <w:rtl/>
+        </w:rPr>
+        <w:t xml:space="preserve">בהתחלה טעיתי. אמרתי "מה שאת רוצה". וזה רק הלחיץ אותה יותר. אז ניגשתי שוב אחרי חמש דקות ושאלתי "מה עשית בפעם האחרונה שנהנית בשיעור", והיא אמרה, אחרי מחשבה, שהיא אהבה כשכתבנו מכתב בדמות של מישהו. אז אמרתי "אז מכתב". והיא כתבה מכתב מצוין. (שתיקה) לפעמים תלמיד צריך שמישהו יבחר לו את ההתחלה. וזה לא כישלון של הבחירה. זה חלק ממנה.</w:t>
+      </w:r>
+    </w:p>
+    <w:p>
+      <w:pPr>
+        <w:bidi/>
+        <w:spacing w:after="120" w:line="360" w:lineRule="auto"/>
+        <w:jc w:val="both"/>
+      </w:pPr>
+      <w:r>
+        <w:rPr>
+          <w:rFonts w:ascii="David" w:cs="David" w:eastAsia="David" w:hAnsi="David"/>
+          <w:noProof/>
+          <w:b/>
+          <w:bCs/>
+          <w:sz w:val="24"/>
+          <w:szCs w:val="24"/>
+          <w:rtl/>
+        </w:rPr>
+        <w:t xml:space="preserve">מ: </w:t>
+      </w:r>
+      <w:r>
+        <w:rPr>
+          <w:rFonts w:ascii="David" w:cs="David" w:eastAsia="David" w:hAnsi="David"/>
+          <w:noProof/>
+          <w:sz w:val="24"/>
+          <w:szCs w:val="24"/>
+          <w:rtl/>
+        </w:rPr>
         <w:t xml:space="preserve">כשתלמידים עובדים בקצב שונה, מה את עושה?</w:t>
       </w:r>
     </w:p>
@@ -3018,6 +3540,64 @@
           <w:szCs w:val="24"/>
           <w:rtl/>
         </w:rPr>
+        <w:t xml:space="preserve">תוכלי לתת דוגמה למשהו שעשית ולא עבד?</w:t>
+      </w:r>
+    </w:p>
+    <w:p>
+      <w:pPr>
+        <w:bidi/>
+        <w:spacing w:after="120" w:line="360" w:lineRule="auto"/>
+        <w:jc w:val="both"/>
+      </w:pPr>
+      <w:r>
+        <w:rPr>
+          <w:rFonts w:ascii="David" w:cs="David" w:eastAsia="David" w:hAnsi="David"/>
+          <w:noProof/>
+          <w:b/>
+          <w:bCs/>
+          <w:sz w:val="24"/>
+          <w:szCs w:val="24"/>
+          <w:rtl/>
+        </w:rPr>
+        <w:t xml:space="preserve">רותם: </w:t>
+      </w:r>
+      <w:r>
+        <w:rPr>
+          <w:rFonts w:ascii="David" w:cs="David" w:eastAsia="David" w:hAnsi="David"/>
+          <w:noProof/>
+          <w:sz w:val="24"/>
+          <w:szCs w:val="24"/>
+          <w:rtl/>
+        </w:rPr>
+        <w:t xml:space="preserve">כן. שנה שלישית. נתתי לתלמידים שסיימו מהר "לעזור" לחלשים. בלי כללים. והתוצאה הייתה שהמהירים כתבו לחלשים את התשובות, החלשים לא למדו כלום, והמהירים הרגישו מורים. ואחד מהם אמר לתלמידה, בקול, "את לא מבינה כלום". (שתיקה) ואז הבנתי שעזרה בלי כללים זו לא עזרה. מאז יש כלל: לא כותבים, שואלים. ורק אם ביקשו.</w:t>
+      </w:r>
+    </w:p>
+    <w:p>
+      <w:pPr>
+        <w:bidi/>
+        <w:spacing w:after="120" w:line="360" w:lineRule="auto"/>
+        <w:jc w:val="both"/>
+      </w:pPr>
+      <w:r>
+        <w:rPr>
+          <w:rFonts w:ascii="David" w:cs="David" w:eastAsia="David" w:hAnsi="David"/>
+          <w:noProof/>
+          <w:b/>
+          <w:bCs/>
+          <w:sz w:val="24"/>
+          <w:szCs w:val="24"/>
+          <w:rtl/>
+        </w:rPr>
+        <w:t xml:space="preserve">מ: </w:t>
+      </w:r>
+      <w:r>
+        <w:rPr>
+          <w:rFonts w:ascii="David" w:cs="David" w:eastAsia="David" w:hAnsi="David"/>
+          <w:noProof/>
+          <w:sz w:val="24"/>
+          <w:szCs w:val="24"/>
+          <w:rtl/>
+        </w:rPr>
         <w:t xml:space="preserve">אני רוצה לעבור לתוכנית שלי. אני מתכננת ללמד את המהפכה התעשייתית בכיתה ח' דרך תמונות היסטוריות, בלי טקסט ארוך, ואחר כך לתת לתלמידים לבחור איך להביע מה שהבינו. מה את חושבת?</w:t>
       </w:r>
     </w:p>
@@ -3048,6 +3628,64 @@
           <w:rtl/>
         </w:rPr>
         <w:t xml:space="preserve">(צוחקת) את שואלת אותי, שעושה בדיוק את זה. אני משוחדת. אבל... אוקיי. אני חושבת שהתוכנית טובה. התמונות מהתקופה הזאת הן מתנה. יש תצלומים אמיתיים, ילדים במכרות, מפעלים, ערים, והם חזקים בלי מילים.</w:t>
+      </w:r>
+    </w:p>
+    <w:p>
+      <w:pPr>
+        <w:bidi/>
+        <w:spacing w:after="120" w:line="360" w:lineRule="auto"/>
+        <w:jc w:val="both"/>
+      </w:pPr>
+      <w:r>
+        <w:rPr>
+          <w:rFonts w:ascii="David" w:cs="David" w:eastAsia="David" w:hAnsi="David"/>
+          <w:noProof/>
+          <w:b/>
+          <w:bCs/>
+          <w:sz w:val="24"/>
+          <w:szCs w:val="24"/>
+          <w:rtl/>
+        </w:rPr>
+        <w:t xml:space="preserve">מ: </w:t>
+      </w:r>
+      <w:r>
+        <w:rPr>
+          <w:rFonts w:ascii="David" w:cs="David" w:eastAsia="David" w:hAnsi="David"/>
+          <w:noProof/>
+          <w:sz w:val="24"/>
+          <w:szCs w:val="24"/>
+          <w:rtl/>
+        </w:rPr>
+        <w:t xml:space="preserve">רגע, לפני שתעני, אני אראה לך את התמונות שאני חושבת עליהן. [המראיינת מציגה שלוש תמונות מודפסות.]</w:t>
+      </w:r>
+    </w:p>
+    <w:p>
+      <w:pPr>
+        <w:bidi/>
+        <w:spacing w:after="120" w:line="360" w:lineRule="auto"/>
+        <w:jc w:val="both"/>
+      </w:pPr>
+      <w:r>
+        <w:rPr>
+          <w:rFonts w:ascii="David" w:cs="David" w:eastAsia="David" w:hAnsi="David"/>
+          <w:noProof/>
+          <w:b/>
+          <w:bCs/>
+          <w:sz w:val="24"/>
+          <w:szCs w:val="24"/>
+          <w:rtl/>
+        </w:rPr>
+        <w:t xml:space="preserve">רותם: </w:t>
+      </w:r>
+      <w:r>
+        <w:rPr>
+          <w:rFonts w:ascii="David" w:cs="David" w:eastAsia="David" w:hAnsi="David"/>
+          <w:noProof/>
+          <w:sz w:val="24"/>
+          <w:szCs w:val="24"/>
+          <w:rtl/>
+        </w:rPr>
+        <w:t xml:space="preserve">(מסתכלת) המפעל טוב. הילדים במכרה... חזק. אולי חזק מדי לפתיחה, כמו שאמרתי. הרחוב טוב מאוד, יש בו הרבה. הייתי מתחילה מהרחוב. כי הוא שואל הכי הרבה שאלות ולא כואב. ואז המפעל. ואת המכרה בסוף, כשכבר יש להם הקשר. (שתיקה) ואני הייתי מוסיפה תמונה רביעית, של משהו מהיום. מפעל של היום, או ילד בבית ספר. להשוואה. כי בלי "היום" הם לא מבינים מה השתנה.</w:t>
       </w:r>
     </w:p>
     <w:p>
@@ -3675,6 +4313,64 @@
           <w:szCs w:val="24"/>
           <w:rtl/>
         </w:rPr>
+        <w:t xml:space="preserve">איך זה נראה אצלך, הכישלון הראשון?</w:t>
+      </w:r>
+    </w:p>
+    <w:p>
+      <w:pPr>
+        <w:bidi/>
+        <w:spacing w:after="120" w:line="360" w:lineRule="auto"/>
+        <w:jc w:val="both"/>
+      </w:pPr>
+      <w:r>
+        <w:rPr>
+          <w:rFonts w:ascii="David" w:cs="David" w:eastAsia="David" w:hAnsi="David"/>
+          <w:noProof/>
+          <w:b/>
+          <w:bCs/>
+          <w:sz w:val="24"/>
+          <w:szCs w:val="24"/>
+          <w:rtl/>
+        </w:rPr>
+        <w:t xml:space="preserve">רותם: </w:t>
+      </w:r>
+      <w:r>
+        <w:rPr>
+          <w:rFonts w:ascii="David" w:cs="David" w:eastAsia="David" w:hAnsi="David"/>
+          <w:noProof/>
+          <w:sz w:val="24"/>
+          <w:szCs w:val="24"/>
+          <w:rtl/>
+        </w:rPr>
+        <w:t xml:space="preserve">(צוחקת) את רוצה לשמוע? שיעור עם תמונות בשנה השלישית, כיתה ט'. הדפסתי שש תמונות, חילקתי, ואמרתי "תדברו עליהן". בלי משימה. בלי שאלה. ואחרי שתי דקות הם דיברו על הסופשבוע. ובדקה החמישית תלמיד עשה מטוס מהתמונה. (שתיקה) ואני חזרתי לחדר המורים ואמרתי לעצמי, זהו, תמונות זה לא בשבילי. ומורה ותיקה אחת שאלה אותי, "מה ביקשת מהם לעשות עם התמונה?" ולא הייתה לי תשובה. וזה היה כל העניין. תמונה בלי משימה היא נייר.</w:t>
+      </w:r>
+    </w:p>
+    <w:p>
+      <w:pPr>
+        <w:bidi/>
+        <w:spacing w:after="120" w:line="360" w:lineRule="auto"/>
+        <w:jc w:val="both"/>
+      </w:pPr>
+      <w:r>
+        <w:rPr>
+          <w:rFonts w:ascii="David" w:cs="David" w:eastAsia="David" w:hAnsi="David"/>
+          <w:noProof/>
+          <w:b/>
+          <w:bCs/>
+          <w:sz w:val="24"/>
+          <w:szCs w:val="24"/>
+          <w:rtl/>
+        </w:rPr>
+        <w:t xml:space="preserve">מ: </w:t>
+      </w:r>
+      <w:r>
+        <w:rPr>
+          <w:rFonts w:ascii="David" w:cs="David" w:eastAsia="David" w:hAnsi="David"/>
+          <w:noProof/>
+          <w:sz w:val="24"/>
+          <w:szCs w:val="24"/>
+          <w:rtl/>
+        </w:rPr>
         <w:t xml:space="preserve">יש משהו שלא שאלתי ורצית להוסיף?</w:t>
       </w:r>
     </w:p>
@@ -3839,7 +4535,7 @@
           <w:szCs w:val="24"/>
           <w:rtl/>
         </w:rPr>
-        <w:t xml:space="preserve">הריאיון נערך בזום, בערב, מביתה של המרואיינת. משך ההקלטה: 64 דקות. שאלות מהמדריך שנשאלו: 1, 3, 4, 6, 7, 8, 10, 11, 12, 14, 15, 16. שאלה 11 עלתה מוקדם, ביוזמת המרואיינת.</w:t>
+        <w:t xml:space="preserve">הריאיון נערך בזום, בערב, מביתה של המרואיינת. משך ההקלטה: 78 דקות. שאלות מהמדריך שנשאלו: 1, 3, 4, 5, 6, 7, 8, 10, 11, 12, 14, 15, 16. שאלה 11 עלתה מוקדם, ביוזמת המרואיינת.</w:t>
       </w:r>
     </w:p>
     <w:p>
@@ -4119,6 +4815,122 @@
           <w:szCs w:val="24"/>
           <w:rtl/>
         </w:rPr>
+        <w:t xml:space="preserve">מה גרם לך להבין את זה? היה רגע?</w:t>
+      </w:r>
+    </w:p>
+    <w:p>
+      <w:pPr>
+        <w:bidi/>
+        <w:spacing w:after="120" w:line="360" w:lineRule="auto"/>
+        <w:jc w:val="both"/>
+      </w:pPr>
+      <w:r>
+        <w:rPr>
+          <w:rFonts w:ascii="David" w:cs="David" w:eastAsia="David" w:hAnsi="David"/>
+          <w:noProof/>
+          <w:b/>
+          <w:bCs/>
+          <w:sz w:val="24"/>
+          <w:szCs w:val="24"/>
+          <w:rtl/>
+        </w:rPr>
+        <w:t xml:space="preserve">סמאח: </w:t>
+      </w:r>
+      <w:r>
+        <w:rPr>
+          <w:rFonts w:ascii="David" w:cs="David" w:eastAsia="David" w:hAnsi="David"/>
+          <w:noProof/>
+          <w:sz w:val="24"/>
+          <w:szCs w:val="24"/>
+          <w:rtl/>
+        </w:rPr>
+        <w:t xml:space="preserve">היה. שנה שלישית, כיתה ח', מלחמת העולם הראשונה. קטע של עמוד וחצי. ובאמצע הקריאה תלמיד, מהחזקים, סגר את הספר ואמר בערבית: "המורה, אני קורא ולא מבין אף מילה, מה הטעם?" והכיתה שתקה. כי הוא אמר מה שכולם הרגישו. (שתיקה) הרגשתי כאילו מישהו הדליק אור בחדר שחשבתי שהוא מואר. שלוש שנים לימדתי חצי כיתה שלא מבינה את השפה של הספר. והם למדו להנהן. וגם אני גדלתי פה. אני יודעת בדיוק איך זה לקרוא ספר בעברית בכיתה ח' ולהבין רק כותרות.</w:t>
+      </w:r>
+    </w:p>
+    <w:p>
+      <w:pPr>
+        <w:bidi/>
+        <w:spacing w:after="120" w:line="360" w:lineRule="auto"/>
+        <w:jc w:val="both"/>
+      </w:pPr>
+      <w:r>
+        <w:rPr>
+          <w:rFonts w:ascii="David" w:cs="David" w:eastAsia="David" w:hAnsi="David"/>
+          <w:noProof/>
+          <w:b/>
+          <w:bCs/>
+          <w:sz w:val="24"/>
+          <w:szCs w:val="24"/>
+          <w:rtl/>
+        </w:rPr>
+        <w:t xml:space="preserve">מ: </w:t>
+      </w:r>
+      <w:r>
+        <w:rPr>
+          <w:rFonts w:ascii="David" w:cs="David" w:eastAsia="David" w:hAnsi="David"/>
+          <w:noProof/>
+          <w:sz w:val="24"/>
+          <w:szCs w:val="24"/>
+          <w:rtl/>
+        </w:rPr>
+        <w:t xml:space="preserve">מה עשית באותו רגע?</w:t>
+      </w:r>
+    </w:p>
+    <w:p>
+      <w:pPr>
+        <w:bidi/>
+        <w:spacing w:after="120" w:line="360" w:lineRule="auto"/>
+        <w:jc w:val="both"/>
+      </w:pPr>
+      <w:r>
+        <w:rPr>
+          <w:rFonts w:ascii="David" w:cs="David" w:eastAsia="David" w:hAnsi="David"/>
+          <w:noProof/>
+          <w:b/>
+          <w:bCs/>
+          <w:sz w:val="24"/>
+          <w:szCs w:val="24"/>
+          <w:rtl/>
+        </w:rPr>
+        <w:t xml:space="preserve">סמאח: </w:t>
+      </w:r>
+      <w:r>
+        <w:rPr>
+          <w:rFonts w:ascii="David" w:cs="David" w:eastAsia="David" w:hAnsi="David"/>
+          <w:noProof/>
+          <w:sz w:val="24"/>
+          <w:szCs w:val="24"/>
+          <w:rtl/>
+        </w:rPr>
+        <w:t xml:space="preserve">סגרתי את הספר. אמרתי שאני מבינה. ושאלתי מה הם כן יודעים על המלחמה הזאת. ומישהו הזכיר את שרידי מסילת הרכבת שהטורקים בנו בנגב. ומשם דיברנו על מה שקרה כאן, אצלנו, בערבית ובעברית מעורבות. ובשיעור שאחרי הבאתי תצלומים של חיילים טורקים בבאר שבע. ורק אחר כך חזרנו לקטע. מקוצר. (שתיקה) ומאז התלמידים ראו שאפשר להגיד למורה "אני לא מבין" והיא לא תיעלב. ומאז הם אומרים. וזה נותן לי מידע שלא היה לי.</w:t>
+      </w:r>
+    </w:p>
+    <w:p>
+      <w:pPr>
+        <w:bidi/>
+        <w:spacing w:after="120" w:line="360" w:lineRule="auto"/>
+        <w:jc w:val="both"/>
+      </w:pPr>
+      <w:r>
+        <w:rPr>
+          <w:rFonts w:ascii="David" w:cs="David" w:eastAsia="David" w:hAnsi="David"/>
+          <w:noProof/>
+          <w:b/>
+          <w:bCs/>
+          <w:sz w:val="24"/>
+          <w:szCs w:val="24"/>
+          <w:rtl/>
+        </w:rPr>
+        <w:t xml:space="preserve">מ: </w:t>
+      </w:r>
+      <w:r>
+        <w:rPr>
+          <w:rFonts w:ascii="David" w:cs="David" w:eastAsia="David" w:hAnsi="David"/>
+          <w:noProof/>
+          <w:sz w:val="24"/>
+          <w:szCs w:val="24"/>
+          <w:rtl/>
+        </w:rPr>
         <w:t xml:space="preserve">תארי לי כיתה שאת מלמדת עכשיו.</w:t>
       </w:r>
     </w:p>
@@ -4207,6 +5019,64 @@
           <w:rtl/>
         </w:rPr>
         <w:t xml:space="preserve">הבית. יש תלמידים שהמשפחה משכילה, ויש תלמידים שאבא שלהם לא קורא וכותב והם הראשונים שהגיעו לכיתה ח'. ו... יש הבדל בין הבנים לבנות. הבנות שקטות, מסודרות. הבנים רועשים, לא מכינים. אבל זה לא אומר שהבנות מבינות יותר. זה אומר שהן מסתירות טוב יותר. (שתיקה) זה לקח לי זמן להבין.</w:t>
+      </w:r>
+    </w:p>
+    <w:p>
+      <w:pPr>
+        <w:bidi/>
+        <w:spacing w:after="120" w:line="360" w:lineRule="auto"/>
+        <w:jc w:val="both"/>
+      </w:pPr>
+      <w:r>
+        <w:rPr>
+          <w:rFonts w:ascii="David" w:cs="David" w:eastAsia="David" w:hAnsi="David"/>
+          <w:noProof/>
+          <w:b/>
+          <w:bCs/>
+          <w:sz w:val="24"/>
+          <w:szCs w:val="24"/>
+          <w:rtl/>
+        </w:rPr>
+        <w:t xml:space="preserve">מ: </w:t>
+      </w:r>
+      <w:r>
+        <w:rPr>
+          <w:rFonts w:ascii="David" w:cs="David" w:eastAsia="David" w:hAnsi="David"/>
+          <w:noProof/>
+          <w:sz w:val="24"/>
+          <w:szCs w:val="24"/>
+          <w:rtl/>
+        </w:rPr>
+        <w:t xml:space="preserve">איך את מתמודדת עם הפער הזה בעברית, בפועל, בשיעור?</w:t>
+      </w:r>
+    </w:p>
+    <w:p>
+      <w:pPr>
+        <w:bidi/>
+        <w:spacing w:after="120" w:line="360" w:lineRule="auto"/>
+        <w:jc w:val="both"/>
+      </w:pPr>
+      <w:r>
+        <w:rPr>
+          <w:rFonts w:ascii="David" w:cs="David" w:eastAsia="David" w:hAnsi="David"/>
+          <w:noProof/>
+          <w:b/>
+          <w:bCs/>
+          <w:sz w:val="24"/>
+          <w:szCs w:val="24"/>
+          <w:rtl/>
+        </w:rPr>
+        <w:t xml:space="preserve">סמאח: </w:t>
+      </w:r>
+      <w:r>
+        <w:rPr>
+          <w:rFonts w:ascii="David" w:cs="David" w:eastAsia="David" w:hAnsi="David"/>
+          <w:noProof/>
+          <w:sz w:val="24"/>
+          <w:szCs w:val="24"/>
+          <w:rtl/>
+        </w:rPr>
+        <w:t xml:space="preserve">כמה דברים שלמדתי לעשות. הראשון, שאני לא מתקנת עברית בשיעור היסטוריה. אם תלמיד אומר משפט בעברית שבורה ותוכן נכון, התוכן נכון. אני לא עוצרת על הדקדוק. זה שיעור היסטוריה. השני, שמותר לענות בערבית. ואז אני חוזרת על התשובה בעברית, על הלוח, וככה הוא שומע את המשפט שלו בעברית. השלישי, שכל דף עבודה שלי הוא בעברית פשוטה עם המילים הקשות בסוגריים בערבית. לוקח לי זמן להכין. אבל בלי זה חצי כיתה לא פותחת את הדף. (שתיקה) ויש דבר שאני עדיין לא יודעת לעשות: הפער בין מי שקורא שוטף למי שלא. הם באותה כיתה, אותו דף. ומי שקורא שוטף משתעמם. עוד לא פתרתי את זה.</w:t>
       </w:r>
     </w:p>
     <w:p>
@@ -4399,6 +5269,64 @@
           <w:szCs w:val="24"/>
           <w:rtl/>
         </w:rPr>
+        <w:t xml:space="preserve">איך שמת לב בסוף?</w:t>
+      </w:r>
+    </w:p>
+    <w:p>
+      <w:pPr>
+        <w:bidi/>
+        <w:spacing w:after="120" w:line="360" w:lineRule="auto"/>
+        <w:jc w:val="both"/>
+      </w:pPr>
+      <w:r>
+        <w:rPr>
+          <w:rFonts w:ascii="David" w:cs="David" w:eastAsia="David" w:hAnsi="David"/>
+          <w:noProof/>
+          <w:b/>
+          <w:bCs/>
+          <w:sz w:val="24"/>
+          <w:szCs w:val="24"/>
+          <w:rtl/>
+        </w:rPr>
+        <w:t xml:space="preserve">סמאח: </w:t>
+      </w:r>
+      <w:r>
+        <w:rPr>
+          <w:rFonts w:ascii="David" w:cs="David" w:eastAsia="David" w:hAnsi="David"/>
+          <w:noProof/>
+          <w:sz w:val="24"/>
+          <w:szCs w:val="24"/>
+          <w:rtl/>
+        </w:rPr>
+        <w:t xml:space="preserve">במקרה, בעצם. בדקתי מבחנים בערב ושמתי לב שהתשובה שלה על שאלה על הצהרת בלפור הייתה... פסקה על מלחמת העולם. יפה, מסודרת, לא קשורה. ובדקתי אחורה, ובמבחן הקודם אותו דבר. היא העתיקה מהמחברת את מה שנראה לה הכי קרוב. ולא הבינה מה השאלה. ואני, במשך חודשיים, נתתי לה ציונים בינוניים כי הכתב היה יפה והיה משהו כתוב. (שתיקה) זה... זה לא נעים לי להגיד. אבל זה מה שקרה.</w:t>
+      </w:r>
+    </w:p>
+    <w:p>
+      <w:pPr>
+        <w:bidi/>
+        <w:spacing w:after="120" w:line="360" w:lineRule="auto"/>
+        <w:jc w:val="both"/>
+      </w:pPr>
+      <w:r>
+        <w:rPr>
+          <w:rFonts w:ascii="David" w:cs="David" w:eastAsia="David" w:hAnsi="David"/>
+          <w:noProof/>
+          <w:b/>
+          <w:bCs/>
+          <w:sz w:val="24"/>
+          <w:szCs w:val="24"/>
+          <w:rtl/>
+        </w:rPr>
+        <w:t xml:space="preserve">מ: </w:t>
+      </w:r>
+      <w:r>
+        <w:rPr>
+          <w:rFonts w:ascii="David" w:cs="David" w:eastAsia="David" w:hAnsi="David"/>
+          <w:noProof/>
+          <w:sz w:val="24"/>
+          <w:szCs w:val="24"/>
+          <w:rtl/>
+        </w:rPr>
         <w:t xml:space="preserve">מה עמד מאחורי זה, לדעתך?</w:t>
       </w:r>
     </w:p>
@@ -5269,6 +6197,122 @@
           <w:szCs w:val="24"/>
           <w:rtl/>
         </w:rPr>
+        <w:t xml:space="preserve">את אמרת שאת מתחילה כל שיעור מתמונה. איך נראית פתיחה כזאת אצלך? יש אחת שאת זוכרת?</w:t>
+      </w:r>
+    </w:p>
+    <w:p>
+      <w:pPr>
+        <w:bidi/>
+        <w:spacing w:after="120" w:line="360" w:lineRule="auto"/>
+        <w:jc w:val="both"/>
+      </w:pPr>
+      <w:r>
+        <w:rPr>
+          <w:rFonts w:ascii="David" w:cs="David" w:eastAsia="David" w:hAnsi="David"/>
+          <w:noProof/>
+          <w:b/>
+          <w:bCs/>
+          <w:sz w:val="24"/>
+          <w:szCs w:val="24"/>
+          <w:rtl/>
+        </w:rPr>
+        <w:t xml:space="preserve">סמאח: </w:t>
+      </w:r>
+      <w:r>
+        <w:rPr>
+          <w:rFonts w:ascii="David" w:cs="David" w:eastAsia="David" w:hAnsi="David"/>
+          <w:noProof/>
+          <w:sz w:val="24"/>
+          <w:szCs w:val="24"/>
+          <w:rtl/>
+        </w:rPr>
+        <w:t xml:space="preserve">יש. תנאי החיים בערי התעשייה, כיתה ח'. הקרנתי תצלום ישן של רחוב צר, בתים צפופים, כביסה, ילדים על המדרכה. ולידו, באותו מסך, תצלום של רחוב ביישוב שלנו לפני חמישים שנה. מצאתי אותו בארכיון של המועצה. ושאלתי: "מה דומה ומה שונה?" דקה. ואז הם לא הפסיקו. בשתי התמונות אין כביש. הילדים ברחוב. הבתים קרובים. וזה "אין אף עשיר" ו"אצלנו לפחות יש שמש" שסיפרתי. (צוחקת) ומשם, למה אנשים חיו ככה בעיר תעשייתית. והם כבר בפנים.</w:t>
+      </w:r>
+    </w:p>
+    <w:p>
+      <w:pPr>
+        <w:bidi/>
+        <w:spacing w:after="120" w:line="360" w:lineRule="auto"/>
+        <w:jc w:val="both"/>
+      </w:pPr>
+      <w:r>
+        <w:rPr>
+          <w:rFonts w:ascii="David" w:cs="David" w:eastAsia="David" w:hAnsi="David"/>
+          <w:noProof/>
+          <w:b/>
+          <w:bCs/>
+          <w:sz w:val="24"/>
+          <w:szCs w:val="24"/>
+          <w:rtl/>
+        </w:rPr>
+        <w:t xml:space="preserve">מ: </w:t>
+      </w:r>
+      <w:r>
+        <w:rPr>
+          <w:rFonts w:ascii="David" w:cs="David" w:eastAsia="David" w:hAnsi="David"/>
+          <w:noProof/>
+          <w:sz w:val="24"/>
+          <w:szCs w:val="24"/>
+          <w:rtl/>
+        </w:rPr>
+        <w:t xml:space="preserve">כמה זמן זה לקח?</w:t>
+      </w:r>
+    </w:p>
+    <w:p>
+      <w:pPr>
+        <w:bidi/>
+        <w:spacing w:after="120" w:line="360" w:lineRule="auto"/>
+        <w:jc w:val="both"/>
+      </w:pPr>
+      <w:r>
+        <w:rPr>
+          <w:rFonts w:ascii="David" w:cs="David" w:eastAsia="David" w:hAnsi="David"/>
+          <w:noProof/>
+          <w:b/>
+          <w:bCs/>
+          <w:sz w:val="24"/>
+          <w:szCs w:val="24"/>
+          <w:rtl/>
+        </w:rPr>
+        <w:t xml:space="preserve">סמאח: </w:t>
+      </w:r>
+      <w:r>
+        <w:rPr>
+          <w:rFonts w:ascii="David" w:cs="David" w:eastAsia="David" w:hAnsi="David"/>
+          <w:noProof/>
+          <w:sz w:val="24"/>
+          <w:szCs w:val="24"/>
+          <w:rtl/>
+        </w:rPr>
+        <w:t xml:space="preserve">עשר דקות. יותר ממה שתכננתי. לא רציתי לעצור. ואני חוזרת על המבנה הזה. משהו על המסך, שאלה אחת, דקה שקט. לא כותבת נושא על הלוח בהתחלה, כי הנושא בעברית הוא מילים שחצי כיתה לא מבינה. ואני רוצה שהדקות הראשונות יהיו שוות לכולם.</w:t>
+      </w:r>
+    </w:p>
+    <w:p>
+      <w:pPr>
+        <w:bidi/>
+        <w:spacing w:after="120" w:line="360" w:lineRule="auto"/>
+        <w:jc w:val="both"/>
+      </w:pPr>
+      <w:r>
+        <w:rPr>
+          <w:rFonts w:ascii="David" w:cs="David" w:eastAsia="David" w:hAnsi="David"/>
+          <w:noProof/>
+          <w:b/>
+          <w:bCs/>
+          <w:sz w:val="24"/>
+          <w:szCs w:val="24"/>
+          <w:rtl/>
+        </w:rPr>
+        <w:t xml:space="preserve">מ: </w:t>
+      </w:r>
+      <w:r>
+        <w:rPr>
+          <w:rFonts w:ascii="David" w:cs="David" w:eastAsia="David" w:hAnsi="David"/>
+          <w:noProof/>
+          <w:sz w:val="24"/>
+          <w:szCs w:val="24"/>
+          <w:rtl/>
+        </w:rPr>
         <w:t xml:space="preserve">מכאן?</w:t>
       </w:r>
     </w:p>
@@ -5733,6 +6777,64 @@
           <w:szCs w:val="24"/>
           <w:rtl/>
         </w:rPr>
+        <w:t xml:space="preserve">ספרי על הקלטה אחת שזכורה לך.</w:t>
+      </w:r>
+    </w:p>
+    <w:p>
+      <w:pPr>
+        <w:bidi/>
+        <w:spacing w:after="120" w:line="360" w:lineRule="auto"/>
+        <w:jc w:val="both"/>
+      </w:pPr>
+      <w:r>
+        <w:rPr>
+          <w:rFonts w:ascii="David" w:cs="David" w:eastAsia="David" w:hAnsi="David"/>
+          <w:noProof/>
+          <w:b/>
+          <w:bCs/>
+          <w:sz w:val="24"/>
+          <w:szCs w:val="24"/>
+          <w:rtl/>
+        </w:rPr>
+        <w:t xml:space="preserve">סמאח: </w:t>
+      </w:r>
+      <w:r>
+        <w:rPr>
+          <w:rFonts w:ascii="David" w:cs="David" w:eastAsia="David" w:hAnsi="David"/>
+          <w:noProof/>
+          <w:sz w:val="24"/>
+          <w:szCs w:val="24"/>
+          <w:rtl/>
+        </w:rPr>
+        <w:t xml:space="preserve">(שתיקה) היה תלמיד, מהשקטים, לא מהחלשים, פשוט שקט, שהקליט "שידור" מהחזית ו... הוא עשה קולות. של פיצוצים, ברקע. ודיבר בקול של כתב רדיו, בעברית, ואמר "אנחנו כאן בבאר שבע, החיילים הטורקים נסוגים", ואז שינה קול והיה חייל, ואמר בערבית "אני רוצה הביתה". ואז חזר לכתב. (שתיקה) הכיתה שמעה את זה בשקט מוחלט. ואני ישבתי וחשבתי, הילד הזה ישב אצלי שנה וחצי ולא ידעתי שיש בו את זה. אם היה מבחן, לא הייתי יודעת אף פעם.</w:t>
+      </w:r>
+    </w:p>
+    <w:p>
+      <w:pPr>
+        <w:bidi/>
+        <w:spacing w:after="120" w:line="360" w:lineRule="auto"/>
+        <w:jc w:val="both"/>
+      </w:pPr>
+      <w:r>
+        <w:rPr>
+          <w:rFonts w:ascii="David" w:cs="David" w:eastAsia="David" w:hAnsi="David"/>
+          <w:noProof/>
+          <w:b/>
+          <w:bCs/>
+          <w:sz w:val="24"/>
+          <w:szCs w:val="24"/>
+          <w:rtl/>
+        </w:rPr>
+        <w:t xml:space="preserve">מ: </w:t>
+      </w:r>
+      <w:r>
+        <w:rPr>
+          <w:rFonts w:ascii="David" w:cs="David" w:eastAsia="David" w:hAnsi="David"/>
+          <w:noProof/>
+          <w:sz w:val="24"/>
+          <w:szCs w:val="24"/>
+          <w:rtl/>
+        </w:rPr>
         <w:t xml:space="preserve">היו תלמידים שהבחירה הקשתה עליהם?</w:t>
       </w:r>
     </w:p>
@@ -5965,6 +7067,64 @@
           <w:szCs w:val="24"/>
           <w:rtl/>
         </w:rPr>
+        <w:t xml:space="preserve">מה עשית עם עצמך בזמן שהם הציגו?</w:t>
+      </w:r>
+    </w:p>
+    <w:p>
+      <w:pPr>
+        <w:bidi/>
+        <w:spacing w:after="120" w:line="360" w:lineRule="auto"/>
+        <w:jc w:val="both"/>
+      </w:pPr>
+      <w:r>
+        <w:rPr>
+          <w:rFonts w:ascii="David" w:cs="David" w:eastAsia="David" w:hAnsi="David"/>
+          <w:noProof/>
+          <w:b/>
+          <w:bCs/>
+          <w:sz w:val="24"/>
+          <w:szCs w:val="24"/>
+          <w:rtl/>
+        </w:rPr>
+        <w:t xml:space="preserve">סמאח: </w:t>
+      </w:r>
+      <w:r>
+        <w:rPr>
+          <w:rFonts w:ascii="David" w:cs="David" w:eastAsia="David" w:hAnsi="David"/>
+          <w:noProof/>
+          <w:sz w:val="24"/>
+          <w:szCs w:val="24"/>
+          <w:rtl/>
+        </w:rPr>
+        <w:t xml:space="preserve">(צוחקת) שאלה טובה. בהתחלה עמדתי ליד הלוח, מתוך הרגל, ואז הבנתי שאם אני ליד הלוח הם מסתכלים עליי ולא על מי שמציג. אז הלכתי לשבת מאחור. בין התלמידים. עם דף. ורשמתי. מי הציג, מי שאל, מה טעה. והדף הזה היה השיעור הבא. וזה בעצם מה שאני עושה מאז. יושבת מאחור. ורושמת. ולפעמים תלמיד מסתובב ורואה אותי כותבת ושואל "המורה, את נותנת לנו ציון?" ואני אומרת "אני לומדת אתכם". (שתיקה) זה נכון.</w:t>
+      </w:r>
+    </w:p>
+    <w:p>
+      <w:pPr>
+        <w:bidi/>
+        <w:spacing w:after="120" w:line="360" w:lineRule="auto"/>
+        <w:jc w:val="both"/>
+      </w:pPr>
+      <w:r>
+        <w:rPr>
+          <w:rFonts w:ascii="David" w:cs="David" w:eastAsia="David" w:hAnsi="David"/>
+          <w:noProof/>
+          <w:b/>
+          <w:bCs/>
+          <w:sz w:val="24"/>
+          <w:szCs w:val="24"/>
+          <w:rtl/>
+        </w:rPr>
+        <w:t xml:space="preserve">מ: </w:t>
+      </w:r>
+      <w:r>
+        <w:rPr>
+          <w:rFonts w:ascii="David" w:cs="David" w:eastAsia="David" w:hAnsi="David"/>
+          <w:noProof/>
+          <w:sz w:val="24"/>
+          <w:szCs w:val="24"/>
+          <w:rtl/>
+        </w:rPr>
         <w:t xml:space="preserve">מה למדת על התלמידים?</w:t>
       </w:r>
     </w:p>
@@ -6111,6 +7271,64 @@
           <w:rtl/>
         </w:rPr>
         <w:t xml:space="preserve">לקצר בחצי. ואינטראקציה כפול. כל ארבע חמש דקות משהו שכל תלמיד חייב לעשות. מילה בצ'אט, סימן, סקר. לוותר על קריאה בזום לגמרי אם אפשר. לשמור את הזום לתמונות ולדיון. טקסט על מסך טלפון... בלתי אפשרי. חדרים של שלושה, קצר, משימה כתובה שרואים בתוך החדר, ולהיכנס לכל חדר.</w:t>
+      </w:r>
+    </w:p>
+    <w:p>
+      <w:pPr>
+        <w:bidi/>
+        <w:spacing w:after="120" w:line="360" w:lineRule="auto"/>
+        <w:jc w:val="both"/>
+      </w:pPr>
+      <w:r>
+        <w:rPr>
+          <w:rFonts w:ascii="David" w:cs="David" w:eastAsia="David" w:hAnsi="David"/>
+          <w:noProof/>
+          <w:b/>
+          <w:bCs/>
+          <w:sz w:val="24"/>
+          <w:szCs w:val="24"/>
+          <w:rtl/>
+        </w:rPr>
+        <w:t xml:space="preserve">מ: </w:t>
+      </w:r>
+      <w:r>
+        <w:rPr>
+          <w:rFonts w:ascii="David" w:cs="David" w:eastAsia="David" w:hAnsi="David"/>
+          <w:noProof/>
+          <w:sz w:val="24"/>
+          <w:szCs w:val="24"/>
+          <w:rtl/>
+        </w:rPr>
+        <w:t xml:space="preserve">איך את יודעת, בזום, מי לא נמצא?</w:t>
+      </w:r>
+    </w:p>
+    <w:p>
+      <w:pPr>
+        <w:bidi/>
+        <w:spacing w:after="120" w:line="360" w:lineRule="auto"/>
+        <w:jc w:val="both"/>
+      </w:pPr>
+      <w:r>
+        <w:rPr>
+          <w:rFonts w:ascii="David" w:cs="David" w:eastAsia="David" w:hAnsi="David"/>
+          <w:noProof/>
+          <w:b/>
+          <w:bCs/>
+          <w:sz w:val="24"/>
+          <w:szCs w:val="24"/>
+          <w:rtl/>
+        </w:rPr>
+        <w:t xml:space="preserve">סמאח: </w:t>
+      </w:r>
+      <w:r>
+        <w:rPr>
+          <w:rFonts w:ascii="David" w:cs="David" w:eastAsia="David" w:hAnsi="David"/>
+          <w:noProof/>
+          <w:sz w:val="24"/>
+          <w:szCs w:val="24"/>
+          <w:rtl/>
+        </w:rPr>
+        <w:t xml:space="preserve">אני לא תמיד יודעת. זו הבעיה. אבל יש לי טריק אחד. אני מבקשת, כל חמש דקות בערך, משהו קטן שכולם עושים. "תכתבו בצ'אט מילה אחת". "תרימו יד וירטואלית מי חושב ככה". ואז אני רואה מי לא הגיב. ורושמת. ואחרי השיעור מתקשרת. לא בכעס. "ראיתי שלא היית, הכול בסדר?" ולפעמים התשובה היא "האינטרנט", ולפעמים "הייתי צריך לשמור על האחים", ולפעמים "לא הבנתי כלום אז הפסקתי". והתשובה השלישית היא הכי חשובה, כי אותה אני יכולה לתקן.</w:t>
       </w:r>
     </w:p>
     <w:p>
@@ -6593,7 +7811,7 @@
           <w:szCs w:val="24"/>
           <w:rtl/>
         </w:rPr>
-        <w:t xml:space="preserve">הריאיון נערך בחדר הרכזת בבית הספר, בהפסקה גדולה ובשעה החופשית שאחריה. משך ההקלטה: 47 דקות. שאלות מהמדריך שנשאלו: 1, 2, 3, 6, 7, 8, 9, 10, 11, 13, 15, 16. שאלה 4 לא נשאלה כי המרואיינת ענתה עליה בתוך שאלה 2.</w:t>
+        <w:t xml:space="preserve">הריאיון נערך בחדר הרכזת בבית הספר, בהפסקה גדולה ובשעה החופשית שאחריה. משך ההקלטה: 62 דקות. שאלות מהמדריך שנשאלו: 1, 2, 3, 6, 7, 8, 9, 10, 11, 12, 13, 15, 16. שאלה 4 לא נשאלה כי המרואיינת ענתה עליה בתוך שאלה 2.</w:t>
       </w:r>
     </w:p>
     <w:p>
@@ -6786,6 +8004,64 @@
           <w:szCs w:val="24"/>
           <w:rtl/>
         </w:rPr>
+        <w:t xml:space="preserve">תני לי דוגמה לרעיון אחד כזה, שמורה יצאה איתו.</w:t>
+      </w:r>
+    </w:p>
+    <w:p>
+      <w:pPr>
+        <w:bidi/>
+        <w:spacing w:after="120" w:line="360" w:lineRule="auto"/>
+        <w:jc w:val="both"/>
+      </w:pPr>
+      <w:r>
+        <w:rPr>
+          <w:rFonts w:ascii="David" w:cs="David" w:eastAsia="David" w:hAnsi="David"/>
+          <w:noProof/>
+          <w:b/>
+          <w:bCs/>
+          <w:sz w:val="24"/>
+          <w:szCs w:val="24"/>
+          <w:rtl/>
+        </w:rPr>
+        <w:t xml:space="preserve">יעל: </w:t>
+      </w:r>
+      <w:r>
+        <w:rPr>
+          <w:rFonts w:ascii="David" w:cs="David" w:eastAsia="David" w:hAnsi="David"/>
+          <w:noProof/>
+          <w:sz w:val="24"/>
+          <w:szCs w:val="24"/>
+          <w:rtl/>
+        </w:rPr>
+        <w:t xml:space="preserve">(שתיקה) שבוע שעבר. מורה בשנה השנייה, לשון, כיתה ז', אמרה לי שהיא לא מצליחה ללמד שם עצם ופועל כי חצי כיתה לא קוראת את המשפטים בדף. ואמרתי לה, תביאי תמונה של רחוב. ותשאלי מה רואים. הם יגידו "ילד", "כלב", "רץ", "אוטו". ותכתבי על הלוח. ותשאלי, מה מהמילים האלה אפשר להצביע עליו ומה מהן קורה. וזה שם עצם ופועל. בלי דף. (שתיקה) היא חזרה אחרי יומיים ואמרה שזה עבד. ואני אמרתי לה, עכשיו תעשי את זה חודש. לא רעיון חדש כל יום.</w:t>
+      </w:r>
+    </w:p>
+    <w:p>
+      <w:pPr>
+        <w:bidi/>
+        <w:spacing w:after="120" w:line="360" w:lineRule="auto"/>
+        <w:jc w:val="both"/>
+      </w:pPr>
+      <w:r>
+        <w:rPr>
+          <w:rFonts w:ascii="David" w:cs="David" w:eastAsia="David" w:hAnsi="David"/>
+          <w:noProof/>
+          <w:b/>
+          <w:bCs/>
+          <w:sz w:val="24"/>
+          <w:szCs w:val="24"/>
+          <w:rtl/>
+        </w:rPr>
+        <w:t xml:space="preserve">מ: </w:t>
+      </w:r>
+      <w:r>
+        <w:rPr>
+          <w:rFonts w:ascii="David" w:cs="David" w:eastAsia="David" w:hAnsi="David"/>
+          <w:noProof/>
+          <w:sz w:val="24"/>
+          <w:szCs w:val="24"/>
+          <w:rtl/>
+        </w:rPr>
         <w:t xml:space="preserve">מה השתנה אצלך מאז שהתחלת?</w:t>
       </w:r>
     </w:p>
@@ -7076,6 +8352,64 @@
           <w:szCs w:val="24"/>
           <w:rtl/>
         </w:rPr>
+        <w:t xml:space="preserve">איך התלמידים הגיבו לשינוי הזה? כשהתחלת לצייר בשיעור ספרות?</w:t>
+      </w:r>
+    </w:p>
+    <w:p>
+      <w:pPr>
+        <w:bidi/>
+        <w:spacing w:after="120" w:line="360" w:lineRule="auto"/>
+        <w:jc w:val="both"/>
+      </w:pPr>
+      <w:r>
+        <w:rPr>
+          <w:rFonts w:ascii="David" w:cs="David" w:eastAsia="David" w:hAnsi="David"/>
+          <w:noProof/>
+          <w:b/>
+          <w:bCs/>
+          <w:sz w:val="24"/>
+          <w:szCs w:val="24"/>
+          <w:rtl/>
+        </w:rPr>
+        <w:t xml:space="preserve">יעל: </w:t>
+      </w:r>
+      <w:r>
+        <w:rPr>
+          <w:rFonts w:ascii="David" w:cs="David" w:eastAsia="David" w:hAnsi="David"/>
+          <w:noProof/>
+          <w:sz w:val="24"/>
+          <w:szCs w:val="24"/>
+          <w:rtl/>
+        </w:rPr>
+        <w:t xml:space="preserve">(צוחקת) בהתחלה חשבו שאני משוגעת. תלמידה אמרה "המורה, זה ספרות או אומנות?" ואמרתי, זה ספרות. ואחרי חודש אף אחד לא שאל. ומה שהיה מעניין... התלמידים החזקים התנגדו יותר מהחלשים. כי הם היו טובים בשיטה הישנה. ניתוח שורה שורה, הם ידעו לעשות. ופתאום ביקשתי משהו אחר, וזה ערער אותם. תלמידה מצטיינת באה אליי אחרי שיעור ואמרה "אני לא יודעת לצייר". ואמרתי לה, זה לא מבחן בציור. (שתיקה) לקח לה זמן. אבל היום היא באוניברסיטה, ספרות, ושלחה לי הודעה שהיא מציירת שירים לפני שהיא כותבת עליהם.</w:t>
+      </w:r>
+    </w:p>
+    <w:p>
+      <w:pPr>
+        <w:bidi/>
+        <w:spacing w:after="120" w:line="360" w:lineRule="auto"/>
+        <w:jc w:val="both"/>
+      </w:pPr>
+      <w:r>
+        <w:rPr>
+          <w:rFonts w:ascii="David" w:cs="David" w:eastAsia="David" w:hAnsi="David"/>
+          <w:noProof/>
+          <w:b/>
+          <w:bCs/>
+          <w:sz w:val="24"/>
+          <w:szCs w:val="24"/>
+          <w:rtl/>
+        </w:rPr>
+        <w:t xml:space="preserve">מ: </w:t>
+      </w:r>
+      <w:r>
+        <w:rPr>
+          <w:rFonts w:ascii="David" w:cs="David" w:eastAsia="David" w:hAnsi="David"/>
+          <w:noProof/>
+          <w:sz w:val="24"/>
+          <w:szCs w:val="24"/>
+          <w:rtl/>
+        </w:rPr>
         <w:t xml:space="preserve">ומה עשית?</w:t>
       </w:r>
     </w:p>
@@ -7192,6 +8526,64 @@
           <w:szCs w:val="24"/>
           <w:rtl/>
         </w:rPr>
+        <w:t xml:space="preserve">ומה עם ההתאמות? יש להם התאמות מהאבחון, איך זה עובד בשיעור עצמו?</w:t>
+      </w:r>
+    </w:p>
+    <w:p>
+      <w:pPr>
+        <w:bidi/>
+        <w:spacing w:after="120" w:line="360" w:lineRule="auto"/>
+        <w:jc w:val="both"/>
+      </w:pPr>
+      <w:r>
+        <w:rPr>
+          <w:rFonts w:ascii="David" w:cs="David" w:eastAsia="David" w:hAnsi="David"/>
+          <w:noProof/>
+          <w:b/>
+          <w:bCs/>
+          <w:sz w:val="24"/>
+          <w:szCs w:val="24"/>
+          <w:rtl/>
+        </w:rPr>
+        <w:t xml:space="preserve">יעל: </w:t>
+      </w:r>
+      <w:r>
+        <w:rPr>
+          <w:rFonts w:ascii="David" w:cs="David" w:eastAsia="David" w:hAnsi="David"/>
+          <w:noProof/>
+          <w:sz w:val="24"/>
+          <w:szCs w:val="24"/>
+          <w:rtl/>
+        </w:rPr>
+        <w:t xml:space="preserve">(נאנחת) על הנייר יש להם. הקראה, תוספת זמן, דף מוגדל. בפועל, בשיעור רגיל, מי מקריא? אני מורה אחת. אז ההתאמות הן במבחן, לא בשיעור. וזה... זה הפוך. הם צריכים את ההתאמה בשיעור, כשהם לומדים, לא רק כשבודקים אותם. וזה בעצם למה בניתי את כל השיטה שלי. ההקלטות שאני מקליטה בעצמי, זה ההקראה שלהם בשיעור. הגרסה המקוצרת זה תוספת הזמן שלהם. אני מנסה שההתאמה תהיה חלק מהשיעור לכולם, לא משהו שרק המאובחנים מקבלים, כי אז הם מסומנים.</w:t>
+      </w:r>
+    </w:p>
+    <w:p>
+      <w:pPr>
+        <w:bidi/>
+        <w:spacing w:after="120" w:line="360" w:lineRule="auto"/>
+        <w:jc w:val="both"/>
+      </w:pPr>
+      <w:r>
+        <w:rPr>
+          <w:rFonts w:ascii="David" w:cs="David" w:eastAsia="David" w:hAnsi="David"/>
+          <w:noProof/>
+          <w:b/>
+          <w:bCs/>
+          <w:sz w:val="24"/>
+          <w:szCs w:val="24"/>
+          <w:rtl/>
+        </w:rPr>
+        <w:t xml:space="preserve">מ: </w:t>
+      </w:r>
+      <w:r>
+        <w:rPr>
+          <w:rFonts w:ascii="David" w:cs="David" w:eastAsia="David" w:hAnsi="David"/>
+          <w:noProof/>
+          <w:sz w:val="24"/>
+          <w:szCs w:val="24"/>
+          <w:rtl/>
+        </w:rPr>
         <w:t xml:space="preserve">איך זה מרגיש לך?</w:t>
       </w:r>
     </w:p>
@@ -7366,6 +8758,64 @@
           <w:szCs w:val="24"/>
           <w:rtl/>
         </w:rPr>
+        <w:t xml:space="preserve">מאיפה את לוקחת את התמונות?</w:t>
+      </w:r>
+    </w:p>
+    <w:p>
+      <w:pPr>
+        <w:bidi/>
+        <w:spacing w:after="120" w:line="360" w:lineRule="auto"/>
+        <w:jc w:val="both"/>
+      </w:pPr>
+      <w:r>
+        <w:rPr>
+          <w:rFonts w:ascii="David" w:cs="David" w:eastAsia="David" w:hAnsi="David"/>
+          <w:noProof/>
+          <w:b/>
+          <w:bCs/>
+          <w:sz w:val="24"/>
+          <w:szCs w:val="24"/>
+          <w:rtl/>
+        </w:rPr>
+        <w:t xml:space="preserve">יעל: </w:t>
+      </w:r>
+      <w:r>
+        <w:rPr>
+          <w:rFonts w:ascii="David" w:cs="David" w:eastAsia="David" w:hAnsi="David"/>
+          <w:noProof/>
+          <w:sz w:val="24"/>
+          <w:szCs w:val="24"/>
+          <w:rtl/>
+        </w:rPr>
+        <w:t xml:space="preserve">ארכיונים דיגיטליים. יש כמה שפתוחים, ארכיונים של מוזיאונים, אוספים היסטוריים. יש לי תיקייה בענן, לפי נושאים, פרידה, בדידות, חברות, מלחמה, בית. עשרים שנה. (שתיקה) ואני מקפידה על שלושה דברים. בלי טקסט בתמונה. פנים ברורות, כי בגיל הזה הם קוראים פנים. ושהתמונה לא תגיד הכול. תמונה שברור מה קורה בה לא משאירה מקום לשאלה. וזה מה שאני מלמדת מורים לבנות לעצמם. תיקייה. לא תמונה לשיעור, תיקייה לקריירה.</w:t>
+      </w:r>
+    </w:p>
+    <w:p>
+      <w:pPr>
+        <w:bidi/>
+        <w:spacing w:after="120" w:line="360" w:lineRule="auto"/>
+        <w:jc w:val="both"/>
+      </w:pPr>
+      <w:r>
+        <w:rPr>
+          <w:rFonts w:ascii="David" w:cs="David" w:eastAsia="David" w:hAnsi="David"/>
+          <w:noProof/>
+          <w:b/>
+          <w:bCs/>
+          <w:sz w:val="24"/>
+          <w:szCs w:val="24"/>
+          <w:rtl/>
+        </w:rPr>
+        <w:t xml:space="preserve">מ: </w:t>
+      </w:r>
+      <w:r>
+        <w:rPr>
+          <w:rFonts w:ascii="David" w:cs="David" w:eastAsia="David" w:hAnsi="David"/>
+          <w:noProof/>
+          <w:sz w:val="24"/>
+          <w:szCs w:val="24"/>
+          <w:rtl/>
+        </w:rPr>
         <w:t xml:space="preserve">מה הם כתבו?</w:t>
       </w:r>
     </w:p>
@@ -7744,6 +9194,122 @@
           <w:rtl/>
         </w:rPr>
         <w:t xml:space="preserve">כמעט חצי אלבום. שליש הקלטה. חמישה יומן, וכולם קוראים חזקים. ו... ראיתי תלמיד עם דיסלקציה קשה מקליט מונולוג חמש פעמים כי "זה לא נשמע כמו הדמות". חמש פעמים. הוא לא היה כותב חמש שורות.</w:t>
+      </w:r>
+    </w:p>
+    <w:p>
+      <w:pPr>
+        <w:bidi/>
+        <w:spacing w:after="120" w:line="360" w:lineRule="auto"/>
+        <w:jc w:val="both"/>
+      </w:pPr>
+      <w:r>
+        <w:rPr>
+          <w:rFonts w:ascii="David" w:cs="David" w:eastAsia="David" w:hAnsi="David"/>
+          <w:noProof/>
+          <w:b/>
+          <w:bCs/>
+          <w:sz w:val="24"/>
+          <w:szCs w:val="24"/>
+          <w:rtl/>
+        </w:rPr>
+        <w:t xml:space="preserve">מ: </w:t>
+      </w:r>
+      <w:r>
+        <w:rPr>
+          <w:rFonts w:ascii="David" w:cs="David" w:eastAsia="David" w:hAnsi="David"/>
+          <w:noProof/>
+          <w:sz w:val="24"/>
+          <w:szCs w:val="24"/>
+          <w:rtl/>
+        </w:rPr>
+        <w:t xml:space="preserve">ספרי לי על אלבום אחד.</w:t>
+      </w:r>
+    </w:p>
+    <w:p>
+      <w:pPr>
+        <w:bidi/>
+        <w:spacing w:after="120" w:line="360" w:lineRule="auto"/>
+        <w:jc w:val="both"/>
+      </w:pPr>
+      <w:r>
+        <w:rPr>
+          <w:rFonts w:ascii="David" w:cs="David" w:eastAsia="David" w:hAnsi="David"/>
+          <w:noProof/>
+          <w:b/>
+          <w:bCs/>
+          <w:sz w:val="24"/>
+          <w:szCs w:val="24"/>
+          <w:rtl/>
+        </w:rPr>
+        <w:t xml:space="preserve">יעל: </w:t>
+      </w:r>
+      <w:r>
+        <w:rPr>
+          <w:rFonts w:ascii="David" w:cs="David" w:eastAsia="David" w:hAnsi="David"/>
+          <w:noProof/>
+          <w:sz w:val="24"/>
+          <w:szCs w:val="24"/>
+          <w:rtl/>
+        </w:rPr>
+        <w:t xml:space="preserve">(שתיקה) הייתה תלמידה, עם לקות קריאה, לא קשה, בינונית, שבחרה חמש תמונות לדמות של ילד שההורים שלו מתגרשים. והתמונה הרביעית הייתה דלת סגורה. סתם דלת. וכתבה מתחת: "היום שבו הוא הפסיק לדבר". ובסיפור אין משפט כזה. אין יום כזה. אבל היא הבינה משהו על הדמות שאני, שקראתי את הסיפור עשרים פעם, לא ניסחתי ככה. (שתיקה ארוכה) זה... זה מה שאני מנסה להסביר למורים כשהם שואלים למה לא מבחן. כי במבחן היא הייתה כותבת "הדמות עצובה". והיא ידעה הרבה יותר מזה.</w:t>
+      </w:r>
+    </w:p>
+    <w:p>
+      <w:pPr>
+        <w:bidi/>
+        <w:spacing w:after="120" w:line="360" w:lineRule="auto"/>
+        <w:jc w:val="both"/>
+      </w:pPr>
+      <w:r>
+        <w:rPr>
+          <w:rFonts w:ascii="David" w:cs="David" w:eastAsia="David" w:hAnsi="David"/>
+          <w:noProof/>
+          <w:b/>
+          <w:bCs/>
+          <w:sz w:val="24"/>
+          <w:szCs w:val="24"/>
+          <w:rtl/>
+        </w:rPr>
+        <w:t xml:space="preserve">מ: </w:t>
+      </w:r>
+      <w:r>
+        <w:rPr>
+          <w:rFonts w:ascii="David" w:cs="David" w:eastAsia="David" w:hAnsi="David"/>
+          <w:noProof/>
+          <w:sz w:val="24"/>
+          <w:szCs w:val="24"/>
+          <w:rtl/>
+        </w:rPr>
+        <w:t xml:space="preserve">ומה עם ההקלטות? ספרי על אחת.</w:t>
+      </w:r>
+    </w:p>
+    <w:p>
+      <w:pPr>
+        <w:bidi/>
+        <w:spacing w:after="120" w:line="360" w:lineRule="auto"/>
+        <w:jc w:val="both"/>
+      </w:pPr>
+      <w:r>
+        <w:rPr>
+          <w:rFonts w:ascii="David" w:cs="David" w:eastAsia="David" w:hAnsi="David"/>
+          <w:noProof/>
+          <w:b/>
+          <w:bCs/>
+          <w:sz w:val="24"/>
+          <w:szCs w:val="24"/>
+          <w:rtl/>
+        </w:rPr>
+        <w:t xml:space="preserve">יעל: </w:t>
+      </w:r>
+      <w:r>
+        <w:rPr>
+          <w:rFonts w:ascii="David" w:cs="David" w:eastAsia="David" w:hAnsi="David"/>
+          <w:noProof/>
+          <w:sz w:val="24"/>
+          <w:szCs w:val="24"/>
+          <w:rtl/>
+        </w:rPr>
+        <w:t xml:space="preserve">התלמיד שהקליט חמש פעמים. (צוחקת) הוא הקליט מונולוג של הדמות, ילד שההורים שלו רבים, ובגרסה החמישית הוא... הוא לחש. את כל המונולוג. ושאלתי אותו למה לחש, והוא אמר "כי הוא לא רוצה שישמעו אותו בבית". (שתיקה ארוכה) הוא לא כתב את זה בשום מקום. בעבודה כתובה זה לא היה מופיע. אבל הוא הבין את הדמות ברמה של... של איך היא נושמת. ואני חושבת על זה כל פעם שמורה אומרת לי שהקלטה זה "לא רציני".</w:t>
       </w:r>
     </w:p>
     <w:p>
@@ -8313,6 +9879,180 @@
           <w:szCs w:val="24"/>
           <w:rtl/>
         </w:rPr>
+        <w:t xml:space="preserve">איזה שלוש אפשרויות בחירה היית מציעה לתלמידים בגיל הזה?</w:t>
+      </w:r>
+    </w:p>
+    <w:p>
+      <w:pPr>
+        <w:bidi/>
+        <w:spacing w:after="120" w:line="360" w:lineRule="auto"/>
+        <w:jc w:val="both"/>
+      </w:pPr>
+      <w:r>
+        <w:rPr>
+          <w:rFonts w:ascii="David" w:cs="David" w:eastAsia="David" w:hAnsi="David"/>
+          <w:noProof/>
+          <w:b/>
+          <w:bCs/>
+          <w:sz w:val="24"/>
+          <w:szCs w:val="24"/>
+          <w:rtl/>
+        </w:rPr>
+        <w:t xml:space="preserve">יעל: </w:t>
+      </w:r>
+      <w:r>
+        <w:rPr>
+          <w:rFonts w:ascii="David" w:cs="David" w:eastAsia="David" w:hAnsi="David"/>
+          <w:noProof/>
+          <w:sz w:val="24"/>
+          <w:szCs w:val="24"/>
+          <w:rtl/>
+        </w:rPr>
+        <w:t xml:space="preserve">אלבום, מכתב או יומן, וקול. (שתיקה) אלבום, חמש תמונות מהתקופה ממאגר שאת נותנת, שני משפטים לכל תמונה, משפט מסכם. זה למי שקשה לו לכתוב, וזה ממשיך ישירות את הלמידה מהתמונות. מכתב או יומן של ילד עובד, גוף ראשון, למי שאוהב לכתוב. וקול, הקלטה של דקה וחצי עד שתיים, כי יש תלמידים, ובכיתה עם לקויות הם רבים, שמדברים הרבה יותר טוב ממה שהם כותבים. לא מצגת. מצגת בכיתה ח' זה העתקה. ולא הצגה חיה כאפשרות יחידה לדיבור.</w:t>
+      </w:r>
+    </w:p>
+    <w:p>
+      <w:pPr>
+        <w:bidi/>
+        <w:spacing w:after="120" w:line="360" w:lineRule="auto"/>
+        <w:jc w:val="both"/>
+      </w:pPr>
+      <w:r>
+        <w:rPr>
+          <w:rFonts w:ascii="David" w:cs="David" w:eastAsia="David" w:hAnsi="David"/>
+          <w:noProof/>
+          <w:b/>
+          <w:bCs/>
+          <w:sz w:val="24"/>
+          <w:szCs w:val="24"/>
+          <w:rtl/>
+        </w:rPr>
+        <w:t xml:space="preserve">מ: </w:t>
+      </w:r>
+      <w:r>
+        <w:rPr>
+          <w:rFonts w:ascii="David" w:cs="David" w:eastAsia="David" w:hAnsi="David"/>
+          <w:noProof/>
+          <w:sz w:val="24"/>
+          <w:szCs w:val="24"/>
+          <w:rtl/>
+        </w:rPr>
+        <w:t xml:space="preserve">ואיך היית מסבירה להם?</w:t>
+      </w:r>
+    </w:p>
+    <w:p>
+      <w:pPr>
+        <w:bidi/>
+        <w:spacing w:after="120" w:line="360" w:lineRule="auto"/>
+        <w:jc w:val="both"/>
+      </w:pPr>
+      <w:r>
+        <w:rPr>
+          <w:rFonts w:ascii="David" w:cs="David" w:eastAsia="David" w:hAnsi="David"/>
+          <w:noProof/>
+          <w:b/>
+          <w:bCs/>
+          <w:sz w:val="24"/>
+          <w:szCs w:val="24"/>
+          <w:rtl/>
+        </w:rPr>
+        <w:t xml:space="preserve">יעל: </w:t>
+      </w:r>
+      <w:r>
+        <w:rPr>
+          <w:rFonts w:ascii="David" w:cs="David" w:eastAsia="David" w:hAnsi="David"/>
+          <w:noProof/>
+          <w:sz w:val="24"/>
+          <w:szCs w:val="24"/>
+          <w:rtl/>
+        </w:rPr>
+        <w:t xml:space="preserve">"כולכם צריכים להראות שלושה דברים, ואת הדרך אתם בוחרים." ולכתוב את שלושת הדברים על הלוח. איך נראה יום של ילד עובד, למה הוא עבד, מה אתם חושבים על זה. ולהראות דוגמה קטנה מכל סוג. ולהגיד במפורש שכל האפשרויות שוות בנקודות. כי ישאלו. (צוחקת) תמיד ישאלו.</w:t>
+      </w:r>
+    </w:p>
+    <w:p>
+      <w:pPr>
+        <w:bidi/>
+        <w:spacing w:after="120" w:line="360" w:lineRule="auto"/>
+        <w:jc w:val="both"/>
+      </w:pPr>
+      <w:r>
+        <w:rPr>
+          <w:rFonts w:ascii="David" w:cs="David" w:eastAsia="David" w:hAnsi="David"/>
+          <w:noProof/>
+          <w:b/>
+          <w:bCs/>
+          <w:sz w:val="24"/>
+          <w:szCs w:val="24"/>
+          <w:rtl/>
+        </w:rPr>
+        <w:t xml:space="preserve">מ: </w:t>
+      </w:r>
+      <w:r>
+        <w:rPr>
+          <w:rFonts w:ascii="David" w:cs="David" w:eastAsia="David" w:hAnsi="David"/>
+          <w:noProof/>
+          <w:sz w:val="24"/>
+          <w:szCs w:val="24"/>
+          <w:rtl/>
+        </w:rPr>
+        <w:t xml:space="preserve">ואיך מעריכים?</w:t>
+      </w:r>
+    </w:p>
+    <w:p>
+      <w:pPr>
+        <w:bidi/>
+        <w:spacing w:after="120" w:line="360" w:lineRule="auto"/>
+        <w:jc w:val="both"/>
+      </w:pPr>
+      <w:r>
+        <w:rPr>
+          <w:rFonts w:ascii="David" w:cs="David" w:eastAsia="David" w:hAnsi="David"/>
+          <w:noProof/>
+          <w:b/>
+          <w:bCs/>
+          <w:sz w:val="24"/>
+          <w:szCs w:val="24"/>
+          <w:rtl/>
+        </w:rPr>
+        <w:t xml:space="preserve">יעל: </w:t>
+      </w:r>
+      <w:r>
+        <w:rPr>
+          <w:rFonts w:ascii="David" w:cs="David" w:eastAsia="David" w:hAnsi="David"/>
+          <w:noProof/>
+          <w:sz w:val="24"/>
+          <w:szCs w:val="24"/>
+          <w:rtl/>
+        </w:rPr>
+        <w:t xml:space="preserve">מחוון אחד. שלא תלוי בסוג. דיוק היסטורי, שימוש בתמונות, עומק ההבנה של הילד, וסדר. לא יופי, לא אורך, לא איכות הקלטה. והמחוון לפניהם לפני שהם בוחרים. המחוון עוזר לבחור.</w:t>
+      </w:r>
+    </w:p>
+    <w:p>
+      <w:pPr>
+        <w:bidi/>
+        <w:spacing w:after="120" w:line="360" w:lineRule="auto"/>
+        <w:jc w:val="both"/>
+      </w:pPr>
+      <w:r>
+        <w:rPr>
+          <w:rFonts w:ascii="David" w:cs="David" w:eastAsia="David" w:hAnsi="David"/>
+          <w:noProof/>
+          <w:b/>
+          <w:bCs/>
+          <w:sz w:val="24"/>
+          <w:szCs w:val="24"/>
+          <w:rtl/>
+        </w:rPr>
+        <w:t xml:space="preserve">מ: </w:t>
+      </w:r>
+      <w:r>
+        <w:rPr>
+          <w:rFonts w:ascii="David" w:cs="David" w:eastAsia="David" w:hAnsi="David"/>
+          <w:noProof/>
+          <w:sz w:val="24"/>
+          <w:szCs w:val="24"/>
+          <w:rtl/>
+        </w:rPr>
         <w:t xml:space="preserve">ומה היית משנה?</w:t>
       </w:r>
     </w:p>
@@ -8575,6 +10315,64 @@
           <w:rtl/>
         </w:rPr>
         <w:t xml:space="preserve">מנעולן. (צוחקת) לא פיוטי למורה לספרות. אבל זה מה שאני עושה. טקסט, תלמיד, וביניהם דלת נעולה. ולכל תלמיד המנעול אחר. אצל אחד הקריאה. אצל אחרת הביטחון. אצל שלישי שאין לו למה שיהיה אכפת. והתפקיד לא לפרוץ, לא לסחוב אותו דרך הדלת, אלא למצוא את המפתח. תמונה, הקלטה, שאלה שנוגעת בחיים שלו, או שאני יושבת לידו.</w:t>
+      </w:r>
+    </w:p>
+    <w:p>
+      <w:pPr>
+        <w:bidi/>
+        <w:spacing w:after="120" w:line="360" w:lineRule="auto"/>
+        <w:jc w:val="both"/>
+      </w:pPr>
+      <w:r>
+        <w:rPr>
+          <w:rFonts w:ascii="David" w:cs="David" w:eastAsia="David" w:hAnsi="David"/>
+          <w:noProof/>
+          <w:b/>
+          <w:bCs/>
+          <w:sz w:val="24"/>
+          <w:szCs w:val="24"/>
+          <w:rtl/>
+        </w:rPr>
+        <w:t xml:space="preserve">מ: </w:t>
+      </w:r>
+      <w:r>
+        <w:rPr>
+          <w:rFonts w:ascii="David" w:cs="David" w:eastAsia="David" w:hAnsi="David"/>
+          <w:noProof/>
+          <w:sz w:val="24"/>
+          <w:szCs w:val="24"/>
+          <w:rtl/>
+        </w:rPr>
+        <w:t xml:space="preserve">תוכלי לתת דוגמה למפתח שלא התאים?</w:t>
+      </w:r>
+    </w:p>
+    <w:p>
+      <w:pPr>
+        <w:bidi/>
+        <w:spacing w:after="120" w:line="360" w:lineRule="auto"/>
+        <w:jc w:val="both"/>
+      </w:pPr>
+      <w:r>
+        <w:rPr>
+          <w:rFonts w:ascii="David" w:cs="David" w:eastAsia="David" w:hAnsi="David"/>
+          <w:noProof/>
+          <w:b/>
+          <w:bCs/>
+          <w:sz w:val="24"/>
+          <w:szCs w:val="24"/>
+          <w:rtl/>
+        </w:rPr>
+        <w:t xml:space="preserve">יעל: </w:t>
+      </w:r>
+      <w:r>
+        <w:rPr>
+          <w:rFonts w:ascii="David" w:cs="David" w:eastAsia="David" w:hAnsi="David"/>
+          <w:noProof/>
+          <w:sz w:val="24"/>
+          <w:szCs w:val="24"/>
+          <w:rtl/>
+        </w:rPr>
+        <w:t xml:space="preserve">(שתיקה ארוכה) כן. תלמיד, לפני שלוש שנים. לקות קריאה, וגם משהו בבית שלא ידעתי מה. ניסיתי תמונות, לא עזר. הקלטות, לא שמע אותן. ניסיתי לשבת לידו, והוא זז. ניסיתי דרך הכדורגל, שהוא אהב, הבאתי טקסט על שחקן, והוא קרא אותו, פעם אחת, וזהו. ובסוף השנה הוא עבר לבית ספר אחר, ואני לא יודעת מה איתו. (שתיקה) המפתח שלו לא היה אצלי בצרור. אולי היה אצל מישהו אחר. אולי הוא בכלל לא היה בבית הספר. ואני אומרת את זה כי מורים צעירים חושבים שאם הם רק ימצאו את השיטה הנכונה, כל דלת תיפתח. לא כל דלת. וזה לא אומר שמפסיקים לנסות מפתחות.</w:t>
       </w:r>
     </w:p>
     <w:p>
@@ -8883,7 +10681,7 @@
           <w:szCs w:val="24"/>
           <w:rtl/>
         </w:rPr>
-        <w:t xml:space="preserve">הריאיון נערך במעבדת המדעים של בית הספר, אחרי שעות הלימודים. משך ההקלטה: 52 דקות. שאלות מהמדריך שנשאלו: 1, 3, 4, 5, 6, 8, 9, 11, 12, 14, 16. המרואיינת הדגימה ניסוי במהלך הריאיון.</w:t>
+        <w:t xml:space="preserve">הריאיון נערך במעבדת המדעים של בית הספר, אחרי שעות הלימודים. משך ההקלטה: 66 דקות. שאלות מהמדריך שנשאלו: 1, 3, 4, 5, 6, 8, 9, 10, 11, 12, 13, 14, 16. המרואיינת הדגימה ניסוי במהלך הריאיון.</w:t>
       </w:r>
     </w:p>
     <w:p>
@@ -8989,6 +10787,64 @@
           <w:szCs w:val="24"/>
           <w:rtl/>
         </w:rPr>
+        <w:t xml:space="preserve">מה את זוכרת מהשנים הראשונות האלה, בבית הספר?</w:t>
+      </w:r>
+    </w:p>
+    <w:p>
+      <w:pPr>
+        <w:bidi/>
+        <w:spacing w:after="120" w:line="360" w:lineRule="auto"/>
+        <w:jc w:val="both"/>
+      </w:pPr>
+      <w:r>
+        <w:rPr>
+          <w:rFonts w:ascii="David" w:cs="David" w:eastAsia="David" w:hAnsi="David"/>
+          <w:noProof/>
+          <w:b/>
+          <w:bCs/>
+          <w:sz w:val="24"/>
+          <w:szCs w:val="24"/>
+          <w:rtl/>
+        </w:rPr>
+        <w:t xml:space="preserve">נטלי: </w:t>
+      </w:r>
+      <w:r>
+        <w:rPr>
+          <w:rFonts w:ascii="David" w:cs="David" w:eastAsia="David" w:hAnsi="David"/>
+          <w:noProof/>
+          <w:sz w:val="24"/>
+          <w:szCs w:val="24"/>
+          <w:rtl/>
+        </w:rPr>
+        <w:t xml:space="preserve">(שתיקה) אני זוכרת שיעור חשבון בכיתה ב'. המורה שאלה שאלה, ואני ידעתי את התשובה, וידעתי אותה ברוסית, ולא ידעתי איך להגיד "שמונה עשרה" בעברית. אז לא הרמתי יד. וילד אחר ענה לא נכון. והמורה תיקנה אותו. ואני ישבתי וידעתי. (שתיקה) ואני חושבת שזה הרגע שאני מנסה למנוע כל יום. ילד שיודע ולא יכול להגיד. וזה למה בכיתה שלי מותר לענות בכל שפה. כל שפה. ואני אתרגם.</w:t>
+      </w:r>
+    </w:p>
+    <w:p>
+      <w:pPr>
+        <w:bidi/>
+        <w:spacing w:after="120" w:line="360" w:lineRule="auto"/>
+        <w:jc w:val="both"/>
+      </w:pPr>
+      <w:r>
+        <w:rPr>
+          <w:rFonts w:ascii="David" w:cs="David" w:eastAsia="David" w:hAnsi="David"/>
+          <w:noProof/>
+          <w:b/>
+          <w:bCs/>
+          <w:sz w:val="24"/>
+          <w:szCs w:val="24"/>
+          <w:rtl/>
+        </w:rPr>
+        <w:t xml:space="preserve">מ: </w:t>
+      </w:r>
+      <w:r>
+        <w:rPr>
+          <w:rFonts w:ascii="David" w:cs="David" w:eastAsia="David" w:hAnsi="David"/>
+          <w:noProof/>
+          <w:sz w:val="24"/>
+          <w:szCs w:val="24"/>
+          <w:rtl/>
+        </w:rPr>
         <w:t xml:space="preserve">מה את הכי אוהבת בעבודה היום?</w:t>
       </w:r>
     </w:p>
@@ -9163,6 +11019,64 @@
           <w:szCs w:val="24"/>
           <w:rtl/>
         </w:rPr>
+        <w:t xml:space="preserve">איך העולים והוותיקים מסתדרים ביניהם בכיתה?</w:t>
+      </w:r>
+    </w:p>
+    <w:p>
+      <w:pPr>
+        <w:bidi/>
+        <w:spacing w:after="120" w:line="360" w:lineRule="auto"/>
+        <w:jc w:val="both"/>
+      </w:pPr>
+      <w:r>
+        <w:rPr>
+          <w:rFonts w:ascii="David" w:cs="David" w:eastAsia="David" w:hAnsi="David"/>
+          <w:noProof/>
+          <w:b/>
+          <w:bCs/>
+          <w:sz w:val="24"/>
+          <w:szCs w:val="24"/>
+          <w:rtl/>
+        </w:rPr>
+        <w:t xml:space="preserve">נטלי: </w:t>
+      </w:r>
+      <w:r>
+        <w:rPr>
+          <w:rFonts w:ascii="David" w:cs="David" w:eastAsia="David" w:hAnsi="David"/>
+          <w:noProof/>
+          <w:sz w:val="24"/>
+          <w:szCs w:val="24"/>
+          <w:rtl/>
+        </w:rPr>
+        <w:t xml:space="preserve">(נאנחת) לא תמיד טוב. יש חלוקה. העולים יושבים ביחד, מדברים רוסית בהפסקה, והוותיקים... יש כאלה שזה מפריע להם. שמעתי "תדברו עברית" לא פעם. ואני מבינה מאיפה זה בא, וגם לא מוכנה לזה. אז במעבדה אני מערבבת בכוונה. בכל קבוצה עולה וותיק. ובניסוי אין ברירה, צריך לדבר. ומשהו קורה שם. ילד ותיק מגלה שהעולה יודע כימיה יותר ממנו, וזה משנה משהו. לא הכול. אבל משהו. (שתיקה) ואני חושבת על זה שאני עצמי הייתי הילדה שאמרו לה "תדברי עברית". אז זה אישי.</w:t>
+      </w:r>
+    </w:p>
+    <w:p>
+      <w:pPr>
+        <w:bidi/>
+        <w:spacing w:after="120" w:line="360" w:lineRule="auto"/>
+        <w:jc w:val="both"/>
+      </w:pPr>
+      <w:r>
+        <w:rPr>
+          <w:rFonts w:ascii="David" w:cs="David" w:eastAsia="David" w:hAnsi="David"/>
+          <w:noProof/>
+          <w:b/>
+          <w:bCs/>
+          <w:sz w:val="24"/>
+          <w:szCs w:val="24"/>
+          <w:rtl/>
+        </w:rPr>
+        <w:t xml:space="preserve">מ: </w:t>
+      </w:r>
+      <w:r>
+        <w:rPr>
+          <w:rFonts w:ascii="David" w:cs="David" w:eastAsia="David" w:hAnsi="David"/>
+          <w:noProof/>
+          <w:sz w:val="24"/>
+          <w:szCs w:val="24"/>
+          <w:rtl/>
+        </w:rPr>
         <w:t xml:space="preserve">איך זה מרגיש לך?</w:t>
       </w:r>
     </w:p>
@@ -9337,6 +11251,64 @@
           <w:szCs w:val="24"/>
           <w:rtl/>
         </w:rPr>
+        <w:t xml:space="preserve">מה היא אמרה לך, בשיחה ברוסית?</w:t>
+      </w:r>
+    </w:p>
+    <w:p>
+      <w:pPr>
+        <w:bidi/>
+        <w:spacing w:after="120" w:line="360" w:lineRule="auto"/>
+        <w:jc w:val="both"/>
+      </w:pPr>
+      <w:r>
+        <w:rPr>
+          <w:rFonts w:ascii="David" w:cs="David" w:eastAsia="David" w:hAnsi="David"/>
+          <w:noProof/>
+          <w:b/>
+          <w:bCs/>
+          <w:sz w:val="24"/>
+          <w:szCs w:val="24"/>
+          <w:rtl/>
+        </w:rPr>
+        <w:t xml:space="preserve">נטלי: </w:t>
+      </w:r>
+      <w:r>
+        <w:rPr>
+          <w:rFonts w:ascii="David" w:cs="David" w:eastAsia="David" w:hAnsi="David"/>
+          <w:noProof/>
+          <w:sz w:val="24"/>
+          <w:szCs w:val="24"/>
+          <w:rtl/>
+        </w:rPr>
+        <w:t xml:space="preserve">(שתיקה) היא אמרה: "אני יודעת את זה כבר שנתיים, ופה אני צריכה לשבת ולשמוע את זה עוד פעם בשפה שאני לא מבינה." ואז היא אמרה משהו שנשאר איתי: "בבית הספר שלי הייתי הכי טובה בכימיה, ופה אני הכי גרועה." והיא לא הייתה הכי גרועה. היא הייתה הכי טובה, בשפה אחרת. (שתיקה) ואני אמרתי לה, אני יודעת בדיוק. ואני חושבת שזה שאמרתי "אני יודעת בדיוק", ברוסית, ושהיא ידעה שאני עליתי, זה עשה משהו לפני כל השיטות.</w:t>
+      </w:r>
+    </w:p>
+    <w:p>
+      <w:pPr>
+        <w:bidi/>
+        <w:spacing w:after="120" w:line="360" w:lineRule="auto"/>
+        <w:jc w:val="both"/>
+      </w:pPr>
+      <w:r>
+        <w:rPr>
+          <w:rFonts w:ascii="David" w:cs="David" w:eastAsia="David" w:hAnsi="David"/>
+          <w:noProof/>
+          <w:b/>
+          <w:bCs/>
+          <w:sz w:val="24"/>
+          <w:szCs w:val="24"/>
+          <w:rtl/>
+        </w:rPr>
+        <w:t xml:space="preserve">מ: </w:t>
+      </w:r>
+      <w:r>
+        <w:rPr>
+          <w:rFonts w:ascii="David" w:cs="David" w:eastAsia="David" w:hAnsi="David"/>
+          <w:noProof/>
+          <w:sz w:val="24"/>
+          <w:szCs w:val="24"/>
+          <w:rtl/>
+        </w:rPr>
         <w:t xml:space="preserve">מה עשית?</w:t>
       </w:r>
     </w:p>
@@ -9685,6 +11657,64 @@
           <w:szCs w:val="24"/>
           <w:rtl/>
         </w:rPr>
+        <w:t xml:space="preserve">איך את בוחרת ניסוי לפתיחה? לא כל ניסוי מתאים, אני מניחה.</w:t>
+      </w:r>
+    </w:p>
+    <w:p>
+      <w:pPr>
+        <w:bidi/>
+        <w:spacing w:after="120" w:line="360" w:lineRule="auto"/>
+        <w:jc w:val="both"/>
+      </w:pPr>
+      <w:r>
+        <w:rPr>
+          <w:rFonts w:ascii="David" w:cs="David" w:eastAsia="David" w:hAnsi="David"/>
+          <w:noProof/>
+          <w:b/>
+          <w:bCs/>
+          <w:sz w:val="24"/>
+          <w:szCs w:val="24"/>
+          <w:rtl/>
+        </w:rPr>
+        <w:t xml:space="preserve">נטלי: </w:t>
+      </w:r>
+      <w:r>
+        <w:rPr>
+          <w:rFonts w:ascii="David" w:cs="David" w:eastAsia="David" w:hAnsi="David"/>
+          <w:noProof/>
+          <w:sz w:val="24"/>
+          <w:szCs w:val="24"/>
+          <w:rtl/>
+        </w:rPr>
+        <w:t xml:space="preserve">לא. שלושה דברים. שיהיה מהיר, פחות מדקה, כי הפתיחה זה לא השיעור. שיהיה מפתיע, משהו שהם לא היו מנחשים, כי אם ברור מה יקרה אין שאלה. ושיהיה בטוח, שאני יכולה לעשות אותו לבד מול שלושים ילדים בלי לפחד. פחית זה מושלם. (צוחקת) ויש לי רשימה. לכל יחידה, אחד או שניים. ואני מוסיפה אחד כל שנה. ואם אין ניסוי, תמונה. תצלום של משהו שקורה. אבל ניסוי עדיף, כי ניסוי קורה עכשיו, ותמונה קרתה פעם.</w:t>
+      </w:r>
+    </w:p>
+    <w:p>
+      <w:pPr>
+        <w:bidi/>
+        <w:spacing w:after="120" w:line="360" w:lineRule="auto"/>
+        <w:jc w:val="both"/>
+      </w:pPr>
+      <w:r>
+        <w:rPr>
+          <w:rFonts w:ascii="David" w:cs="David" w:eastAsia="David" w:hAnsi="David"/>
+          <w:noProof/>
+          <w:b/>
+          <w:bCs/>
+          <w:sz w:val="24"/>
+          <w:szCs w:val="24"/>
+          <w:rtl/>
+        </w:rPr>
+        <w:t xml:space="preserve">מ: </w:t>
+      </w:r>
+      <w:r>
+        <w:rPr>
+          <w:rFonts w:ascii="David" w:cs="David" w:eastAsia="David" w:hAnsi="David"/>
+          <w:noProof/>
+          <w:sz w:val="24"/>
+          <w:szCs w:val="24"/>
+          <w:rtl/>
+        </w:rPr>
         <w:t xml:space="preserve">תני לי דוגמה לשיעור שלם עם תמונות.</w:t>
       </w:r>
     </w:p>
@@ -9801,6 +11831,64 @@
           <w:szCs w:val="24"/>
           <w:rtl/>
         </w:rPr>
+        <w:t xml:space="preserve">ומה עשית עם השאלה שלהם?</w:t>
+      </w:r>
+    </w:p>
+    <w:p>
+      <w:pPr>
+        <w:bidi/>
+        <w:spacing w:after="120" w:line="360" w:lineRule="auto"/>
+        <w:jc w:val="both"/>
+      </w:pPr>
+      <w:r>
+        <w:rPr>
+          <w:rFonts w:ascii="David" w:cs="David" w:eastAsia="David" w:hAnsi="David"/>
+          <w:noProof/>
+          <w:b/>
+          <w:bCs/>
+          <w:sz w:val="24"/>
+          <w:szCs w:val="24"/>
+          <w:rtl/>
+        </w:rPr>
+        <w:t xml:space="preserve">נטלי: </w:t>
+      </w:r>
+      <w:r>
+        <w:rPr>
+          <w:rFonts w:ascii="David" w:cs="David" w:eastAsia="David" w:hAnsi="David"/>
+          <w:noProof/>
+          <w:sz w:val="24"/>
+          <w:szCs w:val="24"/>
+          <w:rtl/>
+        </w:rPr>
+        <w:t xml:space="preserve">זה היה השיעור הבא. פתחתי עם השאלה שלהם על הלוח, "למה היא שחורה", בדיוק במילים שלהם. ונתתי קטע קצר מהספר, שש שורות, ותמונה של פיח. ואמרתי, היום עונים על השאלה שלכם. (שתיקה) והם קראו את שש השורות כאילו זה ספר מתח. כי זו הייתה השאלה שלהם. ותלמיד עולה, אחד השקטים, שאל בסוף, ברוסית, אם זה חוזר להיות ורוד אם מפסיקים. ואמרתי, חלקית. והוא אמר "אז אני אגיד לאבא שלי". (שתיקה) זה שיעור מדעים. אבל זה גם... זה גם משהו אחר.</w:t>
+      </w:r>
+    </w:p>
+    <w:p>
+      <w:pPr>
+        <w:bidi/>
+        <w:spacing w:after="120" w:line="360" w:lineRule="auto"/>
+        <w:jc w:val="both"/>
+      </w:pPr>
+      <w:r>
+        <w:rPr>
+          <w:rFonts w:ascii="David" w:cs="David" w:eastAsia="David" w:hAnsi="David"/>
+          <w:noProof/>
+          <w:b/>
+          <w:bCs/>
+          <w:sz w:val="24"/>
+          <w:szCs w:val="24"/>
+          <w:rtl/>
+        </w:rPr>
+        <w:t xml:space="preserve">מ: </w:t>
+      </w:r>
+      <w:r>
+        <w:rPr>
+          <w:rFonts w:ascii="David" w:cs="David" w:eastAsia="David" w:hAnsi="David"/>
+          <w:noProof/>
+          <w:sz w:val="24"/>
+          <w:szCs w:val="24"/>
+          <w:rtl/>
+        </w:rPr>
         <w:t xml:space="preserve">מה הפתיע אותך?</w:t>
       </w:r>
     </w:p>
@@ -10033,6 +12121,64 @@
           <w:szCs w:val="24"/>
           <w:rtl/>
         </w:rPr>
+        <w:t xml:space="preserve">ספרי לי על דגם אחד.</w:t>
+      </w:r>
+    </w:p>
+    <w:p>
+      <w:pPr>
+        <w:bidi/>
+        <w:spacing w:after="120" w:line="360" w:lineRule="auto"/>
+        <w:jc w:val="both"/>
+      </w:pPr>
+      <w:r>
+        <w:rPr>
+          <w:rFonts w:ascii="David" w:cs="David" w:eastAsia="David" w:hAnsi="David"/>
+          <w:noProof/>
+          <w:b/>
+          <w:bCs/>
+          <w:sz w:val="24"/>
+          <w:szCs w:val="24"/>
+          <w:rtl/>
+        </w:rPr>
+        <w:t xml:space="preserve">נטלי: </w:t>
+      </w:r>
+      <w:r>
+        <w:rPr>
+          <w:rFonts w:ascii="David" w:cs="David" w:eastAsia="David" w:hAnsi="David"/>
+          <w:noProof/>
+          <w:sz w:val="24"/>
+          <w:szCs w:val="24"/>
+          <w:rtl/>
+        </w:rPr>
+        <w:t xml:space="preserve">(שתיקה) תלמיד שילוב, עם קשב חמור, שבמבחנים כותב שתי שורות. בנה מערכת נשימה משני בלונים, בקבוק פלסטיק חתוך, קשית, וכפפת גומי בתחתית. וכשמושכים את הכפפה הבלונים מתנפחים. וזה... זה מדויק. זו הסרעפת. ושאלתי אותו איך ידע, והוא אמר "ראיתי בסרטון, ואז ניסיתי שלוש פעמים עד שעבד". שלוש פעמים. בבית. (שתיקה) ואני חושבת על זה שבמבחן הוא היה מקבל ארבעים. והדגם שלו היה הכי טוב בכיתה. אז מה המבחן מודד?</w:t>
+      </w:r>
+    </w:p>
+    <w:p>
+      <w:pPr>
+        <w:bidi/>
+        <w:spacing w:after="120" w:line="360" w:lineRule="auto"/>
+        <w:jc w:val="both"/>
+      </w:pPr>
+      <w:r>
+        <w:rPr>
+          <w:rFonts w:ascii="David" w:cs="David" w:eastAsia="David" w:hAnsi="David"/>
+          <w:noProof/>
+          <w:b/>
+          <w:bCs/>
+          <w:sz w:val="24"/>
+          <w:szCs w:val="24"/>
+          <w:rtl/>
+        </w:rPr>
+        <w:t xml:space="preserve">מ: </w:t>
+      </w:r>
+      <w:r>
+        <w:rPr>
+          <w:rFonts w:ascii="David" w:cs="David" w:eastAsia="David" w:hAnsi="David"/>
+          <w:noProof/>
+          <w:sz w:val="24"/>
+          <w:szCs w:val="24"/>
+          <w:rtl/>
+        </w:rPr>
         <w:t xml:space="preserve">היו תלמידים שהבחירה הקשתה עליהם?</w:t>
       </w:r>
     </w:p>
@@ -10265,6 +12411,122 @@
           <w:szCs w:val="24"/>
           <w:rtl/>
         </w:rPr>
+        <w:t xml:space="preserve">ספרי לי על שיעור שבו התלמידים הציגו זה לזה. הדגמים, למשל.</w:t>
+      </w:r>
+    </w:p>
+    <w:p>
+      <w:pPr>
+        <w:bidi/>
+        <w:spacing w:after="120" w:line="360" w:lineRule="auto"/>
+        <w:jc w:val="both"/>
+      </w:pPr>
+      <w:r>
+        <w:rPr>
+          <w:rFonts w:ascii="David" w:cs="David" w:eastAsia="David" w:hAnsi="David"/>
+          <w:noProof/>
+          <w:b/>
+          <w:bCs/>
+          <w:sz w:val="24"/>
+          <w:szCs w:val="24"/>
+          <w:rtl/>
+        </w:rPr>
+        <w:t xml:space="preserve">נטלי: </w:t>
+      </w:r>
+      <w:r>
+        <w:rPr>
+          <w:rFonts w:ascii="David" w:cs="David" w:eastAsia="David" w:hAnsi="David"/>
+          <w:noProof/>
+          <w:sz w:val="24"/>
+          <w:szCs w:val="24"/>
+          <w:rtl/>
+        </w:rPr>
+        <w:t xml:space="preserve">כן. הדגמים על השולחנות, כל קבוצה שלוש דקות. מה בנינו, מה כל חלק, מה היה הכי קשה. ואחרי כל הצגה שאלה אחת מהכיתה, ופתק, דבר אחד שלמדתם מהדגם הזה. ותפקידי... קטן. שמרתי על הזמן, קראתי לקבוצה הבאה, ושאלה אחת לכל קבוצה: "איך ידעתם שזה נראה ככה?" כדי שיחזרו לתצלומים.</w:t>
+      </w:r>
+    </w:p>
+    <w:p>
+      <w:pPr>
+        <w:bidi/>
+        <w:spacing w:after="120" w:line="360" w:lineRule="auto"/>
+        <w:jc w:val="both"/>
+      </w:pPr>
+      <w:r>
+        <w:rPr>
+          <w:rFonts w:ascii="David" w:cs="David" w:eastAsia="David" w:hAnsi="David"/>
+          <w:noProof/>
+          <w:b/>
+          <w:bCs/>
+          <w:sz w:val="24"/>
+          <w:szCs w:val="24"/>
+          <w:rtl/>
+        </w:rPr>
+        <w:t xml:space="preserve">מ: </w:t>
+      </w:r>
+      <w:r>
+        <w:rPr>
+          <w:rFonts w:ascii="David" w:cs="David" w:eastAsia="David" w:hAnsi="David"/>
+          <w:noProof/>
+          <w:sz w:val="24"/>
+          <w:szCs w:val="24"/>
+          <w:rtl/>
+        </w:rPr>
+        <w:t xml:space="preserve">ואיך זה היה, לעמוד בצד?</w:t>
+      </w:r>
+    </w:p>
+    <w:p>
+      <w:pPr>
+        <w:bidi/>
+        <w:spacing w:after="120" w:line="360" w:lineRule="auto"/>
+        <w:jc w:val="both"/>
+      </w:pPr>
+      <w:r>
+        <w:rPr>
+          <w:rFonts w:ascii="David" w:cs="David" w:eastAsia="David" w:hAnsi="David"/>
+          <w:noProof/>
+          <w:b/>
+          <w:bCs/>
+          <w:sz w:val="24"/>
+          <w:szCs w:val="24"/>
+          <w:rtl/>
+        </w:rPr>
+        <w:t xml:space="preserve">נטלי: </w:t>
+      </w:r>
+      <w:r>
+        <w:rPr>
+          <w:rFonts w:ascii="David" w:cs="David" w:eastAsia="David" w:hAnsi="David"/>
+          <w:noProof/>
+          <w:sz w:val="24"/>
+          <w:szCs w:val="24"/>
+          <w:rtl/>
+        </w:rPr>
+        <w:t xml:space="preserve">מוזר. במעבדה אני גם אחראית על הבטיחות, אז לעמוד בצד זה נגד האינסטינקט. אבל ראיתי... ראיתי את הכיתה מקשיבה לוויקה, כשהיא הסבירה ברוסית ועם ידיים איך בנו את הריאות מבלונים, יותר ממה שהם מקשיבים לי. כי היא חברה שיודעת משהו. (שתיקה) ומה למדתי. שתלמיד שילוב שחשבתי שלא הבין בנה דגם שהסביר את מסלול האוויר נכון. ושתלמידה חזקה בכתב התקשתה להסביר בקול. ומהפתקים ראיתי מה הכיתה לקחה מכל דגם. וזה הערכה טובה יותר ממבחן. אני עדיין קצת לא מסוגלת לשתוק, אבל פחות.</w:t>
+      </w:r>
+    </w:p>
+    <w:p>
+      <w:pPr>
+        <w:bidi/>
+        <w:spacing w:after="120" w:line="360" w:lineRule="auto"/>
+        <w:jc w:val="both"/>
+      </w:pPr>
+      <w:r>
+        <w:rPr>
+          <w:rFonts w:ascii="David" w:cs="David" w:eastAsia="David" w:hAnsi="David"/>
+          <w:noProof/>
+          <w:b/>
+          <w:bCs/>
+          <w:sz w:val="24"/>
+          <w:szCs w:val="24"/>
+          <w:rtl/>
+        </w:rPr>
+        <w:t xml:space="preserve">מ: </w:t>
+      </w:r>
+      <w:r>
+        <w:rPr>
+          <w:rFonts w:ascii="David" w:cs="David" w:eastAsia="David" w:hAnsi="David"/>
+          <w:noProof/>
+          <w:sz w:val="24"/>
+          <w:szCs w:val="24"/>
+          <w:rtl/>
+        </w:rPr>
         <w:t xml:space="preserve">אני מתכננת ללמד את המהפכה התעשייתית בכיתה ח' דרך תמונות היסטוריות, בלי טקסט ארוך, ואז בחירה.</w:t>
       </w:r>
     </w:p>
@@ -10585,6 +12847,122 @@
           <w:rtl/>
         </w:rPr>
         <w:t xml:space="preserve">"מה יותר קל לך, לבנות, לכתוב או לדבר?" ולתלמיד שילוב שהפתיחות מבלבלת אותו, שתיים. לפעמים שתי אפשרויות זה בחירה ושלוש זה בלבול.</w:t>
+      </w:r>
+    </w:p>
+    <w:p>
+      <w:pPr>
+        <w:bidi/>
+        <w:spacing w:after="120" w:line="360" w:lineRule="auto"/>
+        <w:jc w:val="both"/>
+      </w:pPr>
+      <w:r>
+        <w:rPr>
+          <w:rFonts w:ascii="David" w:cs="David" w:eastAsia="David" w:hAnsi="David"/>
+          <w:noProof/>
+          <w:b/>
+          <w:bCs/>
+          <w:sz w:val="24"/>
+          <w:szCs w:val="24"/>
+          <w:rtl/>
+        </w:rPr>
+        <w:t xml:space="preserve">מ: </w:t>
+      </w:r>
+      <w:r>
+        <w:rPr>
+          <w:rFonts w:ascii="David" w:cs="David" w:eastAsia="David" w:hAnsi="David"/>
+          <w:noProof/>
+          <w:sz w:val="24"/>
+          <w:szCs w:val="24"/>
+          <w:rtl/>
+        </w:rPr>
+        <w:t xml:space="preserve">ומה עם הזמן? כשקבוצות מסיימות בזמנים שונים?</w:t>
+      </w:r>
+    </w:p>
+    <w:p>
+      <w:pPr>
+        <w:bidi/>
+        <w:spacing w:after="120" w:line="360" w:lineRule="auto"/>
+        <w:jc w:val="both"/>
+      </w:pPr>
+      <w:r>
+        <w:rPr>
+          <w:rFonts w:ascii="David" w:cs="David" w:eastAsia="David" w:hAnsi="David"/>
+          <w:noProof/>
+          <w:b/>
+          <w:bCs/>
+          <w:sz w:val="24"/>
+          <w:szCs w:val="24"/>
+          <w:rtl/>
+        </w:rPr>
+        <w:t xml:space="preserve">נטלי: </w:t>
+      </w:r>
+      <w:r>
+        <w:rPr>
+          <w:rFonts w:ascii="David" w:cs="David" w:eastAsia="David" w:hAnsi="David"/>
+          <w:noProof/>
+          <w:sz w:val="24"/>
+          <w:szCs w:val="24"/>
+          <w:rtl/>
+        </w:rPr>
+        <w:t xml:space="preserve">תתכנני שזה יקרה. במעבדה למדתי שאין דבר כזה שכולם מסיימים יחד. שלוש שכבות, כמו שאמרתי. וקבוצה שסיימה הופכת ל"בודקות" של קבוצה אחרת, שתי הערות לפי המחוון. שעון על הלוח, תזכורות, ומי שלא סיים מגיש מה שיש. ושלושים וחמש דקות, לא ארבעים וחמש. עשר תמיד הולכות למעברים ולציוד.</w:t>
+      </w:r>
+    </w:p>
+    <w:p>
+      <w:pPr>
+        <w:bidi/>
+        <w:spacing w:after="120" w:line="360" w:lineRule="auto"/>
+        <w:jc w:val="both"/>
+      </w:pPr>
+      <w:r>
+        <w:rPr>
+          <w:rFonts w:ascii="David" w:cs="David" w:eastAsia="David" w:hAnsi="David"/>
+          <w:noProof/>
+          <w:b/>
+          <w:bCs/>
+          <w:sz w:val="24"/>
+          <w:szCs w:val="24"/>
+          <w:rtl/>
+        </w:rPr>
+        <w:t xml:space="preserve">מ: </w:t>
+      </w:r>
+      <w:r>
+        <w:rPr>
+          <w:rFonts w:ascii="David" w:cs="David" w:eastAsia="David" w:hAnsi="David"/>
+          <w:noProof/>
+          <w:sz w:val="24"/>
+          <w:szCs w:val="24"/>
+          <w:rtl/>
+        </w:rPr>
+        <w:t xml:space="preserve">מה למדת שלא כדאי?</w:t>
+      </w:r>
+    </w:p>
+    <w:p>
+      <w:pPr>
+        <w:bidi/>
+        <w:spacing w:after="120" w:line="360" w:lineRule="auto"/>
+        <w:jc w:val="both"/>
+      </w:pPr>
+      <w:r>
+        <w:rPr>
+          <w:rFonts w:ascii="David" w:cs="David" w:eastAsia="David" w:hAnsi="David"/>
+          <w:noProof/>
+          <w:b/>
+          <w:bCs/>
+          <w:sz w:val="24"/>
+          <w:szCs w:val="24"/>
+          <w:rtl/>
+        </w:rPr>
+        <w:t xml:space="preserve">נטלי: </w:t>
+      </w:r>
+      <w:r>
+        <w:rPr>
+          <w:rFonts w:ascii="David" w:cs="David" w:eastAsia="David" w:hAnsi="David"/>
+          <w:noProof/>
+          <w:sz w:val="24"/>
+          <w:szCs w:val="24"/>
+          <w:rtl/>
+        </w:rPr>
+        <w:t xml:space="preserve">לא לבנות קבוצות לפי רמה. ולא לרוץ בין האיטיות. ו... תכיני משפט אחד לקבוצה שסיימה, "מצוין, עכשיו תמצאו משהו שפספסתם", ומשפט אחד לקבוצה שלא, "תגישו מה שיש, זה מספיק". ותתרגלי אותם. ברגע עצמו אין זמן לחשוב. (צוחקת) אני עדיין אומרת אותם לעצמי לפני שיעור.</w:t>
       </w:r>
     </w:p>
     <w:p>
@@ -11009,7 +13387,7 @@
           <w:szCs w:val="24"/>
           <w:rtl/>
         </w:rPr>
-        <w:t xml:space="preserve">הריאיון נערך בבית קפה בעיר, אחרי שעות הלימודים. משך ההקלטה: 41 דקות. שאלות מהמדריך שנשאלו: 1, 2, 3, 4, 5, 6, 7, 8, 11, 12, 15, 16. שאלות 9, 10, 13 ו-14 לא נשאלו מפאת הזמן.</w:t>
+        <w:t xml:space="preserve">הריאיון נערך בבית קפה בעיר, אחרי שעות הלימודים. משך ההקלטה: 56 דקות. שאלות מהמדריך שנשאלו: 1, 2, 3, 4, 5, 6, 7, 8, 9, 11, 12, 15, 16. שאלות 10, 13 ו-14 לא נשאלו מפאת הזמן.</w:t>
       </w:r>
     </w:p>
     <w:p>
@@ -11173,6 +13551,64 @@
           <w:szCs w:val="24"/>
           <w:rtl/>
         </w:rPr>
+        <w:t xml:space="preserve">תוכלי לספר על פעם אחת כזאת?</w:t>
+      </w:r>
+    </w:p>
+    <w:p>
+      <w:pPr>
+        <w:bidi/>
+        <w:spacing w:after="120" w:line="360" w:lineRule="auto"/>
+        <w:jc w:val="both"/>
+      </w:pPr>
+      <w:r>
+        <w:rPr>
+          <w:rFonts w:ascii="David" w:cs="David" w:eastAsia="David" w:hAnsi="David"/>
+          <w:noProof/>
+          <w:b/>
+          <w:bCs/>
+          <w:sz w:val="24"/>
+          <w:szCs w:val="24"/>
+          <w:rtl/>
+        </w:rPr>
+        <w:t xml:space="preserve">הודיה: </w:t>
+      </w:r>
+      <w:r>
+        <w:rPr>
+          <w:rFonts w:ascii="David" w:cs="David" w:eastAsia="David" w:hAnsi="David"/>
+          <w:noProof/>
+          <w:sz w:val="24"/>
+          <w:szCs w:val="24"/>
+          <w:rtl/>
+        </w:rPr>
+        <w:t xml:space="preserve">(שתיקה) בת בכיתה ח', שנה שעברה. למדנו על העלייה מאתיופיה, אחרי הסיפור שאני עוד אספר לך, ואמרתי לבנות להביא תמונה מהבית. והיא הביאה תמונה של סבתא שלה, במחנה בסודן, עם תינוק. והתינוק זה אבא שלה. ועמדה מול הכיתה ואמרה, "זה אבא שלי", ובכתה. וכל הכיתה שתקה. וגם אני. (שתיקה) ואחרי זה היא כתבה עבודה על המסע, שלושה עמודים, והיא בת שקוראת לאט מאוד וכותבת לאט מאוד. שלושה עמודים. כי זה היה שלה.</w:t>
+      </w:r>
+    </w:p>
+    <w:p>
+      <w:pPr>
+        <w:bidi/>
+        <w:spacing w:after="120" w:line="360" w:lineRule="auto"/>
+        <w:jc w:val="both"/>
+      </w:pPr>
+      <w:r>
+        <w:rPr>
+          <w:rFonts w:ascii="David" w:cs="David" w:eastAsia="David" w:hAnsi="David"/>
+          <w:noProof/>
+          <w:b/>
+          <w:bCs/>
+          <w:sz w:val="24"/>
+          <w:szCs w:val="24"/>
+          <w:rtl/>
+        </w:rPr>
+        <w:t xml:space="preserve">מ: </w:t>
+      </w:r>
+      <w:r>
+        <w:rPr>
+          <w:rFonts w:ascii="David" w:cs="David" w:eastAsia="David" w:hAnsi="David"/>
+          <w:noProof/>
+          <w:sz w:val="24"/>
+          <w:szCs w:val="24"/>
+          <w:rtl/>
+        </w:rPr>
         <w:t xml:space="preserve">מה השתנה אצלך?</w:t>
       </w:r>
     </w:p>
@@ -11463,6 +13899,64 @@
           <w:szCs w:val="24"/>
           <w:rtl/>
         </w:rPr>
+        <w:t xml:space="preserve">את אמרת "רואים עליהן שהן לא בבית", על המפונות. מה את רואה?</w:t>
+      </w:r>
+    </w:p>
+    <w:p>
+      <w:pPr>
+        <w:bidi/>
+        <w:spacing w:after="120" w:line="360" w:lineRule="auto"/>
+        <w:jc w:val="both"/>
+      </w:pPr>
+      <w:r>
+        <w:rPr>
+          <w:rFonts w:ascii="David" w:cs="David" w:eastAsia="David" w:hAnsi="David"/>
+          <w:noProof/>
+          <w:b/>
+          <w:bCs/>
+          <w:sz w:val="24"/>
+          <w:szCs w:val="24"/>
+          <w:rtl/>
+        </w:rPr>
+        <w:t xml:space="preserve">הודיה: </w:t>
+      </w:r>
+      <w:r>
+        <w:rPr>
+          <w:rFonts w:ascii="David" w:cs="David" w:eastAsia="David" w:hAnsi="David"/>
+          <w:noProof/>
+          <w:sz w:val="24"/>
+          <w:szCs w:val="24"/>
+          <w:rtl/>
+        </w:rPr>
+        <w:t xml:space="preserve">(שתיקה ארוכה) הן יושבות ביחד, שלושתן. תמיד. הן לא מדברות על מה שהיה, אבל כשיש רעש חזק במסדרון, אחת מהן קופצת. ואחת שואלת כל בוקר אם יש היום משהו מיוחד, כאילו היא צריכה לדעת מראש מה יקרה. ואחת פשוט... שקטה. הייתה שקטה כל השנה. עד השיעור עם התמונה של הילדה במפעל. אני אספר לך. (שתיקה) ואני לא יועצת. אני מורה לתנ"ך. אבל אני רואה. ואני מדברת עם היועצת. ולפעמים כל מה שאני יכולה זה לא להפתיע אותן.</w:t>
+      </w:r>
+    </w:p>
+    <w:p>
+      <w:pPr>
+        <w:bidi/>
+        <w:spacing w:after="120" w:line="360" w:lineRule="auto"/>
+        <w:jc w:val="both"/>
+      </w:pPr>
+      <w:r>
+        <w:rPr>
+          <w:rFonts w:ascii="David" w:cs="David" w:eastAsia="David" w:hAnsi="David"/>
+          <w:noProof/>
+          <w:b/>
+          <w:bCs/>
+          <w:sz w:val="24"/>
+          <w:szCs w:val="24"/>
+          <w:rtl/>
+        </w:rPr>
+        <w:t xml:space="preserve">מ: </w:t>
+      </w:r>
+      <w:r>
+        <w:rPr>
+          <w:rFonts w:ascii="David" w:cs="David" w:eastAsia="David" w:hAnsi="David"/>
+          <w:noProof/>
+          <w:sz w:val="24"/>
+          <w:szCs w:val="24"/>
+          <w:rtl/>
+        </w:rPr>
         <w:t xml:space="preserve">איך זה מרגיש?</w:t>
       </w:r>
     </w:p>
@@ -11695,6 +14189,64 @@
           <w:szCs w:val="24"/>
           <w:rtl/>
         </w:rPr>
+        <w:t xml:space="preserve">מה בדיוק היא כתבה על יוסף?</w:t>
+      </w:r>
+    </w:p>
+    <w:p>
+      <w:pPr>
+        <w:bidi/>
+        <w:spacing w:after="120" w:line="360" w:lineRule="auto"/>
+        <w:jc w:val="both"/>
+      </w:pPr>
+      <w:r>
+        <w:rPr>
+          <w:rFonts w:ascii="David" w:cs="David" w:eastAsia="David" w:hAnsi="David"/>
+          <w:noProof/>
+          <w:b/>
+          <w:bCs/>
+          <w:sz w:val="24"/>
+          <w:szCs w:val="24"/>
+          <w:rtl/>
+        </w:rPr>
+        <w:t xml:space="preserve">הודיה: </w:t>
+      </w:r>
+      <w:r>
+        <w:rPr>
+          <w:rFonts w:ascii="David" w:cs="David" w:eastAsia="David" w:hAnsi="David"/>
+          <w:noProof/>
+          <w:sz w:val="24"/>
+          <w:szCs w:val="24"/>
+          <w:rtl/>
+        </w:rPr>
+        <w:t xml:space="preserve">אני זוכרת בערך. "הוא מפחד כי חושך. הוא לבד. האחים למעלה ולא אכפת להם. הוא חושב שאבא לא יודע איפה הוא." (שתיקה) ואת המשפט האחרון, "אבא לא יודע איפה הוא", זה בדיוק מה שקורה בסיפור, יעקב לא יודע. והיא לא קראה את הפסוקים. היא הסתכלה על ציור. ואז, כשקראנו את הפסוקים, היא הרימה יד, בפעם הראשונה בשנה, ואמרה "אמרתי שאבא לא יודע". (צוחקת) בגאווה. וזה היה הרגע.</w:t>
+      </w:r>
+    </w:p>
+    <w:p>
+      <w:pPr>
+        <w:bidi/>
+        <w:spacing w:after="120" w:line="360" w:lineRule="auto"/>
+        <w:jc w:val="both"/>
+      </w:pPr>
+      <w:r>
+        <w:rPr>
+          <w:rFonts w:ascii="David" w:cs="David" w:eastAsia="David" w:hAnsi="David"/>
+          <w:noProof/>
+          <w:b/>
+          <w:bCs/>
+          <w:sz w:val="24"/>
+          <w:szCs w:val="24"/>
+          <w:rtl/>
+        </w:rPr>
+        <w:t xml:space="preserve">מ: </w:t>
+      </w:r>
+      <w:r>
+        <w:rPr>
+          <w:rFonts w:ascii="David" w:cs="David" w:eastAsia="David" w:hAnsi="David"/>
+          <w:noProof/>
+          <w:sz w:val="24"/>
+          <w:szCs w:val="24"/>
+          <w:rtl/>
+        </w:rPr>
         <w:t xml:space="preserve">מה עמד מאחורי הקושי, לדעתך?</w:t>
       </w:r>
     </w:p>
@@ -12043,6 +14595,64 @@
           <w:szCs w:val="24"/>
           <w:rtl/>
         </w:rPr>
+        <w:t xml:space="preserve">ומה עשית עם השאלה הזאת?</w:t>
+      </w:r>
+    </w:p>
+    <w:p>
+      <w:pPr>
+        <w:bidi/>
+        <w:spacing w:after="120" w:line="360" w:lineRule="auto"/>
+        <w:jc w:val="both"/>
+      </w:pPr>
+      <w:r>
+        <w:rPr>
+          <w:rFonts w:ascii="David" w:cs="David" w:eastAsia="David" w:hAnsi="David"/>
+          <w:noProof/>
+          <w:b/>
+          <w:bCs/>
+          <w:sz w:val="24"/>
+          <w:szCs w:val="24"/>
+          <w:rtl/>
+        </w:rPr>
+        <w:t xml:space="preserve">הודיה: </w:t>
+      </w:r>
+      <w:r>
+        <w:rPr>
+          <w:rFonts w:ascii="David" w:cs="David" w:eastAsia="David" w:hAnsi="David"/>
+          <w:noProof/>
+          <w:sz w:val="24"/>
+          <w:szCs w:val="24"/>
+          <w:rtl/>
+        </w:rPr>
+        <w:t xml:space="preserve">הפכתי אותה לשיעור. השיעור הבא נפתח בשאלה שלהן על הלוח, במילים שלהן, "איפה כולם ישנים", ונתתי קטע קצר מהספר על צפיפות, שמונה שורות, ועדות של אישה מהתקופה, ארבע שורות. ואמרתי, היום עונים על השאלה שלכן. והן קראו. כי הן רצו לדעת. (שתיקה) ואז בת אחת חישבה, לבד, כמה אנשים בחדר לפי העדות, ואמרה "תשעה בחדר אחד", ובת אחרת אמרה "אצל סבתא שלי היו שבעה", ופתאום זה לא היה על לונדון. וזה בעצם מה שאני מנסה כל הזמן. שהשאלה תבוא מהן, ושהטקסט יענה עליה.</w:t>
+      </w:r>
+    </w:p>
+    <w:p>
+      <w:pPr>
+        <w:bidi/>
+        <w:spacing w:after="120" w:line="360" w:lineRule="auto"/>
+        <w:jc w:val="both"/>
+      </w:pPr>
+      <w:r>
+        <w:rPr>
+          <w:rFonts w:ascii="David" w:cs="David" w:eastAsia="David" w:hAnsi="David"/>
+          <w:noProof/>
+          <w:b/>
+          <w:bCs/>
+          <w:sz w:val="24"/>
+          <w:szCs w:val="24"/>
+          <w:rtl/>
+        </w:rPr>
+        <w:t xml:space="preserve">מ: </w:t>
+      </w:r>
+      <w:r>
+        <w:rPr>
+          <w:rFonts w:ascii="David" w:cs="David" w:eastAsia="David" w:hAnsi="David"/>
+          <w:noProof/>
+          <w:sz w:val="24"/>
+          <w:szCs w:val="24"/>
+          <w:rtl/>
+        </w:rPr>
         <w:t xml:space="preserve">ומה עם קטע ארוך? פרק בתנ"ך?</w:t>
       </w:r>
     </w:p>
@@ -12101,6 +14711,122 @@
           <w:szCs w:val="24"/>
           <w:rtl/>
         </w:rPr>
+        <w:t xml:space="preserve">וכשבנות עובדות בקצב שונה? חלק מסיימות, חלק לא?</w:t>
+      </w:r>
+    </w:p>
+    <w:p>
+      <w:pPr>
+        <w:bidi/>
+        <w:spacing w:after="120" w:line="360" w:lineRule="auto"/>
+        <w:jc w:val="both"/>
+      </w:pPr>
+      <w:r>
+        <w:rPr>
+          <w:rFonts w:ascii="David" w:cs="David" w:eastAsia="David" w:hAnsi="David"/>
+          <w:noProof/>
+          <w:b/>
+          <w:bCs/>
+          <w:sz w:val="24"/>
+          <w:szCs w:val="24"/>
+          <w:rtl/>
+        </w:rPr>
+        <w:t xml:space="preserve">הודיה: </w:t>
+      </w:r>
+      <w:r>
+        <w:rPr>
+          <w:rFonts w:ascii="David" w:cs="David" w:eastAsia="David" w:hAnsi="David"/>
+          <w:noProof/>
+          <w:sz w:val="24"/>
+          <w:szCs w:val="24"/>
+          <w:rtl/>
+        </w:rPr>
+        <w:t xml:space="preserve">כל שיעור. (שתיקה) יש לי שלוש רמות בכל דף. תמונה, טקסט, שאלת חשיבה. "מה היית עושה במקום הדמות." מי שמסיימת מהר מגיעה לשלישי. מי שאיטית, ראשון ושני, וזה בסדר. ו"ואם סיימת" בתחתית, "מצאי בתמונה משהו שאף אחת לא הזכירה". וזמן שאני אומרת כטווח, בין עשר לעשרים.</w:t>
+      </w:r>
+    </w:p>
+    <w:p>
+      <w:pPr>
+        <w:bidi/>
+        <w:spacing w:after="120" w:line="360" w:lineRule="auto"/>
+        <w:jc w:val="both"/>
+      </w:pPr>
+      <w:r>
+        <w:rPr>
+          <w:rFonts w:ascii="David" w:cs="David" w:eastAsia="David" w:hAnsi="David"/>
+          <w:noProof/>
+          <w:b/>
+          <w:bCs/>
+          <w:sz w:val="24"/>
+          <w:szCs w:val="24"/>
+          <w:rtl/>
+        </w:rPr>
+        <w:t xml:space="preserve">מ: </w:t>
+      </w:r>
+      <w:r>
+        <w:rPr>
+          <w:rFonts w:ascii="David" w:cs="David" w:eastAsia="David" w:hAnsi="David"/>
+          <w:noProof/>
+          <w:sz w:val="24"/>
+          <w:szCs w:val="24"/>
+          <w:rtl/>
+        </w:rPr>
+        <w:t xml:space="preserve">למי את ניגשת קודם?</w:t>
+      </w:r>
+    </w:p>
+    <w:p>
+      <w:pPr>
+        <w:bidi/>
+        <w:spacing w:after="120" w:line="360" w:lineRule="auto"/>
+        <w:jc w:val="both"/>
+      </w:pPr>
+      <w:r>
+        <w:rPr>
+          <w:rFonts w:ascii="David" w:cs="David" w:eastAsia="David" w:hAnsi="David"/>
+          <w:noProof/>
+          <w:b/>
+          <w:bCs/>
+          <w:sz w:val="24"/>
+          <w:szCs w:val="24"/>
+          <w:rtl/>
+        </w:rPr>
+        <w:t xml:space="preserve">הודיה: </w:t>
+      </w:r>
+      <w:r>
+        <w:rPr>
+          <w:rFonts w:ascii="David" w:cs="David" w:eastAsia="David" w:hAnsi="David"/>
+          <w:noProof/>
+          <w:sz w:val="24"/>
+          <w:szCs w:val="24"/>
+          <w:rtl/>
+        </w:rPr>
+        <w:t xml:space="preserve">למי שלא תקרא לי. שלוש ארבע בכל כיתה, יושבות מול דף ריק ולא מרימות יד גם אם השיעור ייגמר. בדקה הראשונה. יושבת לידן. ואחר כך מסתכלת על הדפים ולא על הפנים. בת שמחייכת יכולה להיות תקועה. דף ריק אחרי חמש דקות לא משקר. (שתיקה) ואם רוב הכיתה לא מסיימת, הבעיה במשימה שלי ולא בקצב שלהן. לקח לי כמה שנים.</w:t>
+      </w:r>
+    </w:p>
+    <w:p>
+      <w:pPr>
+        <w:bidi/>
+        <w:spacing w:after="120" w:line="360" w:lineRule="auto"/>
+        <w:jc w:val="both"/>
+      </w:pPr>
+      <w:r>
+        <w:rPr>
+          <w:rFonts w:ascii="David" w:cs="David" w:eastAsia="David" w:hAnsi="David"/>
+          <w:noProof/>
+          <w:b/>
+          <w:bCs/>
+          <w:sz w:val="24"/>
+          <w:szCs w:val="24"/>
+          <w:rtl/>
+        </w:rPr>
+        <w:t xml:space="preserve">מ: </w:t>
+      </w:r>
+      <w:r>
+        <w:rPr>
+          <w:rFonts w:ascii="David" w:cs="David" w:eastAsia="David" w:hAnsi="David"/>
+          <w:noProof/>
+          <w:sz w:val="24"/>
+          <w:szCs w:val="24"/>
+          <w:rtl/>
+        </w:rPr>
         <w:t xml:space="preserve">מה את אומרת להן?</w:t>
       </w:r>
     </w:p>
@@ -12275,6 +15001,64 @@
           <w:szCs w:val="24"/>
           <w:rtl/>
         </w:rPr>
+        <w:t xml:space="preserve">ומה עם המפונה, שביקשה לעבור? מה קרה אחר כך?</w:t>
+      </w:r>
+    </w:p>
+    <w:p>
+      <w:pPr>
+        <w:bidi/>
+        <w:spacing w:after="120" w:line="360" w:lineRule="auto"/>
+        <w:jc w:val="both"/>
+      </w:pPr>
+      <w:r>
+        <w:rPr>
+          <w:rFonts w:ascii="David" w:cs="David" w:eastAsia="David" w:hAnsi="David"/>
+          <w:noProof/>
+          <w:b/>
+          <w:bCs/>
+          <w:sz w:val="24"/>
+          <w:szCs w:val="24"/>
+          <w:rtl/>
+        </w:rPr>
+        <w:t xml:space="preserve">הודיה: </w:t>
+      </w:r>
+      <w:r>
+        <w:rPr>
+          <w:rFonts w:ascii="David" w:cs="David" w:eastAsia="David" w:hAnsi="David"/>
+          <w:noProof/>
+          <w:sz w:val="24"/>
+          <w:szCs w:val="24"/>
+          <w:rtl/>
+        </w:rPr>
+        <w:t xml:space="preserve">(שתיקה) היא עברה לאלבום. ובחרה תמונות של... של רחובות. לא של אנשים. חמש תמונות של רחובות בעיר תעשייתית, ריקים. וכתבה מתחת לאחת "פה גרו אנשים". (שתיקה ארוכה) ואני לא אמרתי כלום. נתתי לה ציון על ההיסטוריה, שהייתה נכונה. ודיברתי עם היועצת. ואני חושבת שהאלבום הזה אמר משהו שהיא לא הייתה אומרת בשום שיחה. ואני עדיין לא יודעת אם עשיתי נכון שנתתי לה את הנושא הזה בכלל. (שתיקה) אולי כן. אולי היא הייתה צריכה מקום להגיד את זה.</w:t>
+      </w:r>
+    </w:p>
+    <w:p>
+      <w:pPr>
+        <w:bidi/>
+        <w:spacing w:after="120" w:line="360" w:lineRule="auto"/>
+        <w:jc w:val="both"/>
+      </w:pPr>
+      <w:r>
+        <w:rPr>
+          <w:rFonts w:ascii="David" w:cs="David" w:eastAsia="David" w:hAnsi="David"/>
+          <w:noProof/>
+          <w:b/>
+          <w:bCs/>
+          <w:sz w:val="24"/>
+          <w:szCs w:val="24"/>
+          <w:rtl/>
+        </w:rPr>
+        <w:t xml:space="preserve">מ: </w:t>
+      </w:r>
+      <w:r>
+        <w:rPr>
+          <w:rFonts w:ascii="David" w:cs="David" w:eastAsia="David" w:hAnsi="David"/>
+          <w:noProof/>
+          <w:sz w:val="24"/>
+          <w:szCs w:val="24"/>
+          <w:rtl/>
+        </w:rPr>
         <w:t xml:space="preserve">היו כאלה שהבחירה הקשתה עליהן?</w:t>
       </w:r>
     </w:p>
@@ -12363,6 +15147,64 @@
           <w:rtl/>
         </w:rPr>
         <w:t xml:space="preserve">זה מה שעשיתי שנה שעברה, אז... (צוחקת) טוב. תצלומים מהתקופה הם מקור אמיתי, ותמונה של ילדה בגילן עובדת יותר מכל טקסט. מה הייתי משנה. לא "בלי טקסט". טקסט קצר בסוף. עדות של ילד עובד, כמה שורות, שבודקת את ההשערות. והייתי מוסיפה חפץ. לא רק תמונות. משהו לגעת בו. סליל, פיסת בד, פחם. נשמע קטן. חפץ ביד עושה משהו שתמונה על מסך לא. ו... הבחירה צריכה הכנה. ואחת האפשרויות כמעט בלי כתיבה.</w:t>
+      </w:r>
+    </w:p>
+    <w:p>
+      <w:pPr>
+        <w:bidi/>
+        <w:spacing w:after="120" w:line="360" w:lineRule="auto"/>
+        <w:jc w:val="both"/>
+      </w:pPr>
+      <w:r>
+        <w:rPr>
+          <w:rFonts w:ascii="David" w:cs="David" w:eastAsia="David" w:hAnsi="David"/>
+          <w:noProof/>
+          <w:b/>
+          <w:bCs/>
+          <w:sz w:val="24"/>
+          <w:szCs w:val="24"/>
+          <w:rtl/>
+        </w:rPr>
+        <w:t xml:space="preserve">מ: </w:t>
+      </w:r>
+      <w:r>
+        <w:rPr>
+          <w:rFonts w:ascii="David" w:cs="David" w:eastAsia="David" w:hAnsi="David"/>
+          <w:noProof/>
+          <w:sz w:val="24"/>
+          <w:szCs w:val="24"/>
+          <w:rtl/>
+        </w:rPr>
+        <w:t xml:space="preserve">רגע, אני אראה לך את התמונות שאני חושבת עליהן. [המראיינת מציגה שלוש תמונות מודפסות.]</w:t>
+      </w:r>
+    </w:p>
+    <w:p>
+      <w:pPr>
+        <w:bidi/>
+        <w:spacing w:after="120" w:line="360" w:lineRule="auto"/>
+        <w:jc w:val="both"/>
+      </w:pPr>
+      <w:r>
+        <w:rPr>
+          <w:rFonts w:ascii="David" w:cs="David" w:eastAsia="David" w:hAnsi="David"/>
+          <w:noProof/>
+          <w:b/>
+          <w:bCs/>
+          <w:sz w:val="24"/>
+          <w:szCs w:val="24"/>
+          <w:rtl/>
+        </w:rPr>
+        <w:t xml:space="preserve">הודיה: </w:t>
+      </w:r>
+      <w:r>
+        <w:rPr>
+          <w:rFonts w:ascii="David" w:cs="David" w:eastAsia="David" w:hAnsi="David"/>
+          <w:noProof/>
+          <w:sz w:val="24"/>
+          <w:szCs w:val="24"/>
+          <w:rtl/>
+        </w:rPr>
+        <w:t xml:space="preserve">(מסתכלת זמן מה) המפעל... זה כמעט התמונה שלי. הרחוב טוב. והמכרה. (שתיקה) המכרה חזק. הייתי שומרת אותו לסוף. לא לפתיחה. ואצלי, בכיתה עם מפונות, הייתי חושבת פעמיים אם בכלל. אולי כן. אבל לא כדבר ראשון. ו... אני הייתי מוסיפה תמונה של ילד היום. בבית ספר, במחשב, לא משנה. כי בלי "היום" הן לא מבינות מה השתנה, ומה השתנה זה בעצם השאלה של היחידה.</w:t>
       </w:r>
     </w:p>
     <w:p>
@@ -13038,7 +15880,7 @@
           <w:szCs w:val="24"/>
           <w:rtl/>
         </w:rPr>
-        <w:t xml:space="preserve">הריאיון נערך בחדר המורים של בית הספר, בשעה חופשית. משך ההקלטה: 55 דקות. שאלות מהמדריך שנשאלו: 1, 2, 3, 4, 6, 7, 8, 9, 10, 11, 13, 14, 16. הריאיון נקטע פעמיים בכניסה של מורות לחדר.</w:t>
+        <w:t xml:space="preserve">הריאיון נערך בחדר המורים של בית הספר, בשעה חופשית. משך ההקלטה: 69 דקות. שאלות מהמדריך שנשאלו: 1, 2, 3, 4, 5, 6, 7, 8, 9, 10, 11, 12, 13, 14, 16. הריאיון נקטע פעמיים בכניסה של מורות לחדר.</w:t>
       </w:r>
     </w:p>
     <w:p>
@@ -13144,6 +15986,64 @@
           <w:szCs w:val="24"/>
           <w:rtl/>
         </w:rPr>
+        <w:t xml:space="preserve">איך זה היה, להיות הראשונה במשפחה שנוסעת לאוניברסיטה?</w:t>
+      </w:r>
+    </w:p>
+    <w:p>
+      <w:pPr>
+        <w:bidi/>
+        <w:spacing w:after="120" w:line="360" w:lineRule="auto"/>
+        <w:jc w:val="both"/>
+      </w:pPr>
+      <w:r>
+        <w:rPr>
+          <w:rFonts w:ascii="David" w:cs="David" w:eastAsia="David" w:hAnsi="David"/>
+          <w:noProof/>
+          <w:b/>
+          <w:bCs/>
+          <w:sz w:val="24"/>
+          <w:szCs w:val="24"/>
+          <w:rtl/>
+        </w:rPr>
+        <w:t xml:space="preserve">עביר: </w:t>
+      </w:r>
+      <w:r>
+        <w:rPr>
+          <w:rFonts w:ascii="David" w:cs="David" w:eastAsia="David" w:hAnsi="David"/>
+          <w:noProof/>
+          <w:sz w:val="24"/>
+          <w:szCs w:val="24"/>
+          <w:rtl/>
+        </w:rPr>
+        <w:t xml:space="preserve">(צוחקת) את רוצה את הגרסה הקצרה או הארוכה. הקצרה: אבא שלי לא רצה. סבתא שלי כן. וסבתא ניצחה. (שתיקה) הארוכה: ישבתי בהרצאה על שייקספיר, בשנה הראשונה, ולא הבנתי מילה, ובכיתי בשירותים, וחשבתי לחזור הביתה. ומרצה אחת, שראתה אותי, נתנה לי סרט. "רומיאו ויוליה", הגרסה הישנה. ואמרה, תראי קודם, תקראי אחר כך. וזה... זה בעצם מה שאני עושה עם התלמידים שלי. תראו קודם. תקראו אחר כך. לקח לי שנים להבין שזה מאיפה זה בא.</w:t>
+      </w:r>
+    </w:p>
+    <w:p>
+      <w:pPr>
+        <w:bidi/>
+        <w:spacing w:after="120" w:line="360" w:lineRule="auto"/>
+        <w:jc w:val="both"/>
+      </w:pPr>
+      <w:r>
+        <w:rPr>
+          <w:rFonts w:ascii="David" w:cs="David" w:eastAsia="David" w:hAnsi="David"/>
+          <w:noProof/>
+          <w:b/>
+          <w:bCs/>
+          <w:sz w:val="24"/>
+          <w:szCs w:val="24"/>
+          <w:rtl/>
+        </w:rPr>
+        <w:t xml:space="preserve">מ: </w:t>
+      </w:r>
+      <w:r>
+        <w:rPr>
+          <w:rFonts w:ascii="David" w:cs="David" w:eastAsia="David" w:hAnsi="David"/>
+          <w:noProof/>
+          <w:sz w:val="24"/>
+          <w:szCs w:val="24"/>
+          <w:rtl/>
+        </w:rPr>
         <w:t xml:space="preserve">מה את הכי אוהבת בעבודה היום?</w:t>
       </w:r>
     </w:p>
@@ -13550,6 +16450,64 @@
           <w:szCs w:val="24"/>
           <w:rtl/>
         </w:rPr>
+        <w:t xml:space="preserve">שישה תלמידים בכיתה ח' שמתקשים באותיות. איך זה קורה?</w:t>
+      </w:r>
+    </w:p>
+    <w:p>
+      <w:pPr>
+        <w:bidi/>
+        <w:spacing w:after="120" w:line="360" w:lineRule="auto"/>
+        <w:jc w:val="both"/>
+      </w:pPr>
+      <w:r>
+        <w:rPr>
+          <w:rFonts w:ascii="David" w:cs="David" w:eastAsia="David" w:hAnsi="David"/>
+          <w:noProof/>
+          <w:b/>
+          <w:bCs/>
+          <w:sz w:val="24"/>
+          <w:szCs w:val="24"/>
+          <w:rtl/>
+        </w:rPr>
+        <w:t xml:space="preserve">עביר: </w:t>
+      </w:r>
+      <w:r>
+        <w:rPr>
+          <w:rFonts w:ascii="David" w:cs="David" w:eastAsia="David" w:hAnsi="David"/>
+          <w:noProof/>
+          <w:sz w:val="24"/>
+          <w:szCs w:val="24"/>
+          <w:rtl/>
+        </w:rPr>
+        <w:t xml:space="preserve">(נאנחת) איך זה קורה. הם למדו אנגלית מכיתה ג'. חמש שנים. ובכל שנה המורה לימדה מהספר, והם לא ראו מילים, והעתיקו, ועברו כיתה. כי מעבירים. ואף אחד לא עצר לבדוק אם הם רואים. ואני, כרכזת, מנסה לשנות את זה מלמטה, בכיתה ג' וד', עם המורות של היסודי. אבל את השישה האלה זה לא מציל. (שתיקה) עם השישה אני עובדת בנפרד. עשר דקות בסוף כל שיעור, בזמן שהשאר עובדים על משהו. אותיות, צלילים, מילים קצרות. כמו כיתה ג'. ואני לא מתביישת בזה ולא נותנת להם להתבייש. אני אומרת להם "אתם לומדים עכשיו את מה שהיו צריכים ללמד אתכם קודם. זה לא אתם.</w:t>
+      </w:r>
+    </w:p>
+    <w:p>
+      <w:pPr>
+        <w:bidi/>
+        <w:spacing w:after="120" w:line="360" w:lineRule="auto"/>
+        <w:jc w:val="both"/>
+      </w:pPr>
+      <w:r>
+        <w:rPr>
+          <w:rFonts w:ascii="David" w:cs="David" w:eastAsia="David" w:hAnsi="David"/>
+          <w:noProof/>
+          <w:b/>
+          <w:bCs/>
+          <w:sz w:val="24"/>
+          <w:szCs w:val="24"/>
+          <w:rtl/>
+        </w:rPr>
+        <w:t xml:space="preserve">מ: </w:t>
+      </w:r>
+      <w:r>
+        <w:rPr>
+          <w:rFonts w:ascii="David" w:cs="David" w:eastAsia="David" w:hAnsi="David"/>
+          <w:noProof/>
+          <w:sz w:val="24"/>
+          <w:szCs w:val="24"/>
+          <w:rtl/>
+        </w:rPr>
         <w:t xml:space="preserve">מה זה דורש ממך?</w:t>
       </w:r>
     </w:p>
@@ -13724,6 +16682,64 @@
           <w:szCs w:val="24"/>
           <w:rtl/>
         </w:rPr>
+        <w:t xml:space="preserve">מה מחמוד אמר כשהוא כתב את השמות על הלוח?</w:t>
+      </w:r>
+    </w:p>
+    <w:p>
+      <w:pPr>
+        <w:bidi/>
+        <w:spacing w:after="120" w:line="360" w:lineRule="auto"/>
+        <w:jc w:val="both"/>
+      </w:pPr>
+      <w:r>
+        <w:rPr>
+          <w:rFonts w:ascii="David" w:cs="David" w:eastAsia="David" w:hAnsi="David"/>
+          <w:noProof/>
+          <w:b/>
+          <w:bCs/>
+          <w:sz w:val="24"/>
+          <w:szCs w:val="24"/>
+          <w:rtl/>
+        </w:rPr>
+        <w:t xml:space="preserve">עביר: </w:t>
+      </w:r>
+      <w:r>
+        <w:rPr>
+          <w:rFonts w:ascii="David" w:cs="David" w:eastAsia="David" w:hAnsi="David"/>
+          <w:noProof/>
+          <w:sz w:val="24"/>
+          <w:szCs w:val="24"/>
+          <w:rtl/>
+        </w:rPr>
+        <w:t xml:space="preserve">(צוחקת) הוא כתב, ואז עמד רגע, והסתכל על מה שכתב, ואמר, בערבית, "זה אנגלית?" ואמרתי, כן. ואמר "אז אני יודע אנגלית". וכל הכיתה צחקה, אבל לא עליו. איתו. והוא ישב, ובפעם הראשונה בשנה לא נשלח החוצה באותו שיעור. ולא בשיעור שאחריו. (שתיקה) הוא לא הפך לתלמיד טוב. הוא הפך לתלמיד שנמצא. וזה המון.</w:t>
+      </w:r>
+    </w:p>
+    <w:p>
+      <w:pPr>
+        <w:bidi/>
+        <w:spacing w:after="120" w:line="360" w:lineRule="auto"/>
+        <w:jc w:val="both"/>
+      </w:pPr>
+      <w:r>
+        <w:rPr>
+          <w:rFonts w:ascii="David" w:cs="David" w:eastAsia="David" w:hAnsi="David"/>
+          <w:noProof/>
+          <w:b/>
+          <w:bCs/>
+          <w:sz w:val="24"/>
+          <w:szCs w:val="24"/>
+          <w:rtl/>
+        </w:rPr>
+        <w:t xml:space="preserve">מ: </w:t>
+      </w:r>
+      <w:r>
+        <w:rPr>
+          <w:rFonts w:ascii="David" w:cs="David" w:eastAsia="David" w:hAnsi="David"/>
+          <w:noProof/>
+          <w:sz w:val="24"/>
+          <w:szCs w:val="24"/>
+          <w:rtl/>
+        </w:rPr>
         <w:t xml:space="preserve">ומשם?</w:t>
       </w:r>
     </w:p>
@@ -13754,6 +16770,122 @@
           <w:rtl/>
         </w:rPr>
         <w:t xml:space="preserve">מילים מכדורגל. goal, team, win. שהוא מכיר מהמשחקים. ומהן לקריאה. לא חזרתי לדפי האותיות. לימדתי אותו לקרוא דרך מילים שהוא כבר יודע לשמוע. (שתיקה) הדף השונה היה פתרון של קריאה לבעיה של כבוד. זה מה שלמדתי. ותלמיד שמפריע בשיעור אנגלית כמעט תמיד לא קורא. ההפרעה היא הודעה. קוראים אותה לפני שמענישים.</w:t>
+      </w:r>
+    </w:p>
+    <w:p>
+      <w:pPr>
+        <w:bidi/>
+        <w:spacing w:after="120" w:line="360" w:lineRule="auto"/>
+        <w:jc w:val="both"/>
+      </w:pPr>
+      <w:r>
+        <w:rPr>
+          <w:rFonts w:ascii="David" w:cs="David" w:eastAsia="David" w:hAnsi="David"/>
+          <w:noProof/>
+          <w:b/>
+          <w:bCs/>
+          <w:sz w:val="24"/>
+          <w:szCs w:val="24"/>
+          <w:rtl/>
+        </w:rPr>
+        <w:t xml:space="preserve">מ: </w:t>
+      </w:r>
+      <w:r>
+        <w:rPr>
+          <w:rFonts w:ascii="David" w:cs="David" w:eastAsia="David" w:hAnsi="David"/>
+          <w:noProof/>
+          <w:sz w:val="24"/>
+          <w:szCs w:val="24"/>
+          <w:rtl/>
+        </w:rPr>
+        <w:t xml:space="preserve">איך את פותחת שיעור? יש פתיחה שאת זוכרת?</w:t>
+      </w:r>
+    </w:p>
+    <w:p>
+      <w:pPr>
+        <w:bidi/>
+        <w:spacing w:after="120" w:line="360" w:lineRule="auto"/>
+        <w:jc w:val="both"/>
+      </w:pPr>
+      <w:r>
+        <w:rPr>
+          <w:rFonts w:ascii="David" w:cs="David" w:eastAsia="David" w:hAnsi="David"/>
+          <w:noProof/>
+          <w:b/>
+          <w:bCs/>
+          <w:sz w:val="24"/>
+          <w:szCs w:val="24"/>
+          <w:rtl/>
+        </w:rPr>
+        <w:t xml:space="preserve">עביר: </w:t>
+      </w:r>
+      <w:r>
+        <w:rPr>
+          <w:rFonts w:ascii="David" w:cs="David" w:eastAsia="David" w:hAnsi="David"/>
+          <w:noProof/>
+          <w:sz w:val="24"/>
+          <w:szCs w:val="24"/>
+          <w:rtl/>
+        </w:rPr>
+        <w:t xml:space="preserve">תמיד תמונה או סרטון של דקה, שאלה אחת, ומילים על הלוח מהתשובות. לא נושא באנגלית בהתחלה, כי הנושא באנגלית זה מילים שחצי כיתה לא קוראת. (שתיקה) ואחת שאני זוכרת. זכויות ילדים, כיתה ט'. תצלום ישן של ילד ליד מכונה במפעל, ולידו, על אותו מסך, ילד ליד מחשב. ושאלה, באנגלית פשוטה, כתובה גם על הלוח: "What is the same? What is different?" דקה. ואז הם דיברו, ערבית עברית אנגלית מעורבות, ואני רשמתי באנגלית. both sit. both boys. one works. one plays. one is tired. ותלמיד אמר "the old one is sad and the new one is bored". משפט שלם. מתלמיד שלא מדבר.</w:t>
+      </w:r>
+    </w:p>
+    <w:p>
+      <w:pPr>
+        <w:bidi/>
+        <w:spacing w:after="120" w:line="360" w:lineRule="auto"/>
+        <w:jc w:val="both"/>
+      </w:pPr>
+      <w:r>
+        <w:rPr>
+          <w:rFonts w:ascii="David" w:cs="David" w:eastAsia="David" w:hAnsi="David"/>
+          <w:noProof/>
+          <w:b/>
+          <w:bCs/>
+          <w:sz w:val="24"/>
+          <w:szCs w:val="24"/>
+          <w:rtl/>
+        </w:rPr>
+        <w:t xml:space="preserve">מ: </w:t>
+      </w:r>
+      <w:r>
+        <w:rPr>
+          <w:rFonts w:ascii="David" w:cs="David" w:eastAsia="David" w:hAnsi="David"/>
+          <w:noProof/>
+          <w:sz w:val="24"/>
+          <w:szCs w:val="24"/>
+          <w:rtl/>
+        </w:rPr>
+        <w:t xml:space="preserve">מה הפך את זה למוצלח?</w:t>
+      </w:r>
+    </w:p>
+    <w:p>
+      <w:pPr>
+        <w:bidi/>
+        <w:spacing w:after="120" w:line="360" w:lineRule="auto"/>
+        <w:jc w:val="both"/>
+      </w:pPr>
+      <w:r>
+        <w:rPr>
+          <w:rFonts w:ascii="David" w:cs="David" w:eastAsia="David" w:hAnsi="David"/>
+          <w:noProof/>
+          <w:b/>
+          <w:bCs/>
+          <w:sz w:val="24"/>
+          <w:szCs w:val="24"/>
+          <w:rtl/>
+        </w:rPr>
+        <w:t xml:space="preserve">עביר: </w:t>
+      </w:r>
+      <w:r>
+        <w:rPr>
+          <w:rFonts w:ascii="David" w:cs="David" w:eastAsia="David" w:hAnsi="David"/>
+          <w:noProof/>
+          <w:sz w:val="24"/>
+          <w:szCs w:val="24"/>
+          <w:rtl/>
+        </w:rPr>
+        <w:t xml:space="preserve">בלי טקסט, אז כולם שווים. "דומה ושונה" זו שאלה שכל אחד עונה עליה בלי ידע. וילדים בגילם. עשר דקות. ואני חוזרת על זה בכל יחידה שאפשר, "שתי תמונות, דומה ושונה", כי גיליתי שההשוואה היא הדרך הכי מהירה להוציא מהם מילים באנגלית. הם רוצים להגיד משהו, והמילה מגיעה. (שתיקה) תלמידה שקטה אמרה בסוף השיעור ההוא "the same child" על שני הילדים. ואני עד היום חושבת על זה.</w:t>
       </w:r>
     </w:p>
     <w:p>
@@ -13917,6 +17049,64 @@
           <w:szCs w:val="24"/>
           <w:rtl/>
         </w:rPr>
+        <w:t xml:space="preserve">איך בחרת את שלוש התמונות?</w:t>
+      </w:r>
+    </w:p>
+    <w:p>
+      <w:pPr>
+        <w:bidi/>
+        <w:spacing w:after="120" w:line="360" w:lineRule="auto"/>
+        <w:jc w:val="both"/>
+      </w:pPr>
+      <w:r>
+        <w:rPr>
+          <w:rFonts w:ascii="David" w:cs="David" w:eastAsia="David" w:hAnsi="David"/>
+          <w:noProof/>
+          <w:b/>
+          <w:bCs/>
+          <w:sz w:val="24"/>
+          <w:szCs w:val="24"/>
+          <w:rtl/>
+        </w:rPr>
+        <w:t xml:space="preserve">עביר: </w:t>
+      </w:r>
+      <w:r>
+        <w:rPr>
+          <w:rFonts w:ascii="David" w:cs="David" w:eastAsia="David" w:hAnsi="David"/>
+          <w:noProof/>
+          <w:sz w:val="24"/>
+          <w:szCs w:val="24"/>
+          <w:rtl/>
+        </w:rPr>
+        <w:t xml:space="preserve">ממאגרים חופשיים, ואני מחפשת תמונות עם ילדים, כי הם קוראים פנים של ילדים. ושאין בהן טקסט, כי טקסט באנגלית בתמונה זה בדיוק מה שאני מנסה לדחות לסוף. ושכל אחת מראה עבודה אחרת, כדי שכל קבוצה תדע משהו שהאחרות לא. אחרת אין סיבה להקשיב להצגה. (שתיקה) ואני נמנעת מתמונות קשות מדי. יש מהמכרות שאני לא מראה. לא בכיתה ח'.</w:t>
+      </w:r>
+    </w:p>
+    <w:p>
+      <w:pPr>
+        <w:bidi/>
+        <w:spacing w:after="120" w:line="360" w:lineRule="auto"/>
+        <w:jc w:val="both"/>
+      </w:pPr>
+      <w:r>
+        <w:rPr>
+          <w:rFonts w:ascii="David" w:cs="David" w:eastAsia="David" w:hAnsi="David"/>
+          <w:noProof/>
+          <w:b/>
+          <w:bCs/>
+          <w:sz w:val="24"/>
+          <w:szCs w:val="24"/>
+          <w:rtl/>
+        </w:rPr>
+        <w:t xml:space="preserve">מ: </w:t>
+      </w:r>
+      <w:r>
+        <w:rPr>
+          <w:rFonts w:ascii="David" w:cs="David" w:eastAsia="David" w:hAnsi="David"/>
+          <w:noProof/>
+          <w:sz w:val="24"/>
+          <w:szCs w:val="24"/>
+          <w:rtl/>
+        </w:rPr>
         <w:t xml:space="preserve">מה הפתיע אותך?</w:t>
       </w:r>
     </w:p>
@@ -14207,6 +17397,122 @@
           <w:szCs w:val="24"/>
           <w:rtl/>
         </w:rPr>
+        <w:t xml:space="preserve">איזה שלוש אפשרויות היית מציעה לתלמידים שלי, בכיתה ח', למהפכה התעשייתית?</w:t>
+      </w:r>
+    </w:p>
+    <w:p>
+      <w:pPr>
+        <w:bidi/>
+        <w:spacing w:after="120" w:line="360" w:lineRule="auto"/>
+        <w:jc w:val="both"/>
+      </w:pPr>
+      <w:r>
+        <w:rPr>
+          <w:rFonts w:ascii="David" w:cs="David" w:eastAsia="David" w:hAnsi="David"/>
+          <w:noProof/>
+          <w:b/>
+          <w:bCs/>
+          <w:sz w:val="24"/>
+          <w:szCs w:val="24"/>
+          <w:rtl/>
+        </w:rPr>
+        <w:t xml:space="preserve">עביר: </w:t>
+      </w:r>
+      <w:r>
+        <w:rPr>
+          <w:rFonts w:ascii="David" w:cs="David" w:eastAsia="David" w:hAnsi="David"/>
+          <w:noProof/>
+          <w:sz w:val="24"/>
+          <w:szCs w:val="24"/>
+          <w:rtl/>
+        </w:rPr>
+        <w:t xml:space="preserve">אלבום, מכתב, קול. כמו שלי, בעצם. (צוחקת) אלבום של חמש תמונות ממאגר עם משפט או שניים לכל אחת, כי גם מי שכותב מעט מצליח. מכתב או יומן של ילד עובד, גוף ראשון, למי שאוהב להיכנס לדמות. והקלטה של דקה וחצי עם דף מילים לעזרה, כי יש תלמידים שמדברים הרבה יותר טוב ממה שכותבים. ולא הצגה חיה כחובה. אצלנו בנות לא יעמדו מול בנים. ההקלטה היא הפתרון שלהן.</w:t>
+      </w:r>
+    </w:p>
+    <w:p>
+      <w:pPr>
+        <w:bidi/>
+        <w:spacing w:after="120" w:line="360" w:lineRule="auto"/>
+        <w:jc w:val="both"/>
+      </w:pPr>
+      <w:r>
+        <w:rPr>
+          <w:rFonts w:ascii="David" w:cs="David" w:eastAsia="David" w:hAnsi="David"/>
+          <w:noProof/>
+          <w:b/>
+          <w:bCs/>
+          <w:sz w:val="24"/>
+          <w:szCs w:val="24"/>
+          <w:rtl/>
+        </w:rPr>
+        <w:t xml:space="preserve">מ: </w:t>
+      </w:r>
+      <w:r>
+        <w:rPr>
+          <w:rFonts w:ascii="David" w:cs="David" w:eastAsia="David" w:hAnsi="David"/>
+          <w:noProof/>
+          <w:sz w:val="24"/>
+          <w:szCs w:val="24"/>
+          <w:rtl/>
+        </w:rPr>
+        <w:t xml:space="preserve">איך מעריכים תוצרים כל כך שונים?</w:t>
+      </w:r>
+    </w:p>
+    <w:p>
+      <w:pPr>
+        <w:bidi/>
+        <w:spacing w:after="120" w:line="360" w:lineRule="auto"/>
+        <w:jc w:val="both"/>
+      </w:pPr>
+      <w:r>
+        <w:rPr>
+          <w:rFonts w:ascii="David" w:cs="David" w:eastAsia="David" w:hAnsi="David"/>
+          <w:noProof/>
+          <w:b/>
+          <w:bCs/>
+          <w:sz w:val="24"/>
+          <w:szCs w:val="24"/>
+          <w:rtl/>
+        </w:rPr>
+        <w:t xml:space="preserve">עביר: </w:t>
+      </w:r>
+      <w:r>
+        <w:rPr>
+          <w:rFonts w:ascii="David" w:cs="David" w:eastAsia="David" w:hAnsi="David"/>
+          <w:noProof/>
+          <w:sz w:val="24"/>
+          <w:szCs w:val="24"/>
+          <w:rtl/>
+        </w:rPr>
+        <w:t xml:space="preserve">מחוון אחד. שלושת הדברים שביקשת ושימוש בתמונות. בלי נקודות על יופי, על אורך, על איכות ההקלטה. ובשיעור היסטוריה, גם לא על שפה. וזה חשוב להגיד לתלמידים שהשפה שלהם חלשה. "אני לא בודקת עברית. אני בודקת אם הבנת." (שתיקה) ואת המחוון לפני הבחירה. ולבנות שקטות, לבחור בזוגות. לבד הן לא יבחרו.</w:t>
+      </w:r>
+    </w:p>
+    <w:p>
+      <w:pPr>
+        <w:bidi/>
+        <w:spacing w:after="120" w:line="360" w:lineRule="auto"/>
+        <w:jc w:val="both"/>
+      </w:pPr>
+      <w:r>
+        <w:rPr>
+          <w:rFonts w:ascii="David" w:cs="David" w:eastAsia="David" w:hAnsi="David"/>
+          <w:noProof/>
+          <w:b/>
+          <w:bCs/>
+          <w:sz w:val="24"/>
+          <w:szCs w:val="24"/>
+          <w:rtl/>
+        </w:rPr>
+        <w:t xml:space="preserve">מ: </w:t>
+      </w:r>
+      <w:r>
+        <w:rPr>
+          <w:rFonts w:ascii="David" w:cs="David" w:eastAsia="David" w:hAnsi="David"/>
+          <w:noProof/>
+          <w:sz w:val="24"/>
+          <w:szCs w:val="24"/>
+          <w:rtl/>
+        </w:rPr>
         <w:t xml:space="preserve">היו כאלה שהבחירה הקשתה עליהם?</w:t>
       </w:r>
     </w:p>
@@ -14265,6 +17571,64 @@
           <w:szCs w:val="24"/>
           <w:rtl/>
         </w:rPr>
+        <w:t xml:space="preserve">מה אמרת להן?</w:t>
+      </w:r>
+    </w:p>
+    <w:p>
+      <w:pPr>
+        <w:bidi/>
+        <w:spacing w:after="120" w:line="360" w:lineRule="auto"/>
+        <w:jc w:val="both"/>
+      </w:pPr>
+      <w:r>
+        <w:rPr>
+          <w:rFonts w:ascii="David" w:cs="David" w:eastAsia="David" w:hAnsi="David"/>
+          <w:noProof/>
+          <w:b/>
+          <w:bCs/>
+          <w:sz w:val="24"/>
+          <w:szCs w:val="24"/>
+          <w:rtl/>
+        </w:rPr>
+        <w:t xml:space="preserve">עביר: </w:t>
+      </w:r>
+      <w:r>
+        <w:rPr>
+          <w:rFonts w:ascii="David" w:cs="David" w:eastAsia="David" w:hAnsi="David"/>
+          <w:noProof/>
+          <w:sz w:val="24"/>
+          <w:szCs w:val="24"/>
+          <w:rtl/>
+        </w:rPr>
+        <w:t xml:space="preserve">בפעם הראשונה טעיתי ואמרתי "מה שאתן רוצות", וזה רק הלחיץ. אז בפעם השנייה ישבתי איתן, שלושתן ביחד, ושאלתי "מה יותר קל לכן, לסדר תמונות, לכתוב או לדבר". ואחת אמרה תמונות, ואחת אמרה לדבר אבל לא מול בנים, ואמרתי, אז הקלטה, בבית, אף אחד לא רואה. ואחת לא ידעה. ואמרתי לה, תתחילי עם חברה שלך באלבום, ואם אחרי עשר דקות זה לא הולך, תעברי. (שתיקה) ובנות אצלנו צריכות רשות לבחור. לא רק אפשרות. רשות. זה משהו שלוקח זמן להבין אם לא גדלת פה.</w:t>
+      </w:r>
+    </w:p>
+    <w:p>
+      <w:pPr>
+        <w:bidi/>
+        <w:spacing w:after="120" w:line="360" w:lineRule="auto"/>
+        <w:jc w:val="both"/>
+      </w:pPr>
+      <w:r>
+        <w:rPr>
+          <w:rFonts w:ascii="David" w:cs="David" w:eastAsia="David" w:hAnsi="David"/>
+          <w:noProof/>
+          <w:b/>
+          <w:bCs/>
+          <w:sz w:val="24"/>
+          <w:szCs w:val="24"/>
+          <w:rtl/>
+        </w:rPr>
+        <w:t xml:space="preserve">מ: </w:t>
+      </w:r>
+      <w:r>
+        <w:rPr>
+          <w:rFonts w:ascii="David" w:cs="David" w:eastAsia="David" w:hAnsi="David"/>
+          <w:noProof/>
+          <w:sz w:val="24"/>
+          <w:szCs w:val="24"/>
+          <w:rtl/>
+        </w:rPr>
         <w:t xml:space="preserve">כשתלמידים עובדים בקצב שונה?</w:t>
       </w:r>
     </w:p>
@@ -14527,6 +17891,64 @@
           <w:rtl/>
         </w:rPr>
         <w:t xml:space="preserve">באנגלית אני רגילה להיות המקור היחיד לשפה בכיתה. דיברתי שש דקות. אבל ראיתי מי מקשיב למי. הבנים הקשיבו לבנות. וזה לא מובן מאליו אצלנו. (שתיקה) ומחמוד עמד מול כיתה ואמר חמש מילים באנגלית. את זה לא רואים מהלוח.</w:t>
+      </w:r>
+    </w:p>
+    <w:p>
+      <w:pPr>
+        <w:bidi/>
+        <w:spacing w:after="120" w:line="360" w:lineRule="auto"/>
+        <w:jc w:val="both"/>
+      </w:pPr>
+      <w:r>
+        <w:rPr>
+          <w:rFonts w:ascii="David" w:cs="David" w:eastAsia="David" w:hAnsi="David"/>
+          <w:noProof/>
+          <w:b/>
+          <w:bCs/>
+          <w:sz w:val="24"/>
+          <w:szCs w:val="24"/>
+          <w:rtl/>
+        </w:rPr>
+        <w:t xml:space="preserve">מ: </w:t>
+      </w:r>
+      <w:r>
+        <w:rPr>
+          <w:rFonts w:ascii="David" w:cs="David" w:eastAsia="David" w:hAnsi="David"/>
+          <w:noProof/>
+          <w:sz w:val="24"/>
+          <w:szCs w:val="24"/>
+          <w:rtl/>
+        </w:rPr>
+        <w:t xml:space="preserve">ומה למדת על התלמידים מההצגה?</w:t>
+      </w:r>
+    </w:p>
+    <w:p>
+      <w:pPr>
+        <w:bidi/>
+        <w:spacing w:after="120" w:line="360" w:lineRule="auto"/>
+        <w:jc w:val="both"/>
+      </w:pPr>
+      <w:r>
+        <w:rPr>
+          <w:rFonts w:ascii="David" w:cs="David" w:eastAsia="David" w:hAnsi="David"/>
+          <w:noProof/>
+          <w:b/>
+          <w:bCs/>
+          <w:sz w:val="24"/>
+          <w:szCs w:val="24"/>
+          <w:rtl/>
+        </w:rPr>
+        <w:t xml:space="preserve">עביר: </w:t>
+      </w:r>
+      <w:r>
+        <w:rPr>
+          <w:rFonts w:ascii="David" w:cs="David" w:eastAsia="David" w:hAnsi="David"/>
+          <w:noProof/>
+          <w:sz w:val="24"/>
+          <w:szCs w:val="24"/>
+          <w:rtl/>
+        </w:rPr>
+        <w:t xml:space="preserve">שתלמידה שחשבתי שהיא חלשה מסבירה מצוין בעל פה. הכתיבה מסתירה אותה. שמחמוד יודע לעמוד מול כיתה. ו... (שתיקה) שהם מבינים יותר ממה שהם כותבים. הרבה יותר. כל השנים בדקתי אותם בכתב, וכתב זה בדיוק מה שאין להם. אז מה בדקתי? מאז אני עושה שיעור כזה בסוף כל יחידה. ומקפידה שכל קבוצה תציג משהו שהאחרים לא ראו, כי אז יש סיבה להקשיב. ומרשה לענות בכל שפה. המטרה שיבינו. את האנגלית אני מוסיפה על הלוח.</w:t>
       </w:r>
     </w:p>
     <w:p>

</xml_diff>

<commit_message>
Rename two interviewee pseudonyms (מאי, רינאד)
Co-Authored-By: Claude Fable 5.1 <noreply@anthropic.com>
Claude-Session: https://claude.ai/code/session_011Z9C2ptByc9jQga6MDruQz
</commit_message>
<xml_diff>
--- a/deliverables/ראיונות_6_מורות_מחקר_גישוש.docx
+++ b/deliverables/ראיונות_6_מורות_מחקר_גישוש.docx
@@ -4497,7 +4497,7 @@
           <w:szCs w:val="28"/>
           <w:rtl/>
         </w:rPr>
-        <w:t xml:space="preserve">ריאיון מס' 2: סמאח (שם בדוי)</w:t>
+        <w:t xml:space="preserve">ריאיון מס' 2: מאי (שם בדוי)</w:t>
       </w:r>
     </w:p>
     <w:p>
@@ -4583,26 +4583,26 @@
           <w:szCs w:val="24"/>
           <w:rtl/>
         </w:rPr>
-        <w:t xml:space="preserve">רגע, אני בודקת שההקלטה רצה... כן. אז תודה, סמאח. אני יודעת שזה בערב ואת אחרי יום.</w:t>
-      </w:r>
-    </w:p>
-    <w:p>
-      <w:pPr>
-        <w:bidi/>
-        <w:spacing w:after="120" w:line="360" w:lineRule="auto"/>
-        <w:jc w:val="both"/>
-      </w:pPr>
-      <w:r>
-        <w:rPr>
-          <w:rFonts w:ascii="David" w:cs="David" w:eastAsia="David" w:hAnsi="David"/>
-          <w:noProof/>
-          <w:b/>
-          <w:bCs/>
-          <w:sz w:val="24"/>
-          <w:szCs w:val="24"/>
-          <w:rtl/>
-        </w:rPr>
-        <w:t xml:space="preserve">סמאח: </w:t>
+        <w:t xml:space="preserve">רגע, אני בודקת שההקלטה רצה... כן. אז תודה, מאי. אני יודעת שזה בערב ואת אחרי יום.</w:t>
+      </w:r>
+    </w:p>
+    <w:p>
+      <w:pPr>
+        <w:bidi/>
+        <w:spacing w:after="120" w:line="360" w:lineRule="auto"/>
+        <w:jc w:val="both"/>
+      </w:pPr>
+      <w:r>
+        <w:rPr>
+          <w:rFonts w:ascii="David" w:cs="David" w:eastAsia="David" w:hAnsi="David"/>
+          <w:noProof/>
+          <w:b/>
+          <w:bCs/>
+          <w:sz w:val="24"/>
+          <w:szCs w:val="24"/>
+          <w:rtl/>
+        </w:rPr>
+        <w:t xml:space="preserve">מאי: </w:t>
       </w:r>
       <w:r>
         <w:rPr>
@@ -4660,7 +4660,7 @@
           <w:szCs w:val="24"/>
           <w:rtl/>
         </w:rPr>
-        <w:t xml:space="preserve">סמאח: </w:t>
+        <w:t xml:space="preserve">מאי: </w:t>
       </w:r>
       <w:r>
         <w:rPr>
@@ -4718,7 +4718,7 @@
           <w:szCs w:val="24"/>
           <w:rtl/>
         </w:rPr>
-        <w:t xml:space="preserve">סמאח: </w:t>
+        <w:t xml:space="preserve">מאי: </w:t>
       </w:r>
       <w:r>
         <w:rPr>
@@ -4776,7 +4776,7 @@
           <w:szCs w:val="24"/>
           <w:rtl/>
         </w:rPr>
-        <w:t xml:space="preserve">סמאח: </w:t>
+        <w:t xml:space="preserve">מאי: </w:t>
       </w:r>
       <w:r>
         <w:rPr>
@@ -4834,7 +4834,7 @@
           <w:szCs w:val="24"/>
           <w:rtl/>
         </w:rPr>
-        <w:t xml:space="preserve">סמאח: </w:t>
+        <w:t xml:space="preserve">מאי: </w:t>
       </w:r>
       <w:r>
         <w:rPr>
@@ -4892,7 +4892,7 @@
           <w:szCs w:val="24"/>
           <w:rtl/>
         </w:rPr>
-        <w:t xml:space="preserve">סמאח: </w:t>
+        <w:t xml:space="preserve">מאי: </w:t>
       </w:r>
       <w:r>
         <w:rPr>
@@ -4950,7 +4950,7 @@
           <w:szCs w:val="24"/>
           <w:rtl/>
         </w:rPr>
-        <w:t xml:space="preserve">סמאח: </w:t>
+        <w:t xml:space="preserve">מאי: </w:t>
       </w:r>
       <w:r>
         <w:rPr>
@@ -5008,7 +5008,7 @@
           <w:szCs w:val="24"/>
           <w:rtl/>
         </w:rPr>
-        <w:t xml:space="preserve">סמאח: </w:t>
+        <w:t xml:space="preserve">מאי: </w:t>
       </w:r>
       <w:r>
         <w:rPr>
@@ -5066,7 +5066,7 @@
           <w:szCs w:val="24"/>
           <w:rtl/>
         </w:rPr>
-        <w:t xml:space="preserve">סמאח: </w:t>
+        <w:t xml:space="preserve">מאי: </w:t>
       </w:r>
       <w:r>
         <w:rPr>
@@ -5124,7 +5124,7 @@
           <w:szCs w:val="24"/>
           <w:rtl/>
         </w:rPr>
-        <w:t xml:space="preserve">סמאח: </w:t>
+        <w:t xml:space="preserve">מאי: </w:t>
       </w:r>
       <w:r>
         <w:rPr>
@@ -5172,7 +5172,7 @@
           <w:szCs w:val="24"/>
           <w:rtl/>
         </w:rPr>
-        <w:t xml:space="preserve">סמאח: </w:t>
+        <w:t xml:space="preserve">מאי: </w:t>
       </w:r>
       <w:r>
         <w:rPr>
@@ -5230,7 +5230,7 @@
           <w:szCs w:val="24"/>
           <w:rtl/>
         </w:rPr>
-        <w:t xml:space="preserve">סמאח: </w:t>
+        <w:t xml:space="preserve">מאי: </w:t>
       </w:r>
       <w:r>
         <w:rPr>
@@ -5288,7 +5288,7 @@
           <w:szCs w:val="24"/>
           <w:rtl/>
         </w:rPr>
-        <w:t xml:space="preserve">סמאח: </w:t>
+        <w:t xml:space="preserve">מאי: </w:t>
       </w:r>
       <w:r>
         <w:rPr>
@@ -5346,7 +5346,7 @@
           <w:szCs w:val="24"/>
           <w:rtl/>
         </w:rPr>
-        <w:t xml:space="preserve">סמאח: </w:t>
+        <w:t xml:space="preserve">מאי: </w:t>
       </w:r>
       <w:r>
         <w:rPr>
@@ -5404,7 +5404,7 @@
           <w:szCs w:val="24"/>
           <w:rtl/>
         </w:rPr>
-        <w:t xml:space="preserve">סמאח: </w:t>
+        <w:t xml:space="preserve">מאי: </w:t>
       </w:r>
       <w:r>
         <w:rPr>
@@ -5462,7 +5462,7 @@
           <w:szCs w:val="24"/>
           <w:rtl/>
         </w:rPr>
-        <w:t xml:space="preserve">סמאח: </w:t>
+        <w:t xml:space="preserve">מאי: </w:t>
       </w:r>
       <w:r>
         <w:rPr>
@@ -5520,7 +5520,7 @@
           <w:szCs w:val="24"/>
           <w:rtl/>
         </w:rPr>
-        <w:t xml:space="preserve">סמאח: </w:t>
+        <w:t xml:space="preserve">מאי: </w:t>
       </w:r>
       <w:r>
         <w:rPr>
@@ -5578,7 +5578,7 @@
           <w:szCs w:val="24"/>
           <w:rtl/>
         </w:rPr>
-        <w:t xml:space="preserve">סמאח: </w:t>
+        <w:t xml:space="preserve">מאי: </w:t>
       </w:r>
       <w:r>
         <w:rPr>
@@ -5636,7 +5636,7 @@
           <w:szCs w:val="24"/>
           <w:rtl/>
         </w:rPr>
-        <w:t xml:space="preserve">סמאח: </w:t>
+        <w:t xml:space="preserve">מאי: </w:t>
       </w:r>
       <w:r>
         <w:rPr>
@@ -5694,7 +5694,7 @@
           <w:szCs w:val="24"/>
           <w:rtl/>
         </w:rPr>
-        <w:t xml:space="preserve">סמאח: </w:t>
+        <w:t xml:space="preserve">מאי: </w:t>
       </w:r>
       <w:r>
         <w:rPr>
@@ -5752,7 +5752,7 @@
           <w:szCs w:val="24"/>
           <w:rtl/>
         </w:rPr>
-        <w:t xml:space="preserve">סמאח: </w:t>
+        <w:t xml:space="preserve">מאי: </w:t>
       </w:r>
       <w:r>
         <w:rPr>
@@ -5810,7 +5810,7 @@
           <w:szCs w:val="24"/>
           <w:rtl/>
         </w:rPr>
-        <w:t xml:space="preserve">סמאח: </w:t>
+        <w:t xml:space="preserve">מאי: </w:t>
       </w:r>
       <w:r>
         <w:rPr>
@@ -5868,7 +5868,7 @@
           <w:szCs w:val="24"/>
           <w:rtl/>
         </w:rPr>
-        <w:t xml:space="preserve">סמאח: </w:t>
+        <w:t xml:space="preserve">מאי: </w:t>
       </w:r>
       <w:r>
         <w:rPr>
@@ -5926,7 +5926,7 @@
           <w:szCs w:val="24"/>
           <w:rtl/>
         </w:rPr>
-        <w:t xml:space="preserve">סמאח: </w:t>
+        <w:t xml:space="preserve">מאי: </w:t>
       </w:r>
       <w:r>
         <w:rPr>
@@ -5984,7 +5984,7 @@
           <w:szCs w:val="24"/>
           <w:rtl/>
         </w:rPr>
-        <w:t xml:space="preserve">סמאח: </w:t>
+        <w:t xml:space="preserve">מאי: </w:t>
       </w:r>
       <w:r>
         <w:rPr>
@@ -6042,7 +6042,7 @@
           <w:szCs w:val="24"/>
           <w:rtl/>
         </w:rPr>
-        <w:t xml:space="preserve">סמאח: </w:t>
+        <w:t xml:space="preserve">מאי: </w:t>
       </w:r>
       <w:r>
         <w:rPr>
@@ -6100,7 +6100,7 @@
           <w:szCs w:val="24"/>
           <w:rtl/>
         </w:rPr>
-        <w:t xml:space="preserve">סמאח: </w:t>
+        <w:t xml:space="preserve">מאי: </w:t>
       </w:r>
       <w:r>
         <w:rPr>
@@ -6158,7 +6158,7 @@
           <w:szCs w:val="24"/>
           <w:rtl/>
         </w:rPr>
-        <w:t xml:space="preserve">סמאח: </w:t>
+        <w:t xml:space="preserve">מאי: </w:t>
       </w:r>
       <w:r>
         <w:rPr>
@@ -6216,7 +6216,7 @@
           <w:szCs w:val="24"/>
           <w:rtl/>
         </w:rPr>
-        <w:t xml:space="preserve">סמאח: </w:t>
+        <w:t xml:space="preserve">מאי: </w:t>
       </w:r>
       <w:r>
         <w:rPr>
@@ -6274,7 +6274,7 @@
           <w:szCs w:val="24"/>
           <w:rtl/>
         </w:rPr>
-        <w:t xml:space="preserve">סמאח: </w:t>
+        <w:t xml:space="preserve">מאי: </w:t>
       </w:r>
       <w:r>
         <w:rPr>
@@ -6332,7 +6332,7 @@
           <w:szCs w:val="24"/>
           <w:rtl/>
         </w:rPr>
-        <w:t xml:space="preserve">סמאח: </w:t>
+        <w:t xml:space="preserve">מאי: </w:t>
       </w:r>
       <w:r>
         <w:rPr>
@@ -6390,7 +6390,7 @@
           <w:szCs w:val="24"/>
           <w:rtl/>
         </w:rPr>
-        <w:t xml:space="preserve">סמאח: </w:t>
+        <w:t xml:space="preserve">מאי: </w:t>
       </w:r>
       <w:r>
         <w:rPr>
@@ -6448,7 +6448,7 @@
           <w:szCs w:val="24"/>
           <w:rtl/>
         </w:rPr>
-        <w:t xml:space="preserve">סמאח: </w:t>
+        <w:t xml:space="preserve">מאי: </w:t>
       </w:r>
       <w:r>
         <w:rPr>
@@ -6506,7 +6506,7 @@
           <w:szCs w:val="24"/>
           <w:rtl/>
         </w:rPr>
-        <w:t xml:space="preserve">סמאח: </w:t>
+        <w:t xml:space="preserve">מאי: </w:t>
       </w:r>
       <w:r>
         <w:rPr>
@@ -6564,7 +6564,7 @@
           <w:szCs w:val="24"/>
           <w:rtl/>
         </w:rPr>
-        <w:t xml:space="preserve">סמאח: </w:t>
+        <w:t xml:space="preserve">מאי: </w:t>
       </w:r>
       <w:r>
         <w:rPr>
@@ -6622,7 +6622,7 @@
           <w:szCs w:val="24"/>
           <w:rtl/>
         </w:rPr>
-        <w:t xml:space="preserve">סמאח: </w:t>
+        <w:t xml:space="preserve">מאי: </w:t>
       </w:r>
       <w:r>
         <w:rPr>
@@ -6680,7 +6680,7 @@
           <w:szCs w:val="24"/>
           <w:rtl/>
         </w:rPr>
-        <w:t xml:space="preserve">סמאח: </w:t>
+        <w:t xml:space="preserve">מאי: </w:t>
       </w:r>
       <w:r>
         <w:rPr>
@@ -6738,7 +6738,7 @@
           <w:szCs w:val="24"/>
           <w:rtl/>
         </w:rPr>
-        <w:t xml:space="preserve">סמאח: </w:t>
+        <w:t xml:space="preserve">מאי: </w:t>
       </w:r>
       <w:r>
         <w:rPr>
@@ -6796,7 +6796,7 @@
           <w:szCs w:val="24"/>
           <w:rtl/>
         </w:rPr>
-        <w:t xml:space="preserve">סמאח: </w:t>
+        <w:t xml:space="preserve">מאי: </w:t>
       </w:r>
       <w:r>
         <w:rPr>
@@ -6854,7 +6854,7 @@
           <w:szCs w:val="24"/>
           <w:rtl/>
         </w:rPr>
-        <w:t xml:space="preserve">סמאח: </w:t>
+        <w:t xml:space="preserve">מאי: </w:t>
       </w:r>
       <w:r>
         <w:rPr>
@@ -6912,7 +6912,7 @@
           <w:szCs w:val="24"/>
           <w:rtl/>
         </w:rPr>
-        <w:t xml:space="preserve">סמאח: </w:t>
+        <w:t xml:space="preserve">מאי: </w:t>
       </w:r>
       <w:r>
         <w:rPr>
@@ -6970,7 +6970,7 @@
           <w:szCs w:val="24"/>
           <w:rtl/>
         </w:rPr>
-        <w:t xml:space="preserve">סמאח: </w:t>
+        <w:t xml:space="preserve">מאי: </w:t>
       </w:r>
       <w:r>
         <w:rPr>
@@ -7028,7 +7028,7 @@
           <w:szCs w:val="24"/>
           <w:rtl/>
         </w:rPr>
-        <w:t xml:space="preserve">סמאח: </w:t>
+        <w:t xml:space="preserve">מאי: </w:t>
       </w:r>
       <w:r>
         <w:rPr>
@@ -7086,7 +7086,7 @@
           <w:szCs w:val="24"/>
           <w:rtl/>
         </w:rPr>
-        <w:t xml:space="preserve">סמאח: </w:t>
+        <w:t xml:space="preserve">מאי: </w:t>
       </w:r>
       <w:r>
         <w:rPr>
@@ -7144,7 +7144,7 @@
           <w:szCs w:val="24"/>
           <w:rtl/>
         </w:rPr>
-        <w:t xml:space="preserve">סמאח: </w:t>
+        <w:t xml:space="preserve">מאי: </w:t>
       </w:r>
       <w:r>
         <w:rPr>
@@ -7202,7 +7202,7 @@
           <w:szCs w:val="24"/>
           <w:rtl/>
         </w:rPr>
-        <w:t xml:space="preserve">סמאח: </w:t>
+        <w:t xml:space="preserve">מאי: </w:t>
       </w:r>
       <w:r>
         <w:rPr>
@@ -7260,7 +7260,7 @@
           <w:szCs w:val="24"/>
           <w:rtl/>
         </w:rPr>
-        <w:t xml:space="preserve">סמאח: </w:t>
+        <w:t xml:space="preserve">מאי: </w:t>
       </w:r>
       <w:r>
         <w:rPr>
@@ -7318,7 +7318,7 @@
           <w:szCs w:val="24"/>
           <w:rtl/>
         </w:rPr>
-        <w:t xml:space="preserve">סמאח: </w:t>
+        <w:t xml:space="preserve">מאי: </w:t>
       </w:r>
       <w:r>
         <w:rPr>
@@ -7376,7 +7376,7 @@
           <w:szCs w:val="24"/>
           <w:rtl/>
         </w:rPr>
-        <w:t xml:space="preserve">סמאח: </w:t>
+        <w:t xml:space="preserve">מאי: </w:t>
       </w:r>
       <w:r>
         <w:rPr>
@@ -7434,7 +7434,7 @@
           <w:szCs w:val="24"/>
           <w:rtl/>
         </w:rPr>
-        <w:t xml:space="preserve">סמאח: </w:t>
+        <w:t xml:space="preserve">מאי: </w:t>
       </w:r>
       <w:r>
         <w:rPr>
@@ -7492,7 +7492,7 @@
           <w:szCs w:val="24"/>
           <w:rtl/>
         </w:rPr>
-        <w:t xml:space="preserve">סמאח: </w:t>
+        <w:t xml:space="preserve">מאי: </w:t>
       </w:r>
       <w:r>
         <w:rPr>
@@ -7550,7 +7550,7 @@
           <w:szCs w:val="24"/>
           <w:rtl/>
         </w:rPr>
-        <w:t xml:space="preserve">סמאח: </w:t>
+        <w:t xml:space="preserve">מאי: </w:t>
       </w:r>
       <w:r>
         <w:rPr>
@@ -7608,7 +7608,7 @@
           <w:szCs w:val="24"/>
           <w:rtl/>
         </w:rPr>
-        <w:t xml:space="preserve">סמאח: </w:t>
+        <w:t xml:space="preserve">מאי: </w:t>
       </w:r>
       <w:r>
         <w:rPr>
@@ -7666,7 +7666,7 @@
           <w:szCs w:val="24"/>
           <w:rtl/>
         </w:rPr>
-        <w:t xml:space="preserve">סמאח: </w:t>
+        <w:t xml:space="preserve">מאי: </w:t>
       </w:r>
       <w:r>
         <w:rPr>
@@ -7724,7 +7724,7 @@
           <w:szCs w:val="24"/>
           <w:rtl/>
         </w:rPr>
-        <w:t xml:space="preserve">סמאח: </w:t>
+        <w:t xml:space="preserve">מאי: </w:t>
       </w:r>
       <w:r>
         <w:rPr>
@@ -15842,7 +15842,7 @@
           <w:szCs w:val="28"/>
           <w:rtl/>
         </w:rPr>
-        <w:t xml:space="preserve">ריאיון מס' 6: עביר (שם בדוי)</w:t>
+        <w:t xml:space="preserve">ריאיון מס' 6: רינאד (שם בדוי)</w:t>
       </w:r>
     </w:p>
     <w:p>
@@ -15947,7 +15947,7 @@
           <w:szCs w:val="24"/>
           <w:rtl/>
         </w:rPr>
-        <w:t xml:space="preserve">עביר: </w:t>
+        <w:t xml:space="preserve">רינאד: </w:t>
       </w:r>
       <w:r>
         <w:rPr>
@@ -16005,7 +16005,7 @@
           <w:szCs w:val="24"/>
           <w:rtl/>
         </w:rPr>
-        <w:t xml:space="preserve">עביר: </w:t>
+        <w:t xml:space="preserve">רינאד: </w:t>
       </w:r>
       <w:r>
         <w:rPr>
@@ -16063,7 +16063,7 @@
           <w:szCs w:val="24"/>
           <w:rtl/>
         </w:rPr>
-        <w:t xml:space="preserve">עביר: </w:t>
+        <w:t xml:space="preserve">רינאד: </w:t>
       </w:r>
       <w:r>
         <w:rPr>
@@ -16121,7 +16121,7 @@
           <w:szCs w:val="24"/>
           <w:rtl/>
         </w:rPr>
-        <w:t xml:space="preserve">עביר: </w:t>
+        <w:t xml:space="preserve">רינאד: </w:t>
       </w:r>
       <w:r>
         <w:rPr>
@@ -16179,7 +16179,7 @@
           <w:szCs w:val="24"/>
           <w:rtl/>
         </w:rPr>
-        <w:t xml:space="preserve">עביר: </w:t>
+        <w:t xml:space="preserve">רינאד: </w:t>
       </w:r>
       <w:r>
         <w:rPr>
@@ -16237,7 +16237,7 @@
           <w:szCs w:val="24"/>
           <w:rtl/>
         </w:rPr>
-        <w:t xml:space="preserve">עביר: </w:t>
+        <w:t xml:space="preserve">רינאד: </w:t>
       </w:r>
       <w:r>
         <w:rPr>
@@ -16295,7 +16295,7 @@
           <w:szCs w:val="24"/>
           <w:rtl/>
         </w:rPr>
-        <w:t xml:space="preserve">עביר: </w:t>
+        <w:t xml:space="preserve">רינאד: </w:t>
       </w:r>
       <w:r>
         <w:rPr>
@@ -16353,7 +16353,7 @@
           <w:szCs w:val="24"/>
           <w:rtl/>
         </w:rPr>
-        <w:t xml:space="preserve">עביר: </w:t>
+        <w:t xml:space="preserve">רינאד: </w:t>
       </w:r>
       <w:r>
         <w:rPr>
@@ -16411,7 +16411,7 @@
           <w:szCs w:val="24"/>
           <w:rtl/>
         </w:rPr>
-        <w:t xml:space="preserve">עביר: </w:t>
+        <w:t xml:space="preserve">רינאד: </w:t>
       </w:r>
       <w:r>
         <w:rPr>
@@ -16469,17 +16469,17 @@
           <w:szCs w:val="24"/>
           <w:rtl/>
         </w:rPr>
-        <w:t xml:space="preserve">עביר: </w:t>
-      </w:r>
-      <w:r>
-        <w:rPr>
-          <w:rFonts w:ascii="David" w:cs="David" w:eastAsia="David" w:hAnsi="David"/>
-          <w:noProof/>
-          <w:sz w:val="24"/>
-          <w:szCs w:val="24"/>
-          <w:rtl/>
-        </w:rPr>
-        <w:t xml:space="preserve">(נאנחת) איך זה קורה. הם למדו אנגלית מכיתה ג'. חמש שנים. ובכל שנה המורה לימדה מהספר, והם לא ראו מילים, והעתיקו, ועברו כיתה. כי מעבירים. ואף אחד לא עצר לבדוק אם הם רואים. ואני, כרכזת, מנסה לשנות את זה מלמטה, בכיתה ג' וד', עם המורות של היסודי. אבל את השישה האלה זה לא מציל. (שתיקה) עם השישה אני עובדת בנפרד. עשר דקות בסוף כל שיעור, בזמן שהשאר עובדים על משהו. אותיות, צלילים, מילים קצרות. כמו כיתה ג'. ואני לא מתביישת בזה ולא נותנת להם להתבייש. אני אומרת להם "אתם לומדים עכשיו את מה שהיו צריכים ללמד אתכם קודם. זה לא אתם.</w:t>
+        <w:t xml:space="preserve">רינאד: </w:t>
+      </w:r>
+      <w:r>
+        <w:rPr>
+          <w:rFonts w:ascii="David" w:cs="David" w:eastAsia="David" w:hAnsi="David"/>
+          <w:noProof/>
+          <w:sz w:val="24"/>
+          <w:szCs w:val="24"/>
+          <w:rtl/>
+        </w:rPr>
+        <w:t xml:space="preserve">(נאנחת) איך זה קורה. הם למדו אנגלית מכיתה ג'. חמש שנים. ובכל שנה המורה לימדה מהספר, והם לא ראו מילים, והעתיקו, ועברו כיתה. כי מרינאדים. ואף אחד לא עצר לבדוק אם הם רואים. ואני, כרכזת, מנסה לשנות את זה מלמטה, בכיתה ג' וד', עם המורות של היסודי. אבל את השישה האלה זה לא מציל. (שתיקה) עם השישה אני עובדת בנפרד. עשר דקות בסוף כל שיעור, בזמן שהשאר עובדים על משהו. אותיות, צלילים, מילים קצרות. כמו כיתה ג'. ואני לא מתביישת בזה ולא נותנת להם להתבייש. אני אומרת להם "אתם לומדים עכשיו את מה שהיו צריכים ללמד אתכם קודם. זה לא אתם.</w:t>
       </w:r>
     </w:p>
     <w:p>
@@ -16527,7 +16527,7 @@
           <w:szCs w:val="24"/>
           <w:rtl/>
         </w:rPr>
-        <w:t xml:space="preserve">עביר: </w:t>
+        <w:t xml:space="preserve">רינאד: </w:t>
       </w:r>
       <w:r>
         <w:rPr>
@@ -16585,7 +16585,7 @@
           <w:szCs w:val="24"/>
           <w:rtl/>
         </w:rPr>
-        <w:t xml:space="preserve">עביר: </w:t>
+        <w:t xml:space="preserve">רינאד: </w:t>
       </w:r>
       <w:r>
         <w:rPr>
@@ -16643,7 +16643,7 @@
           <w:szCs w:val="24"/>
           <w:rtl/>
         </w:rPr>
-        <w:t xml:space="preserve">עביר: </w:t>
+        <w:t xml:space="preserve">רינאד: </w:t>
       </w:r>
       <w:r>
         <w:rPr>
@@ -16701,7 +16701,7 @@
           <w:szCs w:val="24"/>
           <w:rtl/>
         </w:rPr>
-        <w:t xml:space="preserve">עביר: </w:t>
+        <w:t xml:space="preserve">רינאד: </w:t>
       </w:r>
       <w:r>
         <w:rPr>
@@ -16759,7 +16759,7 @@
           <w:szCs w:val="24"/>
           <w:rtl/>
         </w:rPr>
-        <w:t xml:space="preserve">עביר: </w:t>
+        <w:t xml:space="preserve">רינאד: </w:t>
       </w:r>
       <w:r>
         <w:rPr>
@@ -16817,7 +16817,7 @@
           <w:szCs w:val="24"/>
           <w:rtl/>
         </w:rPr>
-        <w:t xml:space="preserve">עביר: </w:t>
+        <w:t xml:space="preserve">רינאד: </w:t>
       </w:r>
       <w:r>
         <w:rPr>
@@ -16875,7 +16875,7 @@
           <w:szCs w:val="24"/>
           <w:rtl/>
         </w:rPr>
-        <w:t xml:space="preserve">עביר: </w:t>
+        <w:t xml:space="preserve">רינאד: </w:t>
       </w:r>
       <w:r>
         <w:rPr>
@@ -16952,7 +16952,7 @@
           <w:szCs w:val="24"/>
           <w:rtl/>
         </w:rPr>
-        <w:t xml:space="preserve">עביר: </w:t>
+        <w:t xml:space="preserve">רינאד: </w:t>
       </w:r>
       <w:r>
         <w:rPr>
@@ -17010,7 +17010,7 @@
           <w:szCs w:val="24"/>
           <w:rtl/>
         </w:rPr>
-        <w:t xml:space="preserve">עביר: </w:t>
+        <w:t xml:space="preserve">רינאד: </w:t>
       </w:r>
       <w:r>
         <w:rPr>
@@ -17068,7 +17068,7 @@
           <w:szCs w:val="24"/>
           <w:rtl/>
         </w:rPr>
-        <w:t xml:space="preserve">עביר: </w:t>
+        <w:t xml:space="preserve">רינאד: </w:t>
       </w:r>
       <w:r>
         <w:rPr>
@@ -17126,7 +17126,7 @@
           <w:szCs w:val="24"/>
           <w:rtl/>
         </w:rPr>
-        <w:t xml:space="preserve">עביר: </w:t>
+        <w:t xml:space="preserve">רינאד: </w:t>
       </w:r>
       <w:r>
         <w:rPr>
@@ -17184,7 +17184,7 @@
           <w:szCs w:val="24"/>
           <w:rtl/>
         </w:rPr>
-        <w:t xml:space="preserve">עביר: </w:t>
+        <w:t xml:space="preserve">רינאד: </w:t>
       </w:r>
       <w:r>
         <w:rPr>
@@ -17242,7 +17242,7 @@
           <w:szCs w:val="24"/>
           <w:rtl/>
         </w:rPr>
-        <w:t xml:space="preserve">עביר: </w:t>
+        <w:t xml:space="preserve">רינאד: </w:t>
       </w:r>
       <w:r>
         <w:rPr>
@@ -17300,7 +17300,7 @@
           <w:szCs w:val="24"/>
           <w:rtl/>
         </w:rPr>
-        <w:t xml:space="preserve">עביר: </w:t>
+        <w:t xml:space="preserve">רינאד: </w:t>
       </w:r>
       <w:r>
         <w:rPr>
@@ -17358,7 +17358,7 @@
           <w:szCs w:val="24"/>
           <w:rtl/>
         </w:rPr>
-        <w:t xml:space="preserve">עביר: </w:t>
+        <w:t xml:space="preserve">רינאד: </w:t>
       </w:r>
       <w:r>
         <w:rPr>
@@ -17416,7 +17416,7 @@
           <w:szCs w:val="24"/>
           <w:rtl/>
         </w:rPr>
-        <w:t xml:space="preserve">עביר: </w:t>
+        <w:t xml:space="preserve">רינאד: </w:t>
       </w:r>
       <w:r>
         <w:rPr>
@@ -17474,7 +17474,7 @@
           <w:szCs w:val="24"/>
           <w:rtl/>
         </w:rPr>
-        <w:t xml:space="preserve">עביר: </w:t>
+        <w:t xml:space="preserve">רינאד: </w:t>
       </w:r>
       <w:r>
         <w:rPr>
@@ -17532,7 +17532,7 @@
           <w:szCs w:val="24"/>
           <w:rtl/>
         </w:rPr>
-        <w:t xml:space="preserve">עביר: </w:t>
+        <w:t xml:space="preserve">רינאד: </w:t>
       </w:r>
       <w:r>
         <w:rPr>
@@ -17590,7 +17590,7 @@
           <w:szCs w:val="24"/>
           <w:rtl/>
         </w:rPr>
-        <w:t xml:space="preserve">עביר: </w:t>
+        <w:t xml:space="preserve">רינאד: </w:t>
       </w:r>
       <w:r>
         <w:rPr>
@@ -17648,7 +17648,7 @@
           <w:szCs w:val="24"/>
           <w:rtl/>
         </w:rPr>
-        <w:t xml:space="preserve">עביר: </w:t>
+        <w:t xml:space="preserve">רינאד: </w:t>
       </w:r>
       <w:r>
         <w:rPr>
@@ -17706,7 +17706,7 @@
           <w:szCs w:val="24"/>
           <w:rtl/>
         </w:rPr>
-        <w:t xml:space="preserve">עביר: </w:t>
+        <w:t xml:space="preserve">רינאד: </w:t>
       </w:r>
       <w:r>
         <w:rPr>
@@ -17764,7 +17764,7 @@
           <w:szCs w:val="24"/>
           <w:rtl/>
         </w:rPr>
-        <w:t xml:space="preserve">עביר: </w:t>
+        <w:t xml:space="preserve">רינאד: </w:t>
       </w:r>
       <w:r>
         <w:rPr>
@@ -17822,7 +17822,7 @@
           <w:szCs w:val="24"/>
           <w:rtl/>
         </w:rPr>
-        <w:t xml:space="preserve">עביר: </w:t>
+        <w:t xml:space="preserve">רינאד: </w:t>
       </w:r>
       <w:r>
         <w:rPr>
@@ -17880,7 +17880,7 @@
           <w:szCs w:val="24"/>
           <w:rtl/>
         </w:rPr>
-        <w:t xml:space="preserve">עביר: </w:t>
+        <w:t xml:space="preserve">רינאד: </w:t>
       </w:r>
       <w:r>
         <w:rPr>
@@ -17938,7 +17938,7 @@
           <w:szCs w:val="24"/>
           <w:rtl/>
         </w:rPr>
-        <w:t xml:space="preserve">עביר: </w:t>
+        <w:t xml:space="preserve">רינאד: </w:t>
       </w:r>
       <w:r>
         <w:rPr>
@@ -17996,7 +17996,7 @@
           <w:szCs w:val="24"/>
           <w:rtl/>
         </w:rPr>
-        <w:t xml:space="preserve">עביר: </w:t>
+        <w:t xml:space="preserve">רינאד: </w:t>
       </w:r>
       <w:r>
         <w:rPr>
@@ -18054,7 +18054,7 @@
           <w:szCs w:val="24"/>
           <w:rtl/>
         </w:rPr>
-        <w:t xml:space="preserve">עביר: </w:t>
+        <w:t xml:space="preserve">רינאד: </w:t>
       </w:r>
       <w:r>
         <w:rPr>
@@ -18112,7 +18112,7 @@
           <w:szCs w:val="24"/>
           <w:rtl/>
         </w:rPr>
-        <w:t xml:space="preserve">עביר: </w:t>
+        <w:t xml:space="preserve">רינאד: </w:t>
       </w:r>
       <w:r>
         <w:rPr>
@@ -18170,7 +18170,7 @@
           <w:szCs w:val="24"/>
           <w:rtl/>
         </w:rPr>
-        <w:t xml:space="preserve">עביר: </w:t>
+        <w:t xml:space="preserve">רינאד: </w:t>
       </w:r>
       <w:r>
         <w:rPr>
@@ -18247,7 +18247,7 @@
           <w:szCs w:val="24"/>
           <w:rtl/>
         </w:rPr>
-        <w:t xml:space="preserve">עביר: </w:t>
+        <w:t xml:space="preserve">רינאד: </w:t>
       </w:r>
       <w:r>
         <w:rPr>
@@ -18305,7 +18305,7 @@
           <w:szCs w:val="24"/>
           <w:rtl/>
         </w:rPr>
-        <w:t xml:space="preserve">עביר: </w:t>
+        <w:t xml:space="preserve">רינאד: </w:t>
       </w:r>
       <w:r>
         <w:rPr>
@@ -18363,7 +18363,7 @@
           <w:szCs w:val="24"/>
           <w:rtl/>
         </w:rPr>
-        <w:t xml:space="preserve">עביר: </w:t>
+        <w:t xml:space="preserve">רינאד: </w:t>
       </w:r>
       <w:r>
         <w:rPr>
@@ -18421,7 +18421,7 @@
           <w:szCs w:val="24"/>
           <w:rtl/>
         </w:rPr>
-        <w:t xml:space="preserve">עביר: </w:t>
+        <w:t xml:space="preserve">רינאד: </w:t>
       </w:r>
       <w:r>
         <w:rPr>
@@ -18479,7 +18479,7 @@
           <w:szCs w:val="24"/>
           <w:rtl/>
         </w:rPr>
-        <w:t xml:space="preserve">עביר: </w:t>
+        <w:t xml:space="preserve">רינאד: </w:t>
       </w:r>
       <w:r>
         <w:rPr>

</xml_diff>

<commit_message>
Restore pseudonym סמאח for interview 2
Co-Authored-By: Claude Fable 5.1 <noreply@anthropic.com>
Claude-Session: https://claude.ai/code/session_011Z9C2ptByc9jQga6MDruQz
</commit_message>
<xml_diff>
--- a/deliverables/ראיונות_6_מורות_מחקר_גישוש.docx
+++ b/deliverables/ראיונות_6_מורות_מחקר_גישוש.docx
@@ -4497,7 +4497,7 @@
           <w:szCs w:val="28"/>
           <w:rtl/>
         </w:rPr>
-        <w:t xml:space="preserve">ריאיון מס' 2: מאי (שם בדוי)</w:t>
+        <w:t xml:space="preserve">ריאיון מס' 2: סמאח (שם בדוי)</w:t>
       </w:r>
     </w:p>
     <w:p>
@@ -4583,26 +4583,26 @@
           <w:szCs w:val="24"/>
           <w:rtl/>
         </w:rPr>
-        <w:t xml:space="preserve">רגע, אני בודקת שההקלטה רצה... כן. אז תודה, מאי. אני יודעת שזה בערב ואת אחרי יום.</w:t>
-      </w:r>
-    </w:p>
-    <w:p>
-      <w:pPr>
-        <w:bidi/>
-        <w:spacing w:after="120" w:line="360" w:lineRule="auto"/>
-        <w:jc w:val="both"/>
-      </w:pPr>
-      <w:r>
-        <w:rPr>
-          <w:rFonts w:ascii="David" w:cs="David" w:eastAsia="David" w:hAnsi="David"/>
-          <w:noProof/>
-          <w:b/>
-          <w:bCs/>
-          <w:sz w:val="24"/>
-          <w:szCs w:val="24"/>
-          <w:rtl/>
-        </w:rPr>
-        <w:t xml:space="preserve">מאי: </w:t>
+        <w:t xml:space="preserve">רגע, אני בודקת שההקלטה רצה... כן. אז תודה, סמאח. אני יודעת שזה בערב ואת אחרי יום.</w:t>
+      </w:r>
+    </w:p>
+    <w:p>
+      <w:pPr>
+        <w:bidi/>
+        <w:spacing w:after="120" w:line="360" w:lineRule="auto"/>
+        <w:jc w:val="both"/>
+      </w:pPr>
+      <w:r>
+        <w:rPr>
+          <w:rFonts w:ascii="David" w:cs="David" w:eastAsia="David" w:hAnsi="David"/>
+          <w:noProof/>
+          <w:b/>
+          <w:bCs/>
+          <w:sz w:val="24"/>
+          <w:szCs w:val="24"/>
+          <w:rtl/>
+        </w:rPr>
+        <w:t xml:space="preserve">סמאח: </w:t>
       </w:r>
       <w:r>
         <w:rPr>
@@ -4660,7 +4660,7 @@
           <w:szCs w:val="24"/>
           <w:rtl/>
         </w:rPr>
-        <w:t xml:space="preserve">מאי: </w:t>
+        <w:t xml:space="preserve">סמאח: </w:t>
       </w:r>
       <w:r>
         <w:rPr>
@@ -4718,7 +4718,7 @@
           <w:szCs w:val="24"/>
           <w:rtl/>
         </w:rPr>
-        <w:t xml:space="preserve">מאי: </w:t>
+        <w:t xml:space="preserve">סמאח: </w:t>
       </w:r>
       <w:r>
         <w:rPr>
@@ -4776,7 +4776,7 @@
           <w:szCs w:val="24"/>
           <w:rtl/>
         </w:rPr>
-        <w:t xml:space="preserve">מאי: </w:t>
+        <w:t xml:space="preserve">סמאח: </w:t>
       </w:r>
       <w:r>
         <w:rPr>
@@ -4834,7 +4834,7 @@
           <w:szCs w:val="24"/>
           <w:rtl/>
         </w:rPr>
-        <w:t xml:space="preserve">מאי: </w:t>
+        <w:t xml:space="preserve">סמאח: </w:t>
       </w:r>
       <w:r>
         <w:rPr>
@@ -4892,7 +4892,7 @@
           <w:szCs w:val="24"/>
           <w:rtl/>
         </w:rPr>
-        <w:t xml:space="preserve">מאי: </w:t>
+        <w:t xml:space="preserve">סמאח: </w:t>
       </w:r>
       <w:r>
         <w:rPr>
@@ -4950,7 +4950,7 @@
           <w:szCs w:val="24"/>
           <w:rtl/>
         </w:rPr>
-        <w:t xml:space="preserve">מאי: </w:t>
+        <w:t xml:space="preserve">סמאח: </w:t>
       </w:r>
       <w:r>
         <w:rPr>
@@ -5008,7 +5008,7 @@
           <w:szCs w:val="24"/>
           <w:rtl/>
         </w:rPr>
-        <w:t xml:space="preserve">מאי: </w:t>
+        <w:t xml:space="preserve">סמאח: </w:t>
       </w:r>
       <w:r>
         <w:rPr>
@@ -5066,7 +5066,7 @@
           <w:szCs w:val="24"/>
           <w:rtl/>
         </w:rPr>
-        <w:t xml:space="preserve">מאי: </w:t>
+        <w:t xml:space="preserve">סמאח: </w:t>
       </w:r>
       <w:r>
         <w:rPr>
@@ -5124,7 +5124,7 @@
           <w:szCs w:val="24"/>
           <w:rtl/>
         </w:rPr>
-        <w:t xml:space="preserve">מאי: </w:t>
+        <w:t xml:space="preserve">סמאח: </w:t>
       </w:r>
       <w:r>
         <w:rPr>
@@ -5172,7 +5172,7 @@
           <w:szCs w:val="24"/>
           <w:rtl/>
         </w:rPr>
-        <w:t xml:space="preserve">מאי: </w:t>
+        <w:t xml:space="preserve">סמאח: </w:t>
       </w:r>
       <w:r>
         <w:rPr>
@@ -5230,7 +5230,7 @@
           <w:szCs w:val="24"/>
           <w:rtl/>
         </w:rPr>
-        <w:t xml:space="preserve">מאי: </w:t>
+        <w:t xml:space="preserve">סמאח: </w:t>
       </w:r>
       <w:r>
         <w:rPr>
@@ -5288,7 +5288,7 @@
           <w:szCs w:val="24"/>
           <w:rtl/>
         </w:rPr>
-        <w:t xml:space="preserve">מאי: </w:t>
+        <w:t xml:space="preserve">סמאח: </w:t>
       </w:r>
       <w:r>
         <w:rPr>
@@ -5346,7 +5346,7 @@
           <w:szCs w:val="24"/>
           <w:rtl/>
         </w:rPr>
-        <w:t xml:space="preserve">מאי: </w:t>
+        <w:t xml:space="preserve">סמאח: </w:t>
       </w:r>
       <w:r>
         <w:rPr>
@@ -5404,7 +5404,7 @@
           <w:szCs w:val="24"/>
           <w:rtl/>
         </w:rPr>
-        <w:t xml:space="preserve">מאי: </w:t>
+        <w:t xml:space="preserve">סמאח: </w:t>
       </w:r>
       <w:r>
         <w:rPr>
@@ -5462,7 +5462,7 @@
           <w:szCs w:val="24"/>
           <w:rtl/>
         </w:rPr>
-        <w:t xml:space="preserve">מאי: </w:t>
+        <w:t xml:space="preserve">סמאח: </w:t>
       </w:r>
       <w:r>
         <w:rPr>
@@ -5520,7 +5520,7 @@
           <w:szCs w:val="24"/>
           <w:rtl/>
         </w:rPr>
-        <w:t xml:space="preserve">מאי: </w:t>
+        <w:t xml:space="preserve">סמאח: </w:t>
       </w:r>
       <w:r>
         <w:rPr>
@@ -5578,7 +5578,7 @@
           <w:szCs w:val="24"/>
           <w:rtl/>
         </w:rPr>
-        <w:t xml:space="preserve">מאי: </w:t>
+        <w:t xml:space="preserve">סמאח: </w:t>
       </w:r>
       <w:r>
         <w:rPr>
@@ -5636,7 +5636,7 @@
           <w:szCs w:val="24"/>
           <w:rtl/>
         </w:rPr>
-        <w:t xml:space="preserve">מאי: </w:t>
+        <w:t xml:space="preserve">סמאח: </w:t>
       </w:r>
       <w:r>
         <w:rPr>
@@ -5694,7 +5694,7 @@
           <w:szCs w:val="24"/>
           <w:rtl/>
         </w:rPr>
-        <w:t xml:space="preserve">מאי: </w:t>
+        <w:t xml:space="preserve">סמאח: </w:t>
       </w:r>
       <w:r>
         <w:rPr>
@@ -5752,7 +5752,7 @@
           <w:szCs w:val="24"/>
           <w:rtl/>
         </w:rPr>
-        <w:t xml:space="preserve">מאי: </w:t>
+        <w:t xml:space="preserve">סמאח: </w:t>
       </w:r>
       <w:r>
         <w:rPr>
@@ -5810,7 +5810,7 @@
           <w:szCs w:val="24"/>
           <w:rtl/>
         </w:rPr>
-        <w:t xml:space="preserve">מאי: </w:t>
+        <w:t xml:space="preserve">סמאח: </w:t>
       </w:r>
       <w:r>
         <w:rPr>
@@ -5868,7 +5868,7 @@
           <w:szCs w:val="24"/>
           <w:rtl/>
         </w:rPr>
-        <w:t xml:space="preserve">מאי: </w:t>
+        <w:t xml:space="preserve">סמאח: </w:t>
       </w:r>
       <w:r>
         <w:rPr>
@@ -5926,7 +5926,7 @@
           <w:szCs w:val="24"/>
           <w:rtl/>
         </w:rPr>
-        <w:t xml:space="preserve">מאי: </w:t>
+        <w:t xml:space="preserve">סמאח: </w:t>
       </w:r>
       <w:r>
         <w:rPr>
@@ -5984,7 +5984,7 @@
           <w:szCs w:val="24"/>
           <w:rtl/>
         </w:rPr>
-        <w:t xml:space="preserve">מאי: </w:t>
+        <w:t xml:space="preserve">סמאח: </w:t>
       </w:r>
       <w:r>
         <w:rPr>
@@ -6042,7 +6042,7 @@
           <w:szCs w:val="24"/>
           <w:rtl/>
         </w:rPr>
-        <w:t xml:space="preserve">מאי: </w:t>
+        <w:t xml:space="preserve">סמאח: </w:t>
       </w:r>
       <w:r>
         <w:rPr>
@@ -6100,7 +6100,7 @@
           <w:szCs w:val="24"/>
           <w:rtl/>
         </w:rPr>
-        <w:t xml:space="preserve">מאי: </w:t>
+        <w:t xml:space="preserve">סמאח: </w:t>
       </w:r>
       <w:r>
         <w:rPr>
@@ -6158,7 +6158,7 @@
           <w:szCs w:val="24"/>
           <w:rtl/>
         </w:rPr>
-        <w:t xml:space="preserve">מאי: </w:t>
+        <w:t xml:space="preserve">סמאח: </w:t>
       </w:r>
       <w:r>
         <w:rPr>
@@ -6216,7 +6216,7 @@
           <w:szCs w:val="24"/>
           <w:rtl/>
         </w:rPr>
-        <w:t xml:space="preserve">מאי: </w:t>
+        <w:t xml:space="preserve">סמאח: </w:t>
       </w:r>
       <w:r>
         <w:rPr>
@@ -6274,7 +6274,7 @@
           <w:szCs w:val="24"/>
           <w:rtl/>
         </w:rPr>
-        <w:t xml:space="preserve">מאי: </w:t>
+        <w:t xml:space="preserve">סמאח: </w:t>
       </w:r>
       <w:r>
         <w:rPr>
@@ -6332,7 +6332,7 @@
           <w:szCs w:val="24"/>
           <w:rtl/>
         </w:rPr>
-        <w:t xml:space="preserve">מאי: </w:t>
+        <w:t xml:space="preserve">סמאח: </w:t>
       </w:r>
       <w:r>
         <w:rPr>
@@ -6390,7 +6390,7 @@
           <w:szCs w:val="24"/>
           <w:rtl/>
         </w:rPr>
-        <w:t xml:space="preserve">מאי: </w:t>
+        <w:t xml:space="preserve">סמאח: </w:t>
       </w:r>
       <w:r>
         <w:rPr>
@@ -6448,7 +6448,7 @@
           <w:szCs w:val="24"/>
           <w:rtl/>
         </w:rPr>
-        <w:t xml:space="preserve">מאי: </w:t>
+        <w:t xml:space="preserve">סמאח: </w:t>
       </w:r>
       <w:r>
         <w:rPr>
@@ -6506,7 +6506,7 @@
           <w:szCs w:val="24"/>
           <w:rtl/>
         </w:rPr>
-        <w:t xml:space="preserve">מאי: </w:t>
+        <w:t xml:space="preserve">סמאח: </w:t>
       </w:r>
       <w:r>
         <w:rPr>
@@ -6564,7 +6564,7 @@
           <w:szCs w:val="24"/>
           <w:rtl/>
         </w:rPr>
-        <w:t xml:space="preserve">מאי: </w:t>
+        <w:t xml:space="preserve">סמאח: </w:t>
       </w:r>
       <w:r>
         <w:rPr>
@@ -6622,7 +6622,7 @@
           <w:szCs w:val="24"/>
           <w:rtl/>
         </w:rPr>
-        <w:t xml:space="preserve">מאי: </w:t>
+        <w:t xml:space="preserve">סמאח: </w:t>
       </w:r>
       <w:r>
         <w:rPr>
@@ -6680,7 +6680,7 @@
           <w:szCs w:val="24"/>
           <w:rtl/>
         </w:rPr>
-        <w:t xml:space="preserve">מאי: </w:t>
+        <w:t xml:space="preserve">סמאח: </w:t>
       </w:r>
       <w:r>
         <w:rPr>
@@ -6738,7 +6738,7 @@
           <w:szCs w:val="24"/>
           <w:rtl/>
         </w:rPr>
-        <w:t xml:space="preserve">מאי: </w:t>
+        <w:t xml:space="preserve">סמאח: </w:t>
       </w:r>
       <w:r>
         <w:rPr>
@@ -6796,7 +6796,7 @@
           <w:szCs w:val="24"/>
           <w:rtl/>
         </w:rPr>
-        <w:t xml:space="preserve">מאי: </w:t>
+        <w:t xml:space="preserve">סמאח: </w:t>
       </w:r>
       <w:r>
         <w:rPr>
@@ -6854,7 +6854,7 @@
           <w:szCs w:val="24"/>
           <w:rtl/>
         </w:rPr>
-        <w:t xml:space="preserve">מאי: </w:t>
+        <w:t xml:space="preserve">סמאח: </w:t>
       </w:r>
       <w:r>
         <w:rPr>
@@ -6912,7 +6912,7 @@
           <w:szCs w:val="24"/>
           <w:rtl/>
         </w:rPr>
-        <w:t xml:space="preserve">מאי: </w:t>
+        <w:t xml:space="preserve">סמאח: </w:t>
       </w:r>
       <w:r>
         <w:rPr>
@@ -6970,7 +6970,7 @@
           <w:szCs w:val="24"/>
           <w:rtl/>
         </w:rPr>
-        <w:t xml:space="preserve">מאי: </w:t>
+        <w:t xml:space="preserve">סמאח: </w:t>
       </w:r>
       <w:r>
         <w:rPr>
@@ -7028,7 +7028,7 @@
           <w:szCs w:val="24"/>
           <w:rtl/>
         </w:rPr>
-        <w:t xml:space="preserve">מאי: </w:t>
+        <w:t xml:space="preserve">סמאח: </w:t>
       </w:r>
       <w:r>
         <w:rPr>
@@ -7086,7 +7086,7 @@
           <w:szCs w:val="24"/>
           <w:rtl/>
         </w:rPr>
-        <w:t xml:space="preserve">מאי: </w:t>
+        <w:t xml:space="preserve">סמאח: </w:t>
       </w:r>
       <w:r>
         <w:rPr>
@@ -7144,7 +7144,7 @@
           <w:szCs w:val="24"/>
           <w:rtl/>
         </w:rPr>
-        <w:t xml:space="preserve">מאי: </w:t>
+        <w:t xml:space="preserve">סמאח: </w:t>
       </w:r>
       <w:r>
         <w:rPr>
@@ -7202,7 +7202,7 @@
           <w:szCs w:val="24"/>
           <w:rtl/>
         </w:rPr>
-        <w:t xml:space="preserve">מאי: </w:t>
+        <w:t xml:space="preserve">סמאח: </w:t>
       </w:r>
       <w:r>
         <w:rPr>
@@ -7260,7 +7260,7 @@
           <w:szCs w:val="24"/>
           <w:rtl/>
         </w:rPr>
-        <w:t xml:space="preserve">מאי: </w:t>
+        <w:t xml:space="preserve">סמאח: </w:t>
       </w:r>
       <w:r>
         <w:rPr>
@@ -7318,7 +7318,7 @@
           <w:szCs w:val="24"/>
           <w:rtl/>
         </w:rPr>
-        <w:t xml:space="preserve">מאי: </w:t>
+        <w:t xml:space="preserve">סמאח: </w:t>
       </w:r>
       <w:r>
         <w:rPr>
@@ -7376,7 +7376,7 @@
           <w:szCs w:val="24"/>
           <w:rtl/>
         </w:rPr>
-        <w:t xml:space="preserve">מאי: </w:t>
+        <w:t xml:space="preserve">סמאח: </w:t>
       </w:r>
       <w:r>
         <w:rPr>
@@ -7434,7 +7434,7 @@
           <w:szCs w:val="24"/>
           <w:rtl/>
         </w:rPr>
-        <w:t xml:space="preserve">מאי: </w:t>
+        <w:t xml:space="preserve">סמאח: </w:t>
       </w:r>
       <w:r>
         <w:rPr>
@@ -7492,7 +7492,7 @@
           <w:szCs w:val="24"/>
           <w:rtl/>
         </w:rPr>
-        <w:t xml:space="preserve">מאי: </w:t>
+        <w:t xml:space="preserve">סמאח: </w:t>
       </w:r>
       <w:r>
         <w:rPr>
@@ -7550,7 +7550,7 @@
           <w:szCs w:val="24"/>
           <w:rtl/>
         </w:rPr>
-        <w:t xml:space="preserve">מאי: </w:t>
+        <w:t xml:space="preserve">סמאח: </w:t>
       </w:r>
       <w:r>
         <w:rPr>
@@ -7608,7 +7608,7 @@
           <w:szCs w:val="24"/>
           <w:rtl/>
         </w:rPr>
-        <w:t xml:space="preserve">מאי: </w:t>
+        <w:t xml:space="preserve">סמאח: </w:t>
       </w:r>
       <w:r>
         <w:rPr>
@@ -7666,7 +7666,7 @@
           <w:szCs w:val="24"/>
           <w:rtl/>
         </w:rPr>
-        <w:t xml:space="preserve">מאי: </w:t>
+        <w:t xml:space="preserve">סמאח: </w:t>
       </w:r>
       <w:r>
         <w:rPr>
@@ -7724,7 +7724,7 @@
           <w:szCs w:val="24"/>
           <w:rtl/>
         </w:rPr>
-        <w:t xml:space="preserve">מאי: </w:t>
+        <w:t xml:space="preserve">סמאח: </w:t>
       </w:r>
       <w:r>
         <w:rPr>

</xml_diff>

<commit_message>
Rename all six interviewees with Arabic pseudonyms and adapt school contexts
Co-Authored-By: Claude Fable 5.1 <noreply@anthropic.com>
Claude-Session: https://claude.ai/code/session_011Z9C2ptByc9jQga6MDruQz
</commit_message>
<xml_diff>
--- a/deliverables/ראיונות_6_מורות_מחקר_גישוש.docx
+++ b/deliverables/ראיונות_6_מורות_מחקר_גישוש.docx
@@ -960,7 +960,7 @@
           <w:szCs w:val="28"/>
           <w:rtl/>
         </w:rPr>
-        <w:t xml:space="preserve">ריאיון מס' 1: רותם (שם בדוי)</w:t>
+        <w:t xml:space="preserve">ריאיון מס' 1: רואן (שם בדוי)</w:t>
       </w:r>
     </w:p>
     <w:p>
@@ -979,7 +979,7 @@
           <w:szCs w:val="24"/>
           <w:rtl/>
         </w:rPr>
-        <w:t xml:space="preserve">מורה להיסטוריה ולאזרחות ומחנכת כיתה ח' בחטיבת ביניים בבאר שבע, 15 שנות ותק.</w:t>
+        <w:t xml:space="preserve">מורה להיסטוריה ולאזרחות ומחנכת כיתה ח' בחטיבת ביניים בתל שבע, 15 שנות ותק.</w:t>
       </w:r>
     </w:p>
     <w:p>
@@ -1065,7 +1065,7 @@
           <w:szCs w:val="24"/>
           <w:rtl/>
         </w:rPr>
-        <w:t xml:space="preserve">רותם: </w:t>
+        <w:t xml:space="preserve">רואן: </w:t>
       </w:r>
       <w:r>
         <w:rPr>
@@ -1123,7 +1123,7 @@
           <w:szCs w:val="24"/>
           <w:rtl/>
         </w:rPr>
-        <w:t xml:space="preserve">רותם: </w:t>
+        <w:t xml:space="preserve">רואן: </w:t>
       </w:r>
       <w:r>
         <w:rPr>
@@ -1181,17 +1181,17 @@
           <w:szCs w:val="24"/>
           <w:rtl/>
         </w:rPr>
-        <w:t xml:space="preserve">רותם: </w:t>
-      </w:r>
-      <w:r>
-        <w:rPr>
-          <w:rFonts w:ascii="David" w:cs="David" w:eastAsia="David" w:hAnsi="David"/>
-          <w:noProof/>
-          <w:sz w:val="24"/>
-          <w:szCs w:val="24"/>
-          <w:rtl/>
-        </w:rPr>
-        <w:t xml:space="preserve">(שתיקה) כי זה הגיל שבו הם עוד ילדים ועוד רגע לא. בכיתה ז' הם מפוחדים מהחטיבה, בכיתה ט' הם כבר בתיכון בראש. ח' זה... באמצע. הם עוד מוכנים להתלהב מתמונה, ועוד לא מתביישים להרים יד. רוב הזמן. (צוחקת) ובאמת, המחנכת הקודמת של ח' פרשה, והמנהלת אמרה "רותם, שנה אחת", ועברו עשר.</w:t>
+        <w:t xml:space="preserve">רואן: </w:t>
+      </w:r>
+      <w:r>
+        <w:rPr>
+          <w:rFonts w:ascii="David" w:cs="David" w:eastAsia="David" w:hAnsi="David"/>
+          <w:noProof/>
+          <w:sz w:val="24"/>
+          <w:szCs w:val="24"/>
+          <w:rtl/>
+        </w:rPr>
+        <w:t xml:space="preserve">(שתיקה) כי זה הגיל שבו הם עוד ילדים ועוד רגע לא. בכיתה ז' הם מפוחדים מהחטיבה, בכיתה ט' הם כבר בתיכון בראש. ח' זה... באמצע. הם עוד מוכנים להתלהב מתמונה, ועוד לא מתביישים להרים יד. רוב הזמן. (צוחקת) ובאמת, המחנכת הקודמת של ח' פרשה, והמנהלת אמרה "רואן, שנה אחת", ועברו עשר.</w:t>
       </w:r>
     </w:p>
     <w:p>
@@ -1239,17 +1239,17 @@
           <w:szCs w:val="24"/>
           <w:rtl/>
         </w:rPr>
-        <w:t xml:space="preserve">רותם: </w:t>
-      </w:r>
-      <w:r>
-        <w:rPr>
-          <w:rFonts w:ascii="David" w:cs="David" w:eastAsia="David" w:hAnsi="David"/>
-          <w:noProof/>
-          <w:sz w:val="24"/>
-          <w:szCs w:val="24"/>
-          <w:rtl/>
-        </w:rPr>
-        <w:t xml:space="preserve">אממ... (שתיקה) יש רגע כזה. תלמיד שלא הבין למה בכלל לומדים היסטוריה, ופתאום הוא מחבר משהו לחיים שלו. היה לי תלמיד מאוקראינה, בשיעור על פליטים אחרי מלחמת העולם הראשונה, והוא אמר, ככה בשקט, "זה כמו סבתא שלי". זהו. זה הרגע. בשביל זה.</w:t>
+        <w:t xml:space="preserve">רואן: </w:t>
+      </w:r>
+      <w:r>
+        <w:rPr>
+          <w:rFonts w:ascii="David" w:cs="David" w:eastAsia="David" w:hAnsi="David"/>
+          <w:noProof/>
+          <w:sz w:val="24"/>
+          <w:szCs w:val="24"/>
+          <w:rtl/>
+        </w:rPr>
+        <w:t xml:space="preserve">אממ... (שתיקה) יש רגע כזה. תלמיד שלא הבין למה בכלל לומדים היסטוריה, ופתאום הוא מחבר משהו לחיים שלו. היה לי תלמיד מכפר לא מוכר, בשיעור על פליטים אחרי מלחמת העולם הראשונה, והוא אמר, ככה בשקט, "זה כמו סבתא שלי". זהו. זה הרגע. בשביל זה.</w:t>
       </w:r>
     </w:p>
     <w:p>
@@ -1297,7 +1297,7 @@
           <w:szCs w:val="24"/>
           <w:rtl/>
         </w:rPr>
-        <w:t xml:space="preserve">רותם: </w:t>
+        <w:t xml:space="preserve">רואן: </w:t>
       </w:r>
       <w:r>
         <w:rPr>
@@ -1355,17 +1355,17 @@
           <w:szCs w:val="24"/>
           <w:rtl/>
         </w:rPr>
-        <w:t xml:space="preserve">רותם: </w:t>
-      </w:r>
-      <w:r>
-        <w:rPr>
-          <w:rFonts w:ascii="David" w:cs="David" w:eastAsia="David" w:hAnsi="David"/>
-          <w:noProof/>
-          <w:sz w:val="24"/>
-          <w:szCs w:val="24"/>
-          <w:rtl/>
-        </w:rPr>
-        <w:t xml:space="preserve">כן. יש אחד. זה היה... לפני חמש שנים? בערך. כיתה ט', עליית הנאצים לשלטון. הכנתי מצגת, מסודרת, תאריכים, מושגים, הגעתי לשקף עם שמונה מושגים ואמרתי תעתיקו. ותלמידה, עולה מאתיופיה, שנתיים בארץ, הרימה יד ושאלה, בשקט כזה: "המורה, מה זה בכלל בחירות?" (שתיקה) ואני... אה... הבנתי שאני בונה קומה שלישית על בית שאין לו קומה ראשונה.</w:t>
+        <w:t xml:space="preserve">רואן: </w:t>
+      </w:r>
+      <w:r>
+        <w:rPr>
+          <w:rFonts w:ascii="David" w:cs="David" w:eastAsia="David" w:hAnsi="David"/>
+          <w:noProof/>
+          <w:sz w:val="24"/>
+          <w:szCs w:val="24"/>
+          <w:rtl/>
+        </w:rPr>
+        <w:t xml:space="preserve">כן. יש אחד. זה היה... לפני חמש שנים? בערך. כיתה ט', עליית הנאצים לשלטון. הכנתי מצגת, מסודרת, תאריכים, מושגים, הגעתי לשקף עם שמונה מושגים ואמרתי תעתיקו. ותלמידה, שהגיעה אלינו מהפזורה באותה שנה, הרימה יד ושאלה, בשקט כזה: "המורה, מה זה בכלל בחירות?" (שתיקה) ואני... אה... הבנתי שאני בונה קומה שלישית על בית שאין לו קומה ראשונה.</w:t>
       </w:r>
     </w:p>
     <w:p>
@@ -1413,7 +1413,7 @@
           <w:szCs w:val="24"/>
           <w:rtl/>
         </w:rPr>
-        <w:t xml:space="preserve">רותם: </w:t>
+        <w:t xml:space="preserve">רואן: </w:t>
       </w:r>
       <w:r>
         <w:rPr>
@@ -1471,7 +1471,7 @@
           <w:szCs w:val="24"/>
           <w:rtl/>
         </w:rPr>
-        <w:t xml:space="preserve">רותם: </w:t>
+        <w:t xml:space="preserve">רואן: </w:t>
       </w:r>
       <w:r>
         <w:rPr>
@@ -1529,7 +1529,7 @@
           <w:szCs w:val="24"/>
           <w:rtl/>
         </w:rPr>
-        <w:t xml:space="preserve">רותם: </w:t>
+        <w:t xml:space="preserve">רואן: </w:t>
       </w:r>
       <w:r>
         <w:rPr>
@@ -1587,7 +1587,7 @@
           <w:szCs w:val="24"/>
           <w:rtl/>
         </w:rPr>
-        <w:t xml:space="preserve">רותם: </w:t>
+        <w:t xml:space="preserve">רואן: </w:t>
       </w:r>
       <w:r>
         <w:rPr>
@@ -1645,17 +1645,17 @@
           <w:szCs w:val="24"/>
           <w:rtl/>
         </w:rPr>
-        <w:t xml:space="preserve">רותם: </w:t>
-      </w:r>
-      <w:r>
-        <w:rPr>
-          <w:rFonts w:ascii="David" w:cs="David" w:eastAsia="David" w:hAnsi="David"/>
-          <w:noProof/>
-          <w:sz w:val="24"/>
-          <w:szCs w:val="24"/>
-          <w:rtl/>
-        </w:rPr>
-        <w:t xml:space="preserve">ח'2. הכיתה שלי. שלושים ושניים. (שתיקה) אז מה יש שם. יש ארבעה שעלו בשנתיים האחרונות, אוקראינה, רוסיה, העברית עדיין בבנייה. שלושה ילדים להורים מאתיופיה, נולדו פה, בבית אמהרית. ילדה אחת מצרפת. יש... שמונה בערך שעמוד בספר היסטוריה זה בשבילם חצי שיעור. ויש חמישה שקוראים עמוד בשתי דקות ומשתעממים. שלושה עם אבחון, שניים עם קשב, ולפחות עוד שניים שצריכים ולא אובחנו. ויש בית. יש ילדים שמישהו יושב איתם בערב, ויש ילדים שהם מבשלים לאחים הקטנים.</w:t>
+        <w:t xml:space="preserve">רואן: </w:t>
+      </w:r>
+      <w:r>
+        <w:rPr>
+          <w:rFonts w:ascii="David" w:cs="David" w:eastAsia="David" w:hAnsi="David"/>
+          <w:noProof/>
+          <w:sz w:val="24"/>
+          <w:szCs w:val="24"/>
+          <w:rtl/>
+        </w:rPr>
+        <w:t xml:space="preserve">ח'2. הכיתה שלי. שלושים ושניים. (שתיקה) אז מה יש שם. יש ארבעה שהגיעו בשנתיים האחרונות מכפרים לא מוכרים, בלי יסודי מסודר, והעברית שלהם, שבה כתוב ספר ההיסטוריה, עדיין בבנייה. שלושה שההורים שלהם לא קוראים וכותבים בכלל. ילדה אחת שחזרה אחרי שנים בירדן. יש... שמונה בערך שעמוד בספר היסטוריה זה בשבילם חצי שיעור. ויש חמישה שקוראים עמוד בשתי דקות ומשתעממים. שלושה עם אבחון, שניים עם קשב, ולפחות עוד שניים שצריכים ולא אובחנו. ויש בית. יש ילדים שמישהו יושב איתם בערב, ויש ילדים שהם מבשלים לאחים הקטנים.</w:t>
       </w:r>
     </w:p>
     <w:p>
@@ -1703,7 +1703,7 @@
           <w:szCs w:val="24"/>
           <w:rtl/>
         </w:rPr>
-        <w:t xml:space="preserve">רותם: </w:t>
+        <w:t xml:space="preserve">רואן: </w:t>
       </w:r>
       <w:r>
         <w:rPr>
@@ -1761,17 +1761,17 @@
           <w:szCs w:val="24"/>
           <w:rtl/>
         </w:rPr>
-        <w:t xml:space="preserve">רותם: </w:t>
-      </w:r>
-      <w:r>
-        <w:rPr>
-          <w:rFonts w:ascii="David" w:cs="David" w:eastAsia="David" w:hAnsi="David"/>
-          <w:noProof/>
-          <w:sz w:val="24"/>
-          <w:szCs w:val="24"/>
-          <w:rtl/>
-        </w:rPr>
-        <w:t xml:space="preserve">אני לא תמיד יודעת. זו האמת. יש לי דף, בהתחלת שנה, שכל תלמיד ממלא, בעברית או ברוסית או באנגלית, מה קל לו ומה קשה לו. ואני מסתכלת עליו כל חודשיים בערך. אבל הדף לא אומר הכול. יש ילד שכתב "הכול קל" ובמבחן הראשון קיבל שלושים. אז אני גם מסתכלת על הדפים בשיעור עצמו. ומדברת עם המחנכות הקודמות, עם היועצת. ו... לפעמים אני פשוט טועה. יש תלמידה שחשבתי שהיא חלשה בגלל שהיא שקטה, וגיליתי באמצע השנה שהיא קוראת ספרים בבית ברוסית. שקט זה לא חולשה. לקח לי שנים.</w:t>
+        <w:t xml:space="preserve">רואן: </w:t>
+      </w:r>
+      <w:r>
+        <w:rPr>
+          <w:rFonts w:ascii="David" w:cs="David" w:eastAsia="David" w:hAnsi="David"/>
+          <w:noProof/>
+          <w:sz w:val="24"/>
+          <w:szCs w:val="24"/>
+          <w:rtl/>
+        </w:rPr>
+        <w:t xml:space="preserve">אני לא תמיד יודעת. זו האמת. יש לי דף, בהתחלת שנה, שכל תלמיד ממלא, בערבית או בעברית, מה קל לו ומה קשה לו. ואני מסתכלת עליו כל חודשיים בערך. אבל הדף לא אומר הכול. יש ילד שכתב "הכול קל" ובמבחן הראשון קיבל שלושים. אז אני גם מסתכלת על הדפים בשיעור עצמו. ומדברת עם המחנכות הקודמות, עם היועצת. ו... לפעמים אני פשוט טועה. יש תלמידה שחשבתי שהיא חלשה בגלל שהיא שקטה, וגיליתי באמצע השנה שהיא קוראת ספרים בבית בערבית. שקט זה לא חולשה. לקח לי שנים.</w:t>
       </w:r>
     </w:p>
     <w:p>
@@ -1819,7 +1819,7 @@
           <w:szCs w:val="24"/>
           <w:rtl/>
         </w:rPr>
-        <w:t xml:space="preserve">רותם: </w:t>
+        <w:t xml:space="preserve">רואן: </w:t>
       </w:r>
       <w:r>
         <w:rPr>
@@ -1877,17 +1877,17 @@
           <w:szCs w:val="24"/>
           <w:rtl/>
         </w:rPr>
-        <w:t xml:space="preserve">רותם: </w:t>
-      </w:r>
-      <w:r>
-        <w:rPr>
-          <w:rFonts w:ascii="David" w:cs="David" w:eastAsia="David" w:hAnsi="David"/>
-          <w:noProof/>
-          <w:sz w:val="24"/>
-          <w:szCs w:val="24"/>
-          <w:rtl/>
-        </w:rPr>
-        <w:t xml:space="preserve">כן. דניאל. נקרא לו דניאל. עלה מרוסיה בכיתה ו', חכם, זה היה ברור מהעיניים, אבל בשיעורים שלי ישב וצייר. לא פתח ספר. במבחנים כתב שתי שורות. וחשבתי שזה שפה.</w:t>
+        <w:t xml:space="preserve">רואן: </w:t>
+      </w:r>
+      <w:r>
+        <w:rPr>
+          <w:rFonts w:ascii="David" w:cs="David" w:eastAsia="David" w:hAnsi="David"/>
+          <w:noProof/>
+          <w:sz w:val="24"/>
+          <w:szCs w:val="24"/>
+          <w:rtl/>
+        </w:rPr>
+        <w:t xml:space="preserve">כן. עומר. נקרא לו עומר. הגיע מכפר לא מוכר בכיתה ו', חכם, זה היה ברור מהעיניים, אבל בשיעורים שלי ישב וצייר. לא פתח ספר. במבחנים כתב שתי שורות. וחשבתי שזה שפה.</w:t>
       </w:r>
     </w:p>
     <w:p>
@@ -1935,17 +1935,17 @@
           <w:szCs w:val="24"/>
           <w:rtl/>
         </w:rPr>
-        <w:t xml:space="preserve">רותם: </w:t>
-      </w:r>
-      <w:r>
-        <w:rPr>
-          <w:rFonts w:ascii="David" w:cs="David" w:eastAsia="David" w:hAnsi="David"/>
-          <w:noProof/>
-          <w:sz w:val="24"/>
-          <w:szCs w:val="24"/>
-          <w:rtl/>
-        </w:rPr>
-        <w:t xml:space="preserve">חצי. השפה הייתה חצי. כשדיברתי איתו הבנתי שהוא לא מבין למה הוא צריך ללמוד על יישוב הארץ במאה התשע עשרה. זה לא הסיפור שלו. לא של המשפחה שלו. בשבילו זה היה כמו... ללמוד היסטוריה של זרים.</w:t>
+        <w:t xml:space="preserve">רואן: </w:t>
+      </w:r>
+      <w:r>
+        <w:rPr>
+          <w:rFonts w:ascii="David" w:cs="David" w:eastAsia="David" w:hAnsi="David"/>
+          <w:noProof/>
+          <w:sz w:val="24"/>
+          <w:szCs w:val="24"/>
+          <w:rtl/>
+        </w:rPr>
+        <w:t xml:space="preserve">חצי. השפה הייתה חצי. כשדיברתי איתו הבנתי שהוא לא מבין למה הוא צריך ללמוד על אירופה במאה התשע עשרה. זה לא הסיפור שלו. לא של המשפחה שלו. בשבילו זה היה כמו... ללמוד היסטוריה של זרים.</w:t>
       </w:r>
     </w:p>
     <w:p>
@@ -1993,17 +1993,17 @@
           <w:szCs w:val="24"/>
           <w:rtl/>
         </w:rPr>
-        <w:t xml:space="preserve">רותם: </w:t>
-      </w:r>
-      <w:r>
-        <w:rPr>
-          <w:rFonts w:ascii="David" w:cs="David" w:eastAsia="David" w:hAnsi="David"/>
-          <w:noProof/>
-          <w:sz w:val="24"/>
-          <w:szCs w:val="24"/>
-          <w:rtl/>
-        </w:rPr>
-        <w:t xml:space="preserve">קודם טעיתי. נתתי לו מילון מונחים ברוסית. עזר קצת. לא שינה את הישיבה שלו. ואז, בשיעור על עלייה ראשונה, הבאתי תצלומים. מהגרים, רציפים, מזוודות. ושאלתי את כולם מה הם רואים. ודניאל, שמצייר כל השיעור, פתאום דיבר. כי הוא ראה בתמונה משהו שאחרים לא ראו. את הבגדים, את הפנים. ואז שאלתי אותו אם הוא רוצה לספר על ההגירה של המשפחה שלו, והוא הביא תמונה מהבית.</w:t>
+        <w:t xml:space="preserve">רואן: </w:t>
+      </w:r>
+      <w:r>
+        <w:rPr>
+          <w:rFonts w:ascii="David" w:cs="David" w:eastAsia="David" w:hAnsi="David"/>
+          <w:noProof/>
+          <w:sz w:val="24"/>
+          <w:szCs w:val="24"/>
+          <w:rtl/>
+        </w:rPr>
+        <w:t xml:space="preserve">קודם טעיתי. נתתי לו מילון מונחים בערבית. עזר קצת. לא שינה את הישיבה שלו. ואז, בשיעור על הגירה לערים, הבאתי תצלומים. מהגרים, תחנות רכבת, מזוודות. ושאלתי את כולם מה הם רואים. ועומר, שמצייר כל השיעור, פתאום דיבר. כי הוא ראה בתמונה משהו שאחרים לא ראו. את הבגדים, את הפנים. ואז שאלתי אותו אם הוא רוצה לספר על המעבר של המשפחה שלו, והוא הביא תמונה מהבית.</w:t>
       </w:r>
     </w:p>
     <w:p>
@@ -2051,7 +2051,7 @@
           <w:szCs w:val="24"/>
           <w:rtl/>
         </w:rPr>
-        <w:t xml:space="preserve">רותם: </w:t>
+        <w:t xml:space="preserve">רואן: </w:t>
       </w:r>
       <w:r>
         <w:rPr>
@@ -2109,17 +2109,17 @@
           <w:szCs w:val="24"/>
           <w:rtl/>
         </w:rPr>
-        <w:t xml:space="preserve">רותם: </w:t>
-      </w:r>
-      <w:r>
-        <w:rPr>
-          <w:rFonts w:ascii="David" w:cs="David" w:eastAsia="David" w:hAnsi="David"/>
-          <w:noProof/>
-          <w:sz w:val="24"/>
-          <w:szCs w:val="24"/>
-          <w:rtl/>
-        </w:rPr>
-        <w:t xml:space="preserve">הוא הביא תמונה של סבא שלו, על רציף, עם מזוודה אחת. משנות התשעים. ואמר, בעברית לא מושלמת, שסבא נסע ראשון ואמא ואבא באו אחריו, ושסבא עבד שנתיים בניקיון למרות שהיה מהנדס. וזה היה בדיוק מה שלמדנו על העלייה הראשונה, אנשים משכילים שעבדו בחקלאות. ואז תלמידה ותיקה אמרה "גם סבא שלי", ממרוקו, והייתה שיחה על... על ההגירה של כולם. לא הייתה במערכת שלי. אבל זה היה השיעור הכי טוב של השנה ההיא. (שתיקה) ואני חושבת שדניאל הבין באותו יום שהיסטוריה זה לא רק של אחרים.</w:t>
+        <w:t xml:space="preserve">רואן: </w:t>
+      </w:r>
+      <w:r>
+        <w:rPr>
+          <w:rFonts w:ascii="David" w:cs="David" w:eastAsia="David" w:hAnsi="David"/>
+          <w:noProof/>
+          <w:sz w:val="24"/>
+          <w:szCs w:val="24"/>
+          <w:rtl/>
+        </w:rPr>
+        <w:t xml:space="preserve">הוא הביא תמונה של סבא שלו ליד אוהל, עם עדר, משנות השבעים. ואמר, בעברית לא מושלמת, שסבא לא רצה לעבור ליישוב, ושהמשפחה עברה בסוף בגלל בית הספר, ושסבא חוזר לשם עד היום כל שבוע. וזה היה בדיוק מה שלמדנו על אנשים שעוזבים כפר לעיר ומשאירים משהו מאחור. ואז תלמידה מהיישוב אמרה "גם סבא שלי", והייתה שיחה על... על המעבר של כולם. לא הייתה במערכת שלי. אבל זה היה השיעור הכי טוב של השנה ההיא. (שתיקה) ואני חושבת שעומר הבין באותו יום שהיסטוריה זה לא רק של אחרים.</w:t>
       </w:r>
     </w:p>
     <w:p>
@@ -2167,7 +2167,7 @@
           <w:szCs w:val="24"/>
           <w:rtl/>
         </w:rPr>
-        <w:t xml:space="preserve">רותם: </w:t>
+        <w:t xml:space="preserve">רואן: </w:t>
       </w:r>
       <w:r>
         <w:rPr>
@@ -2225,7 +2225,7 @@
           <w:szCs w:val="24"/>
           <w:rtl/>
         </w:rPr>
-        <w:t xml:space="preserve">רותם: </w:t>
+        <w:t xml:space="preserve">רואן: </w:t>
       </w:r>
       <w:r>
         <w:rPr>
@@ -2283,7 +2283,7 @@
           <w:szCs w:val="24"/>
           <w:rtl/>
         </w:rPr>
-        <w:t xml:space="preserve">רותם: </w:t>
+        <w:t xml:space="preserve">רואן: </w:t>
       </w:r>
       <w:r>
         <w:rPr>
@@ -2341,7 +2341,7 @@
           <w:szCs w:val="24"/>
           <w:rtl/>
         </w:rPr>
-        <w:t xml:space="preserve">רותם: </w:t>
+        <w:t xml:space="preserve">רואן: </w:t>
       </w:r>
       <w:r>
         <w:rPr>
@@ -2399,17 +2399,17 @@
           <w:szCs w:val="24"/>
           <w:rtl/>
         </w:rPr>
-        <w:t xml:space="preserve">רותם: </w:t>
-      </w:r>
-      <w:r>
-        <w:rPr>
-          <w:rFonts w:ascii="David" w:cs="David" w:eastAsia="David" w:hAnsi="David"/>
-          <w:noProof/>
-          <w:sz w:val="24"/>
-          <w:szCs w:val="24"/>
-          <w:rtl/>
-        </w:rPr>
-        <w:t xml:space="preserve">שלושה דברים, אני חושבת. לא היה טקסט, אז העולים והמתקשים היו בפנים מהשנייה הראשונה. זו הייתה שאלה ולא הסבר. והיא הייתה בגיל שלהם, בערך. זה נגע.</w:t>
+        <w:t xml:space="preserve">רואן: </w:t>
+      </w:r>
+      <w:r>
+        <w:rPr>
+          <w:rFonts w:ascii="David" w:cs="David" w:eastAsia="David" w:hAnsi="David"/>
+          <w:noProof/>
+          <w:sz w:val="24"/>
+          <w:szCs w:val="24"/>
+          <w:rtl/>
+        </w:rPr>
+        <w:t xml:space="preserve">שלושה דברים, אני חושבת. לא היה טקסט, אז התלמידים מהפזורה והמתקשים היו בפנים מהשנייה הראשונה. זו הייתה שאלה ולא הסבר. והיא הייתה בגיל שלהם, בערך. זה נגע.</w:t>
       </w:r>
     </w:p>
     <w:p>
@@ -2457,7 +2457,7 @@
           <w:szCs w:val="24"/>
           <w:rtl/>
         </w:rPr>
-        <w:t xml:space="preserve">רותם: </w:t>
+        <w:t xml:space="preserve">רואן: </w:t>
       </w:r>
       <w:r>
         <w:rPr>
@@ -2515,7 +2515,7 @@
           <w:szCs w:val="24"/>
           <w:rtl/>
         </w:rPr>
-        <w:t xml:space="preserve">רותם: </w:t>
+        <w:t xml:space="preserve">רואן: </w:t>
       </w:r>
       <w:r>
         <w:rPr>
@@ -2573,7 +2573,7 @@
           <w:szCs w:val="24"/>
           <w:rtl/>
         </w:rPr>
-        <w:t xml:space="preserve">רותם: </w:t>
+        <w:t xml:space="preserve">רואן: </w:t>
       </w:r>
       <w:r>
         <w:rPr>
@@ -2631,7 +2631,7 @@
           <w:szCs w:val="24"/>
           <w:rtl/>
         </w:rPr>
-        <w:t xml:space="preserve">רותם: </w:t>
+        <w:t xml:space="preserve">רואן: </w:t>
       </w:r>
       <w:r>
         <w:rPr>
@@ -2689,7 +2689,7 @@
           <w:szCs w:val="24"/>
           <w:rtl/>
         </w:rPr>
-        <w:t xml:space="preserve">רותם: </w:t>
+        <w:t xml:space="preserve">רואן: </w:t>
       </w:r>
       <w:r>
         <w:rPr>
@@ -2747,7 +2747,7 @@
           <w:szCs w:val="24"/>
           <w:rtl/>
         </w:rPr>
-        <w:t xml:space="preserve">רותם: </w:t>
+        <w:t xml:space="preserve">רואן: </w:t>
       </w:r>
       <w:r>
         <w:rPr>
@@ -2805,17 +2805,17 @@
           <w:szCs w:val="24"/>
           <w:rtl/>
         </w:rPr>
-        <w:t xml:space="preserve">רותם: </w:t>
-      </w:r>
-      <w:r>
-        <w:rPr>
-          <w:rFonts w:ascii="David" w:cs="David" w:eastAsia="David" w:hAnsi="David"/>
-          <w:noProof/>
-          <w:sz w:val="24"/>
-          <w:szCs w:val="24"/>
-          <w:rtl/>
-        </w:rPr>
-        <w:t xml:space="preserve">שהעולים היו הראשונים לרשום עובדות. כי לרשום "עשן" לא צריך עברית ברמה גבוהה. ו... כמה זמן הם היו מוכנים להסתכל על תמונה אחת. כמעט עשרים דקות. אני לא מצליחה להחזיק אותם על טקסט חמש.</w:t>
+        <w:t xml:space="preserve">רואן: </w:t>
+      </w:r>
+      <w:r>
+        <w:rPr>
+          <w:rFonts w:ascii="David" w:cs="David" w:eastAsia="David" w:hAnsi="David"/>
+          <w:noProof/>
+          <w:sz w:val="24"/>
+          <w:szCs w:val="24"/>
+          <w:rtl/>
+        </w:rPr>
+        <w:t xml:space="preserve">שהחלשים בעברית היו הראשונים לרשום עובדות. כי לרשום "עשן" לא צריך עברית ברמה גבוהה. ו... כמה זמן הם היו מוכנים להסתכל על תמונה אחת. כמעט עשרים דקות. אני לא מצליחה להחזיק אותם על טקסט חמש.</w:t>
       </w:r>
     </w:p>
     <w:p>
@@ -2863,7 +2863,7 @@
           <w:szCs w:val="24"/>
           <w:rtl/>
         </w:rPr>
-        <w:t xml:space="preserve">רותם: </w:t>
+        <w:t xml:space="preserve">רואן: </w:t>
       </w:r>
       <w:r>
         <w:rPr>
@@ -2921,17 +2921,17 @@
           <w:szCs w:val="24"/>
           <w:rtl/>
         </w:rPr>
-        <w:t xml:space="preserve">רותם: </w:t>
-      </w:r>
-      <w:r>
-        <w:rPr>
-          <w:rFonts w:ascii="David" w:cs="David" w:eastAsia="David" w:hAnsi="David"/>
-          <w:noProof/>
-          <w:sz w:val="24"/>
-          <w:szCs w:val="24"/>
-          <w:rtl/>
-        </w:rPr>
-        <w:t xml:space="preserve">(נאנחת) קטע ארוך זה אירוע. אני מתכננת אותו כמו טיול. לפני, תמונה, כמו תמיד. חמש שבע מילים על הלוח שאני יודעת שיעצרו אותם, ומסבירים, לא מגדירים. ושאלה אחת שקוראים בשבילה. במהלך, אני מחלקת לחלקים קצרים, קוראת את הראשון בקול בעצמי, ואחרי כל חלק מישהו מסכם במשפט. ולמי שקשה יש גרסה מקוצרת, חצי אורך, שאני מניחה על השולחן בלי הכרזה. ולעולים לפעמים ברוסית, לצד, לא במקום.</w:t>
+        <w:t xml:space="preserve">רואן: </w:t>
+      </w:r>
+      <w:r>
+        <w:rPr>
+          <w:rFonts w:ascii="David" w:cs="David" w:eastAsia="David" w:hAnsi="David"/>
+          <w:noProof/>
+          <w:sz w:val="24"/>
+          <w:szCs w:val="24"/>
+          <w:rtl/>
+        </w:rPr>
+        <w:t xml:space="preserve">(נאנחת) קטע ארוך זה אירוע. אני מתכננת אותו כמו טיול. לפני, תמונה, כמו תמיד. חמש שבע מילים על הלוח שאני יודעת שיעצרו אותם, ומסבירים, לא מגדירים. ושאלה אחת שקוראים בשבילה. במהלך, אני מחלקת לחלקים קצרים, קוראת את הראשון בקול בעצמי, ואחרי כל חלק מישהו מסכם במשפט. ולמי שקשה יש גרסה מקוצרת, חצי אורך, שאני מניחה על השולחן בלי הכרזה. ולמי שהעברית שלו חלשה לפעמים בערבית, לצד, לא במקום.</w:t>
       </w:r>
     </w:p>
     <w:p>
@@ -2979,7 +2979,7 @@
           <w:szCs w:val="24"/>
           <w:rtl/>
         </w:rPr>
-        <w:t xml:space="preserve">רותם: </w:t>
+        <w:t xml:space="preserve">רואן: </w:t>
       </w:r>
       <w:r>
         <w:rPr>
@@ -3037,7 +3037,7 @@
           <w:szCs w:val="24"/>
           <w:rtl/>
         </w:rPr>
-        <w:t xml:space="preserve">רותם: </w:t>
+        <w:t xml:space="preserve">רואן: </w:t>
       </w:r>
       <w:r>
         <w:rPr>
@@ -3095,7 +3095,7 @@
           <w:szCs w:val="24"/>
           <w:rtl/>
         </w:rPr>
-        <w:t xml:space="preserve">רותם: </w:t>
+        <w:t xml:space="preserve">רואן: </w:t>
       </w:r>
       <w:r>
         <w:rPr>
@@ -3153,7 +3153,7 @@
           <w:szCs w:val="24"/>
           <w:rtl/>
         </w:rPr>
-        <w:t xml:space="preserve">רותם: </w:t>
+        <w:t xml:space="preserve">רואן: </w:t>
       </w:r>
       <w:r>
         <w:rPr>
@@ -3211,17 +3211,17 @@
           <w:szCs w:val="24"/>
           <w:rtl/>
         </w:rPr>
-        <w:t xml:space="preserve">רותם: </w:t>
-      </w:r>
-      <w:r>
-        <w:rPr>
-          <w:rFonts w:ascii="David" w:cs="David" w:eastAsia="David" w:hAnsi="David"/>
-          <w:noProof/>
-          <w:sz w:val="24"/>
-          <w:szCs w:val="24"/>
-          <w:rtl/>
-        </w:rPr>
-        <w:t xml:space="preserve">רועש. (צוחקת) השיעורים של ההכנה היו רועשים וזה הפחיד אותי בהתחלה. אבל זה היה רעש של עבודה. תלמידים שבדרך כלל לא עובדים עבדו. ו... הקומיקס של תלמיד עולה, שכותב במבחנים שתי שורות, הראה הבנה של תנאי העבודה שלא הייתי רואה בשום מבחן. בשום.</w:t>
+        <w:t xml:space="preserve">רואן: </w:t>
+      </w:r>
+      <w:r>
+        <w:rPr>
+          <w:rFonts w:ascii="David" w:cs="David" w:eastAsia="David" w:hAnsi="David"/>
+          <w:noProof/>
+          <w:sz w:val="24"/>
+          <w:szCs w:val="24"/>
+          <w:rtl/>
+        </w:rPr>
+        <w:t xml:space="preserve">רועש. (צוחקת) השיעורים של ההכנה היו רועשים וזה הפחיד אותי בהתחלה. אבל זה היה רעש של עבודה. תלמידים שבדרך כלל לא עובדים עבדו. ו... הקומיקס של תלמיד מהפזורה, שכותב במבחנים שתי שורות, הראה הבנה של תנאי העבודה שלא הייתי רואה בשום מבחן. בשום.</w:t>
       </w:r>
     </w:p>
     <w:p>
@@ -3269,7 +3269,7 @@
           <w:szCs w:val="24"/>
           <w:rtl/>
         </w:rPr>
-        <w:t xml:space="preserve">רותם: </w:t>
+        <w:t xml:space="preserve">רואן: </w:t>
       </w:r>
       <w:r>
         <w:rPr>
@@ -3327,7 +3327,7 @@
           <w:szCs w:val="24"/>
           <w:rtl/>
         </w:rPr>
-        <w:t xml:space="preserve">רותם: </w:t>
+        <w:t xml:space="preserve">רואן: </w:t>
       </w:r>
       <w:r>
         <w:rPr>
@@ -3385,7 +3385,7 @@
           <w:szCs w:val="24"/>
           <w:rtl/>
         </w:rPr>
-        <w:t xml:space="preserve">רותם: </w:t>
+        <w:t xml:space="preserve">רואן: </w:t>
       </w:r>
       <w:r>
         <w:rPr>
@@ -3443,7 +3443,7 @@
           <w:szCs w:val="24"/>
           <w:rtl/>
         </w:rPr>
-        <w:t xml:space="preserve">רותם: </w:t>
+        <w:t xml:space="preserve">רואן: </w:t>
       </w:r>
       <w:r>
         <w:rPr>
@@ -3501,7 +3501,7 @@
           <w:szCs w:val="24"/>
           <w:rtl/>
         </w:rPr>
-        <w:t xml:space="preserve">רותם: </w:t>
+        <w:t xml:space="preserve">רואן: </w:t>
       </w:r>
       <w:r>
         <w:rPr>
@@ -3559,7 +3559,7 @@
           <w:szCs w:val="24"/>
           <w:rtl/>
         </w:rPr>
-        <w:t xml:space="preserve">רותם: </w:t>
+        <w:t xml:space="preserve">רואן: </w:t>
       </w:r>
       <w:r>
         <w:rPr>
@@ -3617,7 +3617,7 @@
           <w:szCs w:val="24"/>
           <w:rtl/>
         </w:rPr>
-        <w:t xml:space="preserve">רותם: </w:t>
+        <w:t xml:space="preserve">רואן: </w:t>
       </w:r>
       <w:r>
         <w:rPr>
@@ -3675,7 +3675,7 @@
           <w:szCs w:val="24"/>
           <w:rtl/>
         </w:rPr>
-        <w:t xml:space="preserve">רותם: </w:t>
+        <w:t xml:space="preserve">רואן: </w:t>
       </w:r>
       <w:r>
         <w:rPr>
@@ -3733,7 +3733,7 @@
           <w:szCs w:val="24"/>
           <w:rtl/>
         </w:rPr>
-        <w:t xml:space="preserve">רותם: </w:t>
+        <w:t xml:space="preserve">רואן: </w:t>
       </w:r>
       <w:r>
         <w:rPr>
@@ -3791,7 +3791,7 @@
           <w:szCs w:val="24"/>
           <w:rtl/>
         </w:rPr>
-        <w:t xml:space="preserve">רותם: </w:t>
+        <w:t xml:space="preserve">רואן: </w:t>
       </w:r>
       <w:r>
         <w:rPr>
@@ -3849,7 +3849,7 @@
           <w:szCs w:val="24"/>
           <w:rtl/>
         </w:rPr>
-        <w:t xml:space="preserve">רותם: </w:t>
+        <w:t xml:space="preserve">רואן: </w:t>
       </w:r>
       <w:r>
         <w:rPr>
@@ -3907,7 +3907,7 @@
           <w:szCs w:val="24"/>
           <w:rtl/>
         </w:rPr>
-        <w:t xml:space="preserve">רותם: </w:t>
+        <w:t xml:space="preserve">רואן: </w:t>
       </w:r>
       <w:r>
         <w:rPr>
@@ -3965,7 +3965,7 @@
           <w:szCs w:val="24"/>
           <w:rtl/>
         </w:rPr>
-        <w:t xml:space="preserve">רותם: </w:t>
+        <w:t xml:space="preserve">רואן: </w:t>
       </w:r>
       <w:r>
         <w:rPr>
@@ -4023,7 +4023,7 @@
           <w:szCs w:val="24"/>
           <w:rtl/>
         </w:rPr>
-        <w:t xml:space="preserve">רותם: </w:t>
+        <w:t xml:space="preserve">רואן: </w:t>
       </w:r>
       <w:r>
         <w:rPr>
@@ -4081,7 +4081,7 @@
           <w:szCs w:val="24"/>
           <w:rtl/>
         </w:rPr>
-        <w:t xml:space="preserve">רותם: </w:t>
+        <w:t xml:space="preserve">רואן: </w:t>
       </w:r>
       <w:r>
         <w:rPr>
@@ -4139,7 +4139,7 @@
           <w:szCs w:val="24"/>
           <w:rtl/>
         </w:rPr>
-        <w:t xml:space="preserve">רותם: </w:t>
+        <w:t xml:space="preserve">רואן: </w:t>
       </w:r>
       <w:r>
         <w:rPr>
@@ -4197,7 +4197,7 @@
           <w:szCs w:val="24"/>
           <w:rtl/>
         </w:rPr>
-        <w:t xml:space="preserve">רותם: </w:t>
+        <w:t xml:space="preserve">רואן: </w:t>
       </w:r>
       <w:r>
         <w:rPr>
@@ -4274,7 +4274,7 @@
           <w:szCs w:val="24"/>
           <w:rtl/>
         </w:rPr>
-        <w:t xml:space="preserve">רותם: </w:t>
+        <w:t xml:space="preserve">רואן: </w:t>
       </w:r>
       <w:r>
         <w:rPr>
@@ -4332,7 +4332,7 @@
           <w:szCs w:val="24"/>
           <w:rtl/>
         </w:rPr>
-        <w:t xml:space="preserve">רותם: </w:t>
+        <w:t xml:space="preserve">רואן: </w:t>
       </w:r>
       <w:r>
         <w:rPr>
@@ -4390,7 +4390,7 @@
           <w:szCs w:val="24"/>
           <w:rtl/>
         </w:rPr>
-        <w:t xml:space="preserve">רותם: </w:t>
+        <w:t xml:space="preserve">רואן: </w:t>
       </w:r>
       <w:r>
         <w:rPr>
@@ -4448,7 +4448,7 @@
           <w:szCs w:val="24"/>
           <w:rtl/>
         </w:rPr>
-        <w:t xml:space="preserve">רותם: </w:t>
+        <w:t xml:space="preserve">רואן: </w:t>
       </w:r>
       <w:r>
         <w:rPr>
@@ -7773,7 +7773,7 @@
           <w:szCs w:val="28"/>
           <w:rtl/>
         </w:rPr>
-        <w:t xml:space="preserve">ריאיון מס' 3: יעל (שם בדוי)</w:t>
+        <w:t xml:space="preserve">ריאיון מס' 3: לינא (שם בדוי)</w:t>
       </w:r>
     </w:p>
     <w:p>
@@ -7792,7 +7792,7 @@
           <w:szCs w:val="24"/>
           <w:rtl/>
         </w:rPr>
-        <w:t xml:space="preserve">מורה לספרות וללשון ורכזת פדגוגית בחטיבת ביניים בנתיבות, 22 שנות ותק.</w:t>
+        <w:t xml:space="preserve">מורה לספרות ערבית וללשון ורכזת פדגוגית בחטיבת ביניים בחורה, 22 שנות ותק.</w:t>
       </w:r>
     </w:p>
     <w:p>
@@ -7849,7 +7849,7 @@
           <w:szCs w:val="24"/>
           <w:rtl/>
         </w:rPr>
-        <w:t xml:space="preserve">יעל: </w:t>
+        <w:t xml:space="preserve">לינא: </w:t>
       </w:r>
       <w:r>
         <w:rPr>
@@ -7907,7 +7907,7 @@
           <w:szCs w:val="24"/>
           <w:rtl/>
         </w:rPr>
-        <w:t xml:space="preserve">יעל: </w:t>
+        <w:t xml:space="preserve">לינא: </w:t>
       </w:r>
       <w:r>
         <w:rPr>
@@ -7965,7 +7965,7 @@
           <w:szCs w:val="24"/>
           <w:rtl/>
         </w:rPr>
-        <w:t xml:space="preserve">יעל: </w:t>
+        <w:t xml:space="preserve">לינא: </w:t>
       </w:r>
       <w:r>
         <w:rPr>
@@ -8023,7 +8023,7 @@
           <w:szCs w:val="24"/>
           <w:rtl/>
         </w:rPr>
-        <w:t xml:space="preserve">יעל: </w:t>
+        <w:t xml:space="preserve">לינא: </w:t>
       </w:r>
       <w:r>
         <w:rPr>
@@ -8081,7 +8081,7 @@
           <w:szCs w:val="24"/>
           <w:rtl/>
         </w:rPr>
-        <w:t xml:space="preserve">יעל: </w:t>
+        <w:t xml:space="preserve">לינא: </w:t>
       </w:r>
       <w:r>
         <w:rPr>
@@ -8139,17 +8139,17 @@
           <w:szCs w:val="24"/>
           <w:rtl/>
         </w:rPr>
-        <w:t xml:space="preserve">יעל: </w:t>
-      </w:r>
-      <w:r>
-        <w:rPr>
-          <w:rFonts w:ascii="David" w:cs="David" w:eastAsia="David" w:hAnsi="David"/>
-          <w:noProof/>
-          <w:sz w:val="24"/>
-          <w:szCs w:val="24"/>
-          <w:rtl/>
-        </w:rPr>
-        <w:t xml:space="preserve">יש לי כזה. שנה עשירית. כיתה ט', שיר של רחל. עשיתי מה שעשיתי עשר שנים. קראתי בקול, ניתחנו שורה שורה, אמצעי עיצוב על הלוח. ותלמיד עם דיסלקציה קשה, שידעתי שהוא מאובחן, אמר בקול, לא בכעס, בעייפות: "המורה, אני לא מצליח לעקוב אחרי השורות, אז אני סתם יושב פה." (שתיקה) והשורה שניתחנו באותו רגע הייתה על בדידות.</w:t>
+        <w:t xml:space="preserve">לינא: </w:t>
+      </w:r>
+      <w:r>
+        <w:rPr>
+          <w:rFonts w:ascii="David" w:cs="David" w:eastAsia="David" w:hAnsi="David"/>
+          <w:noProof/>
+          <w:sz w:val="24"/>
+          <w:szCs w:val="24"/>
+          <w:rtl/>
+        </w:rPr>
+        <w:t xml:space="preserve">יש לי כזה. שנה עשירית. כיתה ט', שיר של מחמוד דרוויש. עשיתי מה שעשיתי עשר שנים. קראתי בקול, ניתחנו שורה שורה, אמצעי עיצוב על הלוח. ותלמיד עם דיסלקציה קשה, שידעתי שהוא מאובחן, אמר בקול, לא בכעס, בעייפות: "המורה, אני לא מצליח לעקוב אחרי השורות, אז אני סתם יושב פה." (שתיקה) והשורה שניתחנו באותו רגע הייתה על בדידות.</w:t>
       </w:r>
     </w:p>
     <w:p>
@@ -8197,7 +8197,7 @@
           <w:szCs w:val="24"/>
           <w:rtl/>
         </w:rPr>
-        <w:t xml:space="preserve">יעל: </w:t>
+        <w:t xml:space="preserve">לינא: </w:t>
       </w:r>
       <w:r>
         <w:rPr>
@@ -8255,7 +8255,7 @@
           <w:szCs w:val="24"/>
           <w:rtl/>
         </w:rPr>
-        <w:t xml:space="preserve">יעל: </w:t>
+        <w:t xml:space="preserve">לינא: </w:t>
       </w:r>
       <w:r>
         <w:rPr>
@@ -8313,17 +8313,17 @@
           <w:szCs w:val="24"/>
           <w:rtl/>
         </w:rPr>
-        <w:t xml:space="preserve">יעל: </w:t>
-      </w:r>
-      <w:r>
-        <w:rPr>
-          <w:rFonts w:ascii="David" w:cs="David" w:eastAsia="David" w:hAnsi="David"/>
-          <w:noProof/>
-          <w:sz w:val="24"/>
-          <w:szCs w:val="24"/>
-          <w:rtl/>
-        </w:rPr>
-        <w:t xml:space="preserve">את הסדר של כל שיעור. קודם החוויה, בשמיעה, בתמונה, בציור. ואז הטקסט. ובריכוז, אני מבקשת מכל מורה שאני מדריכה לשאול את עצמה לפני שיעור: "מה עושה בשיעור הזה תלמיד שלא יכול לקרוא?" ואם התשובה "יושב", השיעור צריך שינוי. (שתיקה) התלמיד ההוא, אגב, איתי נקרא לו, אני אספר לך גם מה קרה איתו אחר כך, כי זה קשור. הוא היה יושב עם הספר בעמוד הלא נכון ואומר "אני לא רואה טוב". ונתתי לו טקסטים מוקלטים, וזה עזר קצת, אבל הוא לא היה בפנים. ובשיחה איתו הבנתי שמאחורי הקריאה יש משהו אחר. הוא היה בטוח שספרות זה "לחכמים". שכל השיעור זה מבחן שהוא כבר נכשל בו.</w:t>
+        <w:t xml:space="preserve">לינא: </w:t>
+      </w:r>
+      <w:r>
+        <w:rPr>
+          <w:rFonts w:ascii="David" w:cs="David" w:eastAsia="David" w:hAnsi="David"/>
+          <w:noProof/>
+          <w:sz w:val="24"/>
+          <w:szCs w:val="24"/>
+          <w:rtl/>
+        </w:rPr>
+        <w:t xml:space="preserve">את הסדר של כל שיעור. קודם החוויה, בשמיעה, בתמונה, בציור. ואז הטקסט. ובריכוז, אני מבקשת מכל מורה שאני מדריכה לשאול את עצמה לפני שיעור: "מה עושה בשיעור הזה תלמיד שלא יכול לקרוא?" ואם התשובה "יושב", השיעור צריך שינוי. (שתיקה) התלמיד ההוא, אגב, אדם נקרא לו, אני אספר לך גם מה קרה איתו אחר כך, כי זה קשור. הוא היה יושב עם הספר בעמוד הלא נכון ואומר "אני לא רואה טוב". ונתתי לו טקסטים מוקלטים, וזה עזר קצת, אבל הוא לא היה בפנים. ובשיחה איתו הבנתי שמאחורי הקריאה יש משהו אחר. הוא היה בטוח שספרות זה "לחכמים". שכל השיעור זה מבחן שהוא כבר נכשל בו.</w:t>
       </w:r>
     </w:p>
     <w:p>
@@ -8371,7 +8371,7 @@
           <w:szCs w:val="24"/>
           <w:rtl/>
         </w:rPr>
-        <w:t xml:space="preserve">יעל: </w:t>
+        <w:t xml:space="preserve">לינא: </w:t>
       </w:r>
       <w:r>
         <w:rPr>
@@ -8429,7 +8429,7 @@
           <w:szCs w:val="24"/>
           <w:rtl/>
         </w:rPr>
-        <w:t xml:space="preserve">יעל: </w:t>
+        <w:t xml:space="preserve">לינא: </w:t>
       </w:r>
       <w:r>
         <w:rPr>
@@ -8487,7 +8487,7 @@
           <w:szCs w:val="24"/>
           <w:rtl/>
         </w:rPr>
-        <w:t xml:space="preserve">יעל: </w:t>
+        <w:t xml:space="preserve">לינא: </w:t>
       </w:r>
       <w:r>
         <w:rPr>
@@ -8545,7 +8545,7 @@
           <w:szCs w:val="24"/>
           <w:rtl/>
         </w:rPr>
-        <w:t xml:space="preserve">יעל: </w:t>
+        <w:t xml:space="preserve">לינא: </w:t>
       </w:r>
       <w:r>
         <w:rPr>
@@ -8603,7 +8603,7 @@
           <w:szCs w:val="24"/>
           <w:rtl/>
         </w:rPr>
-        <w:t xml:space="preserve">יעל: </w:t>
+        <w:t xml:space="preserve">לינא: </w:t>
       </w:r>
       <w:r>
         <w:rPr>
@@ -8661,7 +8661,7 @@
           <w:szCs w:val="24"/>
           <w:rtl/>
         </w:rPr>
-        <w:t xml:space="preserve">יעל: </w:t>
+        <w:t xml:space="preserve">לינא: </w:t>
       </w:r>
       <w:r>
         <w:rPr>
@@ -8719,7 +8719,7 @@
           <w:szCs w:val="24"/>
           <w:rtl/>
         </w:rPr>
-        <w:t xml:space="preserve">יעל: </w:t>
+        <w:t xml:space="preserve">לינא: </w:t>
       </w:r>
       <w:r>
         <w:rPr>
@@ -8777,7 +8777,7 @@
           <w:szCs w:val="24"/>
           <w:rtl/>
         </w:rPr>
-        <w:t xml:space="preserve">יעל: </w:t>
+        <w:t xml:space="preserve">לינא: </w:t>
       </w:r>
       <w:r>
         <w:rPr>
@@ -8835,7 +8835,7 @@
           <w:szCs w:val="24"/>
           <w:rtl/>
         </w:rPr>
-        <w:t xml:space="preserve">יעל: </w:t>
+        <w:t xml:space="preserve">לינא: </w:t>
       </w:r>
       <w:r>
         <w:rPr>
@@ -8893,7 +8893,7 @@
           <w:szCs w:val="24"/>
           <w:rtl/>
         </w:rPr>
-        <w:t xml:space="preserve">יעל: </w:t>
+        <w:t xml:space="preserve">לינא: </w:t>
       </w:r>
       <w:r>
         <w:rPr>
@@ -8951,7 +8951,7 @@
           <w:szCs w:val="24"/>
           <w:rtl/>
         </w:rPr>
-        <w:t xml:space="preserve">יעל: </w:t>
+        <w:t xml:space="preserve">לינא: </w:t>
       </w:r>
       <w:r>
         <w:rPr>
@@ -9009,7 +9009,7 @@
           <w:szCs w:val="24"/>
           <w:rtl/>
         </w:rPr>
-        <w:t xml:space="preserve">יעל: </w:t>
+        <w:t xml:space="preserve">לינא: </w:t>
       </w:r>
       <w:r>
         <w:rPr>
@@ -9067,7 +9067,7 @@
           <w:szCs w:val="24"/>
           <w:rtl/>
         </w:rPr>
-        <w:t xml:space="preserve">יעל: </w:t>
+        <w:t xml:space="preserve">לינא: </w:t>
       </w:r>
       <w:r>
         <w:rPr>
@@ -9125,7 +9125,7 @@
           <w:szCs w:val="24"/>
           <w:rtl/>
         </w:rPr>
-        <w:t xml:space="preserve">יעל: </w:t>
+        <w:t xml:space="preserve">לינא: </w:t>
       </w:r>
       <w:r>
         <w:rPr>
@@ -9183,7 +9183,7 @@
           <w:szCs w:val="24"/>
           <w:rtl/>
         </w:rPr>
-        <w:t xml:space="preserve">יעל: </w:t>
+        <w:t xml:space="preserve">לינא: </w:t>
       </w:r>
       <w:r>
         <w:rPr>
@@ -9241,7 +9241,7 @@
           <w:szCs w:val="24"/>
           <w:rtl/>
         </w:rPr>
-        <w:t xml:space="preserve">יעל: </w:t>
+        <w:t xml:space="preserve">לינא: </w:t>
       </w:r>
       <w:r>
         <w:rPr>
@@ -9299,7 +9299,7 @@
           <w:szCs w:val="24"/>
           <w:rtl/>
         </w:rPr>
-        <w:t xml:space="preserve">יעל: </w:t>
+        <w:t xml:space="preserve">לינא: </w:t>
       </w:r>
       <w:r>
         <w:rPr>
@@ -9357,7 +9357,7 @@
           <w:szCs w:val="24"/>
           <w:rtl/>
         </w:rPr>
-        <w:t xml:space="preserve">יעל: </w:t>
+        <w:t xml:space="preserve">לינא: </w:t>
       </w:r>
       <w:r>
         <w:rPr>
@@ -9415,7 +9415,7 @@
           <w:szCs w:val="24"/>
           <w:rtl/>
         </w:rPr>
-        <w:t xml:space="preserve">יעל: </w:t>
+        <w:t xml:space="preserve">לינא: </w:t>
       </w:r>
       <w:r>
         <w:rPr>
@@ -9473,7 +9473,7 @@
           <w:szCs w:val="24"/>
           <w:rtl/>
         </w:rPr>
-        <w:t xml:space="preserve">יעל: </w:t>
+        <w:t xml:space="preserve">לינא: </w:t>
       </w:r>
       <w:r>
         <w:rPr>
@@ -9531,7 +9531,7 @@
           <w:szCs w:val="24"/>
           <w:rtl/>
         </w:rPr>
-        <w:t xml:space="preserve">יעל: </w:t>
+        <w:t xml:space="preserve">לינא: </w:t>
       </w:r>
       <w:r>
         <w:rPr>
@@ -9608,7 +9608,7 @@
           <w:szCs w:val="24"/>
           <w:rtl/>
         </w:rPr>
-        <w:t xml:space="preserve">יעל: </w:t>
+        <w:t xml:space="preserve">לינא: </w:t>
       </w:r>
       <w:r>
         <w:rPr>
@@ -9666,7 +9666,7 @@
           <w:szCs w:val="24"/>
           <w:rtl/>
         </w:rPr>
-        <w:t xml:space="preserve">יעל: </w:t>
+        <w:t xml:space="preserve">לינא: </w:t>
       </w:r>
       <w:r>
         <w:rPr>
@@ -9724,7 +9724,7 @@
           <w:szCs w:val="24"/>
           <w:rtl/>
         </w:rPr>
-        <w:t xml:space="preserve">יעל: </w:t>
+        <w:t xml:space="preserve">לינא: </w:t>
       </w:r>
       <w:r>
         <w:rPr>
@@ -9782,7 +9782,7 @@
           <w:szCs w:val="24"/>
           <w:rtl/>
         </w:rPr>
-        <w:t xml:space="preserve">יעל: </w:t>
+        <w:t xml:space="preserve">לינא: </w:t>
       </w:r>
       <w:r>
         <w:rPr>
@@ -9840,7 +9840,7 @@
           <w:szCs w:val="24"/>
           <w:rtl/>
         </w:rPr>
-        <w:t xml:space="preserve">יעל: </w:t>
+        <w:t xml:space="preserve">לינא: </w:t>
       </w:r>
       <w:r>
         <w:rPr>
@@ -9898,7 +9898,7 @@
           <w:szCs w:val="24"/>
           <w:rtl/>
         </w:rPr>
-        <w:t xml:space="preserve">יעל: </w:t>
+        <w:t xml:space="preserve">לינא: </w:t>
       </w:r>
       <w:r>
         <w:rPr>
@@ -9956,7 +9956,7 @@
           <w:szCs w:val="24"/>
           <w:rtl/>
         </w:rPr>
-        <w:t xml:space="preserve">יעל: </w:t>
+        <w:t xml:space="preserve">לינא: </w:t>
       </w:r>
       <w:r>
         <w:rPr>
@@ -10014,7 +10014,7 @@
           <w:szCs w:val="24"/>
           <w:rtl/>
         </w:rPr>
-        <w:t xml:space="preserve">יעל: </w:t>
+        <w:t xml:space="preserve">לינא: </w:t>
       </w:r>
       <w:r>
         <w:rPr>
@@ -10072,7 +10072,7 @@
           <w:szCs w:val="24"/>
           <w:rtl/>
         </w:rPr>
-        <w:t xml:space="preserve">יעל: </w:t>
+        <w:t xml:space="preserve">לינא: </w:t>
       </w:r>
       <w:r>
         <w:rPr>
@@ -10130,7 +10130,7 @@
           <w:szCs w:val="24"/>
           <w:rtl/>
         </w:rPr>
-        <w:t xml:space="preserve">יעל: </w:t>
+        <w:t xml:space="preserve">לינא: </w:t>
       </w:r>
       <w:r>
         <w:rPr>
@@ -10188,7 +10188,7 @@
           <w:szCs w:val="24"/>
           <w:rtl/>
         </w:rPr>
-        <w:t xml:space="preserve">יעל: </w:t>
+        <w:t xml:space="preserve">לינא: </w:t>
       </w:r>
       <w:r>
         <w:rPr>
@@ -10246,7 +10246,7 @@
           <w:szCs w:val="24"/>
           <w:rtl/>
         </w:rPr>
-        <w:t xml:space="preserve">יעל: </w:t>
+        <w:t xml:space="preserve">לינא: </w:t>
       </w:r>
       <w:r>
         <w:rPr>
@@ -10304,7 +10304,7 @@
           <w:szCs w:val="24"/>
           <w:rtl/>
         </w:rPr>
-        <w:t xml:space="preserve">יעל: </w:t>
+        <w:t xml:space="preserve">לינא: </w:t>
       </w:r>
       <w:r>
         <w:rPr>
@@ -10362,7 +10362,7 @@
           <w:szCs w:val="24"/>
           <w:rtl/>
         </w:rPr>
-        <w:t xml:space="preserve">יעל: </w:t>
+        <w:t xml:space="preserve">לינא: </w:t>
       </w:r>
       <w:r>
         <w:rPr>
@@ -10420,7 +10420,7 @@
           <w:szCs w:val="24"/>
           <w:rtl/>
         </w:rPr>
-        <w:t xml:space="preserve">יעל: </w:t>
+        <w:t xml:space="preserve">לינא: </w:t>
       </w:r>
       <w:r>
         <w:rPr>
@@ -10478,7 +10478,7 @@
           <w:szCs w:val="24"/>
           <w:rtl/>
         </w:rPr>
-        <w:t xml:space="preserve">יעל: </w:t>
+        <w:t xml:space="preserve">לינא: </w:t>
       </w:r>
       <w:r>
         <w:rPr>
@@ -10536,7 +10536,7 @@
           <w:szCs w:val="24"/>
           <w:rtl/>
         </w:rPr>
-        <w:t xml:space="preserve">יעל: </w:t>
+        <w:t xml:space="preserve">לינא: </w:t>
       </w:r>
       <w:r>
         <w:rPr>
@@ -10594,7 +10594,7 @@
           <w:szCs w:val="24"/>
           <w:rtl/>
         </w:rPr>
-        <w:t xml:space="preserve">יעל: </w:t>
+        <w:t xml:space="preserve">לינא: </w:t>
       </w:r>
       <w:r>
         <w:rPr>
@@ -10643,7 +10643,7 @@
           <w:szCs w:val="28"/>
           <w:rtl/>
         </w:rPr>
-        <w:t xml:space="preserve">ריאיון מס' 4: נטלי (שם בדוי)</w:t>
+        <w:t xml:space="preserve">ריאיון מס' 4: עיינא (שם בדוי)</w:t>
       </w:r>
     </w:p>
     <w:p>
@@ -10662,7 +10662,7 @@
           <w:szCs w:val="24"/>
           <w:rtl/>
         </w:rPr>
-        <w:t xml:space="preserve">מורה למדעים בחטיבת ביניים בדימונה, 8 שנות ותק, עלתה מרוסיה בילדותה.</w:t>
+        <w:t xml:space="preserve">מורה למדעים בחטיבת ביניים בכסיפה, 8 שנות ותק, גדלה בכפר לא מוכר ועברה ליישוב בילדותה.</w:t>
       </w:r>
     </w:p>
     <w:p>
@@ -10748,17 +10748,17 @@
           <w:szCs w:val="24"/>
           <w:rtl/>
         </w:rPr>
-        <w:t xml:space="preserve">נטלי: </w:t>
-      </w:r>
-      <w:r>
-        <w:rPr>
-          <w:rFonts w:ascii="David" w:cs="David" w:eastAsia="David" w:hAnsi="David"/>
-          <w:noProof/>
-          <w:sz w:val="24"/>
-          <w:szCs w:val="24"/>
-          <w:rtl/>
-        </w:rPr>
-        <w:t xml:space="preserve">אז... אני בת שלושים וארבע, מלמדת מדעים פה שמונה שנים, ז' עד ט'. עליתי מרוסיה בגיל שבע. ואני זוכרת מצוין את השנים הראשונות בבית ספר פה. ידעתי דברים ולא יכולתי להגיד אותם. והמורים חשבו שאני חלשה. (שתיקה) אני חושבת שזה מה שהביא אותי. אבל בדרך למדתי ביולוגיה, רציתי מעבדה, ורק בתואר השני הבנתי שאני רוצה לעבוד עם ילדים שמרגישים כמו שאני הרגשתי.</w:t>
+        <w:t xml:space="preserve">עיינא: </w:t>
+      </w:r>
+      <w:r>
+        <w:rPr>
+          <w:rFonts w:ascii="David" w:cs="David" w:eastAsia="David" w:hAnsi="David"/>
+          <w:noProof/>
+          <w:sz w:val="24"/>
+          <w:szCs w:val="24"/>
+          <w:rtl/>
+        </w:rPr>
+        <w:t xml:space="preserve">אז... אני בת שלושים וארבע, מלמדת מדעים פה שמונה שנים, ז' עד ט'. גדלתי בכפר לא מוכר, בלי גן, ובגיל שבע עברנו ליישוב. ואני זוכרת מצוין את השנים הראשונות בבית הספר הגדול. ידעתי דברים מהחיים ולא ידעתי את המילים של הספר, ובעברית בכלל לא. והמורים חשבו שאני חלשה. (שתיקה) אני חושבת שזה מה שהביא אותי. אבל בדרך למדתי ביולוגיה, רציתי מעבדה, ורק בתואר השני הבנתי שאני רוצה לעבוד עם ילדים שמרגישים כמו שאני הרגשתי.</w:t>
       </w:r>
     </w:p>
     <w:p>
@@ -10806,17 +10806,17 @@
           <w:szCs w:val="24"/>
           <w:rtl/>
         </w:rPr>
-        <w:t xml:space="preserve">נטלי: </w:t>
-      </w:r>
-      <w:r>
-        <w:rPr>
-          <w:rFonts w:ascii="David" w:cs="David" w:eastAsia="David" w:hAnsi="David"/>
-          <w:noProof/>
-          <w:sz w:val="24"/>
-          <w:szCs w:val="24"/>
-          <w:rtl/>
-        </w:rPr>
-        <w:t xml:space="preserve">(שתיקה) אני זוכרת שיעור חשבון בכיתה ב'. המורה שאלה שאלה, ואני ידעתי את התשובה, וידעתי אותה ברוסית, ולא ידעתי איך להגיד "שמונה עשרה" בעברית. אז לא הרמתי יד. וילד אחר ענה לא נכון. והמורה תיקנה אותו. ואני ישבתי וידעתי. (שתיקה) ואני חושבת שזה הרגע שאני מנסה למנוע כל יום. ילד שיודע ולא יכול להגיד. וזה למה בכיתה שלי מותר לענות בכל שפה. כל שפה. ואני אתרגם.</w:t>
+        <w:t xml:space="preserve">עיינא: </w:t>
+      </w:r>
+      <w:r>
+        <w:rPr>
+          <w:rFonts w:ascii="David" w:cs="David" w:eastAsia="David" w:hAnsi="David"/>
+          <w:noProof/>
+          <w:sz w:val="24"/>
+          <w:szCs w:val="24"/>
+          <w:rtl/>
+        </w:rPr>
+        <w:t xml:space="preserve">(שתיקה) אני זוכרת שיעור עברית בכיתה ג'. המורה שאלה כמה זה, ואני ידעתי את התשובה, וידעתי אותה בערבית, ולא ידעתי איך להגיד "שמונה עשרה" בעברית. אז לא הרמתי יד. וילד אחר ענה לא נכון. והמורה תיקנה אותו. ואני ישבתי וידעתי. (שתיקה) ואני חושבת שזה הרגע שאני מנסה למנוע כל יום. ילד שיודע ולא יכול להגיד. וזה למה בכיתה שלי מותר לענות בכל שפה. כל שפה. ואני אתרגם.</w:t>
       </w:r>
     </w:p>
     <w:p>
@@ -10864,7 +10864,7 @@
           <w:szCs w:val="24"/>
           <w:rtl/>
         </w:rPr>
-        <w:t xml:space="preserve">נטלי: </w:t>
+        <w:t xml:space="preserve">עיינא: </w:t>
       </w:r>
       <w:r>
         <w:rPr>
@@ -10922,17 +10922,17 @@
           <w:szCs w:val="24"/>
           <w:rtl/>
         </w:rPr>
-        <w:t xml:space="preserve">נטלי: </w:t>
-      </w:r>
-      <w:r>
-        <w:rPr>
-          <w:rFonts w:ascii="David" w:cs="David" w:eastAsia="David" w:hAnsi="David"/>
-          <w:noProof/>
-          <w:sz w:val="24"/>
-          <w:szCs w:val="24"/>
-          <w:rtl/>
-        </w:rPr>
-        <w:t xml:space="preserve">בהתחלה לימדתי כמו שלימדו אותי. מושג, הגדרה, תרגול. והעולים, שבגללם באתי, נשארו בחוץ. כי ההגדרה בעברית הייתה קיר. שלוש שנים לקח לי להבין שאני חוזרת על הטעות שעשו איתי. בודקת שפה במקום לבדוק הבנה. (שתיקה) היום כל מושג מתחיל מתמונה, מניסוי, מסרטון. ורק אחר כך מקבל שם.</w:t>
+        <w:t xml:space="preserve">עיינא: </w:t>
+      </w:r>
+      <w:r>
+        <w:rPr>
+          <w:rFonts w:ascii="David" w:cs="David" w:eastAsia="David" w:hAnsi="David"/>
+          <w:noProof/>
+          <w:sz w:val="24"/>
+          <w:szCs w:val="24"/>
+          <w:rtl/>
+        </w:rPr>
+        <w:t xml:space="preserve">בהתחלה לימדתי כמו שלימדו אותי. מושג, הגדרה, תרגול. והתלמידים מהפזורה, שבגללם באתי, נשארו בחוץ. כי ההגדרה בעברית הייתה קיר. שלוש שנים לקח לי להבין שאני חוזרת על הטעות שעשו איתי. בודקת שפה במקום לבדוק הבנה. (שתיקה) היום כל מושג מתחיל מתמונה, מניסוי, מסרטון. ורק אחר כך מקבל שם.</w:t>
       </w:r>
     </w:p>
     <w:p>
@@ -10980,75 +10980,75 @@
           <w:szCs w:val="24"/>
           <w:rtl/>
         </w:rPr>
-        <w:t xml:space="preserve">נטלי: </w:t>
-      </w:r>
-      <w:r>
-        <w:rPr>
-          <w:rFonts w:ascii="David" w:cs="David" w:eastAsia="David" w:hAnsi="David"/>
-          <w:noProof/>
-          <w:sz w:val="24"/>
-          <w:szCs w:val="24"/>
-          <w:rtl/>
-        </w:rPr>
-        <w:t xml:space="preserve">ח'4. שלושים ואחד. שישה עולים, אוקראינה ורוסיה, שנתיים אחרונות. שלושה עם עברית לשיחה אבל לא לספר, שלושה עם עברית בסיסית מאוד. ארבעה תלמידי שילוב, שניים עם קשב חמור, סייעת בחלק מהשיעורים. חמישה שישה ותיקים חזקים מאוד שמדעים זה המקצוע שלהם ומשתעממים מהר. והאמצע, שהוא הרוב. יכולים להבין אם נותנים דרך, ומפסיקים ברגע שהשיעור הופך לדף.</w:t>
-      </w:r>
-    </w:p>
-    <w:p>
-      <w:pPr>
-        <w:bidi/>
-        <w:spacing w:after="120" w:line="360" w:lineRule="auto"/>
-        <w:jc w:val="both"/>
-      </w:pPr>
-      <w:r>
-        <w:rPr>
-          <w:rFonts w:ascii="David" w:cs="David" w:eastAsia="David" w:hAnsi="David"/>
-          <w:noProof/>
-          <w:b/>
-          <w:bCs/>
-          <w:sz w:val="24"/>
-          <w:szCs w:val="24"/>
-          <w:rtl/>
-        </w:rPr>
-        <w:t xml:space="preserve">מ: </w:t>
-      </w:r>
-      <w:r>
-        <w:rPr>
-          <w:rFonts w:ascii="David" w:cs="David" w:eastAsia="David" w:hAnsi="David"/>
-          <w:noProof/>
-          <w:sz w:val="24"/>
-          <w:szCs w:val="24"/>
-          <w:rtl/>
-        </w:rPr>
-        <w:t xml:space="preserve">איך העולים והוותיקים מסתדרים ביניהם בכיתה?</w:t>
-      </w:r>
-    </w:p>
-    <w:p>
-      <w:pPr>
-        <w:bidi/>
-        <w:spacing w:after="120" w:line="360" w:lineRule="auto"/>
-        <w:jc w:val="both"/>
-      </w:pPr>
-      <w:r>
-        <w:rPr>
-          <w:rFonts w:ascii="David" w:cs="David" w:eastAsia="David" w:hAnsi="David"/>
-          <w:noProof/>
-          <w:b/>
-          <w:bCs/>
-          <w:sz w:val="24"/>
-          <w:szCs w:val="24"/>
-          <w:rtl/>
-        </w:rPr>
-        <w:t xml:space="preserve">נטלי: </w:t>
-      </w:r>
-      <w:r>
-        <w:rPr>
-          <w:rFonts w:ascii="David" w:cs="David" w:eastAsia="David" w:hAnsi="David"/>
-          <w:noProof/>
-          <w:sz w:val="24"/>
-          <w:szCs w:val="24"/>
-          <w:rtl/>
-        </w:rPr>
-        <w:t xml:space="preserve">(נאנחת) לא תמיד טוב. יש חלוקה. העולים יושבים ביחד, מדברים רוסית בהפסקה, והוותיקים... יש כאלה שזה מפריע להם. שמעתי "תדברו עברית" לא פעם. ואני מבינה מאיפה זה בא, וגם לא מוכנה לזה. אז במעבדה אני מערבבת בכוונה. בכל קבוצה עולה וותיק. ובניסוי אין ברירה, צריך לדבר. ומשהו קורה שם. ילד ותיק מגלה שהעולה יודע כימיה יותר ממנו, וזה משנה משהו. לא הכול. אבל משהו. (שתיקה) ואני חושבת על זה שאני עצמי הייתי הילדה שאמרו לה "תדברי עברית". אז זה אישי.</w:t>
+        <w:t xml:space="preserve">עיינא: </w:t>
+      </w:r>
+      <w:r>
+        <w:rPr>
+          <w:rFonts w:ascii="David" w:cs="David" w:eastAsia="David" w:hAnsi="David"/>
+          <w:noProof/>
+          <w:sz w:val="24"/>
+          <w:szCs w:val="24"/>
+          <w:rtl/>
+        </w:rPr>
+        <w:t xml:space="preserve">ח'4. שלושים ואחד. שישה שהגיעו מכפרים לא מוכרים בשנתיים האחרונות, מבתי ספר קטנים בלי מעבדה. שלושה עם עברית לשיחה אבל לא לספר, שלושה עם עברית בסיסית מאוד. ארבעה תלמידי שילוב, שניים עם קשב חמור, סייעת בחלק מהשיעורים. חמישה שישה מהיישוב חזקים מאוד שמדעים זה המקצוע שלהם ומשתעממים מהר. והאמצע, שהוא הרוב. יכולים להבין אם נותנים דרך, ומפסיקים ברגע שהשיעור הופך לדף.</w:t>
+      </w:r>
+    </w:p>
+    <w:p>
+      <w:pPr>
+        <w:bidi/>
+        <w:spacing w:after="120" w:line="360" w:lineRule="auto"/>
+        <w:jc w:val="both"/>
+      </w:pPr>
+      <w:r>
+        <w:rPr>
+          <w:rFonts w:ascii="David" w:cs="David" w:eastAsia="David" w:hAnsi="David"/>
+          <w:noProof/>
+          <w:b/>
+          <w:bCs/>
+          <w:sz w:val="24"/>
+          <w:szCs w:val="24"/>
+          <w:rtl/>
+        </w:rPr>
+        <w:t xml:space="preserve">מ: </w:t>
+      </w:r>
+      <w:r>
+        <w:rPr>
+          <w:rFonts w:ascii="David" w:cs="David" w:eastAsia="David" w:hAnsi="David"/>
+          <w:noProof/>
+          <w:sz w:val="24"/>
+          <w:szCs w:val="24"/>
+          <w:rtl/>
+        </w:rPr>
+        <w:t xml:space="preserve">איך התלמידים מהפזורה והתלמידים מהיישוב מסתדרים ביניהם בכיתה?</w:t>
+      </w:r>
+    </w:p>
+    <w:p>
+      <w:pPr>
+        <w:bidi/>
+        <w:spacing w:after="120" w:line="360" w:lineRule="auto"/>
+        <w:jc w:val="both"/>
+      </w:pPr>
+      <w:r>
+        <w:rPr>
+          <w:rFonts w:ascii="David" w:cs="David" w:eastAsia="David" w:hAnsi="David"/>
+          <w:noProof/>
+          <w:b/>
+          <w:bCs/>
+          <w:sz w:val="24"/>
+          <w:szCs w:val="24"/>
+          <w:rtl/>
+        </w:rPr>
+        <w:t xml:space="preserve">עיינא: </w:t>
+      </w:r>
+      <w:r>
+        <w:rPr>
+          <w:rFonts w:ascii="David" w:cs="David" w:eastAsia="David" w:hAnsi="David"/>
+          <w:noProof/>
+          <w:sz w:val="24"/>
+          <w:szCs w:val="24"/>
+          <w:rtl/>
+        </w:rPr>
+        <w:t xml:space="preserve">(נאנחת) לא תמיד טוב. יש חלוקה. אלה מהפזורה יושבים ביחד, והם מהיישוב... יש כאלה שמסתכלים עליהם מלמעלה. שמעתי "אלה מהאוהלים" לא פעם. ואני מבינה מאיפה זה בא, וגם לא מוכנה לזה. אז במעבדה אני מערבבת בכוונה. בכל קבוצה אחד מהפזורה ואחד מהיישוב. ובניסוי אין ברירה, צריך לדבר. ומשהו קורה שם. ילד מהיישוב מגלה שהילד מהפזורה יודע כימיה יותר ממנו, וזה משנה משהו. לא הכול. אבל משהו. (שתיקה) ואני חושבת על זה שאני עצמי הייתי הילדה שאמרו עליה "מהאוהלים". אז זה אישי.</w:t>
       </w:r>
     </w:p>
     <w:p>
@@ -11096,7 +11096,7 @@
           <w:szCs w:val="24"/>
           <w:rtl/>
         </w:rPr>
-        <w:t xml:space="preserve">נטלי: </w:t>
+        <w:t xml:space="preserve">עיינא: </w:t>
       </w:r>
       <w:r>
         <w:rPr>
@@ -11154,17 +11154,17 @@
           <w:szCs w:val="24"/>
           <w:rtl/>
         </w:rPr>
-        <w:t xml:space="preserve">נטלי: </w:t>
-      </w:r>
-      <w:r>
-        <w:rPr>
-          <w:rFonts w:ascii="David" w:cs="David" w:eastAsia="David" w:hAnsi="David"/>
-          <w:noProof/>
-          <w:sz w:val="24"/>
-          <w:szCs w:val="24"/>
-          <w:rtl/>
-        </w:rPr>
-        <w:t xml:space="preserve">שכל שיעור יתחיל ממשהו שלא דורש עברית. שהמושגים יהיו על הלוח בשלוש שפות, עברית רוסית אנגלית, לא תרגום מלא, עוגן. שיהיה משהו לחזקים להעמיק בו, כי אחרת הם מפריעים, ובכיתה עם עולים ושילוב ההפרעה של החזקים היא מה שהכי מפרק. ו... לזכור שהעולים לא חלשים. הם חדשים. ההבדל הזה קובע איך אני מדברת איתם.</w:t>
+        <w:t xml:space="preserve">עיינא: </w:t>
+      </w:r>
+      <w:r>
+        <w:rPr>
+          <w:rFonts w:ascii="David" w:cs="David" w:eastAsia="David" w:hAnsi="David"/>
+          <w:noProof/>
+          <w:sz w:val="24"/>
+          <w:szCs w:val="24"/>
+          <w:rtl/>
+        </w:rPr>
+        <w:t xml:space="preserve">שכל שיעור יתחיל ממשהו שלא דורש עברית. שהמושגים יהיו על הלוח בשתי שפות, עברית וערבית, ולפעמים גם אנגלית, לא תרגום מלא, עוגן. שיהיה משהו לחזקים להעמיק בו, כי אחרת הם מפריעים, ובכיתה עם תלמידים מהפזורה ושילוב ההפרעה של החזקים היא מה שהכי מפרק. ו... לזכור שאלה מהפזורה לא חלשים. הם חדשים. ההבדל הזה קובע איך אני מדברת איתם.</w:t>
       </w:r>
     </w:p>
     <w:p>
@@ -11212,75 +11212,75 @@
           <w:szCs w:val="24"/>
           <w:rtl/>
         </w:rPr>
-        <w:t xml:space="preserve">נטלי: </w:t>
-      </w:r>
-      <w:r>
-        <w:rPr>
-          <w:rFonts w:ascii="David" w:cs="David" w:eastAsia="David" w:hAnsi="David"/>
-          <w:noProof/>
-          <w:sz w:val="24"/>
-          <w:szCs w:val="24"/>
-          <w:rtl/>
-        </w:rPr>
-        <w:t xml:space="preserve">ויקה. עולה מאוקראינה, כיתה ח', הגיעה באמצע השנה. ישבה בשקט וכתבה ברוסית במחברת. במבחנים כמעט כלום. וחשבתי שפה. ואז דיברתי איתה ברוסית ו... (שתיקה) היא למדה באוקראינה כימיה ברמה גבוהה יותר מכיתה ח' שלנו. היא הייתה משועממת ומתוסכלת בו זמנית. משועממת מהחומר. מתוסכלת שלא יכולה להראות.</w:t>
-      </w:r>
-    </w:p>
-    <w:p>
-      <w:pPr>
-        <w:bidi/>
-        <w:spacing w:after="120" w:line="360" w:lineRule="auto"/>
-        <w:jc w:val="both"/>
-      </w:pPr>
-      <w:r>
-        <w:rPr>
-          <w:rFonts w:ascii="David" w:cs="David" w:eastAsia="David" w:hAnsi="David"/>
-          <w:noProof/>
-          <w:b/>
-          <w:bCs/>
-          <w:sz w:val="24"/>
-          <w:szCs w:val="24"/>
-          <w:rtl/>
-        </w:rPr>
-        <w:t xml:space="preserve">מ: </w:t>
-      </w:r>
-      <w:r>
-        <w:rPr>
-          <w:rFonts w:ascii="David" w:cs="David" w:eastAsia="David" w:hAnsi="David"/>
-          <w:noProof/>
-          <w:sz w:val="24"/>
-          <w:szCs w:val="24"/>
-          <w:rtl/>
-        </w:rPr>
-        <w:t xml:space="preserve">מה היא אמרה לך, בשיחה ברוסית?</w:t>
-      </w:r>
-    </w:p>
-    <w:p>
-      <w:pPr>
-        <w:bidi/>
-        <w:spacing w:after="120" w:line="360" w:lineRule="auto"/>
-        <w:jc w:val="both"/>
-      </w:pPr>
-      <w:r>
-        <w:rPr>
-          <w:rFonts w:ascii="David" w:cs="David" w:eastAsia="David" w:hAnsi="David"/>
-          <w:noProof/>
-          <w:b/>
-          <w:bCs/>
-          <w:sz w:val="24"/>
-          <w:szCs w:val="24"/>
-          <w:rtl/>
-        </w:rPr>
-        <w:t xml:space="preserve">נטלי: </w:t>
-      </w:r>
-      <w:r>
-        <w:rPr>
-          <w:rFonts w:ascii="David" w:cs="David" w:eastAsia="David" w:hAnsi="David"/>
-          <w:noProof/>
-          <w:sz w:val="24"/>
-          <w:szCs w:val="24"/>
-          <w:rtl/>
-        </w:rPr>
-        <w:t xml:space="preserve">(שתיקה) היא אמרה: "אני יודעת את זה כבר שנתיים, ופה אני צריכה לשבת ולשמוע את זה עוד פעם בשפה שאני לא מבינה." ואז היא אמרה משהו שנשאר איתי: "בבית הספר שלי הייתי הכי טובה בכימיה, ופה אני הכי גרועה." והיא לא הייתה הכי גרועה. היא הייתה הכי טובה, בשפה אחרת. (שתיקה) ואני אמרתי לה, אני יודעת בדיוק. ואני חושבת שזה שאמרתי "אני יודעת בדיוק", ברוסית, ושהיא ידעה שאני עליתי, זה עשה משהו לפני כל השיטות.</w:t>
+        <w:t xml:space="preserve">עיינא: </w:t>
+      </w:r>
+      <w:r>
+        <w:rPr>
+          <w:rFonts w:ascii="David" w:cs="David" w:eastAsia="David" w:hAnsi="David"/>
+          <w:noProof/>
+          <w:sz w:val="24"/>
+          <w:szCs w:val="24"/>
+          <w:rtl/>
+        </w:rPr>
+        <w:t xml:space="preserve">אמאני. עברה אלינו מבית ספר בנצרת, כיתה ח', באמצע השנה, כי המשפחה חזרה לנגב. ישבה בשקט וכתבה בערבית במחברת. במבחנים כמעט כלום. וחשבתי שפה. ואז דיברתי איתה, אחרי השיעור, ו... (שתיקה) היא למדה שם כימיה, בערבית, ברמה גבוהה יותר מכיתה ח' שלנו. היא הייתה משועממת ומתוסכלת בו זמנית. משועממת מהחומר. מתוסכלת שלא יכולה להראות.</w:t>
+      </w:r>
+    </w:p>
+    <w:p>
+      <w:pPr>
+        <w:bidi/>
+        <w:spacing w:after="120" w:line="360" w:lineRule="auto"/>
+        <w:jc w:val="both"/>
+      </w:pPr>
+      <w:r>
+        <w:rPr>
+          <w:rFonts w:ascii="David" w:cs="David" w:eastAsia="David" w:hAnsi="David"/>
+          <w:noProof/>
+          <w:b/>
+          <w:bCs/>
+          <w:sz w:val="24"/>
+          <w:szCs w:val="24"/>
+          <w:rtl/>
+        </w:rPr>
+        <w:t xml:space="preserve">מ: </w:t>
+      </w:r>
+      <w:r>
+        <w:rPr>
+          <w:rFonts w:ascii="David" w:cs="David" w:eastAsia="David" w:hAnsi="David"/>
+          <w:noProof/>
+          <w:sz w:val="24"/>
+          <w:szCs w:val="24"/>
+          <w:rtl/>
+        </w:rPr>
+        <w:t xml:space="preserve">מה היא אמרה לך, בשיחה?</w:t>
+      </w:r>
+    </w:p>
+    <w:p>
+      <w:pPr>
+        <w:bidi/>
+        <w:spacing w:after="120" w:line="360" w:lineRule="auto"/>
+        <w:jc w:val="both"/>
+      </w:pPr>
+      <w:r>
+        <w:rPr>
+          <w:rFonts w:ascii="David" w:cs="David" w:eastAsia="David" w:hAnsi="David"/>
+          <w:noProof/>
+          <w:b/>
+          <w:bCs/>
+          <w:sz w:val="24"/>
+          <w:szCs w:val="24"/>
+          <w:rtl/>
+        </w:rPr>
+        <w:t xml:space="preserve">עיינא: </w:t>
+      </w:r>
+      <w:r>
+        <w:rPr>
+          <w:rFonts w:ascii="David" w:cs="David" w:eastAsia="David" w:hAnsi="David"/>
+          <w:noProof/>
+          <w:sz w:val="24"/>
+          <w:szCs w:val="24"/>
+          <w:rtl/>
+        </w:rPr>
+        <w:t xml:space="preserve">(שתיקה) היא אמרה: "אני יודעת את זה כבר שנתיים, ופה אני צריכה לשבת ולשמוע את זה עוד פעם בעברית, מספר שאני בקושי קוראת." ואז היא אמרה משהו שנשאר איתי: "בבית הספר שלי הייתי הכי טובה בכימיה, ופה אני הכי גרועה." והיא לא הייתה הכי גרועה. היא הייתה הכי טובה, בשפה אחרת. (שתיקה) ואני אמרתי לה, אני יודעת בדיוק. ואני חושבת שזה שאמרתי "אני יודעת בדיוק", ברוסית, ושהיא ידעה שאני עליתי, זה עשה משהו לפני כל השיטות.</w:t>
       </w:r>
     </w:p>
     <w:p>
@@ -11328,17 +11328,17 @@
           <w:szCs w:val="24"/>
           <w:rtl/>
         </w:rPr>
-        <w:t xml:space="preserve">נטלי: </w:t>
-      </w:r>
-      <w:r>
-        <w:rPr>
-          <w:rFonts w:ascii="David" w:cs="David" w:eastAsia="David" w:hAnsi="David"/>
-          <w:noProof/>
-          <w:sz w:val="24"/>
-          <w:szCs w:val="24"/>
-          <w:rtl/>
-        </w:rPr>
-        <w:t xml:space="preserve">קודם דפים ברוסית. עזר לכתוב, לא עזר למקום שלה בכיתה. ואז, בתגובות כימיות, ניסוי בקבוצות, ושמתי אותה עם שני ותיקים חזקים ואחד חלש, ומשימה עם תמונות. תצלומים של שלבי הניסוי, להסביר מה קרה בכל שלב. וויקה, שידעה את הכימיה, הצביעה על התמונות והסבירה, בעברית שבורה ובידיים. והחזקים הבינו שהיא יודעת יותר מהם. וזה שינה את המקום שלה תוך שיעור אחד. שיעור אחד.</w:t>
+        <w:t xml:space="preserve">עיינא: </w:t>
+      </w:r>
+      <w:r>
+        <w:rPr>
+          <w:rFonts w:ascii="David" w:cs="David" w:eastAsia="David" w:hAnsi="David"/>
+          <w:noProof/>
+          <w:sz w:val="24"/>
+          <w:szCs w:val="24"/>
+          <w:rtl/>
+        </w:rPr>
+        <w:t xml:space="preserve">קודם דפים בערבית. עזר לכתוב, לא עזר למקום שלה בכיתה. ואז, בתגובות כימיות, ניסוי בקבוצות, ושמתי אותה עם שני חזקים מהיישוב ואחד חלש, ומשימה עם תמונות. תצלומים של שלבי הניסוי, להסביר מה קרה בכל שלב. ואמאני, שידעה את הכימיה, הצביעה על התמונות והסבירה, בעברית שבורה ובידיים. והחזקים הבינו שהיא יודעת יותר מהם. וזה שינה את המקום שלה תוך שיעור אחד. שיעור אחד.</w:t>
       </w:r>
     </w:p>
     <w:p>
@@ -11386,17 +11386,17 @@
           <w:szCs w:val="24"/>
           <w:rtl/>
         </w:rPr>
-        <w:t xml:space="preserve">נטלי: </w:t>
-      </w:r>
-      <w:r>
-        <w:rPr>
-          <w:rFonts w:ascii="David" w:cs="David" w:eastAsia="David" w:hAnsi="David"/>
-          <w:noProof/>
-          <w:sz w:val="24"/>
-          <w:szCs w:val="24"/>
-          <w:rtl/>
-        </w:rPr>
-        <w:t xml:space="preserve">הייתי בודקת בשבוע הראשון מה היא יודעת. ברוסית. לא מחכה חודשיים להבין שהיא לא חלשה אלא חזקה בשפה אחרת. (שתיקה) כשעולה מתקשה, לבדוק קודם מה הוא יודע בשפה שלו. לפעמים הבעיה היא ההפך ממה שנראה.</w:t>
+        <w:t xml:space="preserve">עיינא: </w:t>
+      </w:r>
+      <w:r>
+        <w:rPr>
+          <w:rFonts w:ascii="David" w:cs="David" w:eastAsia="David" w:hAnsi="David"/>
+          <w:noProof/>
+          <w:sz w:val="24"/>
+          <w:szCs w:val="24"/>
+          <w:rtl/>
+        </w:rPr>
+        <w:t xml:space="preserve">הייתי בודקת בשבוע הראשון מה היא יודעת. בערבית. לא מחכה חודשיים להבין שהיא לא חלשה אלא חזקה בשפה אחרת. (שתיקה) כשתלמיד חדש מתקשה, לבדוק קודם מה הוא יודע בשפה שלו. לפעמים הבעיה היא ההפך ממה שנראה.</w:t>
       </w:r>
     </w:p>
     <w:p>
@@ -11444,7 +11444,7 @@
           <w:szCs w:val="24"/>
           <w:rtl/>
         </w:rPr>
-        <w:t xml:space="preserve">נטלי: </w:t>
+        <w:t xml:space="preserve">עיינא: </w:t>
       </w:r>
       <w:r>
         <w:rPr>
@@ -11502,7 +11502,7 @@
           <w:szCs w:val="24"/>
           <w:rtl/>
         </w:rPr>
-        <w:t xml:space="preserve">נטלי: </w:t>
+        <w:t xml:space="preserve">עיינא: </w:t>
       </w:r>
       <w:r>
         <w:rPr>
@@ -11560,17 +11560,17 @@
           <w:szCs w:val="24"/>
           <w:rtl/>
         </w:rPr>
-        <w:t xml:space="preserve">נטלי: </w:t>
-      </w:r>
-      <w:r>
-        <w:rPr>
-          <w:rFonts w:ascii="David" w:cs="David" w:eastAsia="David" w:hAnsi="David"/>
-          <w:noProof/>
-          <w:sz w:val="24"/>
-          <w:szCs w:val="24"/>
-          <w:rtl/>
-        </w:rPr>
-        <w:t xml:space="preserve">שמשהו קרה מול העיניים. וכולם, העולים, השילוב, ראו אותו דבר. שהיה רעש, וזה נשמע ילדותי, אבל פחית שנמעכת בכיתה ח' זה רגע שאף אחד לא מפספס. ושהשאלה בלי תשובה ברורה. אז היה ויכוח. והוויכוח מכניס אותם. (שתיקה) תלמיד שילוב, שבדרך כלל לא מדבר, אמר בסוף "האוויר חזק". בקול. וזה היה בעצם כל השיעור.</w:t>
+        <w:t xml:space="preserve">עיינא: </w:t>
+      </w:r>
+      <w:r>
+        <w:rPr>
+          <w:rFonts w:ascii="David" w:cs="David" w:eastAsia="David" w:hAnsi="David"/>
+          <w:noProof/>
+          <w:sz w:val="24"/>
+          <w:szCs w:val="24"/>
+          <w:rtl/>
+        </w:rPr>
+        <w:t xml:space="preserve">שמשהו קרה מול העיניים. וכולם, מהפזורה, השילוב, ראו אותו דבר. שהיה רעש, וזה נשמע ילדותי, אבל פחית שנמעכת בכיתה ח' זה רגע שאף אחד לא מפספס. ושהשאלה בלי תשובה ברורה. אז היה ויכוח. והוויכוח מכניס אותם. (שתיקה) תלמיד שילוב, שבדרך כלל לא מדבר, אמר בסוף "האוויר חזק". בקול. וזה היה בעצם כל השיעור.</w:t>
       </w:r>
     </w:p>
     <w:p>
@@ -11618,7 +11618,7 @@
           <w:szCs w:val="24"/>
           <w:rtl/>
         </w:rPr>
-        <w:t xml:space="preserve">נטלי: </w:t>
+        <w:t xml:space="preserve">עיינא: </w:t>
       </w:r>
       <w:r>
         <w:rPr>
@@ -11676,7 +11676,7 @@
           <w:szCs w:val="24"/>
           <w:rtl/>
         </w:rPr>
-        <w:t xml:space="preserve">נטלי: </w:t>
+        <w:t xml:space="preserve">עיינא: </w:t>
       </w:r>
       <w:r>
         <w:rPr>
@@ -11734,7 +11734,7 @@
           <w:szCs w:val="24"/>
           <w:rtl/>
         </w:rPr>
-        <w:t xml:space="preserve">נטלי: </w:t>
+        <w:t xml:space="preserve">עיינא: </w:t>
       </w:r>
       <w:r>
         <w:rPr>
@@ -11792,17 +11792,17 @@
           <w:szCs w:val="24"/>
           <w:rtl/>
         </w:rPr>
-        <w:t xml:space="preserve">נטלי: </w:t>
-      </w:r>
-      <w:r>
-        <w:rPr>
-          <w:rFonts w:ascii="David" w:cs="David" w:eastAsia="David" w:hAnsi="David"/>
-          <w:noProof/>
-          <w:sz w:val="24"/>
-          <w:szCs w:val="24"/>
-          <w:rtl/>
-        </w:rPr>
-        <w:t xml:space="preserve">קבוצת המעשן: "למה היא שחורה". וזה השיעור הבא. קבוצת המיקרוסקופ: "זה נראה כמו ספוג". שזה בדיוק ההבנה שרציתי. ותלמידה עולה אמרה על הרנטגן "רואים את הלב", ותלמיד ותיק תיקן שזה הצל של הלב, וויכוח. (צוחקת)</w:t>
+        <w:t xml:space="preserve">עיינא: </w:t>
+      </w:r>
+      <w:r>
+        <w:rPr>
+          <w:rFonts w:ascii="David" w:cs="David" w:eastAsia="David" w:hAnsi="David"/>
+          <w:noProof/>
+          <w:sz w:val="24"/>
+          <w:szCs w:val="24"/>
+          <w:rtl/>
+        </w:rPr>
+        <w:t xml:space="preserve">קבוצת המעשן: "למה היא שחורה". וזה השיעור הבא. קבוצת המיקרוסקופ: "זה נראה כמו ספוג". שזה בדיוק ההבנה שרציתי. ותלמידה מהפזורה אמרה על הרנטגן "רואים את הלב", ותלמיד מהיישוב תיקן שזה הצל של הלב, וויכוח. (צוחקת)</w:t>
       </w:r>
     </w:p>
     <w:p>
@@ -11850,17 +11850,17 @@
           <w:szCs w:val="24"/>
           <w:rtl/>
         </w:rPr>
-        <w:t xml:space="preserve">נטלי: </w:t>
-      </w:r>
-      <w:r>
-        <w:rPr>
-          <w:rFonts w:ascii="David" w:cs="David" w:eastAsia="David" w:hAnsi="David"/>
-          <w:noProof/>
-          <w:sz w:val="24"/>
-          <w:szCs w:val="24"/>
-          <w:rtl/>
-        </w:rPr>
-        <w:t xml:space="preserve">זה היה השיעור הבא. פתחתי עם השאלה שלהם על הלוח, "למה היא שחורה", בדיוק במילים שלהם. ונתתי קטע קצר מהספר, שש שורות, ותמונה של פיח. ואמרתי, היום עונים על השאלה שלכם. (שתיקה) והם קראו את שש השורות כאילו זה ספר מתח. כי זו הייתה השאלה שלהם. ותלמיד עולה, אחד השקטים, שאל בסוף, ברוסית, אם זה חוזר להיות ורוד אם מפסיקים. ואמרתי, חלקית. והוא אמר "אז אני אגיד לאבא שלי". (שתיקה) זה שיעור מדעים. אבל זה גם... זה גם משהו אחר.</w:t>
+        <w:t xml:space="preserve">עיינא: </w:t>
+      </w:r>
+      <w:r>
+        <w:rPr>
+          <w:rFonts w:ascii="David" w:cs="David" w:eastAsia="David" w:hAnsi="David"/>
+          <w:noProof/>
+          <w:sz w:val="24"/>
+          <w:szCs w:val="24"/>
+          <w:rtl/>
+        </w:rPr>
+        <w:t xml:space="preserve">זה היה השיעור הבא. פתחתי עם השאלה שלהם על הלוח, "למה היא שחורה", בדיוק במילים שלהם. ונתתי קטע קצר מהספר, שש שורות, ותמונה של פיח. ואמרתי, היום עונים על השאלה שלכם. (שתיקה) והם קראו את שש השורות כאילו זה ספר מתח. כי זו הייתה השאלה שלהם. ותלמיד מהפזורה, אחד השקטים, שאל בסוף, בערבית, אם זה חוזר להיות ורוד אם מפסיקים. ואמרתי, חלקית. והוא אמר "אז אני אגיד לאבא שלי". (שתיקה) זה שיעור מדעים. אבל זה גם... זה גם משהו אחר.</w:t>
       </w:r>
     </w:p>
     <w:p>
@@ -11908,7 +11908,7 @@
           <w:szCs w:val="24"/>
           <w:rtl/>
         </w:rPr>
-        <w:t xml:space="preserve">נטלי: </w:t>
+        <w:t xml:space="preserve">עיינא: </w:t>
       </w:r>
       <w:r>
         <w:rPr>
@@ -11966,7 +11966,7 @@
           <w:szCs w:val="24"/>
           <w:rtl/>
         </w:rPr>
-        <w:t xml:space="preserve">נטלי: </w:t>
+        <w:t xml:space="preserve">עיינא: </w:t>
       </w:r>
       <w:r>
         <w:rPr>
@@ -12024,7 +12024,7 @@
           <w:szCs w:val="24"/>
           <w:rtl/>
         </w:rPr>
-        <w:t xml:space="preserve">נטלי: </w:t>
+        <w:t xml:space="preserve">עיינא: </w:t>
       </w:r>
       <w:r>
         <w:rPr>
@@ -12082,17 +12082,17 @@
           <w:szCs w:val="24"/>
           <w:rtl/>
         </w:rPr>
-        <w:t xml:space="preserve">נטלי: </w:t>
-      </w:r>
-      <w:r>
-        <w:rPr>
-          <w:rFonts w:ascii="David" w:cs="David" w:eastAsia="David" w:hAnsi="David"/>
-          <w:noProof/>
-          <w:sz w:val="24"/>
-          <w:szCs w:val="24"/>
-          <w:rtl/>
-        </w:rPr>
-        <w:t xml:space="preserve">כמעט חצי דגם. שליש תמונות. השאר הקלטה. ובין המקליטים רוב העולים, כי בהקלטה הם יכלו לדבר ברוסית ולתרגם רק מונחים. והשיעורים היו... רועשים ומלוכלכים. קרטון, צינורות, בלונים. המנהלת עברה במסדרון ונכנסה לראות מה קורה. חששתי. היא ראתה שלושים תלמידים עובדים ויצאה. (צוחקת)</w:t>
+        <w:t xml:space="preserve">עיינא: </w:t>
+      </w:r>
+      <w:r>
+        <w:rPr>
+          <w:rFonts w:ascii="David" w:cs="David" w:eastAsia="David" w:hAnsi="David"/>
+          <w:noProof/>
+          <w:sz w:val="24"/>
+          <w:szCs w:val="24"/>
+          <w:rtl/>
+        </w:rPr>
+        <w:t xml:space="preserve">כמעט חצי דגם. שליש תמונות. השאר הקלטה. ובין המקליטים רוב אלה מהפזורה, כי בהקלטה הם יכלו לדבר בערבית ולתרגם רק מונחים. והשיעורים היו... רועשים ומלוכלכים. קרטון, צינורות, בלונים. המנהלת עברה במסדרון ונכנסה לראות מה קורה. חששתי. היא ראתה שלושים תלמידים עובדים ויצאה. (צוחקת)</w:t>
       </w:r>
     </w:p>
     <w:p>
@@ -12140,7 +12140,7 @@
           <w:szCs w:val="24"/>
           <w:rtl/>
         </w:rPr>
-        <w:t xml:space="preserve">נטלי: </w:t>
+        <w:t xml:space="preserve">עיינא: </w:t>
       </w:r>
       <w:r>
         <w:rPr>
@@ -12198,7 +12198,7 @@
           <w:szCs w:val="24"/>
           <w:rtl/>
         </w:rPr>
-        <w:t xml:space="preserve">נטלי: </w:t>
+        <w:t xml:space="preserve">עיינא: </w:t>
       </w:r>
       <w:r>
         <w:rPr>
@@ -12256,17 +12256,17 @@
           <w:szCs w:val="24"/>
           <w:rtl/>
         </w:rPr>
-        <w:t xml:space="preserve">נטלי: </w:t>
-      </w:r>
-      <w:r>
-        <w:rPr>
-          <w:rFonts w:ascii="David" w:cs="David" w:eastAsia="David" w:hAnsi="David"/>
-          <w:noProof/>
-          <w:sz w:val="24"/>
-          <w:szCs w:val="24"/>
-          <w:rtl/>
-        </w:rPr>
-        <w:t xml:space="preserve">במעבדה זה כל שיעור. קבוצה מסיימת ניסוי בעשר דקות וקבוצה עוד מודדת אחרי עשרים וחמש. שלוש שכבות לכל משימה. בסיס, לבצע ולרשום מה קרה. הרחבה, להסביר למה. אתגר, "מה היה קורה אם היינו משנים את הטמפרטורה". ומי שסיים עולה שכבה. וכרטיסי "ואם סיימת", תמונה מדעית ושאלה, שלוש שפות.</w:t>
+        <w:t xml:space="preserve">עיינא: </w:t>
+      </w:r>
+      <w:r>
+        <w:rPr>
+          <w:rFonts w:ascii="David" w:cs="David" w:eastAsia="David" w:hAnsi="David"/>
+          <w:noProof/>
+          <w:sz w:val="24"/>
+          <w:szCs w:val="24"/>
+          <w:rtl/>
+        </w:rPr>
+        <w:t xml:space="preserve">במעבדה זה כל שיעור. קבוצה מסיימת ניסוי בעשר דקות וקבוצה עוד מודדת אחרי עשרים וחמש. שלוש שכבות לכל משימה. בסיס, לבצע ולרשום מה קרה. הרחבה, להסביר למה. אתגר, "מה היה קורה אם היינו משנים את הטמפרטורה". ומי שסיים תלמיד מהפזורה שכבה. וכרטיסי "ואם סיימת", תמונה מדעית ושאלה, שלוש שפות.</w:t>
       </w:r>
     </w:p>
     <w:p>
@@ -12314,17 +12314,17 @@
           <w:szCs w:val="24"/>
           <w:rtl/>
         </w:rPr>
-        <w:t xml:space="preserve">נטלי: </w:t>
-      </w:r>
-      <w:r>
-        <w:rPr>
-          <w:rFonts w:ascii="David" w:cs="David" w:eastAsia="David" w:hAnsi="David"/>
-          <w:noProof/>
-          <w:sz w:val="24"/>
-          <w:szCs w:val="24"/>
-          <w:rtl/>
-        </w:rPr>
-        <w:t xml:space="preserve">למי שלא יקרא לי. שלושה ארבעה בכל כיתה, בדרך כלל עולים או שילוב, שיישבו מול ניסוי ולא יזוזו. אליהם בדקה הראשונה. ואחר כך אני מסתובבת ומסתכלת על השולחנות. קבוצה שכל הציוד שלה עדיין בקופסה אחרי חמש דקות תקועה. גם אם היא מחייכת.</w:t>
+        <w:t xml:space="preserve">עיינא: </w:t>
+      </w:r>
+      <w:r>
+        <w:rPr>
+          <w:rFonts w:ascii="David" w:cs="David" w:eastAsia="David" w:hAnsi="David"/>
+          <w:noProof/>
+          <w:sz w:val="24"/>
+          <w:szCs w:val="24"/>
+          <w:rtl/>
+        </w:rPr>
+        <w:t xml:space="preserve">למי שלא יקרא לי. שלושה ארבעה בכל כיתה, בדרך כלל מהפזורה או שילוב, שיישבו מול ניסוי ולא יזוזו. אליהם בדקה הראשונה. ואחר כך אני מסתובבת ומסתכלת על השולחנות. קבוצה שכל הציוד שלה עדיין בקופסה אחרי חמש דקות תקועה. גם אם היא מחייכת.</w:t>
       </w:r>
     </w:p>
     <w:p>
@@ -12372,7 +12372,7 @@
           <w:szCs w:val="24"/>
           <w:rtl/>
         </w:rPr>
-        <w:t xml:space="preserve">נטלי: </w:t>
+        <w:t xml:space="preserve">עיינא: </w:t>
       </w:r>
       <w:r>
         <w:rPr>
@@ -12430,7 +12430,7 @@
           <w:szCs w:val="24"/>
           <w:rtl/>
         </w:rPr>
-        <w:t xml:space="preserve">נטלי: </w:t>
+        <w:t xml:space="preserve">עיינא: </w:t>
       </w:r>
       <w:r>
         <w:rPr>
@@ -12488,17 +12488,17 @@
           <w:szCs w:val="24"/>
           <w:rtl/>
         </w:rPr>
-        <w:t xml:space="preserve">נטלי: </w:t>
-      </w:r>
-      <w:r>
-        <w:rPr>
-          <w:rFonts w:ascii="David" w:cs="David" w:eastAsia="David" w:hAnsi="David"/>
-          <w:noProof/>
-          <w:sz w:val="24"/>
-          <w:szCs w:val="24"/>
-          <w:rtl/>
-        </w:rPr>
-        <w:t xml:space="preserve">מוזר. במעבדה אני גם אחראית על הבטיחות, אז לעמוד בצד זה נגד האינסטינקט. אבל ראיתי... ראיתי את הכיתה מקשיבה לוויקה, כשהיא הסבירה ברוסית ועם ידיים איך בנו את הריאות מבלונים, יותר ממה שהם מקשיבים לי. כי היא חברה שיודעת משהו. (שתיקה) ומה למדתי. שתלמיד שילוב שחשבתי שלא הבין בנה דגם שהסביר את מסלול האוויר נכון. ושתלמידה חזקה בכתב התקשתה להסביר בקול. ומהפתקים ראיתי מה הכיתה לקחה מכל דגם. וזה הערכה טובה יותר ממבחן. אני עדיין קצת לא מסוגלת לשתוק, אבל פחות.</w:t>
+        <w:t xml:space="preserve">עיינא: </w:t>
+      </w:r>
+      <w:r>
+        <w:rPr>
+          <w:rFonts w:ascii="David" w:cs="David" w:eastAsia="David" w:hAnsi="David"/>
+          <w:noProof/>
+          <w:sz w:val="24"/>
+          <w:szCs w:val="24"/>
+          <w:rtl/>
+        </w:rPr>
+        <w:t xml:space="preserve">מוזר. במעבדה אני גם אחראית על הבטיחות, אז לעמוד בצד זה נגד האינסטינקט. אבל ראיתי... ראיתי את הכיתה מקשיבה לאמאני, כשהיא הסבירה בערבית ועם ידיים איך בנו את הריאות מבלונים, יותר ממה שהם מקשיבים לי. כי היא חברה שיודעת משהו. (שתיקה) ומה למדתי. שתלמיד שילוב שחשבתי שלא הבין בנה דגם שהסביר את מסלול האוויר נכון. ושתלמידה חזקה בכתב התקשתה להסביר בקול. ומהפתקים ראיתי מה הכיתה לקחה מכל דגם. וזה הערכה טובה יותר ממבחן. אני עדיין קצת לא מסוגלת לשתוק, אבל פחות.</w:t>
       </w:r>
     </w:p>
     <w:p>
@@ -12546,7 +12546,7 @@
           <w:szCs w:val="24"/>
           <w:rtl/>
         </w:rPr>
-        <w:t xml:space="preserve">נטלי: </w:t>
+        <w:t xml:space="preserve">עיינא: </w:t>
       </w:r>
       <w:r>
         <w:rPr>
@@ -12604,17 +12604,17 @@
           <w:szCs w:val="24"/>
           <w:rtl/>
         </w:rPr>
-        <w:t xml:space="preserve">נטלי: </w:t>
-      </w:r>
-      <w:r>
-        <w:rPr>
-          <w:rFonts w:ascii="David" w:cs="David" w:eastAsia="David" w:hAnsi="David"/>
-          <w:noProof/>
-          <w:sz w:val="24"/>
-          <w:szCs w:val="24"/>
-          <w:rtl/>
-        </w:rPr>
-        <w:t xml:space="preserve">ללמד קריאת תמונה במפורש. כמו שאני מלמדת קריאת תצלום מיקרוסקופ. מה רואים, מה לא רואים, מי צילם ולמה, בקנה מידה של מה. ו... אחת האפשרויות בבחירה צריכה להיות כמעט בלי כתיבה. כי יש תלמידים, עולים ושילוב, שהתמונות יפתחו להם דלת והכתיבה תסגור.</w:t>
+        <w:t xml:space="preserve">עיינא: </w:t>
+      </w:r>
+      <w:r>
+        <w:rPr>
+          <w:rFonts w:ascii="David" w:cs="David" w:eastAsia="David" w:hAnsi="David"/>
+          <w:noProof/>
+          <w:sz w:val="24"/>
+          <w:szCs w:val="24"/>
+          <w:rtl/>
+        </w:rPr>
+        <w:t xml:space="preserve">ללמד קריאת תמונה במפורש. כמו שאני מלמדת קריאת תצלום מיקרוסקופ. מה רואים, מה לא רואים, מי צילם ולמה, בקנה מידה של מה. ו... אחת האפשרויות בבחירה צריכה להיות כמעט בלי כתיבה. כי יש תלמידים, מהפזורה ושילוב, שהתמונות יפתחו להם דלת והכתיבה תסגור.</w:t>
       </w:r>
     </w:p>
     <w:p>
@@ -12662,7 +12662,7 @@
           <w:szCs w:val="24"/>
           <w:rtl/>
         </w:rPr>
-        <w:t xml:space="preserve">נטלי: </w:t>
+        <w:t xml:space="preserve">עיינא: </w:t>
       </w:r>
       <w:r>
         <w:rPr>
@@ -12720,17 +12720,17 @@
           <w:szCs w:val="24"/>
           <w:rtl/>
         </w:rPr>
-        <w:t xml:space="preserve">נטלי: </w:t>
-      </w:r>
-      <w:r>
-        <w:rPr>
-          <w:rFonts w:ascii="David" w:cs="David" w:eastAsia="David" w:hAnsi="David"/>
-          <w:noProof/>
-          <w:sz w:val="24"/>
-          <w:szCs w:val="24"/>
-          <w:rtl/>
-        </w:rPr>
-        <w:t xml:space="preserve">דגם או תמונות. כתיבה. קול. לבנות משהו, מודל של מפעל או של בית פועלים, או סדרת תמונות עם כיתוב, כי יש כאלה שחושבים דרך הידיים, ואצלי הם רבים. יומן או מכתב, למי שאוהב להיכנס לדמות. והקלטה, בכל שפה עם תרגום מונחים, כי העולים שלי מסבירים בהקלטה דברים שהם לא יכולים לכתוב. לא מצגת. ולא הצגה חיה כאפשרות יחידה לדיבור, כי עולים לא יעמדו מול כיתה.</w:t>
+        <w:t xml:space="preserve">עיינא: </w:t>
+      </w:r>
+      <w:r>
+        <w:rPr>
+          <w:rFonts w:ascii="David" w:cs="David" w:eastAsia="David" w:hAnsi="David"/>
+          <w:noProof/>
+          <w:sz w:val="24"/>
+          <w:szCs w:val="24"/>
+          <w:rtl/>
+        </w:rPr>
+        <w:t xml:space="preserve">דגם או תמונות. כתיבה. קול. לבנות משהו, מודל של מפעל או של בית פועלים, או סדרת תמונות עם כיתוב, כי יש כאלה שחושבים דרך הידיים, ואצלי הם רבים. יומן או מכתב, למי שאוהב להיכנס לדמות. והקלטה, בכל שפה עם תרגום מונחים, כי התלמידים מהפזורה שלי מסבירים בהקלטה דברים שהם לא יכולים לכתוב. לא מצגת. ולא הצגה חיה כאפשרות יחידה לדיבור, כי תלמידים מהפזורה לא יעמדו מול כיתה.</w:t>
       </w:r>
     </w:p>
     <w:p>
@@ -12778,7 +12778,7 @@
           <w:szCs w:val="24"/>
           <w:rtl/>
         </w:rPr>
-        <w:t xml:space="preserve">נטלי: </w:t>
+        <w:t xml:space="preserve">עיינא: </w:t>
       </w:r>
       <w:r>
         <w:rPr>
@@ -12836,7 +12836,7 @@
           <w:szCs w:val="24"/>
           <w:rtl/>
         </w:rPr>
-        <w:t xml:space="preserve">נטלי: </w:t>
+        <w:t xml:space="preserve">עיינא: </w:t>
       </w:r>
       <w:r>
         <w:rPr>
@@ -12894,7 +12894,7 @@
           <w:szCs w:val="24"/>
           <w:rtl/>
         </w:rPr>
-        <w:t xml:space="preserve">נטלי: </w:t>
+        <w:t xml:space="preserve">עיינא: </w:t>
       </w:r>
       <w:r>
         <w:rPr>
@@ -12952,7 +12952,7 @@
           <w:szCs w:val="24"/>
           <w:rtl/>
         </w:rPr>
-        <w:t xml:space="preserve">נטלי: </w:t>
+        <w:t xml:space="preserve">עיינא: </w:t>
       </w:r>
       <w:r>
         <w:rPr>
@@ -13010,17 +13010,17 @@
           <w:szCs w:val="24"/>
           <w:rtl/>
         </w:rPr>
-        <w:t xml:space="preserve">נטלי: </w:t>
-      </w:r>
-      <w:r>
-        <w:rPr>
-          <w:rFonts w:ascii="David" w:cs="David" w:eastAsia="David" w:hAnsi="David"/>
-          <w:noProof/>
-          <w:sz w:val="24"/>
-          <w:szCs w:val="24"/>
-          <w:rtl/>
-        </w:rPr>
-        <w:t xml:space="preserve">מדעים בזום זה... (נאנחת) אין מעבדה. ואצלי עם עולים ושילוב זה קשה בריבוע. אני לא רואה את הידיים. במעבדה אני יודעת מי מבין לפי מה שהוא עושה עם המבחנה. בזום ריבועים כבויים. והשפה קשה יותר, כי בכיתה אני אומרת לתלמיד עולה מילה ברוסית בשקט, ובזום כל מילה לכולם. והשקטים נעלמים.</w:t>
+        <w:t xml:space="preserve">עיינא: </w:t>
+      </w:r>
+      <w:r>
+        <w:rPr>
+          <w:rFonts w:ascii="David" w:cs="David" w:eastAsia="David" w:hAnsi="David"/>
+          <w:noProof/>
+          <w:sz w:val="24"/>
+          <w:szCs w:val="24"/>
+          <w:rtl/>
+        </w:rPr>
+        <w:t xml:space="preserve">מדעים בזום זה... (נאנחת) אין מעבדה. ואצלי עם תלמידים מהפזורה ושילוב זה קשה בריבוע. אני לא רואה את הידיים. במעבדה אני יודעת מי מבין לפי מה שהוא עושה עם המבחנה. בזום ריבועים כבויים. והשפה קשה יותר, כי בכיתה אני אומרת לתלמיד מילה בערבית בשקט, ובזום כל מילה לכולם. והשקטים נעלמים.</w:t>
       </w:r>
     </w:p>
     <w:p>
@@ -13068,7 +13068,7 @@
           <w:szCs w:val="24"/>
           <w:rtl/>
         </w:rPr>
-        <w:t xml:space="preserve">נטלי: </w:t>
+        <w:t xml:space="preserve">עיינא: </w:t>
       </w:r>
       <w:r>
         <w:rPr>
@@ -13126,17 +13126,17 @@
           <w:szCs w:val="24"/>
           <w:rtl/>
         </w:rPr>
-        <w:t xml:space="preserve">נטלי: </w:t>
-      </w:r>
-      <w:r>
-        <w:rPr>
-          <w:rFonts w:ascii="David" w:cs="David" w:eastAsia="David" w:hAnsi="David"/>
-          <w:noProof/>
-          <w:sz w:val="24"/>
-          <w:szCs w:val="24"/>
-          <w:rtl/>
-        </w:rPr>
-        <w:t xml:space="preserve">עובדות מצוין. יותר מבכיתה, כי ברורות בכל מסך. משתפת תמונה, כל תלמיד כותב בצ'אט דבר אחד, בכל שפה, קוראת בקול, שאלה, חדרים. ולוח שיתופי, כל אחד פתק ליד מה שראה, וככה יש לי מפה של מי נמצא. ו... לעולים, תאפשרי הקלטה קולית במקום צ'אט. לכתוב בעברית מול כולם בזום זה משהו שעולה בשנה הראשונה לא יעשה.</w:t>
+        <w:t xml:space="preserve">עיינא: </w:t>
+      </w:r>
+      <w:r>
+        <w:rPr>
+          <w:rFonts w:ascii="David" w:cs="David" w:eastAsia="David" w:hAnsi="David"/>
+          <w:noProof/>
+          <w:sz w:val="24"/>
+          <w:szCs w:val="24"/>
+          <w:rtl/>
+        </w:rPr>
+        <w:t xml:space="preserve">עובדות מצוין. יותר מבכיתה, כי ברורות בכל מסך. משתפת תמונה, כל תלמיד כותב בצ'אט דבר אחד, בכל שפה, קוראת בקול, שאלה, חדרים. ולוח שיתופי, כל אחד פתק ליד מה שראה, וככה יש לי מפה של מי נמצא. ו... למי שהעברית שלו חלשה, תאפשרי הקלטה קולית במקום צ'אט. לכתוב בעברית מול כולם בזום זה משהו שתלמיד שהעברית שלו חלשה לא יעשה.</w:t>
       </w:r>
     </w:p>
     <w:p>
@@ -13184,17 +13184,17 @@
           <w:szCs w:val="24"/>
           <w:rtl/>
         </w:rPr>
-        <w:t xml:space="preserve">נטלי: </w:t>
-      </w:r>
-      <w:r>
-        <w:rPr>
-          <w:rFonts w:ascii="David" w:cs="David" w:eastAsia="David" w:hAnsi="David"/>
-          <w:noProof/>
-          <w:sz w:val="24"/>
-          <w:szCs w:val="24"/>
-          <w:rtl/>
-        </w:rPr>
-        <w:t xml:space="preserve">תבדקי מה חוסם את התלמידים שלך לפני שאת בוחרת שיטה. (שתיקה) אני התחלתי בשיטות ולא הכרתי את התלמידים. רק כשהבנתי שאצל העולים המכשול הוא השפה ואצל השילוב המכשול הוא הדף, ידעתי מה לשנות. השיטה צריכה לענות על מכשול אמיתי. לא על מאמר. ו... דבר אחד, חודש. תוכנית ב'. מישהי לדבר איתה. אצלי המזל היה מורה ותיקה אחת שאמרה "תמשיכי".</w:t>
+        <w:t xml:space="preserve">עיינא: </w:t>
+      </w:r>
+      <w:r>
+        <w:rPr>
+          <w:rFonts w:ascii="David" w:cs="David" w:eastAsia="David" w:hAnsi="David"/>
+          <w:noProof/>
+          <w:sz w:val="24"/>
+          <w:szCs w:val="24"/>
+          <w:rtl/>
+        </w:rPr>
+        <w:t xml:space="preserve">תבדקי מה חוסם את התלמידים שלך לפני שאת בוחרת שיטה. (שתיקה) אני התחלתי בשיטות ולא הכרתי את התלמידים. רק כשהבנתי שאצל התלמידים מהפזורה המכשול הוא השפה ואצל השילוב המכשול הוא הדף, ידעתי מה לשנות. השיטה צריכה לענות על מכשול אמיתי. לא על מאמר. ו... דבר אחד, חודש. תוכנית ב'. מישהי לדבר איתה. אצלי המזל היה מורה ותיקה אחת שאמרה "תמשיכי".</w:t>
       </w:r>
     </w:p>
     <w:p>
@@ -13242,17 +13242,17 @@
           <w:szCs w:val="24"/>
           <w:rtl/>
         </w:rPr>
-        <w:t xml:space="preserve">נטלי: </w:t>
-      </w:r>
-      <w:r>
-        <w:rPr>
-          <w:rFonts w:ascii="David" w:cs="David" w:eastAsia="David" w:hAnsi="David"/>
-          <w:noProof/>
-          <w:sz w:val="24"/>
-          <w:szCs w:val="24"/>
-          <w:rtl/>
-        </w:rPr>
-        <w:t xml:space="preserve">העולים. שאלת על שונות ותמונות ובחירה ולא ספציפית על תלמידים שהשפה שלהם לא עברית. ואצלי הם הסיבה לכל מה שאני עושה. תמונה בשבילם זה לא "אמצעי חזותי". זו הדרך היחידה להראות שהם יודעים משהו. ובחירה בשבילם צריכה אפשרות בשפה שלהם. ואני חושבת שהמחקר שלך צריך לשאול לא רק מה התמונות עושות, אלא למי הן עושות הכי הרבה. (שתיקה) לפי הניסיון שלי, למי שהטקסט סגר לו את הדלת.</w:t>
+        <w:t xml:space="preserve">עיינא: </w:t>
+      </w:r>
+      <w:r>
+        <w:rPr>
+          <w:rFonts w:ascii="David" w:cs="David" w:eastAsia="David" w:hAnsi="David"/>
+          <w:noProof/>
+          <w:sz w:val="24"/>
+          <w:szCs w:val="24"/>
+          <w:rtl/>
+        </w:rPr>
+        <w:t xml:space="preserve">התלמידים מהפזורה. שאלת על שונות ותמונות ובחירה ולא ספציפית על תלמידים שהשפה שלהם לא עברית. ואצלי הם הסיבה לכל מה שאני עושה. תמונה בשבילם זה לא "אמצעי חזותי". זו הדרך היחידה להראות שהם יודעים משהו. ובחירה בשבילם צריכה אפשרות בשפה שלהם. ואני חושבת שהמחקר שלך צריך לשאול לא רק מה התמונות עושות, אלא למי הן עושות הכי הרבה. (שתיקה) לפי הניסיון שלי, למי שהטקסט סגר לו את הדלת.</w:t>
       </w:r>
     </w:p>
     <w:p>
@@ -13300,7 +13300,7 @@
           <w:szCs w:val="24"/>
           <w:rtl/>
         </w:rPr>
-        <w:t xml:space="preserve">נטלי: </w:t>
+        <w:t xml:space="preserve">עיינא: </w:t>
       </w:r>
       <w:r>
         <w:rPr>
@@ -13349,7 +13349,7 @@
           <w:szCs w:val="28"/>
           <w:rtl/>
         </w:rPr>
-        <w:t xml:space="preserve">ריאיון מס' 5: הודיה (שם בדוי)</w:t>
+        <w:t xml:space="preserve">ריאיון מס' 5: סוזאן (שם בדוי)</w:t>
       </w:r>
     </w:p>
     <w:p>
@@ -13368,7 +13368,7 @@
           <w:szCs w:val="24"/>
           <w:rtl/>
         </w:rPr>
-        <w:t xml:space="preserve">מורה לתנ"ך ולהיסטוריה בחטיבת ביניים ממלכתית-דתית לבנות באופקים, 6 שנות ותק.</w:t>
+        <w:t xml:space="preserve">מורה להיסטוריה ולדת בחטיבת ביניים לבנות בלקייה, 6 שנות ותק.</w:t>
       </w:r>
     </w:p>
     <w:p>
@@ -13454,17 +13454,17 @@
           <w:szCs w:val="24"/>
           <w:rtl/>
         </w:rPr>
-        <w:t xml:space="preserve">הודיה: </w:t>
-      </w:r>
-      <w:r>
-        <w:rPr>
-          <w:rFonts w:ascii="David" w:cs="David" w:eastAsia="David" w:hAnsi="David"/>
-          <w:noProof/>
-          <w:sz w:val="24"/>
-          <w:szCs w:val="24"/>
-          <w:rtl/>
-        </w:rPr>
-        <w:t xml:space="preserve">אני בת שלושים. שש שנים מלמדת, תנ"ך והיסטוריה, בממ"ד לבנות. ומחנכת ז', שנה שלישית. הגעתי ישר מהלימודים. ידעתי מכיתה י' שאני רוצה ללמד. הייתה לי מורה להיסטוריה שהייתה מביאה חפצים. מטבע עתיק, דף עיתון ישן. מעבירה ביד. ואני זוכרת את המגע של הדברים האלה יותר מכל מה שכתוב במחברת. (שתיקה) זה בעצם כל מה שאני מנסה לעשות. להיות היא.</w:t>
+        <w:t xml:space="preserve">סוזאן: </w:t>
+      </w:r>
+      <w:r>
+        <w:rPr>
+          <w:rFonts w:ascii="David" w:cs="David" w:eastAsia="David" w:hAnsi="David"/>
+          <w:noProof/>
+          <w:sz w:val="24"/>
+          <w:szCs w:val="24"/>
+          <w:rtl/>
+        </w:rPr>
+        <w:t xml:space="preserve">אני בת שלושים. שש שנים מלמדת, היסטוריה ודת, בחטיבה לבנות. ומחנכת ז', שנה שלישית. הגעתי ישר מהלימודים. ידעתי מכיתה י' שאני רוצה ללמד. הייתה לי מורה להיסטוריה שהייתה מביאה חפצים. מטבע עתיק, דף עיתון ישן. מעבירה ביד. ואני זוכרת את המגע של הדברים האלה יותר מכל מה שכתוב במחברת. (שתיקה) זה בעצם כל מה שאני מנסה לעשות. להיות היא.</w:t>
       </w:r>
     </w:p>
     <w:p>
@@ -13512,17 +13512,17 @@
           <w:szCs w:val="24"/>
           <w:rtl/>
         </w:rPr>
-        <w:t xml:space="preserve">הודיה: </w:t>
-      </w:r>
-      <w:r>
-        <w:rPr>
-          <w:rFonts w:ascii="David" w:cs="David" w:eastAsia="David" w:hAnsi="David"/>
-          <w:noProof/>
-          <w:sz w:val="24"/>
-          <w:szCs w:val="24"/>
-          <w:rtl/>
-        </w:rPr>
-        <w:t xml:space="preserve">כשבת שבטוחה שההיסטוריה זה סיפור של אחרים מגלה שגם המשפחה שלה היא היסטוריה. קרה לי כמה פעמים עם בנות שהמשפחה שלהן עלתה מאתיופיה ברגל.</w:t>
+        <w:t xml:space="preserve">סוזאן: </w:t>
+      </w:r>
+      <w:r>
+        <w:rPr>
+          <w:rFonts w:ascii="David" w:cs="David" w:eastAsia="David" w:hAnsi="David"/>
+          <w:noProof/>
+          <w:sz w:val="24"/>
+          <w:szCs w:val="24"/>
+          <w:rtl/>
+        </w:rPr>
+        <w:t xml:space="preserve">כשבת שבטוחה שההיסטוריה זה סיפור של אחרים מגלה שגם המשפחה שלה היא היסטוריה. קרה לי כמה פעמים עם בנות שהמשפחה שלהן עברה מהאוהל ליישוב לפני דור אחד.</w:t>
       </w:r>
     </w:p>
     <w:p>
@@ -13570,17 +13570,17 @@
           <w:szCs w:val="24"/>
           <w:rtl/>
         </w:rPr>
-        <w:t xml:space="preserve">הודיה: </w:t>
-      </w:r>
-      <w:r>
-        <w:rPr>
-          <w:rFonts w:ascii="David" w:cs="David" w:eastAsia="David" w:hAnsi="David"/>
-          <w:noProof/>
-          <w:sz w:val="24"/>
-          <w:szCs w:val="24"/>
-          <w:rtl/>
-        </w:rPr>
-        <w:t xml:space="preserve">(שתיקה) בת בכיתה ח', שנה שעברה. למדנו על העלייה מאתיופיה, אחרי הסיפור שאני עוד אספר לך, ואמרתי לבנות להביא תמונה מהבית. והיא הביאה תמונה של סבתא שלה, במחנה בסודן, עם תינוק. והתינוק זה אבא שלה. ועמדה מול הכיתה ואמרה, "זה אבא שלי", ובכתה. וכל הכיתה שתקה. וגם אני. (שתיקה) ואחרי זה היא כתבה עבודה על המסע, שלושה עמודים, והיא בת שקוראת לאט מאוד וכותבת לאט מאוד. שלושה עמודים. כי זה היה שלה.</w:t>
+        <w:t xml:space="preserve">סוזאן: </w:t>
+      </w:r>
+      <w:r>
+        <w:rPr>
+          <w:rFonts w:ascii="David" w:cs="David" w:eastAsia="David" w:hAnsi="David"/>
+          <w:noProof/>
+          <w:sz w:val="24"/>
+          <w:szCs w:val="24"/>
+          <w:rtl/>
+        </w:rPr>
+        <w:t xml:space="preserve">(שתיקה) בת בכיתה ח', שנה שעברה. למדנו על המעבר מהפזורה ליישובים, אחרי הסיפור שאני עוד אספר לך, ואמרתי לבנות להביא תמונה מהבית. והיא הביאה תמונה של סבתא שלה, ליד אוהל, עם תינוק. והתינוק זה אבא שלה. ועמדה מול הכיתה ואמרה, "זה אבא שלי", ובכתה. וכל הכיתה שתקה. וגם אני. (שתיקה) ואחרי זה היא כתבה עבודה על המעבר, שלושה עמודים, והיא בת שקוראת לאט מאוד וכותבת לאט מאוד. שלושה עמודים. כי זה היה שלה.</w:t>
       </w:r>
     </w:p>
     <w:p>
@@ -13628,7 +13628,7 @@
           <w:szCs w:val="24"/>
           <w:rtl/>
         </w:rPr>
-        <w:t xml:space="preserve">הודיה: </w:t>
+        <w:t xml:space="preserve">סוזאן: </w:t>
       </w:r>
       <w:r>
         <w:rPr>
@@ -13686,17 +13686,17 @@
           <w:szCs w:val="24"/>
           <w:rtl/>
         </w:rPr>
-        <w:t xml:space="preserve">הודיה: </w:t>
-      </w:r>
-      <w:r>
-        <w:rPr>
-          <w:rFonts w:ascii="David" w:cs="David" w:eastAsia="David" w:hAnsi="David"/>
-          <w:noProof/>
-          <w:sz w:val="24"/>
-          <w:szCs w:val="24"/>
-          <w:rtl/>
-        </w:rPr>
-        <w:t xml:space="preserve">שנה שנייה. כיתה ח', העלייה מארצות האסלאם. שיעור מהספר. קטע, שאלות, סיכום. ובת ממשפחה מאתיופיה הרימה יד ושאלה, בשקט: "ולמה בספר אין את העלייה שלנו?" ופתחתי את הספר וחיפשתי. פסקה אחת. קטנה. בסוף הפרק. (שתיקה) הרגשתי שנתפסתי. לא בגלל הספר. בגלל שלימדתי שנתיים בלי לשים לב שיש בנות שהסיפור שלהן לא בו.</w:t>
+        <w:t xml:space="preserve">סוזאן: </w:t>
+      </w:r>
+      <w:r>
+        <w:rPr>
+          <w:rFonts w:ascii="David" w:cs="David" w:eastAsia="David" w:hAnsi="David"/>
+          <w:noProof/>
+          <w:sz w:val="24"/>
+          <w:szCs w:val="24"/>
+          <w:rtl/>
+        </w:rPr>
+        <w:t xml:space="preserve">שנה שנייה. כיתה ח', הקמת המדינה. שיעור מהספר. קטע, שאלות, סיכום. ובת הרימה יד ושאלה, בשקט: "ולמה בספר אין אותנו?" ופתחתי את הספר וחיפשתי. פסקה אחת. קטנה. בסוף הפרק. (שתיקה) הרגשתי שנתפסתי. לא בגלל הספר. בגלל שלימדתי שנתיים בלי לשים לב שיש בנות שהסיפור שלהן לא בו.</w:t>
       </w:r>
     </w:p>
     <w:p>
@@ -13744,17 +13744,17 @@
           <w:szCs w:val="24"/>
           <w:rtl/>
         </w:rPr>
-        <w:t xml:space="preserve">הודיה: </w:t>
-      </w:r>
-      <w:r>
-        <w:rPr>
-          <w:rFonts w:ascii="David" w:cs="David" w:eastAsia="David" w:hAnsi="David"/>
-          <w:noProof/>
-          <w:sz w:val="24"/>
-          <w:szCs w:val="24"/>
-          <w:rtl/>
-        </w:rPr>
-        <w:t xml:space="preserve">סגרתי את הספר. שאלתי אם היא רוצה לספר מה היא יודעת על העלייה של המשפחה שלה. והיא סיפרה, בקצרה, על סבתא שהלכה ברגל. ובנות אחרות הצטרפו. ובת ממשפחה ותיקה סיפרה על סבא ממרוקו. ופתאום השיעור על העליות מהכיתה, לא מהספר. ובשיעור הבא כל בת הביאה תמונה של סבא או סבתא, ובנינו קיר. ולידו למדנו את הפרק.</w:t>
+        <w:t xml:space="preserve">סוזאן: </w:t>
+      </w:r>
+      <w:r>
+        <w:rPr>
+          <w:rFonts w:ascii="David" w:cs="David" w:eastAsia="David" w:hAnsi="David"/>
+          <w:noProof/>
+          <w:sz w:val="24"/>
+          <w:szCs w:val="24"/>
+          <w:rtl/>
+        </w:rPr>
+        <w:t xml:space="preserve">סגרתי את הספר. שאלתי אם היא רוצה לספר מה היא יודעת על ההיסטוריה של המשפחה שלה. והיא סיפרה, בקצרה, על סבתא שנולדה באוהל ועברה לבית אבן. ובנות אחרות הצטרפו. ובת סיפרה על סבא שהעבירו אותו עם כל השבט למקום אחר. ופתאום השיעור על ההיסטוריה של הכיתה, לא מהספר. ובשיעור הבא כל בת הביאה תמונה של סבא או סבתא, ובנינו קיר. ולידו למדנו את הפרק.</w:t>
       </w:r>
     </w:p>
     <w:p>
@@ -13802,7 +13802,7 @@
           <w:szCs w:val="24"/>
           <w:rtl/>
         </w:rPr>
-        <w:t xml:space="preserve">הודיה: </w:t>
+        <w:t xml:space="preserve">סוזאן: </w:t>
       </w:r>
       <w:r>
         <w:rPr>
@@ -13860,65 +13860,65 @@
           <w:szCs w:val="24"/>
           <w:rtl/>
         </w:rPr>
-        <w:t xml:space="preserve">הודיה: </w:t>
-      </w:r>
-      <w:r>
-        <w:rPr>
-          <w:rFonts w:ascii="David" w:cs="David" w:eastAsia="David" w:hAnsi="David"/>
-          <w:noProof/>
-          <w:sz w:val="24"/>
-          <w:szCs w:val="24"/>
-          <w:rtl/>
-        </w:rPr>
-        <w:t xml:space="preserve">ז'2, שלי. עשרים ותשע בנות. עשר בערך ממשפחות יוצאות אתיופיה, שתיים הגיעו בגיל שש שבע, העברית טובה אבל הקריאה איטית, השאר נולדו פה. שלוש בנות שהתפנו מהעוטף ונשארו. עדיין רואים עליהן שהן לא בבית. שני אבחונים ואחת עם קשב, ועוד שתיים לדעתי. שש שבע שקוראות פרק בתנ"ך בקלות. עשר שפרק זה עשרים דקות. ו... בנות שההורים יושבים איתן, ובנות שההורים לא קוראים עברית, ובנות שמטפלות באחים.</w:t>
-      </w:r>
-    </w:p>
-    <w:p>
-      <w:pPr>
-        <w:bidi/>
-        <w:spacing w:after="120" w:line="360" w:lineRule="auto"/>
-        <w:jc w:val="both"/>
-      </w:pPr>
-      <w:r>
-        <w:rPr>
-          <w:rFonts w:ascii="David" w:cs="David" w:eastAsia="David" w:hAnsi="David"/>
-          <w:noProof/>
-          <w:b/>
-          <w:bCs/>
-          <w:sz w:val="24"/>
-          <w:szCs w:val="24"/>
-          <w:rtl/>
-        </w:rPr>
-        <w:t xml:space="preserve">מ: </w:t>
-      </w:r>
-      <w:r>
-        <w:rPr>
-          <w:rFonts w:ascii="David" w:cs="David" w:eastAsia="David" w:hAnsi="David"/>
-          <w:noProof/>
-          <w:sz w:val="24"/>
-          <w:szCs w:val="24"/>
-          <w:rtl/>
-        </w:rPr>
-        <w:t xml:space="preserve">את אמרת "רואים עליהן שהן לא בבית", על המפונות. מה את רואה?</w:t>
-      </w:r>
-    </w:p>
-    <w:p>
-      <w:pPr>
-        <w:bidi/>
-        <w:spacing w:after="120" w:line="360" w:lineRule="auto"/>
-        <w:jc w:val="both"/>
-      </w:pPr>
-      <w:r>
-        <w:rPr>
-          <w:rFonts w:ascii="David" w:cs="David" w:eastAsia="David" w:hAnsi="David"/>
-          <w:noProof/>
-          <w:b/>
-          <w:bCs/>
-          <w:sz w:val="24"/>
-          <w:szCs w:val="24"/>
-          <w:rtl/>
-        </w:rPr>
-        <w:t xml:space="preserve">הודיה: </w:t>
+        <w:t xml:space="preserve">סוזאן: </w:t>
+      </w:r>
+      <w:r>
+        <w:rPr>
+          <w:rFonts w:ascii="David" w:cs="David" w:eastAsia="David" w:hAnsi="David"/>
+          <w:noProof/>
+          <w:sz w:val="24"/>
+          <w:szCs w:val="24"/>
+          <w:rtl/>
+        </w:rPr>
+        <w:t xml:space="preserve">ז'2, שלי. עשרים ותשע בנות. עשר בערך מהפזורה, שתיים הגיעו לבית ספר מסודר רק בגיל שש שבע, והקריאה שלהן איטית. שלוש בנות שהמשפחה שלהן עברה אלינו אחרי שנפל טיל ליד הכפר שלהן, במלחמה, ונשארו. עדיין רואים עליהן שהן לא בבית. שני אבחונים ואחת עם קשב, ועוד שתיים לדעתי. שש שבע שקוראות פרק בתנ"ך בקלות. עשר שפרק זה עשרים דקות. ו... בנות שההורים יושבים איתן, ובנות שההורים לא קוראים עברית, ובנות שמטפלות באחים.</w:t>
+      </w:r>
+    </w:p>
+    <w:p>
+      <w:pPr>
+        <w:bidi/>
+        <w:spacing w:after="120" w:line="360" w:lineRule="auto"/>
+        <w:jc w:val="both"/>
+      </w:pPr>
+      <w:r>
+        <w:rPr>
+          <w:rFonts w:ascii="David" w:cs="David" w:eastAsia="David" w:hAnsi="David"/>
+          <w:noProof/>
+          <w:b/>
+          <w:bCs/>
+          <w:sz w:val="24"/>
+          <w:szCs w:val="24"/>
+          <w:rtl/>
+        </w:rPr>
+        <w:t xml:space="preserve">מ: </w:t>
+      </w:r>
+      <w:r>
+        <w:rPr>
+          <w:rFonts w:ascii="David" w:cs="David" w:eastAsia="David" w:hAnsi="David"/>
+          <w:noProof/>
+          <w:sz w:val="24"/>
+          <w:szCs w:val="24"/>
+          <w:rtl/>
+        </w:rPr>
+        <w:t xml:space="preserve">את אמרת "רואים עליהן שהן לא בבית", על הבנות שעברו אחרי הטיל. מה את רואה?</w:t>
+      </w:r>
+    </w:p>
+    <w:p>
+      <w:pPr>
+        <w:bidi/>
+        <w:spacing w:after="120" w:line="360" w:lineRule="auto"/>
+        <w:jc w:val="both"/>
+      </w:pPr>
+      <w:r>
+        <w:rPr>
+          <w:rFonts w:ascii="David" w:cs="David" w:eastAsia="David" w:hAnsi="David"/>
+          <w:noProof/>
+          <w:b/>
+          <w:bCs/>
+          <w:sz w:val="24"/>
+          <w:szCs w:val="24"/>
+          <w:rtl/>
+        </w:rPr>
+        <w:t xml:space="preserve">סוזאן: </w:t>
       </w:r>
       <w:r>
         <w:rPr>
@@ -13976,7 +13976,7 @@
           <w:szCs w:val="24"/>
           <w:rtl/>
         </w:rPr>
-        <w:t xml:space="preserve">הודיה: </w:t>
+        <w:t xml:space="preserve">סוזאן: </w:t>
       </w:r>
       <w:r>
         <w:rPr>
@@ -14034,17 +14034,17 @@
           <w:szCs w:val="24"/>
           <w:rtl/>
         </w:rPr>
-        <w:t xml:space="preserve">הודיה: </w:t>
-      </w:r>
-      <w:r>
-        <w:rPr>
-          <w:rFonts w:ascii="David" w:cs="David" w:eastAsia="David" w:hAnsi="David"/>
-          <w:noProof/>
-          <w:sz w:val="24"/>
-          <w:szCs w:val="24"/>
-          <w:rtl/>
-        </w:rPr>
-        <w:t xml:space="preserve">שכל שיעור יתחיל ממשהו שכולן יכולות. תמונה, חפץ, שאלה. שהתנ"ך יגיע עם תמונה, כי פסוק בלי תמונה הוא לחצי מהכיתה סתם מילים. לדעת מי עדיין לא בפנים. ו... זה מה שאני עדיין לומדת. לא לחשוב על הבנות מאתיופיה כקבוצה. הן לא קבוצה. הן עשר בנות שונות. ואם אני חושבת עליהן כקבוצה אני מפספסת את מי שחזקה ואת מי שחלשה.</w:t>
+        <w:t xml:space="preserve">סוזאן: </w:t>
+      </w:r>
+      <w:r>
+        <w:rPr>
+          <w:rFonts w:ascii="David" w:cs="David" w:eastAsia="David" w:hAnsi="David"/>
+          <w:noProof/>
+          <w:sz w:val="24"/>
+          <w:szCs w:val="24"/>
+          <w:rtl/>
+        </w:rPr>
+        <w:t xml:space="preserve">שכל שיעור יתחיל ממשהו שכולן יכולות. תמונה, חפץ, שאלה. שגם שיעור דת יגיע עם תמונה, כי טקסט בלי תמונה הוא לחצי מהכיתה סתם מילים. לדעת מי עדיין לא בפנים. ו... זה מה שאני עדיין לומדת. לא לחשוב על הבנות מהפזורה כקבוצה. הן לא קבוצה. הן עשר בנות שונות. ואם אני חושבת עליהן כקבוצה אני מפספסת את מי שחזקה ואת מי שחלשה.</w:t>
       </w:r>
     </w:p>
     <w:p>
@@ -14092,17 +14092,17 @@
           <w:szCs w:val="24"/>
           <w:rtl/>
         </w:rPr>
-        <w:t xml:space="preserve">הודיה: </w:t>
-      </w:r>
-      <w:r>
-        <w:rPr>
-          <w:rFonts w:ascii="David" w:cs="David" w:eastAsia="David" w:hAnsi="David"/>
-          <w:noProof/>
-          <w:sz w:val="24"/>
-          <w:szCs w:val="24"/>
-          <w:rtl/>
-        </w:rPr>
-        <w:t xml:space="preserve">שירה. כיתה ז'. נולדה בארץ. מנומסת מאוד, מעתיקה הכול בכתב יפה, ובמבחנים... דברים לא קשורים. לקח לי זמן לשים לב כי היא לא הפריעה. וכשדיברתי איתה, הקושי כפול. קוראת לאט מאוד. ובטוחה שתנ"ך זה משהו שמעתיקים ומשננים. ככה לימדו ביסודי.</w:t>
+        <w:t xml:space="preserve">סוזאן: </w:t>
+      </w:r>
+      <w:r>
+        <w:rPr>
+          <w:rFonts w:ascii="David" w:cs="David" w:eastAsia="David" w:hAnsi="David"/>
+          <w:noProof/>
+          <w:sz w:val="24"/>
+          <w:szCs w:val="24"/>
+          <w:rtl/>
+        </w:rPr>
+        <w:t xml:space="preserve">שהד. כיתה ז'. נולדה ביישוב. מנומסת מאוד, מעתיקה הכול בכתב יפה, ובמבחנים... דברים לא קשורים. לקח לי זמן לשים לב כי היא לא הפריעה. וכשדיברתי איתה, הקושי כפול. קוראת לאט מאוד. ובטוחה שהיסטוריה זה משהו שמעתיקים ומשננים. ככה לימדו ביסודי.</w:t>
       </w:r>
     </w:p>
     <w:p>
@@ -14150,17 +14150,17 @@
           <w:szCs w:val="24"/>
           <w:rtl/>
         </w:rPr>
-        <w:t xml:space="preserve">הודיה: </w:t>
-      </w:r>
-      <w:r>
-        <w:rPr>
-          <w:rFonts w:ascii="David" w:cs="David" w:eastAsia="David" w:hAnsi="David"/>
-          <w:noProof/>
-          <w:sz w:val="24"/>
-          <w:szCs w:val="24"/>
-          <w:rtl/>
-        </w:rPr>
-        <w:t xml:space="preserve">קודם דפים מקוצרים. לא עזר, העתיקה אותם באותה צורה. ואז בסיפור יוסף הבאתי תצלום של ציור ישן של יוסף בבור, על כל שולחן, ושאלתי: "מה הוא מרגיש?" ושירה כתבה חצי עמוד. פחד, בדידות, האחים למעלה. (שתיקה) היא מבינה הרבה יותר ממה שהמבחנים מראים. משם נתתי לה לכתוב קודם מה הדמות מרגישה ורק אז לקרוא את הפסוקים. ולאט לאט הקריאה התחברה למשהו.</w:t>
+        <w:t xml:space="preserve">סוזאן: </w:t>
+      </w:r>
+      <w:r>
+        <w:rPr>
+          <w:rFonts w:ascii="David" w:cs="David" w:eastAsia="David" w:hAnsi="David"/>
+          <w:noProof/>
+          <w:sz w:val="24"/>
+          <w:szCs w:val="24"/>
+          <w:rtl/>
+        </w:rPr>
+        <w:t xml:space="preserve">קודם דפים מקוצרים. לא עזר, העתיקה אותם באותה צורה. ואז בסיפור הנביא יוסף, בשיעור דת, הבאתי תצלום של בור עתיק במדבר, חשוך, על כל שולחן, ושאלתי: "מה מרגיש מי שנמצא שם למטה?" ושהד כתבה חצי עמוד. פחד, בדידות, האחים למעלה. (שתיקה) היא מבינה הרבה יותר ממה שהמבחנים מראים. משם נתתי לה לכתוב קודם מה הדמות מרגישה ורק אז לקרוא את הפסוקים. ולאט לאט הקריאה התחברה למשהו.</w:t>
       </w:r>
     </w:p>
     <w:p>
@@ -14208,17 +14208,17 @@
           <w:szCs w:val="24"/>
           <w:rtl/>
         </w:rPr>
-        <w:t xml:space="preserve">הודיה: </w:t>
-      </w:r>
-      <w:r>
-        <w:rPr>
-          <w:rFonts w:ascii="David" w:cs="David" w:eastAsia="David" w:hAnsi="David"/>
-          <w:noProof/>
-          <w:sz w:val="24"/>
-          <w:szCs w:val="24"/>
-          <w:rtl/>
-        </w:rPr>
-        <w:t xml:space="preserve">אני זוכרת בערך. "הוא מפחד כי חושך. הוא לבד. האחים למעלה ולא אכפת להם. הוא חושב שאבא לא יודע איפה הוא." (שתיקה) ואת המשפט האחרון, "אבא לא יודע איפה הוא", זה בדיוק מה שקורה בסיפור, יעקב לא יודע. והיא לא קראה את הפסוקים. היא הסתכלה על ציור. ואז, כשקראנו את הפסוקים, היא הרימה יד, בפעם הראשונה בשנה, ואמרה "אמרתי שאבא לא יודע". (צוחקת) בגאווה. וזה היה הרגע.</w:t>
+        <w:t xml:space="preserve">סוזאן: </w:t>
+      </w:r>
+      <w:r>
+        <w:rPr>
+          <w:rFonts w:ascii="David" w:cs="David" w:eastAsia="David" w:hAnsi="David"/>
+          <w:noProof/>
+          <w:sz w:val="24"/>
+          <w:szCs w:val="24"/>
+          <w:rtl/>
+        </w:rPr>
+        <w:t xml:space="preserve">אני זוכרת בערך. "הוא מפחד כי חושך. הוא לבד. האחים למעלה ולא אכפת להם. הוא חושב שאבא לא יודע איפה הוא." (שתיקה) ואת המשפט האחרון, "אבא לא יודע איפה הוא", זה בדיוק מה שקורה בסיפור, האב לא יודע. והיא לא קראה את הטקסט. היא הסתכלה על ציור. ואז, כשקראנו את הסיפור, היא הרימה יד, בפעם הראשונה בשנה, ואמרה "אמרתי שאבא לא יודע". (צוחקת) בגאווה. וזה היה הרגע.</w:t>
       </w:r>
     </w:p>
     <w:p>
@@ -14266,7 +14266,7 @@
           <w:szCs w:val="24"/>
           <w:rtl/>
         </w:rPr>
-        <w:t xml:space="preserve">הודיה: </w:t>
+        <w:t xml:space="preserve">סוזאן: </w:t>
       </w:r>
       <w:r>
         <w:rPr>
@@ -14324,7 +14324,7 @@
           <w:szCs w:val="24"/>
           <w:rtl/>
         </w:rPr>
-        <w:t xml:space="preserve">הודיה: </w:t>
+        <w:t xml:space="preserve">סוזאן: </w:t>
       </w:r>
       <w:r>
         <w:rPr>
@@ -14382,17 +14382,17 @@
           <w:szCs w:val="24"/>
           <w:rtl/>
         </w:rPr>
-        <w:t xml:space="preserve">הודיה: </w:t>
-      </w:r>
-      <w:r>
-        <w:rPr>
-          <w:rFonts w:ascii="David" w:cs="David" w:eastAsia="David" w:hAnsi="David"/>
-          <w:noProof/>
-          <w:sz w:val="24"/>
-          <w:szCs w:val="24"/>
-          <w:rtl/>
-        </w:rPr>
-        <w:t xml:space="preserve">בלי טקסט, אז כולן שוות. חפצים אמיתיים, לגעת. זה מהמורה שלי. והשאלה על ילדה בגילן. (שתיקה) ובת שהתפנתה מהעוטף, ששתקה חודשים, אמרה בסוף: "גם אני לא הייתי בבית ספר הרבה זמן." וזה... זה לימד אותי שתמונה פותחת דלתות שלא תכננתי.</w:t>
+        <w:t xml:space="preserve">סוזאן: </w:t>
+      </w:r>
+      <w:r>
+        <w:rPr>
+          <w:rFonts w:ascii="David" w:cs="David" w:eastAsia="David" w:hAnsi="David"/>
+          <w:noProof/>
+          <w:sz w:val="24"/>
+          <w:szCs w:val="24"/>
+          <w:rtl/>
+        </w:rPr>
+        <w:t xml:space="preserve">בלי טקסט, אז כולן שוות. חפצים אמיתיים, לגעת. זה מהמורה שלי. והשאלה על ילדה בגילן. (שתיקה) ובת מאלה שעברו אחרי הטיל, ששתקה חודשים, אמרה בסוף: "גם אני לא הייתי בבית ספר הרבה זמן." וזה... זה לימד אותי שתמונה פותחת דלתות שלא תכננתי.</w:t>
       </w:r>
     </w:p>
     <w:p>
@@ -14440,7 +14440,7 @@
           <w:szCs w:val="24"/>
           <w:rtl/>
         </w:rPr>
-        <w:t xml:space="preserve">הודיה: </w:t>
+        <w:t xml:space="preserve">סוזאן: </w:t>
       </w:r>
       <w:r>
         <w:rPr>
@@ -14498,7 +14498,7 @@
           <w:szCs w:val="24"/>
           <w:rtl/>
         </w:rPr>
-        <w:t xml:space="preserve">הודיה: </w:t>
+        <w:t xml:space="preserve">סוזאן: </w:t>
       </w:r>
       <w:r>
         <w:rPr>
@@ -14556,7 +14556,7 @@
           <w:szCs w:val="24"/>
           <w:rtl/>
         </w:rPr>
-        <w:t xml:space="preserve">הודיה: </w:t>
+        <w:t xml:space="preserve">סוזאן: </w:t>
       </w:r>
       <w:r>
         <w:rPr>
@@ -14614,7 +14614,7 @@
           <w:szCs w:val="24"/>
           <w:rtl/>
         </w:rPr>
-        <w:t xml:space="preserve">הודיה: </w:t>
+        <w:t xml:space="preserve">סוזאן: </w:t>
       </w:r>
       <w:r>
         <w:rPr>
@@ -14653,36 +14653,36 @@
           <w:szCs w:val="24"/>
           <w:rtl/>
         </w:rPr>
-        <w:t xml:space="preserve">ומה עם קטע ארוך? פרק בתנ"ך?</w:t>
-      </w:r>
-    </w:p>
-    <w:p>
-      <w:pPr>
-        <w:bidi/>
-        <w:spacing w:after="120" w:line="360" w:lineRule="auto"/>
-        <w:jc w:val="both"/>
-      </w:pPr>
-      <w:r>
-        <w:rPr>
-          <w:rFonts w:ascii="David" w:cs="David" w:eastAsia="David" w:hAnsi="David"/>
-          <w:noProof/>
-          <w:b/>
-          <w:bCs/>
-          <w:sz w:val="24"/>
-          <w:szCs w:val="24"/>
-          <w:rtl/>
-        </w:rPr>
-        <w:t xml:space="preserve">הודיה: </w:t>
-      </w:r>
-      <w:r>
-        <w:rPr>
-          <w:rFonts w:ascii="David" w:cs="David" w:eastAsia="David" w:hAnsi="David"/>
-          <w:noProof/>
-          <w:sz w:val="24"/>
-          <w:szCs w:val="24"/>
-          <w:rtl/>
-        </w:rPr>
-        <w:t xml:space="preserve">הר. לפני, מספרת את ההתחלה בעל פה. תמונה של המקום או הדמות. חמש שבע מילים על הלוח שאני יודעת שיעצרו אותן, ומסבירות יחד. לא מגדירות. עם דוגמה. ושאלה אחת. במהלך, אני קוראת פסוקים ראשונים בקול, בטעמים, כי הקול נותן משמעות. ואז בזוגות, ועוצרות. ולמי שקשה, גרסה מקוצרת בעברית פשוטה, בשקט. ובתנ"ך אני מקפידה שגם המקוצרת תכלול את הפסוקים החשובים במקור. כי הפסוק עצמו הוא הדבר.</w:t>
+        <w:t xml:space="preserve">ומה עם קטע ארוך? פרק בספר?</w:t>
+      </w:r>
+    </w:p>
+    <w:p>
+      <w:pPr>
+        <w:bidi/>
+        <w:spacing w:after="120" w:line="360" w:lineRule="auto"/>
+        <w:jc w:val="both"/>
+      </w:pPr>
+      <w:r>
+        <w:rPr>
+          <w:rFonts w:ascii="David" w:cs="David" w:eastAsia="David" w:hAnsi="David"/>
+          <w:noProof/>
+          <w:b/>
+          <w:bCs/>
+          <w:sz w:val="24"/>
+          <w:szCs w:val="24"/>
+          <w:rtl/>
+        </w:rPr>
+        <w:t xml:space="preserve">סוזאן: </w:t>
+      </w:r>
+      <w:r>
+        <w:rPr>
+          <w:rFonts w:ascii="David" w:cs="David" w:eastAsia="David" w:hAnsi="David"/>
+          <w:noProof/>
+          <w:sz w:val="24"/>
+          <w:szCs w:val="24"/>
+          <w:rtl/>
+        </w:rPr>
+        <w:t xml:space="preserve">הר. לפני, מספרת את ההתחלה בעל פה. תמונה של המקום או הדמות. חמש שבע מילים על הלוח שאני יודעת שיעצרו אותן, ומסבירות יחד. לא מגדירות. עם דוגמה. ושאלה אחת. במהלך, אני קוראת את הפסקה הראשונה בקול, לאט, כי הקול נותן משמעות. ואז בזוגות, ועוצרות. ולמי שקשה, גרסה מקוצרת בעברית פשוטה, בשקט. ובשיעור דת אני מקפידה שגם המקוצרת תכלול את הפסוקים החשובים במקור. כי הפסוק עצמו הוא הדבר.</w:t>
       </w:r>
     </w:p>
     <w:p>
@@ -14730,7 +14730,7 @@
           <w:szCs w:val="24"/>
           <w:rtl/>
         </w:rPr>
-        <w:t xml:space="preserve">הודיה: </w:t>
+        <w:t xml:space="preserve">סוזאן: </w:t>
       </w:r>
       <w:r>
         <w:rPr>
@@ -14788,7 +14788,7 @@
           <w:szCs w:val="24"/>
           <w:rtl/>
         </w:rPr>
-        <w:t xml:space="preserve">הודיה: </w:t>
+        <w:t xml:space="preserve">סוזאן: </w:t>
       </w:r>
       <w:r>
         <w:rPr>
@@ -14846,17 +14846,17 @@
           <w:szCs w:val="24"/>
           <w:rtl/>
         </w:rPr>
-        <w:t xml:space="preserve">הודיה: </w:t>
-      </w:r>
-      <w:r>
-        <w:rPr>
-          <w:rFonts w:ascii="David" w:cs="David" w:eastAsia="David" w:hAnsi="David"/>
-          <w:noProof/>
-          <w:sz w:val="24"/>
-          <w:szCs w:val="24"/>
-          <w:rtl/>
-        </w:rPr>
-        <w:t xml:space="preserve">שלא צריך להבין כל מילה. שאפשר להבין מה קרה גם עם חורים. ולפעמים, שגם אני קראתי תנ"ך בכיתה ז' והבנתי חצי. וזה נכון. (צוחקת) ואני לא מבקשת מבת לקרוא בקול אם לא הרימה יד. בכיתה ז' זה עונש.</w:t>
+        <w:t xml:space="preserve">סוזאן: </w:t>
+      </w:r>
+      <w:r>
+        <w:rPr>
+          <w:rFonts w:ascii="David" w:cs="David" w:eastAsia="David" w:hAnsi="David"/>
+          <w:noProof/>
+          <w:sz w:val="24"/>
+          <w:szCs w:val="24"/>
+          <w:rtl/>
+        </w:rPr>
+        <w:t xml:space="preserve">שלא צריך להבין כל מילה. שאפשר להבין מה קרה גם עם חורים. ולפעמים, שגם אני קראתי ספר היסטוריה בכיתה ז' והבנתי חצי. וזה נכון. (צוחקת) ואני לא מבקשת מבת לקרוא בקול אם לא הרימה יד. בכיתה ז' זה עונש.</w:t>
       </w:r>
     </w:p>
     <w:p>
@@ -14904,7 +14904,7 @@
           <w:szCs w:val="24"/>
           <w:rtl/>
         </w:rPr>
-        <w:t xml:space="preserve">הודיה: </w:t>
+        <w:t xml:space="preserve">סוזאן: </w:t>
       </w:r>
       <w:r>
         <w:rPr>
@@ -14962,65 +14962,65 @@
           <w:szCs w:val="24"/>
           <w:rtl/>
         </w:rPr>
-        <w:t xml:space="preserve">הודיה: </w:t>
-      </w:r>
-      <w:r>
-        <w:rPr>
-          <w:rFonts w:ascii="David" w:cs="David" w:eastAsia="David" w:hAnsi="David"/>
-          <w:noProof/>
-          <w:sz w:val="24"/>
-          <w:szCs w:val="24"/>
-          <w:rtl/>
-        </w:rPr>
-        <w:t xml:space="preserve">כמעט חצי אלבום. שליש הקלטה. שש מכתב, כולן קוראות חזקות. והאלבום של שירה, שכותבת במבחנים דברים לא קשורים... היא בחרה תמונות של ילדים ישנים במפעל וכתבה "אין להם בית ללכת אליו". (שתיקה) בשום מבחן לא הייתי רואה את זה.</w:t>
-      </w:r>
-    </w:p>
-    <w:p>
-      <w:pPr>
-        <w:bidi/>
-        <w:spacing w:after="120" w:line="360" w:lineRule="auto"/>
-        <w:jc w:val="both"/>
-      </w:pPr>
-      <w:r>
-        <w:rPr>
-          <w:rFonts w:ascii="David" w:cs="David" w:eastAsia="David" w:hAnsi="David"/>
-          <w:noProof/>
-          <w:b/>
-          <w:bCs/>
-          <w:sz w:val="24"/>
-          <w:szCs w:val="24"/>
-          <w:rtl/>
-        </w:rPr>
-        <w:t xml:space="preserve">מ: </w:t>
-      </w:r>
-      <w:r>
-        <w:rPr>
-          <w:rFonts w:ascii="David" w:cs="David" w:eastAsia="David" w:hAnsi="David"/>
-          <w:noProof/>
-          <w:sz w:val="24"/>
-          <w:szCs w:val="24"/>
-          <w:rtl/>
-        </w:rPr>
-        <w:t xml:space="preserve">ומה עם המפונה, שביקשה לעבור? מה קרה אחר כך?</w:t>
-      </w:r>
-    </w:p>
-    <w:p>
-      <w:pPr>
-        <w:bidi/>
-        <w:spacing w:after="120" w:line="360" w:lineRule="auto"/>
-        <w:jc w:val="both"/>
-      </w:pPr>
-      <w:r>
-        <w:rPr>
-          <w:rFonts w:ascii="David" w:cs="David" w:eastAsia="David" w:hAnsi="David"/>
-          <w:noProof/>
-          <w:b/>
-          <w:bCs/>
-          <w:sz w:val="24"/>
-          <w:szCs w:val="24"/>
-          <w:rtl/>
-        </w:rPr>
-        <w:t xml:space="preserve">הודיה: </w:t>
+        <w:t xml:space="preserve">סוזאן: </w:t>
+      </w:r>
+      <w:r>
+        <w:rPr>
+          <w:rFonts w:ascii="David" w:cs="David" w:eastAsia="David" w:hAnsi="David"/>
+          <w:noProof/>
+          <w:sz w:val="24"/>
+          <w:szCs w:val="24"/>
+          <w:rtl/>
+        </w:rPr>
+        <w:t xml:space="preserve">כמעט חצי אלבום. שליש הקלטה. שש מכתב, כולן קוראות חזקות. והאלבום של שהד, שכותבת במבחנים דברים לא קשורים... היא בחרה תמונות של ילדים ישנים במפעל וכתבה "אין להם בית ללכת אליו". (שתיקה) בשום מבחן לא הייתי רואה את זה.</w:t>
+      </w:r>
+    </w:p>
+    <w:p>
+      <w:pPr>
+        <w:bidi/>
+        <w:spacing w:after="120" w:line="360" w:lineRule="auto"/>
+        <w:jc w:val="both"/>
+      </w:pPr>
+      <w:r>
+        <w:rPr>
+          <w:rFonts w:ascii="David" w:cs="David" w:eastAsia="David" w:hAnsi="David"/>
+          <w:noProof/>
+          <w:b/>
+          <w:bCs/>
+          <w:sz w:val="24"/>
+          <w:szCs w:val="24"/>
+          <w:rtl/>
+        </w:rPr>
+        <w:t xml:space="preserve">מ: </w:t>
+      </w:r>
+      <w:r>
+        <w:rPr>
+          <w:rFonts w:ascii="David" w:cs="David" w:eastAsia="David" w:hAnsi="David"/>
+          <w:noProof/>
+          <w:sz w:val="24"/>
+          <w:szCs w:val="24"/>
+          <w:rtl/>
+        </w:rPr>
+        <w:t xml:space="preserve">ומה עם הבת שעברה אחרי הטיל, שביקשה לעבור? מה קרה אחר כך?</w:t>
+      </w:r>
+    </w:p>
+    <w:p>
+      <w:pPr>
+        <w:bidi/>
+        <w:spacing w:after="120" w:line="360" w:lineRule="auto"/>
+        <w:jc w:val="both"/>
+      </w:pPr>
+      <w:r>
+        <w:rPr>
+          <w:rFonts w:ascii="David" w:cs="David" w:eastAsia="David" w:hAnsi="David"/>
+          <w:noProof/>
+          <w:b/>
+          <w:bCs/>
+          <w:sz w:val="24"/>
+          <w:szCs w:val="24"/>
+          <w:rtl/>
+        </w:rPr>
+        <w:t xml:space="preserve">סוזאן: </w:t>
       </w:r>
       <w:r>
         <w:rPr>
@@ -15078,17 +15078,17 @@
           <w:szCs w:val="24"/>
           <w:rtl/>
         </w:rPr>
-        <w:t xml:space="preserve">הודיה: </w:t>
-      </w:r>
-      <w:r>
-        <w:rPr>
-          <w:rFonts w:ascii="David" w:cs="David" w:eastAsia="David" w:hAnsi="David"/>
-          <w:noProof/>
-          <w:sz w:val="24"/>
-          <w:szCs w:val="24"/>
-          <w:rtl/>
-        </w:rPr>
-        <w:t xml:space="preserve">שלוש שאלו "מה את רוצה שאני אעשה". רגילות לעשות מה שהמורה רוצה. ואחת, מצטיינת, ממש התעצבנה שאין מבחן. ובת מהמפונות בחרה מכתב ואחרי עשר דקות ביקשה לעבור. "אני לא יכולה לכתוב על ילדה שעזבה את הבית." (שתיקה ארוכה) לא הייתי מוכנה לזה.</w:t>
+        <w:t xml:space="preserve">סוזאן: </w:t>
+      </w:r>
+      <w:r>
+        <w:rPr>
+          <w:rFonts w:ascii="David" w:cs="David" w:eastAsia="David" w:hAnsi="David"/>
+          <w:noProof/>
+          <w:sz w:val="24"/>
+          <w:szCs w:val="24"/>
+          <w:rtl/>
+        </w:rPr>
+        <w:t xml:space="preserve">שלוש שאלו "מה את רוצה שאני אעשה". רגילות לעשות מה שהמורה רוצה. ואחת, מצטיינת, ממש התעצבנה שאין מבחן. ובת מאלה שעברו בחרה מכתב ואחרי עשר דקות ביקשה לעבור. "אני לא יכולה לכתוב על ילדה שעזבה את הבית." (שתיקה ארוכה) לא הייתי מוכנה לזה.</w:t>
       </w:r>
     </w:p>
     <w:p>
@@ -15136,7 +15136,7 @@
           <w:szCs w:val="24"/>
           <w:rtl/>
         </w:rPr>
-        <w:t xml:space="preserve">הודיה: </w:t>
+        <w:t xml:space="preserve">סוזאן: </w:t>
       </w:r>
       <w:r>
         <w:rPr>
@@ -15194,17 +15194,17 @@
           <w:szCs w:val="24"/>
           <w:rtl/>
         </w:rPr>
-        <w:t xml:space="preserve">הודיה: </w:t>
-      </w:r>
-      <w:r>
-        <w:rPr>
-          <w:rFonts w:ascii="David" w:cs="David" w:eastAsia="David" w:hAnsi="David"/>
-          <w:noProof/>
-          <w:sz w:val="24"/>
-          <w:szCs w:val="24"/>
-          <w:rtl/>
-        </w:rPr>
-        <w:t xml:space="preserve">(מסתכלת זמן מה) המפעל... זה כמעט התמונה שלי. הרחוב טוב. והמכרה. (שתיקה) המכרה חזק. הייתי שומרת אותו לסוף. לא לפתיחה. ואצלי, בכיתה עם מפונות, הייתי חושבת פעמיים אם בכלל. אולי כן. אבל לא כדבר ראשון. ו... אני הייתי מוסיפה תמונה של ילד היום. בבית ספר, במחשב, לא משנה. כי בלי "היום" הן לא מבינות מה השתנה, ומה השתנה זה בעצם השאלה של היחידה.</w:t>
+        <w:t xml:space="preserve">סוזאן: </w:t>
+      </w:r>
+      <w:r>
+        <w:rPr>
+          <w:rFonts w:ascii="David" w:cs="David" w:eastAsia="David" w:hAnsi="David"/>
+          <w:noProof/>
+          <w:sz w:val="24"/>
+          <w:szCs w:val="24"/>
+          <w:rtl/>
+        </w:rPr>
+        <w:t xml:space="preserve">(מסתכלת זמן מה) המפעל... זה כמעט התמונה שלי. הרחוב טוב. והמכרה. (שתיקה) המכרה חזק. הייתי שומרת אותו לסוף. לא לפתיחה. ואצלי, בכיתה עם בנות שהיו קרובות לטיל, הייתי חושבת פעמיים אם בכלל. אולי כן. אבל לא כדבר ראשון. ו... אני הייתי מוסיפה תמונה של ילד היום. בבית ספר, במחשב, לא משנה. כי בלי "היום" הן לא מבינות מה השתנה, ומה השתנה זה בעצם השאלה של היחידה.</w:t>
       </w:r>
     </w:p>
     <w:p>
@@ -15252,17 +15252,17 @@
           <w:szCs w:val="24"/>
           <w:rtl/>
         </w:rPr>
-        <w:t xml:space="preserve">הודיה: </w:t>
-      </w:r>
-      <w:r>
-        <w:rPr>
-          <w:rFonts w:ascii="David" w:cs="David" w:eastAsia="David" w:hAnsi="David"/>
-          <w:noProof/>
-          <w:sz w:val="24"/>
-          <w:szCs w:val="24"/>
-          <w:rtl/>
-        </w:rPr>
-        <w:t xml:space="preserve">לתאר תמונה יפה בלי להבין למה. אז "למה" לכל תמונה. החזקות ישתעממו. שאלה שנייה, מי צילם ולמה. הבחירה של הכי קל. מחוון. ו... (שתיקה) מה שקרה לי. תמונה של ילד עובד יכולה לגעת בבת במקום כואב. ובכיתה עם מפונות ועם בנות שעברו דברים, לא תמיד יודעים מה. תכיני מראש מה את עושה עם בת שהתמונה פתחה לה משהו. אני לא הכנתי.</w:t>
+        <w:t xml:space="preserve">סוזאן: </w:t>
+      </w:r>
+      <w:r>
+        <w:rPr>
+          <w:rFonts w:ascii="David" w:cs="David" w:eastAsia="David" w:hAnsi="David"/>
+          <w:noProof/>
+          <w:sz w:val="24"/>
+          <w:szCs w:val="24"/>
+          <w:rtl/>
+        </w:rPr>
+        <w:t xml:space="preserve">לתאר תמונה יפה בלי להבין למה. אז "למה" לכל תמונה. החזקות ישתעממו. שאלה שנייה, מי צילם ולמה. הבחירה של הכי קל. מחוון. ו... (שתיקה) מה שקרה לי. תמונה של ילד עובד יכולה לגעת בבת במקום כואב. ובכיתה עם בנות שהיו קרובות לטיל ועם בנות שעברו דברים, לא תמיד יודעים מה. תכיני מראש מה את עושה עם בת שהתמונה פתחה לה משהו. אני לא הכנתי.</w:t>
       </w:r>
     </w:p>
     <w:p>
@@ -15310,7 +15310,7 @@
           <w:szCs w:val="24"/>
           <w:rtl/>
         </w:rPr>
-        <w:t xml:space="preserve">הודיה: </w:t>
+        <w:t xml:space="preserve">סוזאן: </w:t>
       </w:r>
       <w:r>
         <w:rPr>
@@ -15368,7 +15368,7 @@
           <w:szCs w:val="24"/>
           <w:rtl/>
         </w:rPr>
-        <w:t xml:space="preserve">הודיה: </w:t>
+        <w:t xml:space="preserve">סוזאן: </w:t>
       </w:r>
       <w:r>
         <w:rPr>
@@ -15426,7 +15426,7 @@
           <w:szCs w:val="24"/>
           <w:rtl/>
         </w:rPr>
-        <w:t xml:space="preserve">הודיה: </w:t>
+        <w:t xml:space="preserve">סוזאן: </w:t>
       </w:r>
       <w:r>
         <w:rPr>
@@ -15503,17 +15503,17 @@
           <w:szCs w:val="24"/>
           <w:rtl/>
         </w:rPr>
-        <w:t xml:space="preserve">הודיה: </w:t>
-      </w:r>
-      <w:r>
-        <w:rPr>
-          <w:rFonts w:ascii="David" w:cs="David" w:eastAsia="David" w:hAnsi="David"/>
-          <w:noProof/>
-          <w:sz w:val="24"/>
-          <w:szCs w:val="24"/>
-          <w:rtl/>
-        </w:rPr>
-        <w:t xml:space="preserve">שולחן. שולחן ארוך, כמו שולחן שבת. ועליו חפצים ותמונות. ובנות יושבות סביבו ומעבירות מיד ליד. ואני ביניהן. לא בראש השולחן.</w:t>
+        <w:t xml:space="preserve">סוזאן: </w:t>
+      </w:r>
+      <w:r>
+        <w:rPr>
+          <w:rFonts w:ascii="David" w:cs="David" w:eastAsia="David" w:hAnsi="David"/>
+          <w:noProof/>
+          <w:sz w:val="24"/>
+          <w:szCs w:val="24"/>
+          <w:rtl/>
+        </w:rPr>
+        <w:t xml:space="preserve">שולחן. שולחן ארוך, כמו שולחן בחתונה. ועליו חפצים ותמונות. ובנות יושבות סביבו ומעבירות מיד ליד. ואני ביניהן. לא בראש השולחן.</w:t>
       </w:r>
     </w:p>
     <w:p>
@@ -15561,17 +15561,17 @@
           <w:szCs w:val="24"/>
           <w:rtl/>
         </w:rPr>
-        <w:t xml:space="preserve">הודיה: </w:t>
-      </w:r>
-      <w:r>
-        <w:rPr>
-          <w:rFonts w:ascii="David" w:cs="David" w:eastAsia="David" w:hAnsi="David"/>
-          <w:noProof/>
-          <w:sz w:val="24"/>
-          <w:szCs w:val="24"/>
-          <w:rtl/>
-        </w:rPr>
-        <w:t xml:space="preserve">כי שולחן זה מקום שיושבים בו יחד. אפשר לגעת, להזיז, לקום, לעבור. לא כמו לוח, שאחת עומדת מולו והשאר יושבות. ו... כי אני מאמינה, מהמורה שלי, שהיסטוריה ותנ"ך מתחילים ממשהו שרואים ונוגעים בו. בת שמחזיקה סליל חוטים ושואלת "מי סובב את זה" כבר עושה היסטוריה. גם בלי תאריך. (שתיקה) ואני ביניהן כי מהראש רואים פנים ומהאמצע רואים ידיים. ומהידיים אני יודעת מי בפנים.</w:t>
+        <w:t xml:space="preserve">סוזאן: </w:t>
+      </w:r>
+      <w:r>
+        <w:rPr>
+          <w:rFonts w:ascii="David" w:cs="David" w:eastAsia="David" w:hAnsi="David"/>
+          <w:noProof/>
+          <w:sz w:val="24"/>
+          <w:szCs w:val="24"/>
+          <w:rtl/>
+        </w:rPr>
+        <w:t xml:space="preserve">כי שולחן זה מקום שיושבים בו יחד. אפשר לגעת, להזיז, לקום, לעבור. לא כמו לוח, שאחת עומדת מולו והשאר יושבות. ו... כי אני מאמינה, מהמורה שלי, שהיסטוריה ודת מתחילים ממשהו שרואים ונוגעים בו. בת שמחזיקה סליל חוטים ושואלת "מי סובב את זה" כבר עושה היסטוריה. גם בלי תאריך. (שתיקה) ואני ביניהן כי מהראש רואים פנים ומהאמצע רואים ידיים. ומהידיים אני יודעת מי בפנים.</w:t>
       </w:r>
     </w:p>
     <w:p>
@@ -15619,7 +15619,7 @@
           <w:szCs w:val="24"/>
           <w:rtl/>
         </w:rPr>
-        <w:t xml:space="preserve">הודיה: </w:t>
+        <w:t xml:space="preserve">סוזאן: </w:t>
       </w:r>
       <w:r>
         <w:rPr>
@@ -15677,7 +15677,7 @@
           <w:szCs w:val="24"/>
           <w:rtl/>
         </w:rPr>
-        <w:t xml:space="preserve">הודיה: </w:t>
+        <w:t xml:space="preserve">סוזאן: </w:t>
       </w:r>
       <w:r>
         <w:rPr>
@@ -15735,17 +15735,17 @@
           <w:szCs w:val="24"/>
           <w:rtl/>
         </w:rPr>
-        <w:t xml:space="preserve">הודיה: </w:t>
-      </w:r>
-      <w:r>
-        <w:rPr>
-          <w:rFonts w:ascii="David" w:cs="David" w:eastAsia="David" w:hAnsi="David"/>
-          <w:noProof/>
-          <w:sz w:val="24"/>
-          <w:szCs w:val="24"/>
-          <w:rtl/>
-        </w:rPr>
-        <w:t xml:space="preserve">ההורים. יש הורים שמודאגים כשזה לא נראה כמו בית הספר שהם מכירים. ואצלי, בממ"ד, גם הורים ששואלים למה בתנ"ך יש ציורים. תסבירי מראש. מכתב, מפגש. תראי תוצר אחד. ו... מה שאמרתי על המפונה. לא שאלת מה התמונות פותחות אצל התלמידות. תחשבי על זה מראש. אני לא חשבתי.</w:t>
+        <w:t xml:space="preserve">סוזאן: </w:t>
+      </w:r>
+      <w:r>
+        <w:rPr>
+          <w:rFonts w:ascii="David" w:cs="David" w:eastAsia="David" w:hAnsi="David"/>
+          <w:noProof/>
+          <w:sz w:val="24"/>
+          <w:szCs w:val="24"/>
+          <w:rtl/>
+        </w:rPr>
+        <w:t xml:space="preserve">ההורים. יש הורים שמודאגים כשזה לא נראה כמו בית הספר שהם מכירים. ואצלי גם הורים ששואלים למה בשיעור דת יש תמונות. תסבירי מראש. מכתב, מפגש. תראי תוצר אחד. ו... מה שאמרתי על הבת שעברה. לא שאלת מה התמונות פותחות אצל התלמידות. תחשבי על זה מראש. אני לא חשבתי.</w:t>
       </w:r>
     </w:p>
     <w:p>
@@ -15793,7 +15793,7 @@
           <w:szCs w:val="24"/>
           <w:rtl/>
         </w:rPr>
-        <w:t xml:space="preserve">הודיה: </w:t>
+        <w:t xml:space="preserve">סוזאן: </w:t>
       </w:r>
       <w:r>
         <w:rPr>

</xml_diff>

<commit_message>
Fix remaining context leftovers in renamed transcripts
Co-Authored-By: Claude Fable 5.1 <noreply@anthropic.com>
Claude-Session: https://claude.ai/code/session_011Z9C2ptByc9jQga6MDruQz
</commit_message>
<xml_diff>
--- a/deliverables/ראיונות_6_מורות_מחקר_גישוש.docx
+++ b/deliverables/ראיונות_6_מורות_מחקר_גישוש.docx
@@ -7676,7 +7676,7 @@
           <w:szCs w:val="24"/>
           <w:rtl/>
         </w:rPr>
-        <w:t xml:space="preserve">השפה. את שאלת על תמונות ועל בחירה ועל זמן ולא שאלת על שפה. ובכיתות כמו שלי, ואולי גם שלך עם עולים, השפה היא מאחורי כל השאר. התלמיד שלא בוחר לפעמים לא הבין את האפשרויות. התלמיד שאיטי לפעמים קורא לאט. התלמיד ששותק לפעמים לא מוצא מילים. תמונות עוזרות בדיוק כי הן עוקפות את זה. וכדאי שהמחקר שלך יגיד את זה. במפורש.</w:t>
+        <w:t xml:space="preserve">השפה. את שאלת על תמונות ועל בחירה ועל זמן ולא שאלת על שפה. ובכיתות כמו שלי, ואולי גם שלך, השפה היא מאחורי כל השאר. התלמיד שלא בוחר לפעמים לא הבין את האפשרויות. התלמיד שאיטי לפעמים קורא לאט. התלמיד ששותק לפעמים לא מוצא מילים. תמונות עוזרות בדיוק כי הן עוקפות את זה. וכדאי שהמחקר שלך יגיד את זה. במפורש.</w:t>
       </w:r>
     </w:p>
     <w:p>
@@ -8439,7 +8439,7 @@
           <w:szCs w:val="24"/>
           <w:rtl/>
         </w:rPr>
-        <w:t xml:space="preserve">בסיפור קצר, נתתי לכל קבוצה תצלום שמתאים לסצנה, בלי הטקסט, ולנחש מהתצלום מה קורה. ואיתי, שרואה תמונות מצוין, אמר לקבוצה: "היא כועסת עליו, תראו את היד שלה." ושבע דקות אחר כך, כשקראנו את הסצנה, הוא היה הראשון שאמר "אמרתי לכם". מאותו יום הוא הפסיק להגיד "אני לא רואה טוב". (שתיקה) לקות קריאה זה כמעט תמיד בעיה כפולה. יש את הקריאה. ויש מה שהילד למד על עצמו בגלל הקריאה. והשנייה קשה יותר לתיקון.</w:t>
+        <w:t xml:space="preserve">בסיפור קצר, נתתי לכל קבוצה תצלום שמתאים לסצנה, בלי הטקסט, ולנחש מהתצלום מה קורה. ואדם, שרואה תמונות מצוין, אמר לקבוצה: "היא כועסת עליו, תראו את היד שלה." ושבע דקות אחר כך, כשקראנו את הסצנה, הוא היה הראשון שאמר "אמרתי לכם". מאותו יום הוא הפסיק להגיד "אני לא רואה טוב". (שתיקה) לקות קריאה זה כמעט תמיד בעיה כפולה. יש את הקריאה. ויש מה שהילד למד על עצמו בגלל הקריאה. והשנייה קשה יותר לתיקון.</w:t>
       </w:r>
     </w:p>
     <w:p>
@@ -11280,7 +11280,7 @@
           <w:szCs w:val="24"/>
           <w:rtl/>
         </w:rPr>
-        <w:t xml:space="preserve">(שתיקה) היא אמרה: "אני יודעת את זה כבר שנתיים, ופה אני צריכה לשבת ולשמוע את זה עוד פעם בעברית, מספר שאני בקושי קוראת." ואז היא אמרה משהו שנשאר איתי: "בבית הספר שלי הייתי הכי טובה בכימיה, ופה אני הכי גרועה." והיא לא הייתה הכי גרועה. היא הייתה הכי טובה, בשפה אחרת. (שתיקה) ואני אמרתי לה, אני יודעת בדיוק. ואני חושבת שזה שאמרתי "אני יודעת בדיוק", ברוסית, ושהיא ידעה שאני עליתי, זה עשה משהו לפני כל השיטות.</w:t>
+        <w:t xml:space="preserve">(שתיקה) היא אמרה: "אני יודעת את זה כבר שנתיים, ופה אני צריכה לשבת ולשמוע את זה עוד פעם בעברית, מספר שאני בקושי קוראת." ואז היא אמרה משהו שנשאר איתי: "בבית הספר שלי הייתי הכי טובה בכימיה, ופה אני הכי גרועה." והיא לא הייתה הכי גרועה. היא הייתה הכי טובה, בשפה אחרת. (שתיקה) ואני אמרתי לה, אני יודעת בדיוק. ואני חושבת שזה שאמרתי "אני יודעת בדיוק", ושהיא ידעה שגם אני באתי מבחוץ, זה עשה משהו לפני כל השיטות.</w:t>
       </w:r>
     </w:p>
     <w:p>
@@ -13870,7 +13870,7 @@
           <w:szCs w:val="24"/>
           <w:rtl/>
         </w:rPr>
-        <w:t xml:space="preserve">ז'2, שלי. עשרים ותשע בנות. עשר בערך מהפזורה, שתיים הגיעו לבית ספר מסודר רק בגיל שש שבע, והקריאה שלהן איטית. שלוש בנות שהמשפחה שלהן עברה אלינו אחרי שנפל טיל ליד הכפר שלהן, במלחמה, ונשארו. עדיין רואים עליהן שהן לא בבית. שני אבחונים ואחת עם קשב, ועוד שתיים לדעתי. שש שבע שקוראות פרק בתנ"ך בקלות. עשר שפרק זה עשרים דקות. ו... בנות שההורים יושבים איתן, ובנות שההורים לא קוראים עברית, ובנות שמטפלות באחים.</w:t>
+        <w:t xml:space="preserve">ז'2, שלי. עשרים ותשע בנות. עשר בערך מהפזורה, שתיים הגיעו לבית ספר מסודר רק בגיל שש שבע, והקריאה שלהן איטית. שלוש בנות שהמשפחה שלהן עברה אלינו אחרי שנפל טיל ליד הכפר שלהן, במלחמה, ונשארו. עדיין רואים עליהן שהן לא בבית. שני אבחונים ואחת עם קשב, ועוד שתיים לדעתי. שש שבע שקוראות פרק בספר בקלות. עשר שפרק זה עשרים דקות. ו... בנות שההורים יושבים איתן, ובנות שההורים לא קוראים עברית, ובנות שמטפלות באחים.</w:t>
       </w:r>
     </w:p>
     <w:p>
@@ -13928,7 +13928,7 @@
           <w:szCs w:val="24"/>
           <w:rtl/>
         </w:rPr>
-        <w:t xml:space="preserve">(שתיקה ארוכה) הן יושבות ביחד, שלושתן. תמיד. הן לא מדברות על מה שהיה, אבל כשיש רעש חזק במסדרון, אחת מהן קופצת. ואחת שואלת כל בוקר אם יש היום משהו מיוחד, כאילו היא צריכה לדעת מראש מה יקרה. ואחת פשוט... שקטה. הייתה שקטה כל השנה. עד השיעור עם התמונה של הילדה במפעל. אני אספר לך. (שתיקה) ואני לא יועצת. אני מורה לתנ"ך. אבל אני רואה. ואני מדברת עם היועצת. ולפעמים כל מה שאני יכולה זה לא להפתיע אותן.</w:t>
+        <w:t xml:space="preserve">(שתיקה ארוכה) הן יושבות ביחד, שלושתן. תמיד. הן לא מדברות על מה שהיה, אבל כשיש רעש חזק במסדרון, אחת מהן קופצת. ואחת שואלת כל בוקר אם יש היום משהו מיוחד, כאילו היא צריכה לדעת מראש מה יקרה. ואחת פשוט... שקטה. הייתה שקטה כל השנה. עד השיעור עם התמונה של הילדה במפעל. אני אספר לך. (שתיקה) ואני לא יועצת. אני מורה להיסטוריה. אבל אני רואה. ואני מדברת עם היועצת. ולפעמים כל מה שאני יכולה זה לא להפתיע אותן.</w:t>
       </w:r>
     </w:p>
     <w:p>
@@ -18431,7 +18431,7 @@
           <w:szCs w:val="24"/>
           <w:rtl/>
         </w:rPr>
-        <w:t xml:space="preserve">השפה. ובנים ובנות. שאלת על תמונות, בחירה, זמן. לא על שפה. ובכיתות כמו שלי, ואולי שלך עם עולים, השפה היא מאחורי כל השאר. התלמיד שלא בוחר לפעמים לא הבין את האפשרויות. ותמונות עוזרות כי הן עוקפות את זה. תגידי את זה במחקר. ובכיתות מעורבות, בחירה ותצוגה נראות אחרת לבנות. בת שלא תעמוד מול בנים תקליט. ואם אין הקלטה, היא לא תעשה כלום.</w:t>
+        <w:t xml:space="preserve">השפה. ובנים ובנות. שאלת על תמונות, בחירה, זמן. לא על שפה. ובכיתות כמו שלי, ואולי גם שלך, השפה היא מאחורי כל השאר. התלמיד שלא בוחר לפעמים לא הבין את האפשרויות. ותמונות עוזרות כי הן עוקפות את זה. תגידי את זה במחקר. ובכיתות מעורבות, בחירה ותצוגה נראות אחרת לבנות. בת שלא תעמוד מול בנים תקליט. ואם אין הקלטה, היא לא תעשה כלום.</w:t>
       </w:r>
     </w:p>
     <w:p>

</xml_diff>